<commit_message>
Update algorithm documentation and binary files for Cortext
- Revised the algorithms.md file for improved clarity and formatting, consolidating multiple lines into single paragraphs for better readability.
- Added a new section on Composite Score Computation, detailing the metrics and their dependencies.
- Updated algorithms.docx and paper.docx binary files to reflect recent changes in the documentation.
</commit_message>
<xml_diff>
--- a/docs/research/algorithms.docx
+++ b/docs/research/algorithms.docx
@@ -395,75 +395,244 @@
     </w:p>
     <w:p>
       <w:pPr>
+        <w:pStyle w:val="Heading3"/>
+      </w:pPr>
+      <w:r>
+        <w:t xml:space="preserve">1.3.4 Experiential Mass and Maturity</w:t>
+      </w:r>
+    </w:p>
+    <w:p>
+      <w:pPr>
+        <w:pStyle w:val="Equation"/>
+      </w:pPr>
+      <w:r>
+        <w:rPr>
+          <w:rFonts w:ascii="Courier New" w:cs="Courier New" w:eastAsia="Courier New" w:hAnsi="Courier New"/>
+          <w:sz w:val="20"/>
+          <w:szCs w:val="20"/>
+        </w:rPr>
+        <w:t xml:space="preserve">τ_m(T) = lerp(10.0, 200.0, T)</w:t>
+      </w:r>
+    </w:p>
+    <w:p>
+      <w:pPr>
+        <w:pStyle w:val="Equation"/>
+      </w:pPr>
+      <w:r>
+        <w:rPr>
+          <w:rFonts w:ascii="Courier New" w:cs="Courier New" w:eastAsia="Courier New" w:hAnsi="Courier New"/>
+          <w:sz w:val="20"/>
+          <w:szCs w:val="20"/>
+        </w:rPr>
+        <w:t xml:space="preserve">maturity(t) = 1 − exp(−count / τ_m(T))</w:t>
+      </w:r>
+    </w:p>
+    <w:p>
+      <w:pPr>
+        <w:pStyle w:val="Equation"/>
+      </w:pPr>
+      <w:r>
+        <w:rPr>
+          <w:rFonts w:ascii="Courier New" w:cs="Courier New" w:eastAsia="Courier New" w:hAnsi="Courier New"/>
+          <w:sz w:val="20"/>
+          <w:szCs w:val="20"/>
+        </w:rPr>
+        <w:t xml:space="preserve">T_min(t) = lerp(0.01, 0.05, maturity(t))</w:t>
+      </w:r>
+    </w:p>
+    <w:p>
+      <w:pPr>
+        <w:pStyle w:val="Equation"/>
+      </w:pPr>
+      <w:r>
+        <w:rPr>
+          <w:rFonts w:ascii="Courier New" w:cs="Courier New" w:eastAsia="Courier New" w:hAnsi="Courier New"/>
+          <w:sz w:val="20"/>
+          <w:szCs w:val="20"/>
+        </w:rPr>
+        <w:t xml:space="preserve">T_max(t) = lerp(0.99, 0.95, maturity(t))</w:t>
+      </w:r>
+    </w:p>
+    <w:p>
+      <w:pPr>
+        <w:pStyle w:val="Equation"/>
+      </w:pPr>
+      <w:r>
+        <w:rPr>
+          <w:rFonts w:ascii="Courier New" w:cs="Courier New" w:eastAsia="Courier New" w:hAnsi="Courier New"/>
+          <w:sz w:val="20"/>
+          <w:szCs w:val="20"/>
+        </w:rPr>
+        <w:t xml:space="preserve">max_ΔT_per_min(t) = lerp(0.30, 0.10, maturity(t))</w:t>
+      </w:r>
+    </w:p>
+    <w:p>
+      <w:pPr>
         <w:pStyle w:val="Heading2"/>
       </w:pPr>
       <w:r>
-        <w:t xml:space="preserve">1.3.4 Experiential Mass and Maturity</w:t>
-      </w:r>
-    </w:p>
-    <w:p>
-      <w:pPr>
-        <w:pStyle w:val="Equation"/>
-      </w:pPr>
-      <w:r>
-        <w:rPr>
-          <w:rFonts w:ascii="Courier New" w:cs="Courier New" w:eastAsia="Courier New" w:hAnsi="Courier New"/>
-          <w:sz w:val="20"/>
-          <w:szCs w:val="20"/>
-        </w:rPr>
-        <w:t xml:space="preserve">τ_m(T) = lerp(10.0, 200.0, T)</w:t>
-      </w:r>
-    </w:p>
-    <w:p>
-      <w:pPr>
-        <w:pStyle w:val="Equation"/>
-      </w:pPr>
-      <w:r>
-        <w:rPr>
-          <w:rFonts w:ascii="Courier New" w:cs="Courier New" w:eastAsia="Courier New" w:hAnsi="Courier New"/>
-          <w:sz w:val="20"/>
-          <w:szCs w:val="20"/>
-        </w:rPr>
-        <w:t xml:space="preserve">maturity(t) = 1 − exp(−count / τ_m(T))</w:t>
-      </w:r>
-    </w:p>
-    <w:p>
-      <w:pPr>
-        <w:pStyle w:val="Equation"/>
-      </w:pPr>
-      <w:r>
-        <w:rPr>
-          <w:rFonts w:ascii="Courier New" w:cs="Courier New" w:eastAsia="Courier New" w:hAnsi="Courier New"/>
-          <w:sz w:val="20"/>
-          <w:szCs w:val="20"/>
-        </w:rPr>
-        <w:t xml:space="preserve">T_min(t) = lerp(0.01, 0.05, maturity(t))</w:t>
-      </w:r>
-    </w:p>
-    <w:p>
-      <w:pPr>
-        <w:pStyle w:val="Equation"/>
-      </w:pPr>
-      <w:r>
-        <w:rPr>
-          <w:rFonts w:ascii="Courier New" w:cs="Courier New" w:eastAsia="Courier New" w:hAnsi="Courier New"/>
-          <w:sz w:val="20"/>
-          <w:szCs w:val="20"/>
-        </w:rPr>
-        <w:t xml:space="preserve">T_max(t) = lerp(0.99, 0.95, maturity(t))</w:t>
-      </w:r>
-    </w:p>
-    <w:p>
-      <w:pPr>
-        <w:pStyle w:val="Equation"/>
-      </w:pPr>
-      <w:r>
-        <w:rPr>
-          <w:rFonts w:ascii="Courier New" w:cs="Courier New" w:eastAsia="Courier New" w:hAnsi="Courier New"/>
-          <w:sz w:val="20"/>
-          <w:szCs w:val="20"/>
-        </w:rPr>
-        <w:t xml:space="preserve">max_ΔT_per_min(t) = lerp(0.30, 0.10, maturity(t))</w:t>
+        <w:t xml:space="preserve">1.4 Uncertainty Estimation</w:t>
+      </w:r>
+    </w:p>
+    <w:p>
+      <w:pPr>
+        <w:pStyle w:val="Equation"/>
+      </w:pPr>
+      <w:r>
+        <w:rPr>
+          <w:rFonts w:ascii="Courier New" w:cs="Courier New" w:eastAsia="Courier New" w:hAnsi="Courier New"/>
+          <w:sz w:val="20"/>
+          <w:szCs w:val="20"/>
+        </w:rPr>
+        <w:t xml:space="preserve">var_score_max = 0.25</w:t>
+      </w:r>
+    </w:p>
+    <w:p>
+      <w:pPr>
+        <w:pStyle w:val="Equation"/>
+      </w:pPr>
+      <w:r>
+        <w:rPr>
+          <w:rFonts w:ascii="Courier New" w:cs="Courier New" w:eastAsia="Courier New" w:hAnsi="Courier New"/>
+          <w:sz w:val="20"/>
+          <w:szCs w:val="20"/>
+        </w:rPr>
+        <w:t xml:space="preserve">var_recent_norm = clamp(var(scores[t−w:t]) / var_score_max, 0, 1)</w:t>
+      </w:r>
+    </w:p>
+    <w:p>
+      <w:pPr>
+        <w:pStyle w:val="Equation"/>
+      </w:pPr>
+      <w:r>
+        <w:rPr>
+          <w:rFonts w:ascii="Courier New" w:cs="Courier New" w:eastAsia="Courier New" w:hAnsi="Courier New"/>
+          <w:sz w:val="20"/>
+          <w:szCs w:val="20"/>
+        </w:rPr>
+        <w:t xml:space="preserve">coherence_complement = 1 − coherence_t</w:t>
+      </w:r>
+    </w:p>
+    <w:p>
+      <w:pPr>
+        <w:pStyle w:val="Equation"/>
+      </w:pPr>
+      <w:r>
+        <w:rPr>
+          <w:rFonts w:ascii="Courier New" w:cs="Courier New" w:eastAsia="Courier New" w:hAnsi="Courier New"/>
+          <w:sz w:val="20"/>
+          <w:szCs w:val="20"/>
+        </w:rPr>
+        <w:t xml:space="preserve">novelty_surprise = blend([novelty_t, surprisal_t],</w:t>
+      </w:r>
+    </w:p>
+    <w:p>
+      <w:pPr>
+        <w:pStyle w:val="Equation"/>
+      </w:pPr>
+      <w:r>
+        <w:rPr>
+          <w:rFonts w:ascii="Courier New" w:cs="Courier New" w:eastAsia="Courier New" w:hAnsi="Courier New"/>
+          <w:sz w:val="20"/>
+          <w:szCs w:val="20"/>
+        </w:rPr>
+        <w:t xml:space="preserve">                        weights = normalize([S, 1 − T]))</w:t>
+      </w:r>
+    </w:p>
+    <w:p>
+      <w:pPr>
+        <w:pStyle w:val="Equation"/>
+      </w:pPr>
+      <w:r>
+        <w:rPr>
+          <w:rFonts w:ascii="Courier New" w:cs="Courier New" w:eastAsia="Courier New" w:hAnsi="Courier New"/>
+          <w:sz w:val="20"/>
+          <w:szCs w:val="20"/>
+        </w:rPr>
+        <w:t xml:space="preserve">weights_u = normalize([S, F, 1 − T, S × (1 − T)])</w:t>
+      </w:r>
+    </w:p>
+    <w:p>
+      <w:pPr>
+        <w:pStyle w:val="Equation"/>
+      </w:pPr>
+      <w:r>
+        <w:rPr>
+          <w:rFonts w:ascii="Courier New" w:cs="Courier New" w:eastAsia="Courier New" w:hAnsi="Courier New"/>
+          <w:sz w:val="20"/>
+          <w:szCs w:val="20"/>
+        </w:rPr>
+        <w:t xml:space="preserve">u_raw(t) = clamp(blend([var_recent_norm, focus_spread,</w:t>
+      </w:r>
+    </w:p>
+    <w:p>
+      <w:pPr>
+        <w:pStyle w:val="Equation"/>
+      </w:pPr>
+      <w:r>
+        <w:rPr>
+          <w:rFonts w:ascii="Courier New" w:cs="Courier New" w:eastAsia="Courier New" w:hAnsi="Courier New"/>
+          <w:sz w:val="20"/>
+          <w:szCs w:val="20"/>
+        </w:rPr>
+        <w:t xml:space="preserve">                        coherence_complement, novelty_surprise],</w:t>
+      </w:r>
+    </w:p>
+    <w:p>
+      <w:pPr>
+        <w:pStyle w:val="Equation"/>
+      </w:pPr>
+      <w:r>
+        <w:rPr>
+          <w:rFonts w:ascii="Courier New" w:cs="Courier New" w:eastAsia="Courier New" w:hAnsi="Courier New"/>
+          <w:sz w:val="20"/>
+          <w:szCs w:val="20"/>
+        </w:rPr>
+        <w:t xml:space="preserve">                       weights = weights_u), 0, 1)</w:t>
+      </w:r>
+    </w:p>
+    <w:p>
+      <w:pPr>
+        <w:pStyle w:val="Equation"/>
+      </w:pPr>
+      <w:r>
+        <w:rPr>
+          <w:rFonts w:ascii="Courier New" w:cs="Courier New" w:eastAsia="Courier New" w:hAnsi="Courier New"/>
+          <w:sz w:val="20"/>
+          <w:szCs w:val="20"/>
+        </w:rPr>
+        <w:t xml:space="preserve">α_u(T) = 0.10 + (1 − T) × 0.60</w:t>
+      </w:r>
+    </w:p>
+    <w:p>
+      <w:pPr>
+        <w:pStyle w:val="Equation"/>
+      </w:pPr>
+      <w:r>
+        <w:rPr>
+          <w:rFonts w:ascii="Courier New" w:cs="Courier New" w:eastAsia="Courier New" w:hAnsi="Courier New"/>
+          <w:sz w:val="20"/>
+          <w:szCs w:val="20"/>
+        </w:rPr>
+        <w:t xml:space="preserve">u(t) = EWMA(u(t−1), u_raw(t), α = α_u(T))</w:t>
+      </w:r>
+    </w:p>
+    <w:p>
+      <w:r>
+        <w:t xml:space="preserve">When structural metrics are unavailable, the fallback is u_raw(t) = 1 − maturity(t).</w:t>
+      </w:r>
+    </w:p>
+    <w:p>
+      <w:r>
+        <w:br w:type="page"/>
+      </w:r>
+    </w:p>
+    <w:p>
+      <w:pPr>
+        <w:pStyle w:val="Heading1"/>
+      </w:pPr>
+      <w:r>
+        <w:t xml:space="preserve">2. Core Adaptation Algorithms</w:t>
       </w:r>
     </w:p>
     <w:p>
@@ -471,155 +640,919 @@
         <w:pStyle w:val="Heading2"/>
       </w:pPr>
       <w:r>
-        <w:t xml:space="preserve">1.4 Uncertainty Estimation</w:t>
-      </w:r>
-    </w:p>
-    <w:p>
-      <w:pPr>
-        <w:pStyle w:val="Equation"/>
-      </w:pPr>
-      <w:r>
-        <w:rPr>
-          <w:rFonts w:ascii="Courier New" w:cs="Courier New" w:eastAsia="Courier New" w:hAnsi="Courier New"/>
-          <w:sz w:val="20"/>
-          <w:szCs w:val="20"/>
-        </w:rPr>
-        <w:t xml:space="preserve">var_score_max = 0.25</w:t>
-      </w:r>
-    </w:p>
-    <w:p>
-      <w:pPr>
-        <w:pStyle w:val="Equation"/>
-      </w:pPr>
-      <w:r>
-        <w:rPr>
-          <w:rFonts w:ascii="Courier New" w:cs="Courier New" w:eastAsia="Courier New" w:hAnsi="Courier New"/>
-          <w:sz w:val="20"/>
-          <w:szCs w:val="20"/>
-        </w:rPr>
-        <w:t xml:space="preserve">var_recent_norm = clamp(var(scores[t−w:t]) / var_score_max, 0, 1)</w:t>
-      </w:r>
-    </w:p>
-    <w:p>
-      <w:pPr>
-        <w:pStyle w:val="Equation"/>
-      </w:pPr>
-      <w:r>
-        <w:rPr>
-          <w:rFonts w:ascii="Courier New" w:cs="Courier New" w:eastAsia="Courier New" w:hAnsi="Courier New"/>
-          <w:sz w:val="20"/>
-          <w:szCs w:val="20"/>
-        </w:rPr>
-        <w:t xml:space="preserve">coherence_complement = 1 − coherence_t</w:t>
-      </w:r>
-    </w:p>
-    <w:p>
-      <w:pPr>
-        <w:pStyle w:val="Equation"/>
-      </w:pPr>
-      <w:r>
-        <w:rPr>
-          <w:rFonts w:ascii="Courier New" w:cs="Courier New" w:eastAsia="Courier New" w:hAnsi="Courier New"/>
-          <w:sz w:val="20"/>
-          <w:szCs w:val="20"/>
-        </w:rPr>
-        <w:t xml:space="preserve">novelty_surprise = blend([novelty_t, surprisal_t],</w:t>
-      </w:r>
-    </w:p>
-    <w:p>
-      <w:pPr>
-        <w:pStyle w:val="Equation"/>
-      </w:pPr>
-      <w:r>
-        <w:rPr>
-          <w:rFonts w:ascii="Courier New" w:cs="Courier New" w:eastAsia="Courier New" w:hAnsi="Courier New"/>
-          <w:sz w:val="20"/>
-          <w:szCs w:val="20"/>
-        </w:rPr>
-        <w:t xml:space="preserve">                        weights = normalize([S, 1 − T]))</w:t>
-      </w:r>
-    </w:p>
-    <w:p>
-      <w:pPr>
-        <w:pStyle w:val="Equation"/>
-      </w:pPr>
-      <w:r>
-        <w:rPr>
-          <w:rFonts w:ascii="Courier New" w:cs="Courier New" w:eastAsia="Courier New" w:hAnsi="Courier New"/>
-          <w:sz w:val="20"/>
-          <w:szCs w:val="20"/>
-        </w:rPr>
-        <w:t xml:space="preserve">weights_u = normalize([S, F, 1 − T, S × (1 − T)])</w:t>
-      </w:r>
-    </w:p>
-    <w:p>
-      <w:pPr>
-        <w:pStyle w:val="Equation"/>
-      </w:pPr>
-      <w:r>
-        <w:rPr>
-          <w:rFonts w:ascii="Courier New" w:cs="Courier New" w:eastAsia="Courier New" w:hAnsi="Courier New"/>
-          <w:sz w:val="20"/>
-          <w:szCs w:val="20"/>
-        </w:rPr>
-        <w:t xml:space="preserve">u_raw(t) = clamp(blend([var_recent_norm, focus_spread,</w:t>
-      </w:r>
-    </w:p>
-    <w:p>
-      <w:pPr>
-        <w:pStyle w:val="Equation"/>
-      </w:pPr>
-      <w:r>
-        <w:rPr>
-          <w:rFonts w:ascii="Courier New" w:cs="Courier New" w:eastAsia="Courier New" w:hAnsi="Courier New"/>
-          <w:sz w:val="20"/>
-          <w:szCs w:val="20"/>
-        </w:rPr>
-        <w:t xml:space="preserve">                        coherence_complement, novelty_surprise],</w:t>
-      </w:r>
-    </w:p>
-    <w:p>
-      <w:pPr>
-        <w:pStyle w:val="Equation"/>
-      </w:pPr>
-      <w:r>
-        <w:rPr>
-          <w:rFonts w:ascii="Courier New" w:cs="Courier New" w:eastAsia="Courier New" w:hAnsi="Courier New"/>
-          <w:sz w:val="20"/>
-          <w:szCs w:val="20"/>
-        </w:rPr>
-        <w:t xml:space="preserve">                       weights = weights_u), 0, 1)</w:t>
-      </w:r>
-    </w:p>
-    <w:p>
-      <w:pPr>
-        <w:pStyle w:val="Equation"/>
-      </w:pPr>
-      <w:r>
-        <w:rPr>
-          <w:rFonts w:ascii="Courier New" w:cs="Courier New" w:eastAsia="Courier New" w:hAnsi="Courier New"/>
-          <w:sz w:val="20"/>
-          <w:szCs w:val="20"/>
-        </w:rPr>
-        <w:t xml:space="preserve">α_u(T) = 0.10 + (1 − T) × 0.60</w:t>
-      </w:r>
-    </w:p>
-    <w:p>
-      <w:pPr>
-        <w:pStyle w:val="Equation"/>
-      </w:pPr>
-      <w:r>
-        <w:rPr>
-          <w:rFonts w:ascii="Courier New" w:cs="Courier New" w:eastAsia="Courier New" w:hAnsi="Courier New"/>
-          <w:sz w:val="20"/>
-          <w:szCs w:val="20"/>
-        </w:rPr>
-        <w:t xml:space="preserve">u(t) = EWMA(u(t−1), u_raw(t), α = α_u(T))</w:t>
-      </w:r>
-    </w:p>
-    <w:p>
-      <w:r>
-        <w:t xml:space="preserve">When structural metrics are unavailable, the fallback is u_raw(t) = 1 − maturity(t).</w:t>
+        <w:t xml:space="preserve">2.1 Focus-Driven Selectivity</w:t>
+      </w:r>
+    </w:p>
+    <w:p>
+      <w:pPr>
+        <w:pStyle w:val="Heading3"/>
+      </w:pPr>
+      <w:r>
+        <w:t xml:space="preserve">2.1.1 Focus Priors</w:t>
+      </w:r>
+    </w:p>
+    <w:p>
+      <w:pPr>
+        <w:pStyle w:val="Equation"/>
+      </w:pPr>
+      <w:r>
+        <w:rPr>
+          <w:rFonts w:ascii="Courier New" w:cs="Courier New" w:eastAsia="Courier New" w:hAnsi="Courier New"/>
+          <w:sz w:val="20"/>
+          <w:szCs w:val="20"/>
+        </w:rPr>
+        <w:t xml:space="preserve">weight_relevance_prior = sigmoid(2F − 1)</w:t>
+      </w:r>
+    </w:p>
+    <w:p>
+      <w:pPr>
+        <w:pStyle w:val="Equation"/>
+      </w:pPr>
+      <w:r>
+        <w:rPr>
+          <w:rFonts w:ascii="Courier New" w:cs="Courier New" w:eastAsia="Courier New" w:hAnsi="Courier New"/>
+          <w:sz w:val="20"/>
+          <w:szCs w:val="20"/>
+        </w:rPr>
+        <w:t xml:space="preserve">coverage_gain_floor = 0.3 + 0.7F</w:t>
+      </w:r>
+    </w:p>
+    <w:p>
+      <w:pPr>
+        <w:pStyle w:val="Equation"/>
+      </w:pPr>
+      <w:r>
+        <w:rPr>
+          <w:rFonts w:ascii="Courier New" w:cs="Courier New" w:eastAsia="Courier New" w:hAnsi="Courier New"/>
+          <w:sz w:val="20"/>
+          <w:szCs w:val="20"/>
+        </w:rPr>
+        <w:t xml:space="preserve">mismatch_weight_prior = 1 − F</w:t>
+      </w:r>
+    </w:p>
+    <w:p>
+      <w:pPr>
+        <w:pStyle w:val="Equation"/>
+      </w:pPr>
+      <w:r>
+        <w:rPr>
+          <w:rFonts w:ascii="Courier New" w:cs="Courier New" w:eastAsia="Courier New" w:hAnsi="Courier New"/>
+          <w:sz w:val="20"/>
+          <w:szCs w:val="20"/>
+        </w:rPr>
+        <w:t xml:space="preserve">attention_width_prior = lerp(π, 0.1π, F)</w:t>
+      </w:r>
+    </w:p>
+    <w:p>
+      <w:pPr>
+        <w:pStyle w:val="Heading3"/>
+      </w:pPr>
+      <w:r>
+        <w:t xml:space="preserve">2.1.2 Dynamic Focus Update</w:t>
+      </w:r>
+    </w:p>
+    <w:p>
+      <w:pPr>
+        <w:pStyle w:val="Equation"/>
+      </w:pPr>
+      <w:r>
+        <w:rPr>
+          <w:rFonts w:ascii="Courier New" w:cs="Courier New" w:eastAsia="Courier New" w:hAnsi="Courier New"/>
+          <w:sz w:val="20"/>
+          <w:szCs w:val="20"/>
+        </w:rPr>
+        <w:t xml:space="preserve">recent_context ← tail(context_buffer, n_ctx(T))</w:t>
+      </w:r>
+    </w:p>
+    <w:p>
+      <w:pPr>
+        <w:pStyle w:val="Equation"/>
+      </w:pPr>
+      <w:r>
+        <w:rPr>
+          <w:rFonts w:ascii="Courier New" w:cs="Courier New" w:eastAsia="Courier New" w:hAnsi="Courier New"/>
+          <w:sz w:val="20"/>
+          <w:szCs w:val="20"/>
+        </w:rPr>
+        <w:t xml:space="preserve">observed_cosine ← cos(x_t, mean(recent_context))</w:t>
+      </w:r>
+    </w:p>
+    <w:p>
+      <w:pPr>
+        <w:pStyle w:val="Equation"/>
+      </w:pPr>
+      <w:r>
+        <w:rPr>
+          <w:rFonts w:ascii="Courier New" w:cs="Courier New" w:eastAsia="Courier New" w:hAnsi="Courier New"/>
+          <w:sz w:val="20"/>
+          <w:szCs w:val="20"/>
+        </w:rPr>
+        <w:t xml:space="preserve">weight_relevance_t ← EWMA(weight_relevance_{t−1},</w:t>
+      </w:r>
+    </w:p>
+    <w:p>
+      <w:pPr>
+        <w:pStyle w:val="Equation"/>
+      </w:pPr>
+      <w:r>
+        <w:rPr>
+          <w:rFonts w:ascii="Courier New" w:cs="Courier New" w:eastAsia="Courier New" w:hAnsi="Courier New"/>
+          <w:sz w:val="20"/>
+          <w:szCs w:val="20"/>
+        </w:rPr>
+        <w:t xml:space="preserve">                         map01(observed_cosine), α = α_F(t))</w:t>
+      </w:r>
+    </w:p>
+    <w:p>
+      <w:pPr>
+        <w:pStyle w:val="Equation"/>
+      </w:pPr>
+      <w:r>
+        <w:rPr>
+          <w:rFonts w:ascii="Courier New" w:cs="Courier New" w:eastAsia="Courier New" w:hAnsi="Courier New"/>
+          <w:sz w:val="20"/>
+          <w:szCs w:val="20"/>
+        </w:rPr>
+        <w:t xml:space="preserve">α_min_F = 0.05; α_span_F = 0.45</w:t>
+      </w:r>
+    </w:p>
+    <w:p>
+      <w:pPr>
+        <w:pStyle w:val="Equation"/>
+      </w:pPr>
+      <w:r>
+        <w:rPr>
+          <w:rFonts w:ascii="Courier New" w:cs="Courier New" w:eastAsia="Courier New" w:hAnsi="Courier New"/>
+          <w:sz w:val="20"/>
+          <w:szCs w:val="20"/>
+        </w:rPr>
+        <w:t xml:space="preserve">α_F(t) = α_min_F + F × α_span_F × u(t)</w:t>
+      </w:r>
+    </w:p>
+    <w:p>
+      <w:pPr>
+        <w:pStyle w:val="Heading2"/>
+      </w:pPr>
+      <w:r>
+        <w:t xml:space="preserve">2.2 Sensitivity-Driven Plasticity</w:t>
+      </w:r>
+    </w:p>
+    <w:p>
+      <w:pPr>
+        <w:pStyle w:val="Heading3"/>
+      </w:pPr>
+      <w:r>
+        <w:t xml:space="preserve">2.2.1 Sensitivity Priors</w:t>
+      </w:r>
+    </w:p>
+    <w:p>
+      <w:pPr>
+        <w:pStyle w:val="Equation"/>
+      </w:pPr>
+      <w:r>
+        <w:rPr>
+          <w:rFonts w:ascii="Courier New" w:cs="Courier New" w:eastAsia="Courier New" w:hAnsi="Courier New"/>
+          <w:sz w:val="20"/>
+          <w:szCs w:val="20"/>
+        </w:rPr>
+        <w:t xml:space="preserve">base_rate_prior = lerp(0.2, 5.0, S)  # writes/min</w:t>
+      </w:r>
+    </w:p>
+    <w:p>
+      <w:pPr>
+        <w:pStyle w:val="Equation"/>
+      </w:pPr>
+      <w:r>
+        <w:rPr>
+          <w:rFonts w:ascii="Courier New" w:cs="Courier New" w:eastAsia="Courier New" w:hAnsi="Courier New"/>
+          <w:sz w:val="20"/>
+          <w:szCs w:val="20"/>
+        </w:rPr>
+        <w:t xml:space="preserve">weight_novelty_prior = 0.3 + 0.7S</w:t>
+      </w:r>
+    </w:p>
+    <w:p>
+      <w:pPr>
+        <w:pStyle w:val="Equation"/>
+      </w:pPr>
+      <w:r>
+        <w:rPr>
+          <w:rFonts w:ascii="Courier New" w:cs="Courier New" w:eastAsia="Courier New" w:hAnsi="Courier New"/>
+          <w:sz w:val="20"/>
+          <w:szCs w:val="20"/>
+        </w:rPr>
+        <w:t xml:space="preserve">weight_surprise_prior = 0.2 + 0.8S</w:t>
+      </w:r>
+    </w:p>
+    <w:p>
+      <w:pPr>
+        <w:pStyle w:val="Equation"/>
+      </w:pPr>
+      <w:r>
+        <w:rPr>
+          <w:rFonts w:ascii="Courier New" w:cs="Courier New" w:eastAsia="Courier New" w:hAnsi="Courier New"/>
+          <w:sz w:val="20"/>
+          <w:szCs w:val="20"/>
+        </w:rPr>
+        <w:t xml:space="preserve">weight_valence_prior = 0.4 + 0.6S</w:t>
+      </w:r>
+    </w:p>
+    <w:p>
+      <w:pPr>
+        <w:pStyle w:val="Equation"/>
+      </w:pPr>
+      <w:r>
+        <w:rPr>
+          <w:rFonts w:ascii="Courier New" w:cs="Courier New" w:eastAsia="Courier New" w:hAnsi="Courier New"/>
+          <w:sz w:val="20"/>
+          <w:szCs w:val="20"/>
+        </w:rPr>
+        <w:t xml:space="preserve">weight_arousal_prior = S</w:t>
+      </w:r>
+    </w:p>
+    <w:p>
+      <w:pPr>
+        <w:pStyle w:val="Equation"/>
+      </w:pPr>
+      <w:r>
+        <w:rPr>
+          <w:rFonts w:ascii="Courier New" w:cs="Courier New" w:eastAsia="Courier New" w:hAnsi="Courier New"/>
+          <w:sz w:val="20"/>
+          <w:szCs w:val="20"/>
+        </w:rPr>
+        <w:t xml:space="preserve">emotion_gain_prior = exp(1.5S)</w:t>
+      </w:r>
+    </w:p>
+    <w:p>
+      <w:pPr>
+        <w:pStyle w:val="Equation"/>
+      </w:pPr>
+      <w:r>
+        <w:rPr>
+          <w:rFonts w:ascii="Courier New" w:cs="Courier New" w:eastAsia="Courier New" w:hAnsi="Courier New"/>
+          <w:sz w:val="20"/>
+          <w:szCs w:val="20"/>
+        </w:rPr>
+        <w:t xml:space="preserve">score_gain_prior = exp(2S)</w:t>
+      </w:r>
+    </w:p>
+    <w:p>
+      <w:pPr>
+        <w:pStyle w:val="Equation"/>
+      </w:pPr>
+      <w:r>
+        <w:rPr>
+          <w:rFonts w:ascii="Courier New" w:cs="Courier New" w:eastAsia="Courier New" w:hAnsi="Courier New"/>
+          <w:sz w:val="20"/>
+          <w:szCs w:val="20"/>
+        </w:rPr>
+        <w:t xml:space="preserve">rate_target_prior = base_rate_prior × (0.5 + 1.5S)</w:t>
+      </w:r>
+    </w:p>
+    <w:p>
+      <w:pPr>
+        <w:pStyle w:val="Heading3"/>
+      </w:pPr>
+      <w:r>
+        <w:t xml:space="preserve">2.2.2 Emotional Projection</w:t>
+      </w:r>
+    </w:p>
+    <w:p>
+      <w:pPr>
+        <w:pStyle w:val="Equation"/>
+      </w:pPr>
+      <w:r>
+        <w:rPr>
+          <w:rFonts w:ascii="Courier New" w:cs="Courier New" w:eastAsia="Courier New" w:hAnsi="Courier New"/>
+          <w:sz w:val="20"/>
+          <w:szCs w:val="20"/>
+        </w:rPr>
+        <w:t xml:space="preserve">v_map = {anger: −0.9, fear: −0.8, sadness: −0.9,</w:t>
+      </w:r>
+    </w:p>
+    <w:p>
+      <w:pPr>
+        <w:pStyle w:val="Equation"/>
+      </w:pPr>
+      <w:r>
+        <w:rPr>
+          <w:rFonts w:ascii="Courier New" w:cs="Courier New" w:eastAsia="Courier New" w:hAnsi="Courier New"/>
+          <w:sz w:val="20"/>
+          <w:szCs w:val="20"/>
+        </w:rPr>
+        <w:t xml:space="preserve">         joy: +0.9, love: +0.8, surprise: 0.0}</w:t>
+      </w:r>
+    </w:p>
+    <w:p>
+      <w:pPr>
+        <w:pStyle w:val="Equation"/>
+      </w:pPr>
+      <w:r>
+        <w:rPr>
+          <w:rFonts w:ascii="Courier New" w:cs="Courier New" w:eastAsia="Courier New" w:hAnsi="Courier New"/>
+          <w:sz w:val="20"/>
+          <w:szCs w:val="20"/>
+        </w:rPr>
+        <w:t xml:space="preserve">a_map = {anger: +0.9, fear: +0.9, sadness: +0.3,</w:t>
+      </w:r>
+    </w:p>
+    <w:p>
+      <w:pPr>
+        <w:pStyle w:val="Equation"/>
+      </w:pPr>
+      <w:r>
+        <w:rPr>
+          <w:rFonts w:ascii="Courier New" w:cs="Courier New" w:eastAsia="Courier New" w:hAnsi="Courier New"/>
+          <w:sz w:val="20"/>
+          <w:szCs w:val="20"/>
+        </w:rPr>
+        <w:t xml:space="preserve">         joy: +0.6, love: +0.5, surprise: +0.8}</w:t>
+      </w:r>
+    </w:p>
+    <w:p>
+      <w:pPr>
+        <w:pStyle w:val="Equation"/>
+      </w:pPr>
+      <w:r>
+        <w:rPr>
+          <w:rFonts w:ascii="Courier New" w:cs="Courier New" w:eastAsia="Courier New" w:hAnsi="Courier New"/>
+          <w:sz w:val="20"/>
+          <w:szCs w:val="20"/>
+        </w:rPr>
+        <w:t xml:space="preserve">raw_cos_c ← cos(x_t, centroids[c]) for each c ∈ C</w:t>
+      </w:r>
+    </w:p>
+    <w:p>
+      <w:pPr>
+        <w:pStyle w:val="Equation"/>
+      </w:pPr>
+      <w:r>
+        <w:rPr>
+          <w:rFonts w:ascii="Courier New" w:cs="Courier New" w:eastAsia="Courier New" w:hAnsi="Courier New"/>
+          <w:sz w:val="20"/>
+          <w:szCs w:val="20"/>
+        </w:rPr>
+        <w:t xml:space="preserve">if all raw_cos_c ≤ 0:</w:t>
+      </w:r>
+    </w:p>
+    <w:p>
+      <w:pPr>
+        <w:pStyle w:val="Equation"/>
+      </w:pPr>
+      <w:r>
+        <w:rPr>
+          <w:rFonts w:ascii="Courier New" w:cs="Courier New" w:eastAsia="Courier New" w:hAnsi="Courier New"/>
+          <w:sz w:val="20"/>
+          <w:szCs w:val="20"/>
+        </w:rPr>
+        <w:t xml:space="preserve">    emotion_intensity_t ← 0; valence_t ← 0.5; arousal_t ← 0</w:t>
+      </w:r>
+    </w:p>
+    <w:p>
+      <w:pPr>
+        <w:pStyle w:val="Equation"/>
+      </w:pPr>
+      <w:r>
+        <w:rPr>
+          <w:rFonts w:ascii="Courier New" w:cs="Courier New" w:eastAsia="Courier New" w:hAnsi="Courier New"/>
+          <w:sz w:val="20"/>
+          <w:szCs w:val="20"/>
+        </w:rPr>
+        <w:t xml:space="preserve">else:</w:t>
+      </w:r>
+    </w:p>
+    <w:p>
+      <w:pPr>
+        <w:pStyle w:val="Equation"/>
+      </w:pPr>
+      <w:r>
+        <w:rPr>
+          <w:rFonts w:ascii="Courier New" w:cs="Courier New" w:eastAsia="Courier New" w:hAnsi="Courier New"/>
+          <w:sz w:val="20"/>
+          <w:szCs w:val="20"/>
+        </w:rPr>
+        <w:t xml:space="preserve">    logits_c ← max(0, raw_cos_c)</w:t>
+      </w:r>
+    </w:p>
+    <w:p>
+      <w:pPr>
+        <w:pStyle w:val="Equation"/>
+      </w:pPr>
+      <w:r>
+        <w:rPr>
+          <w:rFonts w:ascii="Courier New" w:cs="Courier New" w:eastAsia="Courier New" w:hAnsi="Courier New"/>
+          <w:sz w:val="20"/>
+          <w:szCs w:val="20"/>
+        </w:rPr>
+        <w:t xml:space="preserve">    β(S) = 4 + 8S  # softmax inverse temperature</w:t>
+      </w:r>
+    </w:p>
+    <w:p>
+      <w:pPr>
+        <w:pStyle w:val="Equation"/>
+      </w:pPr>
+      <w:r>
+        <w:rPr>
+          <w:rFonts w:ascii="Courier New" w:cs="Courier New" w:eastAsia="Courier New" w:hAnsi="Courier New"/>
+          <w:sz w:val="20"/>
+          <w:szCs w:val="20"/>
+        </w:rPr>
+        <w:t xml:space="preserve">    p_c ← softmax(β(S) × logits_c)</w:t>
+      </w:r>
+    </w:p>
+    <w:p>
+      <w:pPr>
+        <w:pStyle w:val="Equation"/>
+      </w:pPr>
+      <w:r>
+        <w:rPr>
+          <w:rFonts w:ascii="Courier New" w:cs="Courier New" w:eastAsia="Courier New" w:hAnsi="Courier New"/>
+          <w:sz w:val="20"/>
+          <w:szCs w:val="20"/>
+        </w:rPr>
+        <w:t xml:space="preserve">    peak ← max_c(p_c)</w:t>
+      </w:r>
+    </w:p>
+    <w:p>
+      <w:pPr>
+        <w:pStyle w:val="Equation"/>
+      </w:pPr>
+      <w:r>
+        <w:rPr>
+          <w:rFonts w:ascii="Courier New" w:cs="Courier New" w:eastAsia="Courier New" w:hAnsi="Courier New"/>
+          <w:sz w:val="20"/>
+          <w:szCs w:val="20"/>
+        </w:rPr>
+        <w:t xml:space="preserve">    confidence ← 1 − H(p_c) / ln(6)</w:t>
+      </w:r>
+    </w:p>
+    <w:p>
+      <w:pPr>
+        <w:pStyle w:val="Equation"/>
+      </w:pPr>
+      <w:r>
+        <w:rPr>
+          <w:rFonts w:ascii="Courier New" w:cs="Courier New" w:eastAsia="Courier New" w:hAnsi="Courier New"/>
+          <w:sz w:val="20"/>
+          <w:szCs w:val="20"/>
+        </w:rPr>
+        <w:t xml:space="preserve">    emotion_intensity_t ← sqrt(peak × confidence)</w:t>
+      </w:r>
+    </w:p>
+    <w:p>
+      <w:pPr>
+        <w:pStyle w:val="Equation"/>
+      </w:pPr>
+      <w:r>
+        <w:rPr>
+          <w:rFonts w:ascii="Courier New" w:cs="Courier New" w:eastAsia="Courier New" w:hAnsi="Courier New"/>
+          <w:sz w:val="20"/>
+          <w:szCs w:val="20"/>
+        </w:rPr>
+        <w:t xml:space="preserve">    valence_t ← (Σ_c p_c × v_map[c] + 0.9) / 1.8</w:t>
+      </w:r>
+    </w:p>
+    <w:p>
+      <w:pPr>
+        <w:pStyle w:val="Equation"/>
+      </w:pPr>
+      <w:r>
+        <w:rPr>
+          <w:rFonts w:ascii="Courier New" w:cs="Courier New" w:eastAsia="Courier New" w:hAnsi="Courier New"/>
+          <w:sz w:val="20"/>
+          <w:szCs w:val="20"/>
+        </w:rPr>
+        <w:t xml:space="preserve">    arousal_t ← clamp(Σ_c p_c × a_map[c], 0, 1)</w:t>
+      </w:r>
+    </w:p>
+    <w:p>
+      <w:pPr>
+        <w:pStyle w:val="Heading3"/>
+      </w:pPr>
+      <w:r>
+        <w:t xml:space="preserve">2.2.3 Threshold Modulation from Emotion</w:t>
+      </w:r>
+    </w:p>
+    <w:p>
+      <w:pPr>
+        <w:pStyle w:val="Equation"/>
+      </w:pPr>
+      <w:r>
+        <w:rPr>
+          <w:rFonts w:ascii="Courier New" w:cs="Courier New" w:eastAsia="Courier New" w:hAnsi="Courier New"/>
+          <w:sz w:val="20"/>
+          <w:szCs w:val="20"/>
+        </w:rPr>
+        <w:t xml:space="preserve">κ_emo ← κ_base × S  # where κ_base = 0.10</w:t>
+      </w:r>
+    </w:p>
+    <w:p>
+      <w:pPr>
+        <w:pStyle w:val="Equation"/>
+      </w:pPr>
+      <w:r>
+        <w:rPr>
+          <w:rFonts w:ascii="Courier New" w:cs="Courier New" w:eastAsia="Courier New" w:hAnsi="Courier New"/>
+          <w:sz w:val="20"/>
+          <w:szCs w:val="20"/>
+        </w:rPr>
+        <w:t xml:space="preserve">ΔThreshold_emotion_t ← −κ_emo × emotion_intensity_t ×</w:t>
+      </w:r>
+    </w:p>
+    <w:p>
+      <w:pPr>
+        <w:pStyle w:val="Equation"/>
+      </w:pPr>
+      <w:r>
+        <w:rPr>
+          <w:rFonts w:ascii="Courier New" w:cs="Courier New" w:eastAsia="Courier New" w:hAnsi="Courier New"/>
+          <w:sz w:val="20"/>
+          <w:szCs w:val="20"/>
+        </w:rPr>
+        <w:t xml:space="preserve">                        (0.5 + 0.5 × arousal_t)</w:t>
+      </w:r>
+    </w:p>
+    <w:p>
+      <w:pPr>
+        <w:pStyle w:val="Heading3"/>
+      </w:pPr>
+      <w:r>
+        <w:t xml:space="preserve">2.2.4 Mood Integration</w:t>
+      </w:r>
+    </w:p>
+    <w:p>
+      <w:pPr>
+        <w:pStyle w:val="Equation"/>
+      </w:pPr>
+      <w:r>
+        <w:rPr>
+          <w:rFonts w:ascii="Courier New" w:cs="Courier New" w:eastAsia="Courier New" w:hAnsi="Courier New"/>
+          <w:sz w:val="20"/>
+          <w:szCs w:val="20"/>
+        </w:rPr>
+        <w:t xml:space="preserve">α_mood(S) = lerp(0.01, 0.20, S)  # reactivity</w:t>
+      </w:r>
+    </w:p>
+    <w:p>
+      <w:pPr>
+        <w:pStyle w:val="Equation"/>
+      </w:pPr>
+      <w:r>
+        <w:rPr>
+          <w:rFonts w:ascii="Courier New" w:cs="Courier New" w:eastAsia="Courier New" w:hAnsi="Courier New"/>
+          <w:sz w:val="20"/>
+          <w:szCs w:val="20"/>
+        </w:rPr>
+        <w:t xml:space="preserve">λ_mood(T) = lerp(0.90, 0.999, T)  # decay</w:t>
+      </w:r>
+    </w:p>
+    <w:p>
+      <w:pPr>
+        <w:pStyle w:val="Equation"/>
+      </w:pPr>
+      <w:r>
+        <w:rPr>
+          <w:rFonts w:ascii="Courier New" w:cs="Courier New" w:eastAsia="Courier New" w:hAnsi="Courier New"/>
+          <w:sz w:val="20"/>
+          <w:szCs w:val="20"/>
+        </w:rPr>
+        <w:t xml:space="preserve">M_t = λ_mood(T) × M_{t−1} + α_mood(S) × e_t</w:t>
+      </w:r>
+    </w:p>
+    <w:p>
+      <w:pPr>
+        <w:pStyle w:val="Equation"/>
+      </w:pPr>
+      <w:r>
+        <w:rPr>
+          <w:rFonts w:ascii="Courier New" w:cs="Courier New" w:eastAsia="Courier New" w:hAnsi="Courier New"/>
+          <w:sz w:val="20"/>
+          <w:szCs w:val="20"/>
+        </w:rPr>
+        <w:t xml:space="preserve">M_t ← clamp(M_t, −1.0, 1.0)</w:t>
+      </w:r>
+    </w:p>
+    <w:p>
+      <w:pPr>
+        <w:pStyle w:val="Equation"/>
+      </w:pPr>
+      <w:r>
+        <w:rPr>
+          <w:rFonts w:ascii="Courier New" w:cs="Courier New" w:eastAsia="Courier New" w:hAnsi="Courier New"/>
+          <w:sz w:val="20"/>
+          <w:szCs w:val="20"/>
+        </w:rPr>
+        <w:t xml:space="preserve">κ_mood ← κ_base × S</w:t>
+      </w:r>
+    </w:p>
+    <w:p>
+      <w:pPr>
+        <w:pStyle w:val="Equation"/>
+      </w:pPr>
+      <w:r>
+        <w:rPr>
+          <w:rFonts w:ascii="Courier New" w:cs="Courier New" w:eastAsia="Courier New" w:hAnsi="Courier New"/>
+          <w:sz w:val="20"/>
+          <w:szCs w:val="20"/>
+        </w:rPr>
+        <w:t xml:space="preserve">m_norm ← ‖M_t‖ / √6</w:t>
+      </w:r>
+    </w:p>
+    <w:p>
+      <w:pPr>
+        <w:pStyle w:val="Equation"/>
+      </w:pPr>
+      <w:r>
+        <w:rPr>
+          <w:rFonts w:ascii="Courier New" w:cs="Courier New" w:eastAsia="Courier New" w:hAnsi="Courier New"/>
+          <w:sz w:val="20"/>
+          <w:szCs w:val="20"/>
+        </w:rPr>
+        <w:t xml:space="preserve">ΔThreshold_mood_t ← −κ_mood × clamp(m_norm, 0, 1)</w:t>
+      </w:r>
+    </w:p>
+    <w:p>
+      <w:pPr>
+        <w:pStyle w:val="Heading2"/>
+      </w:pPr>
+      <w:r>
+        <w:t xml:space="preserve">2.3 Stability-Driven Persistence</w:t>
+      </w:r>
+    </w:p>
+    <w:p>
+      <w:pPr>
+        <w:pStyle w:val="Heading3"/>
+      </w:pPr>
+      <w:r>
+        <w:t xml:space="preserve">2.3.1 Stability Priors</w:t>
+      </w:r>
+    </w:p>
+    <w:p>
+      <w:pPr>
+        <w:pStyle w:val="Equation"/>
+      </w:pPr>
+      <w:r>
+        <w:rPr>
+          <w:rFonts w:ascii="Courier New" w:cs="Courier New" w:eastAsia="Courier New" w:hAnsi="Courier New"/>
+          <w:sz w:val="20"/>
+          <w:szCs w:val="20"/>
+        </w:rPr>
+        <w:t xml:space="preserve">hysteresis_band_prior = lerp(0.02, 0.25, T)</w:t>
+      </w:r>
+    </w:p>
+    <w:p>
+      <w:pPr>
+        <w:pStyle w:val="Equation"/>
+      </w:pPr>
+      <w:r>
+        <w:rPr>
+          <w:rFonts w:ascii="Courier New" w:cs="Courier New" w:eastAsia="Courier New" w:hAnsi="Courier New"/>
+          <w:sz w:val="20"/>
+          <w:szCs w:val="20"/>
+        </w:rPr>
+        <w:t xml:space="preserve">half_life_prior = base_half_life(T)</w:t>
+      </w:r>
+    </w:p>
+    <w:p>
+      <w:pPr>
+        <w:pStyle w:val="Equation"/>
+      </w:pPr>
+      <w:r>
+        <w:rPr>
+          <w:rFonts w:ascii="Courier New" w:cs="Courier New" w:eastAsia="Courier New" w:hAnsi="Courier New"/>
+          <w:sz w:val="20"/>
+          <w:szCs w:val="20"/>
+        </w:rPr>
+        <w:t xml:space="preserve">rate_decay_prior = lerp(0.60, 0.98, T)</w:t>
+      </w:r>
+    </w:p>
+    <w:p>
+      <w:pPr>
+        <w:pStyle w:val="Equation"/>
+      </w:pPr>
+      <w:r>
+        <w:rPr>
+          <w:rFonts w:ascii="Courier New" w:cs="Courier New" w:eastAsia="Courier New" w:hAnsi="Courier New"/>
+          <w:sz w:val="20"/>
+          <w:szCs w:val="20"/>
+        </w:rPr>
+        <w:t xml:space="preserve">periphery_half_life_prior = clamp(0.5 × half_life_prior,</w:t>
+      </w:r>
+    </w:p>
+    <w:p>
+      <w:pPr>
+        <w:pStyle w:val="Equation"/>
+      </w:pPr>
+      <w:r>
+        <w:rPr>
+          <w:rFonts w:ascii="Courier New" w:cs="Courier New" w:eastAsia="Courier New" w:hAnsi="Courier New"/>
+          <w:sz w:val="20"/>
+          <w:szCs w:val="20"/>
+        </w:rPr>
+        <w:t xml:space="preserve">                                   τ_min, τ_max)</w:t>
+      </w:r>
+    </w:p>
+    <w:p>
+      <w:pPr>
+        <w:pStyle w:val="Equation"/>
+      </w:pPr>
+      <w:r>
+        <w:rPr>
+          <w:rFonts w:ascii="Courier New" w:cs="Courier New" w:eastAsia="Courier New" w:hAnsi="Courier New"/>
+          <w:sz w:val="20"/>
+          <w:szCs w:val="20"/>
+        </w:rPr>
+        <w:t xml:space="preserve">drift_weight_prior = 0.5 × (1 − T)</w:t>
+      </w:r>
+    </w:p>
+    <w:p>
+      <w:pPr>
+        <w:pStyle w:val="Heading3"/>
+      </w:pPr>
+      <w:r>
+        <w:t xml:space="preserve">2.3.2 Dynamic Stability Update</w:t>
+      </w:r>
+    </w:p>
+    <w:p>
+      <w:pPr>
+        <w:pStyle w:val="Equation"/>
+      </w:pPr>
+      <w:r>
+        <w:rPr>
+          <w:rFonts w:ascii="Courier New" w:cs="Courier New" w:eastAsia="Courier New" w:hAnsi="Courier New"/>
+          <w:sz w:val="20"/>
+          <w:szCs w:val="20"/>
+        </w:rPr>
+        <w:t xml:space="preserve">active_memories ← {m | strength(m) ≥ periphery_cutoff(T)}</w:t>
+      </w:r>
+    </w:p>
+    <w:p>
+      <w:pPr>
+        <w:pStyle w:val="Equation"/>
+      </w:pPr>
+      <w:r>
+        <w:rPr>
+          <w:rFonts w:ascii="Courier New" w:cs="Courier New" w:eastAsia="Courier New" w:hAnsi="Courier New"/>
+          <w:sz w:val="20"/>
+          <w:szCs w:val="20"/>
+        </w:rPr>
+        <w:t xml:space="preserve">observed_retention ← mean_age(active_memories)</w:t>
+      </w:r>
+    </w:p>
+    <w:p>
+      <w:pPr>
+        <w:pStyle w:val="Equation"/>
+      </w:pPr>
+      <w:r>
+        <w:rPr>
+          <w:rFonts w:ascii="Courier New" w:cs="Courier New" w:eastAsia="Courier New" w:hAnsi="Courier New"/>
+          <w:sz w:val="20"/>
+          <w:szCs w:val="20"/>
+        </w:rPr>
+        <w:t xml:space="preserve">retention_ema_t ← EWMA(retention_ema_{t−1},</w:t>
+      </w:r>
+    </w:p>
+    <w:p>
+      <w:pPr>
+        <w:pStyle w:val="Equation"/>
+      </w:pPr>
+      <w:r>
+        <w:rPr>
+          <w:rFonts w:ascii="Courier New" w:cs="Courier New" w:eastAsia="Courier New" w:hAnsi="Courier New"/>
+          <w:sz w:val="20"/>
+          <w:szCs w:val="20"/>
+        </w:rPr>
+        <w:t xml:space="preserve">                       observed_retention, α = α_T(t))</w:t>
+      </w:r>
+    </w:p>
+    <w:p>
+      <w:pPr>
+        <w:pStyle w:val="Equation"/>
+      </w:pPr>
+      <w:r>
+        <w:rPr>
+          <w:rFonts w:ascii="Courier New" w:cs="Courier New" w:eastAsia="Courier New" w:hAnsi="Courier New"/>
+          <w:sz w:val="20"/>
+          <w:szCs w:val="20"/>
+        </w:rPr>
+        <w:t xml:space="preserve">last_w_ret ← tail(retention_history, w_ret(T))</w:t>
+      </w:r>
+    </w:p>
+    <w:p>
+      <w:pPr>
+        <w:pStyle w:val="Equation"/>
+      </w:pPr>
+      <w:r>
+        <w:rPr>
+          <w:rFonts w:ascii="Courier New" w:cs="Courier New" w:eastAsia="Courier New" w:hAnsi="Courier New"/>
+          <w:sz w:val="20"/>
+          <w:szCs w:val="20"/>
+        </w:rPr>
+        <w:t xml:space="preserve">μ_ret ← mean(last_w_ret)</w:t>
+      </w:r>
+    </w:p>
+    <w:p>
+      <w:pPr>
+        <w:pStyle w:val="Equation"/>
+      </w:pPr>
+      <w:r>
+        <w:rPr>
+          <w:rFonts w:ascii="Courier New" w:cs="Courier New" w:eastAsia="Courier New" w:hAnsi="Courier New"/>
+          <w:sz w:val="20"/>
+          <w:szCs w:val="20"/>
+        </w:rPr>
+        <w:t xml:space="preserve">σ_ret ← max(std(last_w_ret), 1.0)</w:t>
+      </w:r>
+    </w:p>
+    <w:p>
+      <w:pPr>
+        <w:pStyle w:val="Equation"/>
+      </w:pPr>
+      <w:r>
+        <w:rPr>
+          <w:rFonts w:ascii="Courier New" w:cs="Courier New" w:eastAsia="Courier New" w:hAnsi="Courier New"/>
+          <w:sz w:val="20"/>
+          <w:szCs w:val="20"/>
+        </w:rPr>
+        <w:t xml:space="preserve">zscore_ret ← clamp((observed_retention − μ_ret) / σ_ret, −3, +3)</w:t>
+      </w:r>
+    </w:p>
+    <w:p>
+      <w:pPr>
+        <w:pStyle w:val="Equation"/>
+      </w:pPr>
+      <w:r>
+        <w:rPr>
+          <w:rFonts w:ascii="Courier New" w:cs="Courier New" w:eastAsia="Courier New" w:hAnsi="Courier New"/>
+          <w:sz w:val="20"/>
+          <w:szCs w:val="20"/>
+        </w:rPr>
+        <w:t xml:space="preserve">stability_adj ← ΔHalfLife_adj_t if provided else 0</w:t>
+      </w:r>
+    </w:p>
+    <w:p>
+      <w:pPr>
+        <w:pStyle w:val="Equation"/>
+      </w:pPr>
+      <w:r>
+        <w:rPr>
+          <w:rFonts w:ascii="Courier New" w:cs="Courier New" w:eastAsia="Courier New" w:hAnsi="Courier New"/>
+          <w:sz w:val="20"/>
+          <w:szCs w:val="20"/>
+        </w:rPr>
+        <w:t xml:space="preserve">target_half_life_t ← clamp(base_half_life(T) ×</w:t>
+      </w:r>
+    </w:p>
+    <w:p>
+      <w:pPr>
+        <w:pStyle w:val="Equation"/>
+      </w:pPr>
+      <w:r>
+        <w:rPr>
+          <w:rFonts w:ascii="Courier New" w:cs="Courier New" w:eastAsia="Courier New" w:hAnsi="Courier New"/>
+          <w:sz w:val="20"/>
+          <w:szCs w:val="20"/>
+        </w:rPr>
+        <w:t xml:space="preserve">                          (1 + 0.25 × zscore_ret + stability_adj),</w:t>
+      </w:r>
+    </w:p>
+    <w:p>
+      <w:pPr>
+        <w:pStyle w:val="Equation"/>
+      </w:pPr>
+      <w:r>
+        <w:rPr>
+          <w:rFonts w:ascii="Courier New" w:cs="Courier New" w:eastAsia="Courier New" w:hAnsi="Courier New"/>
+          <w:sz w:val="20"/>
+          <w:szCs w:val="20"/>
+        </w:rPr>
+        <w:t xml:space="preserve">                          τ_min, τ_max)</w:t>
+      </w:r>
+    </w:p>
+    <w:p>
+      <w:pPr>
+        <w:pStyle w:val="Equation"/>
+      </w:pPr>
+      <w:r>
+        <w:rPr>
+          <w:rFonts w:ascii="Courier New" w:cs="Courier New" w:eastAsia="Courier New" w:hAnsi="Courier New"/>
+          <w:sz w:val="20"/>
+          <w:szCs w:val="20"/>
+        </w:rPr>
+        <w:t xml:space="preserve">half_life_t ← EWMA(half_life_{t−1}, target_half_life_t,</w:t>
+      </w:r>
+    </w:p>
+    <w:p>
+      <w:pPr>
+        <w:pStyle w:val="Equation"/>
+      </w:pPr>
+      <w:r>
+        <w:rPr>
+          <w:rFonts w:ascii="Courier New" w:cs="Courier New" w:eastAsia="Courier New" w:hAnsi="Courier New"/>
+          <w:sz w:val="20"/>
+          <w:szCs w:val="20"/>
+        </w:rPr>
+        <w:t xml:space="preserve">                   α = α_T(t))</w:t>
       </w:r>
     </w:p>
     <w:p>
@@ -632,7 +1565,7 @@
         <w:pStyle w:val="Heading1"/>
       </w:pPr>
       <w:r>
-        <w:t xml:space="preserve">2. Core Adaptation Algorithms</w:t>
+        <w:t xml:space="preserve">3. Structural Metrics and Composite Scoring</w:t>
       </w:r>
     </w:p>
     <w:p>
@@ -640,7 +1573,7 @@
         <w:pStyle w:val="Heading2"/>
       </w:pPr>
       <w:r>
-        <w:t xml:space="preserve">2.1 Focus-Driven Selectivity</w:t>
+        <w:t xml:space="preserve">3.1 Embedding-Derived Metrics</w:t>
       </w:r>
     </w:p>
     <w:p>
@@ -648,59 +1581,46 @@
         <w:pStyle w:val="Heading3"/>
       </w:pPr>
       <w:r>
-        <w:t xml:space="preserve">2.1.1 Focus Priors</w:t>
-      </w:r>
-    </w:p>
-    <w:p>
-      <w:pPr>
-        <w:pStyle w:val="Equation"/>
-      </w:pPr>
-      <w:r>
-        <w:rPr>
-          <w:rFonts w:ascii="Courier New" w:cs="Courier New" w:eastAsia="Courier New" w:hAnsi="Courier New"/>
-          <w:sz w:val="20"/>
-          <w:szCs w:val="20"/>
-        </w:rPr>
-        <w:t xml:space="preserve">weight_relevance_prior = sigmoid(2F − 1)</w:t>
-      </w:r>
-    </w:p>
-    <w:p>
-      <w:pPr>
-        <w:pStyle w:val="Equation"/>
-      </w:pPr>
-      <w:r>
-        <w:rPr>
-          <w:rFonts w:ascii="Courier New" w:cs="Courier New" w:eastAsia="Courier New" w:hAnsi="Courier New"/>
-          <w:sz w:val="20"/>
-          <w:szCs w:val="20"/>
-        </w:rPr>
-        <w:t xml:space="preserve">coverage_gain_floor = 0.3 + 0.7F</w:t>
-      </w:r>
-    </w:p>
-    <w:p>
-      <w:pPr>
-        <w:pStyle w:val="Equation"/>
-      </w:pPr>
-      <w:r>
-        <w:rPr>
-          <w:rFonts w:ascii="Courier New" w:cs="Courier New" w:eastAsia="Courier New" w:hAnsi="Courier New"/>
-          <w:sz w:val="20"/>
-          <w:szCs w:val="20"/>
-        </w:rPr>
-        <w:t xml:space="preserve">mismatch_weight_prior = 1 − F</w:t>
-      </w:r>
-    </w:p>
-    <w:p>
-      <w:pPr>
-        <w:pStyle w:val="Equation"/>
-      </w:pPr>
-      <w:r>
-        <w:rPr>
-          <w:rFonts w:ascii="Courier New" w:cs="Courier New" w:eastAsia="Courier New" w:hAnsi="Courier New"/>
-          <w:sz w:val="20"/>
-          <w:szCs w:val="20"/>
-        </w:rPr>
-        <w:t xml:space="preserve">attention_width_prior = lerp(π, 0.1π, F)</w:t>
+        <w:t xml:space="preserve">3.1.1 Coherence</w:t>
+      </w:r>
+    </w:p>
+    <w:p>
+      <w:pPr>
+        <w:pStyle w:val="Equation"/>
+      </w:pPr>
+      <w:r>
+        <w:rPr>
+          <w:rFonts w:ascii="Courier New" w:cs="Courier New" w:eastAsia="Courier New" w:hAnsi="Courier New"/>
+          <w:sz w:val="20"/>
+          <w:szCs w:val="20"/>
+        </w:rPr>
+        <w:t xml:space="preserve">raw ← var([cos(x_t, c) for c in context_window])</w:t>
+      </w:r>
+    </w:p>
+    <w:p>
+      <w:pPr>
+        <w:pStyle w:val="Equation"/>
+      </w:pPr>
+      <w:r>
+        <w:rPr>
+          <w:rFonts w:ascii="Courier New" w:cs="Courier New" w:eastAsia="Courier New" w:hAnsi="Courier New"/>
+          <w:sz w:val="20"/>
+          <w:szCs w:val="20"/>
+        </w:rPr>
+        <w:t xml:space="preserve">coherence_t ← 1 − clamp(raw, 0, 1)</w:t>
+      </w:r>
+    </w:p>
+    <w:p>
+      <w:pPr>
+        <w:pStyle w:val="Equation"/>
+      </w:pPr>
+      <w:r>
+        <w:rPr>
+          <w:rFonts w:ascii="Courier New" w:cs="Courier New" w:eastAsia="Courier New" w:hAnsi="Courier New"/>
+          <w:sz w:val="20"/>
+          <w:szCs w:val="20"/>
+        </w:rPr>
+        <w:t xml:space="preserve">F_eff = F × (0.5 + 0.5 × coherence_t)</w:t>
       </w:r>
     </w:p>
     <w:p>
@@ -708,85 +1628,231 @@
         <w:pStyle w:val="Heading3"/>
       </w:pPr>
       <w:r>
-        <w:t xml:space="preserve">2.1.2 Dynamic Focus Update</w:t>
-      </w:r>
-    </w:p>
-    <w:p>
-      <w:pPr>
-        <w:pStyle w:val="Equation"/>
-      </w:pPr>
-      <w:r>
-        <w:rPr>
-          <w:rFonts w:ascii="Courier New" w:cs="Courier New" w:eastAsia="Courier New" w:hAnsi="Courier New"/>
-          <w:sz w:val="20"/>
-          <w:szCs w:val="20"/>
-        </w:rPr>
-        <w:t xml:space="preserve">recent_context ← tail(context_buffer, n_ctx(T))</w:t>
-      </w:r>
-    </w:p>
-    <w:p>
-      <w:pPr>
-        <w:pStyle w:val="Equation"/>
-      </w:pPr>
-      <w:r>
-        <w:rPr>
-          <w:rFonts w:ascii="Courier New" w:cs="Courier New" w:eastAsia="Courier New" w:hAnsi="Courier New"/>
-          <w:sz w:val="20"/>
-          <w:szCs w:val="20"/>
-        </w:rPr>
-        <w:t xml:space="preserve">observed_cosine ← cos(x_t, mean(recent_context))</w:t>
-      </w:r>
-    </w:p>
-    <w:p>
-      <w:pPr>
-        <w:pStyle w:val="Equation"/>
-      </w:pPr>
-      <w:r>
-        <w:rPr>
-          <w:rFonts w:ascii="Courier New" w:cs="Courier New" w:eastAsia="Courier New" w:hAnsi="Courier New"/>
-          <w:sz w:val="20"/>
-          <w:szCs w:val="20"/>
-        </w:rPr>
-        <w:t xml:space="preserve">weight_relevance_t ← EWMA(weight_relevance_{t−1},</w:t>
-      </w:r>
-    </w:p>
-    <w:p>
-      <w:pPr>
-        <w:pStyle w:val="Equation"/>
-      </w:pPr>
-      <w:r>
-        <w:rPr>
-          <w:rFonts w:ascii="Courier New" w:cs="Courier New" w:eastAsia="Courier New" w:hAnsi="Courier New"/>
-          <w:sz w:val="20"/>
-          <w:szCs w:val="20"/>
-        </w:rPr>
-        <w:t xml:space="preserve">                         map01(observed_cosine), α = α_F(t))</w:t>
-      </w:r>
-    </w:p>
-    <w:p>
-      <w:pPr>
-        <w:pStyle w:val="Equation"/>
-      </w:pPr>
-      <w:r>
-        <w:rPr>
-          <w:rFonts w:ascii="Courier New" w:cs="Courier New" w:eastAsia="Courier New" w:hAnsi="Courier New"/>
-          <w:sz w:val="20"/>
-          <w:szCs w:val="20"/>
-        </w:rPr>
-        <w:t xml:space="preserve">α_min_F = 0.05; α_span_F = 0.45</w:t>
-      </w:r>
-    </w:p>
-    <w:p>
-      <w:pPr>
-        <w:pStyle w:val="Equation"/>
-      </w:pPr>
-      <w:r>
-        <w:rPr>
-          <w:rFonts w:ascii="Courier New" w:cs="Courier New" w:eastAsia="Courier New" w:hAnsi="Courier New"/>
-          <w:sz w:val="20"/>
-          <w:szCs w:val="20"/>
-        </w:rPr>
-        <w:t xml:space="preserve">α_F(t) = α_min_F + F × α_span_F × u(t)</w:t>
+        <w:t xml:space="preserve">3.1.2 Focus Spread</w:t>
+      </w:r>
+    </w:p>
+    <w:p>
+      <w:pPr>
+        <w:pStyle w:val="Equation"/>
+      </w:pPr>
+      <w:r>
+        <w:rPr>
+          <w:rFonts w:ascii="Courier New" w:cs="Courier New" w:eastAsia="Courier New" w:hAnsi="Courier New"/>
+          <w:sz w:val="20"/>
+          <w:szCs w:val="20"/>
+        </w:rPr>
+        <w:t xml:space="preserve">k ← k_neighbors(T) = round(lerp(8, 32, T))</w:t>
+      </w:r>
+    </w:p>
+    <w:p>
+      <w:pPr>
+        <w:pStyle w:val="Equation"/>
+      </w:pPr>
+      <w:r>
+        <w:rPr>
+          <w:rFonts w:ascii="Courier New" w:cs="Courier New" w:eastAsia="Courier New" w:hAnsi="Courier New"/>
+          <w:sz w:val="20"/>
+          <w:szCs w:val="20"/>
+        </w:rPr>
+        <w:t xml:space="preserve">p ← softmax(kNN_similarities)</w:t>
+      </w:r>
+    </w:p>
+    <w:p>
+      <w:pPr>
+        <w:pStyle w:val="Equation"/>
+      </w:pPr>
+      <w:r>
+        <w:rPr>
+          <w:rFonts w:ascii="Courier New" w:cs="Courier New" w:eastAsia="Courier New" w:hAnsi="Courier New"/>
+          <w:sz w:val="20"/>
+          <w:szCs w:val="20"/>
+        </w:rPr>
+        <w:t xml:space="preserve">focus_spread_t ← H(p) / ln(k)</w:t>
+      </w:r>
+    </w:p>
+    <w:p>
+      <w:pPr>
+        <w:pStyle w:val="Equation"/>
+      </w:pPr>
+      <w:r>
+        <w:rPr>
+          <w:rFonts w:ascii="Courier New" w:cs="Courier New" w:eastAsia="Courier New" w:hAnsi="Courier New"/>
+          <w:sz w:val="20"/>
+          <w:szCs w:val="20"/>
+        </w:rPr>
+        <w:t xml:space="preserve">F_eff ← F_eff × (1 − focus_spread_t)</w:t>
+      </w:r>
+    </w:p>
+    <w:p>
+      <w:pPr>
+        <w:pStyle w:val="Heading3"/>
+      </w:pPr>
+      <w:r>
+        <w:t xml:space="preserve">3.1.3 Trajectory Drift</w:t>
+      </w:r>
+    </w:p>
+    <w:p>
+      <w:pPr>
+        <w:pStyle w:val="Equation"/>
+      </w:pPr>
+      <w:r>
+        <w:rPr>
+          <w:rFonts w:ascii="Courier New" w:cs="Courier New" w:eastAsia="Courier New" w:hAnsi="Courier New"/>
+          <w:sz w:val="20"/>
+          <w:szCs w:val="20"/>
+        </w:rPr>
+        <w:t xml:space="preserve">drift_vec_t ← l2_normalize(mean(ctx_t)) −</w:t>
+      </w:r>
+    </w:p>
+    <w:p>
+      <w:pPr>
+        <w:pStyle w:val="Equation"/>
+      </w:pPr>
+      <w:r>
+        <w:rPr>
+          <w:rFonts w:ascii="Courier New" w:cs="Courier New" w:eastAsia="Courier New" w:hAnsi="Courier New"/>
+          <w:sz w:val="20"/>
+          <w:szCs w:val="20"/>
+        </w:rPr>
+        <w:t xml:space="preserve">              l2_normalize(mean(ctx_{t−k}))</w:t>
+      </w:r>
+    </w:p>
+    <w:p>
+      <w:pPr>
+        <w:pStyle w:val="Equation"/>
+      </w:pPr>
+      <w:r>
+        <w:rPr>
+          <w:rFonts w:ascii="Courier New" w:cs="Courier New" w:eastAsia="Courier New" w:hAnsi="Courier New"/>
+          <w:sz w:val="20"/>
+          <w:szCs w:val="20"/>
+        </w:rPr>
+        <w:t xml:space="preserve">drift_mag_t ← ‖drift_vec_t‖</w:t>
+      </w:r>
+    </w:p>
+    <w:p>
+      <w:pPr>
+        <w:pStyle w:val="Equation"/>
+      </w:pPr>
+      <w:r>
+        <w:rPr>
+          <w:rFonts w:ascii="Courier New" w:cs="Courier New" w:eastAsia="Courier New" w:hAnsi="Courier New"/>
+          <w:sz w:val="20"/>
+          <w:szCs w:val="20"/>
+        </w:rPr>
+        <w:t xml:space="preserve">drift_threshold ← lerp(0.10, 0.35, T)</w:t>
+      </w:r>
+    </w:p>
+    <w:p>
+      <w:pPr>
+        <w:pStyle w:val="Equation"/>
+      </w:pPr>
+      <w:r>
+        <w:rPr>
+          <w:rFonts w:ascii="Courier New" w:cs="Courier New" w:eastAsia="Courier New" w:hAnsi="Courier New"/>
+          <w:sz w:val="20"/>
+          <w:szCs w:val="20"/>
+        </w:rPr>
+        <w:t xml:space="preserve">if drift_mag_t &gt; drift_threshold:</w:t>
+      </w:r>
+    </w:p>
+    <w:p>
+      <w:pPr>
+        <w:pStyle w:val="Equation"/>
+      </w:pPr>
+      <w:r>
+        <w:rPr>
+          <w:rFonts w:ascii="Courier New" w:cs="Courier New" w:eastAsia="Courier New" w:hAnsi="Courier New"/>
+          <w:sz w:val="20"/>
+          <w:szCs w:val="20"/>
+        </w:rPr>
+        <w:t xml:space="preserve">    trigger_episode_boundary()</w:t>
+      </w:r>
+    </w:p>
+    <w:p>
+      <w:pPr>
+        <w:pStyle w:val="Heading3"/>
+      </w:pPr>
+      <w:r>
+        <w:t xml:space="preserve">3.1.4 Embedding Prediction Error</w:t>
+      </w:r>
+    </w:p>
+    <w:p>
+      <w:pPr>
+        <w:pStyle w:val="Equation"/>
+      </w:pPr>
+      <w:r>
+        <w:rPr>
+          <w:rFonts w:ascii="Courier New" w:cs="Courier New" w:eastAsia="Courier New" w:hAnsi="Courier New"/>
+          <w:sz w:val="20"/>
+          <w:szCs w:val="20"/>
+        </w:rPr>
+        <w:t xml:space="preserve">Δx_t = x_t − x_{t−1}</w:t>
+      </w:r>
+    </w:p>
+    <w:p>
+      <w:pPr>
+        <w:pStyle w:val="Equation"/>
+      </w:pPr>
+      <w:r>
+        <w:rPr>
+          <w:rFonts w:ascii="Courier New" w:cs="Courier New" w:eastAsia="Courier New" w:hAnsi="Courier New"/>
+          <w:sz w:val="20"/>
+          <w:szCs w:val="20"/>
+        </w:rPr>
+        <w:t xml:space="preserve">Δx_trend_t = EWMA(Δx_trend_{t−1}, Δx_t, α=0.1)</w:t>
+      </w:r>
+    </w:p>
+    <w:p>
+      <w:pPr>
+        <w:pStyle w:val="Equation"/>
+      </w:pPr>
+      <w:r>
+        <w:rPr>
+          <w:rFonts w:ascii="Courier New" w:cs="Courier New" w:eastAsia="Courier New" w:hAnsi="Courier New"/>
+          <w:sz w:val="20"/>
+          <w:szCs w:val="20"/>
+        </w:rPr>
+        <w:t xml:space="preserve">x_pred_t = x_{t−1} + Δx_trend_{t−1}</w:t>
+      </w:r>
+    </w:p>
+    <w:p>
+      <w:pPr>
+        <w:pStyle w:val="Equation"/>
+      </w:pPr>
+      <w:r>
+        <w:rPr>
+          <w:rFonts w:ascii="Courier New" w:cs="Courier New" w:eastAsia="Courier New" w:hAnsi="Courier New"/>
+          <w:sz w:val="20"/>
+          <w:szCs w:val="20"/>
+        </w:rPr>
+        <w:t xml:space="preserve">prediction_error_t = 1 − cos(x_pred_t, x_t)</w:t>
+      </w:r>
+    </w:p>
+    <w:p>
+      <w:pPr>
+        <w:pStyle w:val="Equation"/>
+      </w:pPr>
+      <w:r>
+        <w:rPr>
+          <w:rFonts w:ascii="Courier New" w:cs="Courier New" w:eastAsia="Courier New" w:hAnsi="Courier New"/>
+          <w:sz w:val="20"/>
+          <w:szCs w:val="20"/>
+        </w:rPr>
+        <w:t xml:space="preserve">err_max = 0.5</w:t>
+      </w:r>
+    </w:p>
+    <w:p>
+      <w:pPr>
+        <w:pStyle w:val="Equation"/>
+      </w:pPr>
+      <w:r>
+        <w:rPr>
+          <w:rFonts w:ascii="Courier New" w:cs="Courier New" w:eastAsia="Courier New" w:hAnsi="Courier New"/>
+          <w:sz w:val="20"/>
+          <w:szCs w:val="20"/>
+        </w:rPr>
+        <w:t xml:space="preserve">surprisal_t ← clamp(prediction_error_t / err_max, 0, 1)</w:t>
       </w:r>
     </w:p>
     <w:p>
@@ -794,7 +1860,679 @@
         <w:pStyle w:val="Heading2"/>
       </w:pPr>
       <w:r>
-        <w:t xml:space="preserve">2.2 Sensitivity-Driven Plasticity</w:t>
+        <w:t xml:space="preserve">3.2 Composite Score Computation</w:t>
+      </w:r>
+    </w:p>
+    <w:p>
+      <w:r>
+        <w:t xml:space="preserve">The system computes 12 metrics that blend into a composite write score:</w:t>
+      </w:r>
+    </w:p>
+    <w:tbl>
+      <w:tblPr>
+        <w:tblW w:type="auto" w:w="100"/>
+        <w:tblBorders>
+          <w:top w:val="single" w:color="auto" w:sz="4"/>
+          <w:left w:val="single" w:color="auto" w:sz="4"/>
+          <w:bottom w:val="single" w:color="auto" w:sz="4"/>
+          <w:right w:val="single" w:color="auto" w:sz="4"/>
+          <w:insideH w:val="single" w:color="auto" w:sz="4"/>
+          <w:insideV w:val="single" w:color="auto" w:sz="4"/>
+        </w:tblBorders>
+      </w:tblPr>
+      <w:tblGrid>
+        <w:gridCol w:w="2500"/>
+        <w:gridCol w:w="2000"/>
+        <w:gridCol w:w="4860"/>
+      </w:tblGrid>
+      <w:tr>
+        <w:trPr>
+          <w:tblHeader/>
+        </w:trPr>
+        <w:tc>
+          <w:tcPr>
+            <w:tcBorders>
+              <w:top w:val="single" w:color="999999" w:sz="1"/>
+              <w:left w:val="single" w:color="999999" w:sz="1"/>
+              <w:bottom w:val="single" w:color="999999" w:sz="1"/>
+              <w:right w:val="single" w:color="999999" w:sz="1"/>
+            </w:tcBorders>
+            <w:shd w:fill="E8E8E8" w:val="clear"/>
+          </w:tcPr>
+          <w:p>
+            <w:pPr>
+              <w:jc w:val="center"/>
+            </w:pPr>
+            <w:r>
+              <w:rPr>
+                <w:b/>
+                <w:bCs/>
+              </w:rPr>
+              <w:t xml:space="preserve">Metric</w:t>
+            </w:r>
+          </w:p>
+        </w:tc>
+        <w:tc>
+          <w:tcPr>
+            <w:tcBorders>
+              <w:top w:val="single" w:color="999999" w:sz="1"/>
+              <w:left w:val="single" w:color="999999" w:sz="1"/>
+              <w:bottom w:val="single" w:color="999999" w:sz="1"/>
+              <w:right w:val="single" w:color="999999" w:sz="1"/>
+            </w:tcBorders>
+            <w:shd w:fill="E8E8E8" w:val="clear"/>
+          </w:tcPr>
+          <w:p>
+            <w:pPr>
+              <w:jc w:val="center"/>
+            </w:pPr>
+            <w:r>
+              <w:rPr>
+                <w:b/>
+                <w:bCs/>
+              </w:rPr>
+              <w:t xml:space="preserve">Knob</w:t>
+            </w:r>
+          </w:p>
+        </w:tc>
+        <w:tc>
+          <w:tcPr>
+            <w:tcBorders>
+              <w:top w:val="single" w:color="999999" w:sz="1"/>
+              <w:left w:val="single" w:color="999999" w:sz="1"/>
+              <w:bottom w:val="single" w:color="999999" w:sz="1"/>
+              <w:right w:val="single" w:color="999999" w:sz="1"/>
+            </w:tcBorders>
+            <w:shd w:fill="E8E8E8" w:val="clear"/>
+          </w:tcPr>
+          <w:p>
+            <w:pPr>
+              <w:jc w:val="center"/>
+            </w:pPr>
+            <w:r>
+              <w:rPr>
+                <w:b/>
+                <w:bCs/>
+              </w:rPr>
+              <w:t xml:space="preserve">Expression</w:t>
+            </w:r>
+          </w:p>
+        </w:tc>
+      </w:tr>
+      <w:tr>
+        <w:tc>
+          <w:tcPr>
+            <w:tcBorders>
+              <w:top w:val="single" w:color="999999" w:sz="1"/>
+              <w:left w:val="single" w:color="999999" w:sz="1"/>
+              <w:bottom w:val="single" w:color="999999" w:sz="1"/>
+              <w:right w:val="single" w:color="999999" w:sz="1"/>
+            </w:tcBorders>
+          </w:tcPr>
+          <w:p>
+            <w:r>
+              <w:t xml:space="preserve">Relevance</w:t>
+            </w:r>
+          </w:p>
+        </w:tc>
+        <w:tc>
+          <w:tcPr>
+            <w:tcBorders>
+              <w:top w:val="single" w:color="999999" w:sz="1"/>
+              <w:left w:val="single" w:color="999999" w:sz="1"/>
+              <w:bottom w:val="single" w:color="999999" w:sz="1"/>
+              <w:right w:val="single" w:color="999999" w:sz="1"/>
+            </w:tcBorders>
+          </w:tcPr>
+          <w:p>
+            <w:r>
+              <w:t xml:space="preserve">↑F</w:t>
+            </w:r>
+          </w:p>
+        </w:tc>
+        <w:tc>
+          <w:tcPr>
+            <w:tcBorders>
+              <w:top w:val="single" w:color="999999" w:sz="1"/>
+              <w:left w:val="single" w:color="999999" w:sz="1"/>
+              <w:bottom w:val="single" w:color="999999" w:sz="1"/>
+              <w:right w:val="single" w:color="999999" w:sz="1"/>
+            </w:tcBorders>
+          </w:tcPr>
+          <w:p>
+            <w:r>
+              <w:rPr>
+                <w:rFonts w:ascii="Courier New" w:cs="Courier New" w:eastAsia="Courier New" w:hAnsi="Courier New"/>
+                <w:sz w:val="20"/>
+                <w:szCs w:val="20"/>
+              </w:rPr>
+              <w:t xml:space="preserve">cos(x, μ_ctx) × (0.5 + F)</w:t>
+            </w:r>
+          </w:p>
+        </w:tc>
+      </w:tr>
+      <w:tr>
+        <w:tc>
+          <w:tcPr>
+            <w:tcBorders>
+              <w:top w:val="single" w:color="999999" w:sz="1"/>
+              <w:left w:val="single" w:color="999999" w:sz="1"/>
+              <w:bottom w:val="single" w:color="999999" w:sz="1"/>
+              <w:right w:val="single" w:color="999999" w:sz="1"/>
+            </w:tcBorders>
+          </w:tcPr>
+          <w:p>
+            <w:r>
+              <w:t xml:space="preserve">Mismatch</w:t>
+            </w:r>
+          </w:p>
+        </w:tc>
+        <w:tc>
+          <w:tcPr>
+            <w:tcBorders>
+              <w:top w:val="single" w:color="999999" w:sz="1"/>
+              <w:left w:val="single" w:color="999999" w:sz="1"/>
+              <w:bottom w:val="single" w:color="999999" w:sz="1"/>
+              <w:right w:val="single" w:color="999999" w:sz="1"/>
+            </w:tcBorders>
+          </w:tcPr>
+          <w:p>
+            <w:r>
+              <w:t xml:space="preserve">↓F, ↑S</w:t>
+            </w:r>
+          </w:p>
+        </w:tc>
+        <w:tc>
+          <w:tcPr>
+            <w:tcBorders>
+              <w:top w:val="single" w:color="999999" w:sz="1"/>
+              <w:left w:val="single" w:color="999999" w:sz="1"/>
+              <w:bottom w:val="single" w:color="999999" w:sz="1"/>
+              <w:right w:val="single" w:color="999999" w:sz="1"/>
+            </w:tcBorders>
+          </w:tcPr>
+          <w:p>
+            <w:r>
+              <w:rPr>
+                <w:rFonts w:ascii="Courier New" w:cs="Courier New" w:eastAsia="Courier New" w:hAnsi="Courier New"/>
+                <w:sz w:val="20"/>
+                <w:szCs w:val="20"/>
+              </w:rPr>
+              <w:t xml:space="preserve">(1 − F) × S × novelty</w:t>
+            </w:r>
+          </w:p>
+        </w:tc>
+      </w:tr>
+      <w:tr>
+        <w:tc>
+          <w:tcPr>
+            <w:tcBorders>
+              <w:top w:val="single" w:color="999999" w:sz="1"/>
+              <w:left w:val="single" w:color="999999" w:sz="1"/>
+              <w:bottom w:val="single" w:color="999999" w:sz="1"/>
+              <w:right w:val="single" w:color="999999" w:sz="1"/>
+            </w:tcBorders>
+          </w:tcPr>
+          <w:p>
+            <w:r>
+              <w:t xml:space="preserve">Prediction Error</w:t>
+            </w:r>
+          </w:p>
+        </w:tc>
+        <w:tc>
+          <w:tcPr>
+            <w:tcBorders>
+              <w:top w:val="single" w:color="999999" w:sz="1"/>
+              <w:left w:val="single" w:color="999999" w:sz="1"/>
+              <w:bottom w:val="single" w:color="999999" w:sz="1"/>
+              <w:right w:val="single" w:color="999999" w:sz="1"/>
+            </w:tcBorders>
+          </w:tcPr>
+          <w:p>
+            <w:r>
+              <w:t xml:space="preserve">↑S, ↓T</w:t>
+            </w:r>
+          </w:p>
+        </w:tc>
+        <w:tc>
+          <w:tcPr>
+            <w:tcBorders>
+              <w:top w:val="single" w:color="999999" w:sz="1"/>
+              <w:left w:val="single" w:color="999999" w:sz="1"/>
+              <w:bottom w:val="single" w:color="999999" w:sz="1"/>
+              <w:right w:val="single" w:color="999999" w:sz="1"/>
+            </w:tcBorders>
+          </w:tcPr>
+          <w:p>
+            <w:r>
+              <w:rPr>
+                <w:rFonts w:ascii="Courier New" w:cs="Courier New" w:eastAsia="Courier New" w:hAnsi="Courier New"/>
+                <w:sz w:val="20"/>
+                <w:szCs w:val="20"/>
+              </w:rPr>
+              <w:t xml:space="preserve">surprisal_t × S × (1 − T)</w:t>
+            </w:r>
+          </w:p>
+        </w:tc>
+      </w:tr>
+      <w:tr>
+        <w:tc>
+          <w:tcPr>
+            <w:tcBorders>
+              <w:top w:val="single" w:color="999999" w:sz="1"/>
+              <w:left w:val="single" w:color="999999" w:sz="1"/>
+              <w:bottom w:val="single" w:color="999999" w:sz="1"/>
+              <w:right w:val="single" w:color="999999" w:sz="1"/>
+            </w:tcBorders>
+          </w:tcPr>
+          <w:p>
+            <w:r>
+              <w:t xml:space="preserve">Rarity</w:t>
+            </w:r>
+          </w:p>
+        </w:tc>
+        <w:tc>
+          <w:tcPr>
+            <w:tcBorders>
+              <w:top w:val="single" w:color="999999" w:sz="1"/>
+              <w:left w:val="single" w:color="999999" w:sz="1"/>
+              <w:bottom w:val="single" w:color="999999" w:sz="1"/>
+              <w:right w:val="single" w:color="999999" w:sz="1"/>
+            </w:tcBorders>
+          </w:tcPr>
+          <w:p>
+            <w:r>
+              <w:t xml:space="preserve">↑F, ↓T</w:t>
+            </w:r>
+          </w:p>
+        </w:tc>
+        <w:tc>
+          <w:tcPr>
+            <w:tcBorders>
+              <w:top w:val="single" w:color="999999" w:sz="1"/>
+              <w:left w:val="single" w:color="999999" w:sz="1"/>
+              <w:bottom w:val="single" w:color="999999" w:sz="1"/>
+              <w:right w:val="single" w:color="999999" w:sz="1"/>
+            </w:tcBorders>
+          </w:tcPr>
+          <w:p>
+            <w:r>
+              <w:rPr>
+                <w:rFonts w:ascii="Courier New" w:cs="Courier New" w:eastAsia="Courier New" w:hAnsi="Courier New"/>
+                <w:sz w:val="20"/>
+                <w:szCs w:val="20"/>
+              </w:rPr>
+              <w:t xml:space="preserve">(1 − μ_sim) × (0.5 + 0.5F) × (1 − 0.2T)</w:t>
+            </w:r>
+          </w:p>
+        </w:tc>
+      </w:tr>
+      <w:tr>
+        <w:tc>
+          <w:tcPr>
+            <w:tcBorders>
+              <w:top w:val="single" w:color="999999" w:sz="1"/>
+              <w:left w:val="single" w:color="999999" w:sz="1"/>
+              <w:bottom w:val="single" w:color="999999" w:sz="1"/>
+              <w:right w:val="single" w:color="999999" w:sz="1"/>
+            </w:tcBorders>
+          </w:tcPr>
+          <w:p>
+            <w:r>
+              <w:t xml:space="preserve">Drift</w:t>
+            </w:r>
+          </w:p>
+        </w:tc>
+        <w:tc>
+          <w:tcPr>
+            <w:tcBorders>
+              <w:top w:val="single" w:color="999999" w:sz="1"/>
+              <w:left w:val="single" w:color="999999" w:sz="1"/>
+              <w:bottom w:val="single" w:color="999999" w:sz="1"/>
+              <w:right w:val="single" w:color="999999" w:sz="1"/>
+            </w:tcBorders>
+          </w:tcPr>
+          <w:p>
+            <w:r>
+              <w:t xml:space="preserve">↓T</w:t>
+            </w:r>
+          </w:p>
+        </w:tc>
+        <w:tc>
+          <w:tcPr>
+            <w:tcBorders>
+              <w:top w:val="single" w:color="999999" w:sz="1"/>
+              <w:left w:val="single" w:color="999999" w:sz="1"/>
+              <w:bottom w:val="single" w:color="999999" w:sz="1"/>
+              <w:right w:val="single" w:color="999999" w:sz="1"/>
+            </w:tcBorders>
+          </w:tcPr>
+          <w:p>
+            <w:r>
+              <w:rPr>
+                <w:rFonts w:ascii="Courier New" w:cs="Courier New" w:eastAsia="Courier New" w:hAnsi="Courier New"/>
+                <w:sz w:val="20"/>
+                <w:szCs w:val="20"/>
+              </w:rPr>
+              <w:t xml:space="preserve">(drift_mag / 2) × (1 − T)</w:t>
+            </w:r>
+          </w:p>
+        </w:tc>
+      </w:tr>
+      <w:tr>
+        <w:tc>
+          <w:tcPr>
+            <w:tcBorders>
+              <w:top w:val="single" w:color="999999" w:sz="1"/>
+              <w:left w:val="single" w:color="999999" w:sz="1"/>
+              <w:bottom w:val="single" w:color="999999" w:sz="1"/>
+              <w:right w:val="single" w:color="999999" w:sz="1"/>
+            </w:tcBorders>
+          </w:tcPr>
+          <w:p>
+            <w:r>
+              <w:t xml:space="preserve">Utility</w:t>
+            </w:r>
+          </w:p>
+        </w:tc>
+        <w:tc>
+          <w:tcPr>
+            <w:tcBorders>
+              <w:top w:val="single" w:color="999999" w:sz="1"/>
+              <w:left w:val="single" w:color="999999" w:sz="1"/>
+              <w:bottom w:val="single" w:color="999999" w:sz="1"/>
+              <w:right w:val="single" w:color="999999" w:sz="1"/>
+            </w:tcBorders>
+          </w:tcPr>
+          <w:p>
+            <w:r>
+              <w:t xml:space="preserve">↑F, ↓S</w:t>
+            </w:r>
+          </w:p>
+        </w:tc>
+        <w:tc>
+          <w:tcPr>
+            <w:tcBorders>
+              <w:top w:val="single" w:color="999999" w:sz="1"/>
+              <w:left w:val="single" w:color="999999" w:sz="1"/>
+              <w:bottom w:val="single" w:color="999999" w:sz="1"/>
+              <w:right w:val="single" w:color="999999" w:sz="1"/>
+            </w:tcBorders>
+          </w:tcPr>
+          <w:p>
+            <w:r>
+              <w:rPr>
+                <w:rFonts w:ascii="Courier New" w:cs="Courier New" w:eastAsia="Courier New" w:hAnsi="Courier New"/>
+                <w:sz w:val="20"/>
+                <w:szCs w:val="20"/>
+              </w:rPr>
+              <w:t xml:space="preserve">ΔSSE × (0.5 + 0.5F) × (1 − 0.3S)</w:t>
+            </w:r>
+          </w:p>
+        </w:tc>
+      </w:tr>
+      <w:tr>
+        <w:tc>
+          <w:tcPr>
+            <w:tcBorders>
+              <w:top w:val="single" w:color="999999" w:sz="1"/>
+              <w:left w:val="single" w:color="999999" w:sz="1"/>
+              <w:bottom w:val="single" w:color="999999" w:sz="1"/>
+              <w:right w:val="single" w:color="999999" w:sz="1"/>
+            </w:tcBorders>
+          </w:tcPr>
+          <w:p>
+            <w:r>
+              <w:t xml:space="preserve">Salience</w:t>
+            </w:r>
+          </w:p>
+        </w:tc>
+        <w:tc>
+          <w:tcPr>
+            <w:tcBorders>
+              <w:top w:val="single" w:color="999999" w:sz="1"/>
+              <w:left w:val="single" w:color="999999" w:sz="1"/>
+              <w:bottom w:val="single" w:color="999999" w:sz="1"/>
+              <w:right w:val="single" w:color="999999" w:sz="1"/>
+            </w:tcBorders>
+          </w:tcPr>
+          <w:p>
+            <w:r>
+              <w:t xml:space="preserve">F, S</w:t>
+            </w:r>
+          </w:p>
+        </w:tc>
+        <w:tc>
+          <w:tcPr>
+            <w:tcBorders>
+              <w:top w:val="single" w:color="999999" w:sz="1"/>
+              <w:left w:val="single" w:color="999999" w:sz="1"/>
+              <w:bottom w:val="single" w:color="999999" w:sz="1"/>
+              <w:right w:val="single" w:color="999999" w:sz="1"/>
+            </w:tcBorders>
+          </w:tcPr>
+          <w:p>
+            <w:r>
+              <w:rPr>
+                <w:rFonts w:ascii="Courier New" w:cs="Courier New" w:eastAsia="Courier New" w:hAnsi="Courier New"/>
+                <w:sz w:val="20"/>
+                <w:szCs w:val="20"/>
+              </w:rPr>
+              <w:t xml:space="preserve">(rarity + novelty) / 2 × (F + S) / 2</w:t>
+            </w:r>
+          </w:p>
+        </w:tc>
+      </w:tr>
+      <w:tr>
+        <w:tc>
+          <w:tcPr>
+            <w:tcBorders>
+              <w:top w:val="single" w:color="999999" w:sz="1"/>
+              <w:left w:val="single" w:color="999999" w:sz="1"/>
+              <w:bottom w:val="single" w:color="999999" w:sz="1"/>
+              <w:right w:val="single" w:color="999999" w:sz="1"/>
+            </w:tcBorders>
+          </w:tcPr>
+          <w:p>
+            <w:r>
+              <w:t xml:space="preserve">Valence</w:t>
+            </w:r>
+          </w:p>
+        </w:tc>
+        <w:tc>
+          <w:tcPr>
+            <w:tcBorders>
+              <w:top w:val="single" w:color="999999" w:sz="1"/>
+              <w:left w:val="single" w:color="999999" w:sz="1"/>
+              <w:bottom w:val="single" w:color="999999" w:sz="1"/>
+              <w:right w:val="single" w:color="999999" w:sz="1"/>
+            </w:tcBorders>
+          </w:tcPr>
+          <w:p>
+            <w:r>
+              <w:t xml:space="preserve">S, ↓T</w:t>
+            </w:r>
+          </w:p>
+        </w:tc>
+        <w:tc>
+          <w:tcPr>
+            <w:tcBorders>
+              <w:top w:val="single" w:color="999999" w:sz="1"/>
+              <w:left w:val="single" w:color="999999" w:sz="1"/>
+              <w:bottom w:val="single" w:color="999999" w:sz="1"/>
+              <w:right w:val="single" w:color="999999" w:sz="1"/>
+            </w:tcBorders>
+          </w:tcPr>
+          <w:p>
+            <w:r>
+              <w:rPr>
+                <w:rFonts w:ascii="Courier New" w:cs="Courier New" w:eastAsia="Courier New" w:hAnsi="Courier New"/>
+                <w:sz w:val="20"/>
+                <w:szCs w:val="20"/>
+              </w:rPr>
+              <w:t xml:space="preserve">map01(Σ p_c × v_map[c])</w:t>
+            </w:r>
+          </w:p>
+        </w:tc>
+      </w:tr>
+      <w:tr>
+        <w:tc>
+          <w:tcPr>
+            <w:tcBorders>
+              <w:top w:val="single" w:color="999999" w:sz="1"/>
+              <w:left w:val="single" w:color="999999" w:sz="1"/>
+              <w:bottom w:val="single" w:color="999999" w:sz="1"/>
+              <w:right w:val="single" w:color="999999" w:sz="1"/>
+            </w:tcBorders>
+          </w:tcPr>
+          <w:p>
+            <w:r>
+              <w:t xml:space="preserve">Arousal</w:t>
+            </w:r>
+          </w:p>
+        </w:tc>
+        <w:tc>
+          <w:tcPr>
+            <w:tcBorders>
+              <w:top w:val="single" w:color="999999" w:sz="1"/>
+              <w:left w:val="single" w:color="999999" w:sz="1"/>
+              <w:bottom w:val="single" w:color="999999" w:sz="1"/>
+              <w:right w:val="single" w:color="999999" w:sz="1"/>
+            </w:tcBorders>
+          </w:tcPr>
+          <w:p>
+            <w:r>
+              <w:t xml:space="preserve">S, ↓T</w:t>
+            </w:r>
+          </w:p>
+        </w:tc>
+        <w:tc>
+          <w:tcPr>
+            <w:tcBorders>
+              <w:top w:val="single" w:color="999999" w:sz="1"/>
+              <w:left w:val="single" w:color="999999" w:sz="1"/>
+              <w:bottom w:val="single" w:color="999999" w:sz="1"/>
+              <w:right w:val="single" w:color="999999" w:sz="1"/>
+            </w:tcBorders>
+          </w:tcPr>
+          <w:p>
+            <w:r>
+              <w:rPr>
+                <w:rFonts w:ascii="Courier New" w:cs="Courier New" w:eastAsia="Courier New" w:hAnsi="Courier New"/>
+                <w:sz w:val="20"/>
+                <w:szCs w:val="20"/>
+              </w:rPr>
+              <w:t xml:space="preserve">clamp(Σ p_c × a_map[c], 0, 1)</w:t>
+            </w:r>
+          </w:p>
+        </w:tc>
+      </w:tr>
+    </w:tbl>
+    <w:p>
+      <w:pPr>
+        <w:pStyle w:val="Caption"/>
+      </w:pPr>
+      <w:r>
+        <w:t xml:space="preserve">Table 1: Metric definitions and knob dependencies. Arrows indicate direction of influence.</w:t>
+      </w:r>
+    </w:p>
+    <w:p>
+      <w:pPr>
+        <w:pStyle w:val="Heading2"/>
+      </w:pPr>
+      <w:r>
+        <w:t xml:space="preserve">3.3 Metric Weight Blending</w:t>
+      </w:r>
+    </w:p>
+    <w:p>
+      <w:pPr>
+        <w:pStyle w:val="Equation"/>
+      </w:pPr>
+      <w:r>
+        <w:rPr>
+          <w:rFonts w:ascii="Courier New" w:cs="Courier New" w:eastAsia="Courier New" w:hAnsi="Courier New"/>
+          <w:sz w:val="20"/>
+          <w:szCs w:val="20"/>
+        </w:rPr>
+        <w:t xml:space="preserve">w_bootstrap[i] ← sigmoid(c_F[i]×F + c_S[i]×S + c_T[i]×T + d_i)</w:t>
+      </w:r>
+    </w:p>
+    <w:p>
+      <w:pPr>
+        <w:pStyle w:val="Equation"/>
+      </w:pPr>
+      <w:r>
+        <w:rPr>
+          <w:rFonts w:ascii="Courier New" w:cs="Courier New" w:eastAsia="Courier New" w:hAnsi="Courier New"/>
+          <w:sz w:val="20"/>
+          <w:szCs w:val="20"/>
+        </w:rPr>
+        <w:t xml:space="preserve">φ(T) = 0.90 + 0.09T</w:t>
+      </w:r>
+    </w:p>
+    <w:p>
+      <w:pPr>
+        <w:pStyle w:val="Equation"/>
+      </w:pPr>
+      <w:r>
+        <w:rPr>
+          <w:rFonts w:ascii="Courier New" w:cs="Courier New" w:eastAsia="Courier New" w:hAnsi="Courier New"/>
+          <w:sz w:val="20"/>
+          <w:szCs w:val="20"/>
+        </w:rPr>
+        <w:t xml:space="preserve">N ← round(lerp(64, 512, T))  # fitting window</w:t>
+      </w:r>
+    </w:p>
+    <w:p>
+      <w:pPr>
+        <w:pStyle w:val="Equation"/>
+      </w:pPr>
+      <w:r>
+        <w:rPr>
+          <w:rFonts w:ascii="Courier New" w:cs="Courier New" w:eastAsia="Courier New" w:hAnsi="Courier New"/>
+          <w:sz w:val="20"/>
+          <w:szCs w:val="20"/>
+        </w:rPr>
+        <w:t xml:space="preserve">τ_rls ← lerp(20.0, 80.0, T)</w:t>
+      </w:r>
+    </w:p>
+    <w:p>
+      <w:pPr>
+        <w:pStyle w:val="Equation"/>
+      </w:pPr>
+      <w:r>
+        <w:rPr>
+          <w:rFonts w:ascii="Courier New" w:cs="Courier New" w:eastAsia="Courier New" w:hAnsi="Courier New"/>
+          <w:sz w:val="20"/>
+          <w:szCs w:val="20"/>
+        </w:rPr>
+        <w:t xml:space="preserve">confidence_rls ← 1 − exp(−t / τ_rls)</w:t>
+      </w:r>
+    </w:p>
+    <w:p>
+      <w:pPr>
+        <w:pStyle w:val="Equation"/>
+      </w:pPr>
+      <w:r>
+        <w:rPr>
+          <w:rFonts w:ascii="Courier New" w:cs="Courier New" w:eastAsia="Courier New" w:hAnsi="Courier New"/>
+          <w:sz w:val="20"/>
+          <w:szCs w:val="20"/>
+        </w:rPr>
+        <w:t xml:space="preserve">weight_i(t) ← (1 − confidence_rls) × w_bootstrap[i] +</w:t>
+      </w:r>
+    </w:p>
+    <w:p>
+      <w:pPr>
+        <w:pStyle w:val="Equation"/>
+      </w:pPr>
+      <w:r>
+        <w:rPr>
+          <w:rFonts w:ascii="Courier New" w:cs="Courier New" w:eastAsia="Courier New" w:hAnsi="Courier New"/>
+          <w:sz w:val="20"/>
+          <w:szCs w:val="20"/>
+        </w:rPr>
+        <w:t xml:space="preserve">               confidence_rls × w_rls[i]</w:t>
       </w:r>
     </w:p>
     <w:p>
@@ -802,1164 +2540,7 @@
         <w:pStyle w:val="Heading3"/>
       </w:pPr>
       <w:r>
-        <w:t xml:space="preserve">2.2.1 Sensitivity Priors</w:t>
-      </w:r>
-    </w:p>
-    <w:p>
-      <w:pPr>
-        <w:pStyle w:val="Equation"/>
-      </w:pPr>
-      <w:r>
-        <w:rPr>
-          <w:rFonts w:ascii="Courier New" w:cs="Courier New" w:eastAsia="Courier New" w:hAnsi="Courier New"/>
-          <w:sz w:val="20"/>
-          <w:szCs w:val="20"/>
-        </w:rPr>
-        <w:t xml:space="preserve">base_rate_prior = lerp(0.2, 5.0, S)  # writes/min</w:t>
-      </w:r>
-    </w:p>
-    <w:p>
-      <w:pPr>
-        <w:pStyle w:val="Equation"/>
-      </w:pPr>
-      <w:r>
-        <w:rPr>
-          <w:rFonts w:ascii="Courier New" w:cs="Courier New" w:eastAsia="Courier New" w:hAnsi="Courier New"/>
-          <w:sz w:val="20"/>
-          <w:szCs w:val="20"/>
-        </w:rPr>
-        <w:t xml:space="preserve">weight_novelty_prior = 0.3 + 0.7S</w:t>
-      </w:r>
-    </w:p>
-    <w:p>
-      <w:pPr>
-        <w:pStyle w:val="Equation"/>
-      </w:pPr>
-      <w:r>
-        <w:rPr>
-          <w:rFonts w:ascii="Courier New" w:cs="Courier New" w:eastAsia="Courier New" w:hAnsi="Courier New"/>
-          <w:sz w:val="20"/>
-          <w:szCs w:val="20"/>
-        </w:rPr>
-        <w:t xml:space="preserve">weight_surprise_prior = 0.2 + 0.8S</w:t>
-      </w:r>
-    </w:p>
-    <w:p>
-      <w:pPr>
-        <w:pStyle w:val="Equation"/>
-      </w:pPr>
-      <w:r>
-        <w:rPr>
-          <w:rFonts w:ascii="Courier New" w:cs="Courier New" w:eastAsia="Courier New" w:hAnsi="Courier New"/>
-          <w:sz w:val="20"/>
-          <w:szCs w:val="20"/>
-        </w:rPr>
-        <w:t xml:space="preserve">weight_valence_prior = 0.4 + 0.6S</w:t>
-      </w:r>
-    </w:p>
-    <w:p>
-      <w:pPr>
-        <w:pStyle w:val="Equation"/>
-      </w:pPr>
-      <w:r>
-        <w:rPr>
-          <w:rFonts w:ascii="Courier New" w:cs="Courier New" w:eastAsia="Courier New" w:hAnsi="Courier New"/>
-          <w:sz w:val="20"/>
-          <w:szCs w:val="20"/>
-        </w:rPr>
-        <w:t xml:space="preserve">weight_arousal_prior = S</w:t>
-      </w:r>
-    </w:p>
-    <w:p>
-      <w:pPr>
-        <w:pStyle w:val="Equation"/>
-      </w:pPr>
-      <w:r>
-        <w:rPr>
-          <w:rFonts w:ascii="Courier New" w:cs="Courier New" w:eastAsia="Courier New" w:hAnsi="Courier New"/>
-          <w:sz w:val="20"/>
-          <w:szCs w:val="20"/>
-        </w:rPr>
-        <w:t xml:space="preserve">emotion_gain_prior = exp(1.5S)</w:t>
-      </w:r>
-    </w:p>
-    <w:p>
-      <w:pPr>
-        <w:pStyle w:val="Equation"/>
-      </w:pPr>
-      <w:r>
-        <w:rPr>
-          <w:rFonts w:ascii="Courier New" w:cs="Courier New" w:eastAsia="Courier New" w:hAnsi="Courier New"/>
-          <w:sz w:val="20"/>
-          <w:szCs w:val="20"/>
-        </w:rPr>
-        <w:t xml:space="preserve">score_gain_prior = exp(2S)</w:t>
-      </w:r>
-    </w:p>
-    <w:p>
-      <w:pPr>
-        <w:pStyle w:val="Equation"/>
-      </w:pPr>
-      <w:r>
-        <w:rPr>
-          <w:rFonts w:ascii="Courier New" w:cs="Courier New" w:eastAsia="Courier New" w:hAnsi="Courier New"/>
-          <w:sz w:val="20"/>
-          <w:szCs w:val="20"/>
-        </w:rPr>
-        <w:t xml:space="preserve">rate_target_prior = base_rate_prior × (0.5 + 1.5S)</w:t>
-      </w:r>
-    </w:p>
-    <w:p>
-      <w:pPr>
-        <w:pStyle w:val="Heading3"/>
-      </w:pPr>
-      <w:r>
-        <w:t xml:space="preserve">2.2.2 Emotional Projection</w:t>
-      </w:r>
-    </w:p>
-    <w:p>
-      <w:pPr>
-        <w:pStyle w:val="Equation"/>
-      </w:pPr>
-      <w:r>
-        <w:rPr>
-          <w:rFonts w:ascii="Courier New" w:cs="Courier New" w:eastAsia="Courier New" w:hAnsi="Courier New"/>
-          <w:sz w:val="20"/>
-          <w:szCs w:val="20"/>
-        </w:rPr>
-        <w:t xml:space="preserve">v_map = {anger: −0.9, fear: −0.8, sadness: −0.9,</w:t>
-      </w:r>
-    </w:p>
-    <w:p>
-      <w:pPr>
-        <w:pStyle w:val="Equation"/>
-      </w:pPr>
-      <w:r>
-        <w:rPr>
-          <w:rFonts w:ascii="Courier New" w:cs="Courier New" w:eastAsia="Courier New" w:hAnsi="Courier New"/>
-          <w:sz w:val="20"/>
-          <w:szCs w:val="20"/>
-        </w:rPr>
-        <w:t xml:space="preserve">         joy: +0.9, love: +0.8, surprise: 0.0}</w:t>
-      </w:r>
-    </w:p>
-    <w:p>
-      <w:pPr>
-        <w:pStyle w:val="Equation"/>
-      </w:pPr>
-      <w:r>
-        <w:rPr>
-          <w:rFonts w:ascii="Courier New" w:cs="Courier New" w:eastAsia="Courier New" w:hAnsi="Courier New"/>
-          <w:sz w:val="20"/>
-          <w:szCs w:val="20"/>
-        </w:rPr>
-        <w:t xml:space="preserve">a_map = {anger: +0.9, fear: +0.9, sadness: +0.3,</w:t>
-      </w:r>
-    </w:p>
-    <w:p>
-      <w:pPr>
-        <w:pStyle w:val="Equation"/>
-      </w:pPr>
-      <w:r>
-        <w:rPr>
-          <w:rFonts w:ascii="Courier New" w:cs="Courier New" w:eastAsia="Courier New" w:hAnsi="Courier New"/>
-          <w:sz w:val="20"/>
-          <w:szCs w:val="20"/>
-        </w:rPr>
-        <w:t xml:space="preserve">         joy: +0.6, love: +0.5, surprise: +0.8}</w:t>
-      </w:r>
-    </w:p>
-    <w:p>
-      <w:pPr>
-        <w:pStyle w:val="Equation"/>
-      </w:pPr>
-      <w:r>
-        <w:rPr>
-          <w:rFonts w:ascii="Courier New" w:cs="Courier New" w:eastAsia="Courier New" w:hAnsi="Courier New"/>
-          <w:sz w:val="20"/>
-          <w:szCs w:val="20"/>
-        </w:rPr>
-        <w:t xml:space="preserve">raw_cos_c ← cos(x_t, centroids[c]) for each c ∈ C</w:t>
-      </w:r>
-    </w:p>
-    <w:p>
-      <w:pPr>
-        <w:pStyle w:val="Equation"/>
-      </w:pPr>
-      <w:r>
-        <w:rPr>
-          <w:rFonts w:ascii="Courier New" w:cs="Courier New" w:eastAsia="Courier New" w:hAnsi="Courier New"/>
-          <w:sz w:val="20"/>
-          <w:szCs w:val="20"/>
-        </w:rPr>
-        <w:t xml:space="preserve">if all raw_cos_c ≤ 0:</w:t>
-      </w:r>
-    </w:p>
-    <w:p>
-      <w:pPr>
-        <w:pStyle w:val="Equation"/>
-      </w:pPr>
-      <w:r>
-        <w:rPr>
-          <w:rFonts w:ascii="Courier New" w:cs="Courier New" w:eastAsia="Courier New" w:hAnsi="Courier New"/>
-          <w:sz w:val="20"/>
-          <w:szCs w:val="20"/>
-        </w:rPr>
-        <w:t xml:space="preserve">    emotion_intensity_t ← 0; valence_t ← 0.5; arousal_t ← 0</w:t>
-      </w:r>
-    </w:p>
-    <w:p>
-      <w:pPr>
-        <w:pStyle w:val="Equation"/>
-      </w:pPr>
-      <w:r>
-        <w:rPr>
-          <w:rFonts w:ascii="Courier New" w:cs="Courier New" w:eastAsia="Courier New" w:hAnsi="Courier New"/>
-          <w:sz w:val="20"/>
-          <w:szCs w:val="20"/>
-        </w:rPr>
-        <w:t xml:space="preserve">else:</w:t>
-      </w:r>
-    </w:p>
-    <w:p>
-      <w:pPr>
-        <w:pStyle w:val="Equation"/>
-      </w:pPr>
-      <w:r>
-        <w:rPr>
-          <w:rFonts w:ascii="Courier New" w:cs="Courier New" w:eastAsia="Courier New" w:hAnsi="Courier New"/>
-          <w:sz w:val="20"/>
-          <w:szCs w:val="20"/>
-        </w:rPr>
-        <w:t xml:space="preserve">    logits_c ← max(0, raw_cos_c)</w:t>
-      </w:r>
-    </w:p>
-    <w:p>
-      <w:pPr>
-        <w:pStyle w:val="Equation"/>
-      </w:pPr>
-      <w:r>
-        <w:rPr>
-          <w:rFonts w:ascii="Courier New" w:cs="Courier New" w:eastAsia="Courier New" w:hAnsi="Courier New"/>
-          <w:sz w:val="20"/>
-          <w:szCs w:val="20"/>
-        </w:rPr>
-        <w:t xml:space="preserve">    β(S) = 4 + 8S  # softmax inverse temperature</w:t>
-      </w:r>
-    </w:p>
-    <w:p>
-      <w:pPr>
-        <w:pStyle w:val="Equation"/>
-      </w:pPr>
-      <w:r>
-        <w:rPr>
-          <w:rFonts w:ascii="Courier New" w:cs="Courier New" w:eastAsia="Courier New" w:hAnsi="Courier New"/>
-          <w:sz w:val="20"/>
-          <w:szCs w:val="20"/>
-        </w:rPr>
-        <w:t xml:space="preserve">    p_c ← softmax(β(S) × logits_c)</w:t>
-      </w:r>
-    </w:p>
-    <w:p>
-      <w:pPr>
-        <w:pStyle w:val="Equation"/>
-      </w:pPr>
-      <w:r>
-        <w:rPr>
-          <w:rFonts w:ascii="Courier New" w:cs="Courier New" w:eastAsia="Courier New" w:hAnsi="Courier New"/>
-          <w:sz w:val="20"/>
-          <w:szCs w:val="20"/>
-        </w:rPr>
-        <w:t xml:space="preserve">    peak ← max_c(p_c)</w:t>
-      </w:r>
-    </w:p>
-    <w:p>
-      <w:pPr>
-        <w:pStyle w:val="Equation"/>
-      </w:pPr>
-      <w:r>
-        <w:rPr>
-          <w:rFonts w:ascii="Courier New" w:cs="Courier New" w:eastAsia="Courier New" w:hAnsi="Courier New"/>
-          <w:sz w:val="20"/>
-          <w:szCs w:val="20"/>
-        </w:rPr>
-        <w:t xml:space="preserve">    confidence ← 1 − H(p_c) / ln(6)</w:t>
-      </w:r>
-    </w:p>
-    <w:p>
-      <w:pPr>
-        <w:pStyle w:val="Equation"/>
-      </w:pPr>
-      <w:r>
-        <w:rPr>
-          <w:rFonts w:ascii="Courier New" w:cs="Courier New" w:eastAsia="Courier New" w:hAnsi="Courier New"/>
-          <w:sz w:val="20"/>
-          <w:szCs w:val="20"/>
-        </w:rPr>
-        <w:t xml:space="preserve">    emotion_intensity_t ← sqrt(peak × confidence)</w:t>
-      </w:r>
-    </w:p>
-    <w:p>
-      <w:pPr>
-        <w:pStyle w:val="Equation"/>
-      </w:pPr>
-      <w:r>
-        <w:rPr>
-          <w:rFonts w:ascii="Courier New" w:cs="Courier New" w:eastAsia="Courier New" w:hAnsi="Courier New"/>
-          <w:sz w:val="20"/>
-          <w:szCs w:val="20"/>
-        </w:rPr>
-        <w:t xml:space="preserve">    valence_t ← (Σ_c p_c × v_map[c] + 0.9) / 1.8</w:t>
-      </w:r>
-    </w:p>
-    <w:p>
-      <w:pPr>
-        <w:pStyle w:val="Equation"/>
-      </w:pPr>
-      <w:r>
-        <w:rPr>
-          <w:rFonts w:ascii="Courier New" w:cs="Courier New" w:eastAsia="Courier New" w:hAnsi="Courier New"/>
-          <w:sz w:val="20"/>
-          <w:szCs w:val="20"/>
-        </w:rPr>
-        <w:t xml:space="preserve">    arousal_t ← clamp(Σ_c p_c × a_map[c], 0, 1)</w:t>
-      </w:r>
-    </w:p>
-    <w:p>
-      <w:pPr>
-        <w:pStyle w:val="Heading3"/>
-      </w:pPr>
-      <w:r>
-        <w:t xml:space="preserve">2.2.3 Threshold Modulation from Emotion</w:t>
-      </w:r>
-    </w:p>
-    <w:p>
-      <w:pPr>
-        <w:pStyle w:val="Equation"/>
-      </w:pPr>
-      <w:r>
-        <w:rPr>
-          <w:rFonts w:ascii="Courier New" w:cs="Courier New" w:eastAsia="Courier New" w:hAnsi="Courier New"/>
-          <w:sz w:val="20"/>
-          <w:szCs w:val="20"/>
-        </w:rPr>
-        <w:t xml:space="preserve">κ_emo ← κ_base × S  # where κ_base = 0.10</w:t>
-      </w:r>
-    </w:p>
-    <w:p>
-      <w:pPr>
-        <w:pStyle w:val="Equation"/>
-      </w:pPr>
-      <w:r>
-        <w:rPr>
-          <w:rFonts w:ascii="Courier New" w:cs="Courier New" w:eastAsia="Courier New" w:hAnsi="Courier New"/>
-          <w:sz w:val="20"/>
-          <w:szCs w:val="20"/>
-        </w:rPr>
-        <w:t xml:space="preserve">ΔThreshold_emotion_t ← −κ_emo × emotion_intensity_t ×</w:t>
-      </w:r>
-    </w:p>
-    <w:p>
-      <w:pPr>
-        <w:pStyle w:val="Equation"/>
-      </w:pPr>
-      <w:r>
-        <w:rPr>
-          <w:rFonts w:ascii="Courier New" w:cs="Courier New" w:eastAsia="Courier New" w:hAnsi="Courier New"/>
-          <w:sz w:val="20"/>
-          <w:szCs w:val="20"/>
-        </w:rPr>
-        <w:t xml:space="preserve">                        (0.5 + 0.5 × arousal_t)</w:t>
-      </w:r>
-    </w:p>
-    <w:p>
-      <w:pPr>
-        <w:pStyle w:val="Heading3"/>
-      </w:pPr>
-      <w:r>
-        <w:t xml:space="preserve">2.2.4 Mood Integration</w:t>
-      </w:r>
-    </w:p>
-    <w:p>
-      <w:pPr>
-        <w:pStyle w:val="Equation"/>
-      </w:pPr>
-      <w:r>
-        <w:rPr>
-          <w:rFonts w:ascii="Courier New" w:cs="Courier New" w:eastAsia="Courier New" w:hAnsi="Courier New"/>
-          <w:sz w:val="20"/>
-          <w:szCs w:val="20"/>
-        </w:rPr>
-        <w:t xml:space="preserve">α_mood(S) = lerp(0.01, 0.20, S)  # reactivity</w:t>
-      </w:r>
-    </w:p>
-    <w:p>
-      <w:pPr>
-        <w:pStyle w:val="Equation"/>
-      </w:pPr>
-      <w:r>
-        <w:rPr>
-          <w:rFonts w:ascii="Courier New" w:cs="Courier New" w:eastAsia="Courier New" w:hAnsi="Courier New"/>
-          <w:sz w:val="20"/>
-          <w:szCs w:val="20"/>
-        </w:rPr>
-        <w:t xml:space="preserve">λ_mood(T) = lerp(0.90, 0.999, T)  # decay</w:t>
-      </w:r>
-    </w:p>
-    <w:p>
-      <w:pPr>
-        <w:pStyle w:val="Equation"/>
-      </w:pPr>
-      <w:r>
-        <w:rPr>
-          <w:rFonts w:ascii="Courier New" w:cs="Courier New" w:eastAsia="Courier New" w:hAnsi="Courier New"/>
-          <w:sz w:val="20"/>
-          <w:szCs w:val="20"/>
-        </w:rPr>
-        <w:t xml:space="preserve">M_t = λ_mood(T) × M_{t−1} + α_mood(S) × e_t</w:t>
-      </w:r>
-    </w:p>
-    <w:p>
-      <w:pPr>
-        <w:pStyle w:val="Equation"/>
-      </w:pPr>
-      <w:r>
-        <w:rPr>
-          <w:rFonts w:ascii="Courier New" w:cs="Courier New" w:eastAsia="Courier New" w:hAnsi="Courier New"/>
-          <w:sz w:val="20"/>
-          <w:szCs w:val="20"/>
-        </w:rPr>
-        <w:t xml:space="preserve">M_t ← clamp(M_t, −1.0, 1.0)</w:t>
-      </w:r>
-    </w:p>
-    <w:p>
-      <w:pPr>
-        <w:pStyle w:val="Equation"/>
-      </w:pPr>
-      <w:r>
-        <w:rPr>
-          <w:rFonts w:ascii="Courier New" w:cs="Courier New" w:eastAsia="Courier New" w:hAnsi="Courier New"/>
-          <w:sz w:val="20"/>
-          <w:szCs w:val="20"/>
-        </w:rPr>
-        <w:t xml:space="preserve">κ_mood ← κ_base × S</w:t>
-      </w:r>
-    </w:p>
-    <w:p>
-      <w:pPr>
-        <w:pStyle w:val="Equation"/>
-      </w:pPr>
-      <w:r>
-        <w:rPr>
-          <w:rFonts w:ascii="Courier New" w:cs="Courier New" w:eastAsia="Courier New" w:hAnsi="Courier New"/>
-          <w:sz w:val="20"/>
-          <w:szCs w:val="20"/>
-        </w:rPr>
-        <w:t xml:space="preserve">m_norm ← ‖M_t‖ / √6</w:t>
-      </w:r>
-    </w:p>
-    <w:p>
-      <w:pPr>
-        <w:pStyle w:val="Equation"/>
-      </w:pPr>
-      <w:r>
-        <w:rPr>
-          <w:rFonts w:ascii="Courier New" w:cs="Courier New" w:eastAsia="Courier New" w:hAnsi="Courier New"/>
-          <w:sz w:val="20"/>
-          <w:szCs w:val="20"/>
-        </w:rPr>
-        <w:t xml:space="preserve">ΔThreshold_mood_t ← −κ_mood × clamp(m_norm, 0, 1)</w:t>
-      </w:r>
-    </w:p>
-    <w:p>
-      <w:pPr>
-        <w:pStyle w:val="Heading2"/>
-      </w:pPr>
-      <w:r>
-        <w:t xml:space="preserve">2.3 Stability-Driven Persistence</w:t>
-      </w:r>
-    </w:p>
-    <w:p>
-      <w:pPr>
-        <w:pStyle w:val="Heading3"/>
-      </w:pPr>
-      <w:r>
-        <w:t xml:space="preserve">2.3.1 Stability Priors</w:t>
-      </w:r>
-    </w:p>
-    <w:p>
-      <w:pPr>
-        <w:pStyle w:val="Equation"/>
-      </w:pPr>
-      <w:r>
-        <w:rPr>
-          <w:rFonts w:ascii="Courier New" w:cs="Courier New" w:eastAsia="Courier New" w:hAnsi="Courier New"/>
-          <w:sz w:val="20"/>
-          <w:szCs w:val="20"/>
-        </w:rPr>
-        <w:t xml:space="preserve">hysteresis_band_prior = lerp(0.02, 0.25, T)</w:t>
-      </w:r>
-    </w:p>
-    <w:p>
-      <w:pPr>
-        <w:pStyle w:val="Equation"/>
-      </w:pPr>
-      <w:r>
-        <w:rPr>
-          <w:rFonts w:ascii="Courier New" w:cs="Courier New" w:eastAsia="Courier New" w:hAnsi="Courier New"/>
-          <w:sz w:val="20"/>
-          <w:szCs w:val="20"/>
-        </w:rPr>
-        <w:t xml:space="preserve">half_life_prior = base_half_life(T)</w:t>
-      </w:r>
-    </w:p>
-    <w:p>
-      <w:pPr>
-        <w:pStyle w:val="Equation"/>
-      </w:pPr>
-      <w:r>
-        <w:rPr>
-          <w:rFonts w:ascii="Courier New" w:cs="Courier New" w:eastAsia="Courier New" w:hAnsi="Courier New"/>
-          <w:sz w:val="20"/>
-          <w:szCs w:val="20"/>
-        </w:rPr>
-        <w:t xml:space="preserve">rate_decay_prior = lerp(0.60, 0.98, T)</w:t>
-      </w:r>
-    </w:p>
-    <w:p>
-      <w:pPr>
-        <w:pStyle w:val="Equation"/>
-      </w:pPr>
-      <w:r>
-        <w:rPr>
-          <w:rFonts w:ascii="Courier New" w:cs="Courier New" w:eastAsia="Courier New" w:hAnsi="Courier New"/>
-          <w:sz w:val="20"/>
-          <w:szCs w:val="20"/>
-        </w:rPr>
-        <w:t xml:space="preserve">periphery_half_life_prior = clamp(0.5 × half_life_prior,</w:t>
-      </w:r>
-    </w:p>
-    <w:p>
-      <w:pPr>
-        <w:pStyle w:val="Equation"/>
-      </w:pPr>
-      <w:r>
-        <w:rPr>
-          <w:rFonts w:ascii="Courier New" w:cs="Courier New" w:eastAsia="Courier New" w:hAnsi="Courier New"/>
-          <w:sz w:val="20"/>
-          <w:szCs w:val="20"/>
-        </w:rPr>
-        <w:t xml:space="preserve">                                   τ_min, τ_max)</w:t>
-      </w:r>
-    </w:p>
-    <w:p>
-      <w:pPr>
-        <w:pStyle w:val="Equation"/>
-      </w:pPr>
-      <w:r>
-        <w:rPr>
-          <w:rFonts w:ascii="Courier New" w:cs="Courier New" w:eastAsia="Courier New" w:hAnsi="Courier New"/>
-          <w:sz w:val="20"/>
-          <w:szCs w:val="20"/>
-        </w:rPr>
-        <w:t xml:space="preserve">drift_weight_prior = 0.5 × (1 − T)</w:t>
-      </w:r>
-    </w:p>
-    <w:p>
-      <w:pPr>
-        <w:pStyle w:val="Heading3"/>
-      </w:pPr>
-      <w:r>
-        <w:t xml:space="preserve">2.3.2 Dynamic Stability Update</w:t>
-      </w:r>
-    </w:p>
-    <w:p>
-      <w:pPr>
-        <w:pStyle w:val="Equation"/>
-      </w:pPr>
-      <w:r>
-        <w:rPr>
-          <w:rFonts w:ascii="Courier New" w:cs="Courier New" w:eastAsia="Courier New" w:hAnsi="Courier New"/>
-          <w:sz w:val="20"/>
-          <w:szCs w:val="20"/>
-        </w:rPr>
-        <w:t xml:space="preserve">active_memories ← {m | strength(m) ≥ periphery_cutoff(T)}</w:t>
-      </w:r>
-    </w:p>
-    <w:p>
-      <w:pPr>
-        <w:pStyle w:val="Equation"/>
-      </w:pPr>
-      <w:r>
-        <w:rPr>
-          <w:rFonts w:ascii="Courier New" w:cs="Courier New" w:eastAsia="Courier New" w:hAnsi="Courier New"/>
-          <w:sz w:val="20"/>
-          <w:szCs w:val="20"/>
-        </w:rPr>
-        <w:t xml:space="preserve">observed_retention ← mean_age(active_memories)</w:t>
-      </w:r>
-    </w:p>
-    <w:p>
-      <w:pPr>
-        <w:pStyle w:val="Equation"/>
-      </w:pPr>
-      <w:r>
-        <w:rPr>
-          <w:rFonts w:ascii="Courier New" w:cs="Courier New" w:eastAsia="Courier New" w:hAnsi="Courier New"/>
-          <w:sz w:val="20"/>
-          <w:szCs w:val="20"/>
-        </w:rPr>
-        <w:t xml:space="preserve">retention_ema_t ← EWMA(retention_ema_{t−1},</w:t>
-      </w:r>
-    </w:p>
-    <w:p>
-      <w:pPr>
-        <w:pStyle w:val="Equation"/>
-      </w:pPr>
-      <w:r>
-        <w:rPr>
-          <w:rFonts w:ascii="Courier New" w:cs="Courier New" w:eastAsia="Courier New" w:hAnsi="Courier New"/>
-          <w:sz w:val="20"/>
-          <w:szCs w:val="20"/>
-        </w:rPr>
-        <w:t xml:space="preserve">                       observed_retention, α = α_T(t))</w:t>
-      </w:r>
-    </w:p>
-    <w:p>
-      <w:pPr>
-        <w:pStyle w:val="Equation"/>
-      </w:pPr>
-      <w:r>
-        <w:rPr>
-          <w:rFonts w:ascii="Courier New" w:cs="Courier New" w:eastAsia="Courier New" w:hAnsi="Courier New"/>
-          <w:sz w:val="20"/>
-          <w:szCs w:val="20"/>
-        </w:rPr>
-        <w:t xml:space="preserve">last_w_ret ← tail(retention_history, w_ret(T))</w:t>
-      </w:r>
-    </w:p>
-    <w:p>
-      <w:pPr>
-        <w:pStyle w:val="Equation"/>
-      </w:pPr>
-      <w:r>
-        <w:rPr>
-          <w:rFonts w:ascii="Courier New" w:cs="Courier New" w:eastAsia="Courier New" w:hAnsi="Courier New"/>
-          <w:sz w:val="20"/>
-          <w:szCs w:val="20"/>
-        </w:rPr>
-        <w:t xml:space="preserve">μ_ret ← mean(last_w_ret)</w:t>
-      </w:r>
-    </w:p>
-    <w:p>
-      <w:pPr>
-        <w:pStyle w:val="Equation"/>
-      </w:pPr>
-      <w:r>
-        <w:rPr>
-          <w:rFonts w:ascii="Courier New" w:cs="Courier New" w:eastAsia="Courier New" w:hAnsi="Courier New"/>
-          <w:sz w:val="20"/>
-          <w:szCs w:val="20"/>
-        </w:rPr>
-        <w:t xml:space="preserve">σ_ret ← max(std(last_w_ret), 1.0)</w:t>
-      </w:r>
-    </w:p>
-    <w:p>
-      <w:pPr>
-        <w:pStyle w:val="Equation"/>
-      </w:pPr>
-      <w:r>
-        <w:rPr>
-          <w:rFonts w:ascii="Courier New" w:cs="Courier New" w:eastAsia="Courier New" w:hAnsi="Courier New"/>
-          <w:sz w:val="20"/>
-          <w:szCs w:val="20"/>
-        </w:rPr>
-        <w:t xml:space="preserve">zscore_ret ← clamp((observed_retention − μ_ret) / σ_ret, −3, +3)</w:t>
-      </w:r>
-    </w:p>
-    <w:p>
-      <w:pPr>
-        <w:pStyle w:val="Equation"/>
-      </w:pPr>
-      <w:r>
-        <w:rPr>
-          <w:rFonts w:ascii="Courier New" w:cs="Courier New" w:eastAsia="Courier New" w:hAnsi="Courier New"/>
-          <w:sz w:val="20"/>
-          <w:szCs w:val="20"/>
-        </w:rPr>
-        <w:t xml:space="preserve">stability_adj ← ΔHalfLife_adj_t if provided else 0</w:t>
-      </w:r>
-    </w:p>
-    <w:p>
-      <w:pPr>
-        <w:pStyle w:val="Equation"/>
-      </w:pPr>
-      <w:r>
-        <w:rPr>
-          <w:rFonts w:ascii="Courier New" w:cs="Courier New" w:eastAsia="Courier New" w:hAnsi="Courier New"/>
-          <w:sz w:val="20"/>
-          <w:szCs w:val="20"/>
-        </w:rPr>
-        <w:t xml:space="preserve">target_half_life_t ← clamp(base_half_life(T) ×</w:t>
-      </w:r>
-    </w:p>
-    <w:p>
-      <w:pPr>
-        <w:pStyle w:val="Equation"/>
-      </w:pPr>
-      <w:r>
-        <w:rPr>
-          <w:rFonts w:ascii="Courier New" w:cs="Courier New" w:eastAsia="Courier New" w:hAnsi="Courier New"/>
-          <w:sz w:val="20"/>
-          <w:szCs w:val="20"/>
-        </w:rPr>
-        <w:t xml:space="preserve">                          (1 + 0.25 × zscore_ret + stability_adj),</w:t>
-      </w:r>
-    </w:p>
-    <w:p>
-      <w:pPr>
-        <w:pStyle w:val="Equation"/>
-      </w:pPr>
-      <w:r>
-        <w:rPr>
-          <w:rFonts w:ascii="Courier New" w:cs="Courier New" w:eastAsia="Courier New" w:hAnsi="Courier New"/>
-          <w:sz w:val="20"/>
-          <w:szCs w:val="20"/>
-        </w:rPr>
-        <w:t xml:space="preserve">                          τ_min, τ_max)</w:t>
-      </w:r>
-    </w:p>
-    <w:p>
-      <w:pPr>
-        <w:pStyle w:val="Equation"/>
-      </w:pPr>
-      <w:r>
-        <w:rPr>
-          <w:rFonts w:ascii="Courier New" w:cs="Courier New" w:eastAsia="Courier New" w:hAnsi="Courier New"/>
-          <w:sz w:val="20"/>
-          <w:szCs w:val="20"/>
-        </w:rPr>
-        <w:t xml:space="preserve">half_life_t ← EWMA(half_life_{t−1}, target_half_life_t,</w:t>
-      </w:r>
-    </w:p>
-    <w:p>
-      <w:pPr>
-        <w:pStyle w:val="Equation"/>
-      </w:pPr>
-      <w:r>
-        <w:rPr>
-          <w:rFonts w:ascii="Courier New" w:cs="Courier New" w:eastAsia="Courier New" w:hAnsi="Courier New"/>
-          <w:sz w:val="20"/>
-          <w:szCs w:val="20"/>
-        </w:rPr>
-        <w:t xml:space="preserve">                   α = α_T(t))</w:t>
-      </w:r>
-    </w:p>
-    <w:p>
-      <w:r>
-        <w:br w:type="page"/>
-      </w:r>
-    </w:p>
-    <w:p>
-      <w:pPr>
-        <w:pStyle w:val="Heading1"/>
-      </w:pPr>
-      <w:r>
-        <w:t xml:space="preserve">3. Structural Metrics and Composite Scoring</w:t>
-      </w:r>
-    </w:p>
-    <w:p>
-      <w:pPr>
-        <w:pStyle w:val="Heading2"/>
-      </w:pPr>
-      <w:r>
-        <w:t xml:space="preserve">3.1 Embedding-Derived Metrics</w:t>
-      </w:r>
-    </w:p>
-    <w:p>
-      <w:pPr>
-        <w:pStyle w:val="Heading3"/>
-      </w:pPr>
-      <w:r>
-        <w:t xml:space="preserve">3.1.1 Coherence</w:t>
-      </w:r>
-    </w:p>
-    <w:p>
-      <w:pPr>
-        <w:pStyle w:val="Equation"/>
-      </w:pPr>
-      <w:r>
-        <w:rPr>
-          <w:rFonts w:ascii="Courier New" w:cs="Courier New" w:eastAsia="Courier New" w:hAnsi="Courier New"/>
-          <w:sz w:val="20"/>
-          <w:szCs w:val="20"/>
-        </w:rPr>
-        <w:t xml:space="preserve">raw ← var([cos(x_t, c) for c in context_window])</w:t>
-      </w:r>
-    </w:p>
-    <w:p>
-      <w:pPr>
-        <w:pStyle w:val="Equation"/>
-      </w:pPr>
-      <w:r>
-        <w:rPr>
-          <w:rFonts w:ascii="Courier New" w:cs="Courier New" w:eastAsia="Courier New" w:hAnsi="Courier New"/>
-          <w:sz w:val="20"/>
-          <w:szCs w:val="20"/>
-        </w:rPr>
-        <w:t xml:space="preserve">coherence_t ← 1 − clamp(raw, 0, 1)</w:t>
-      </w:r>
-    </w:p>
-    <w:p>
-      <w:pPr>
-        <w:pStyle w:val="Equation"/>
-      </w:pPr>
-      <w:r>
-        <w:rPr>
-          <w:rFonts w:ascii="Courier New" w:cs="Courier New" w:eastAsia="Courier New" w:hAnsi="Courier New"/>
-          <w:sz w:val="20"/>
-          <w:szCs w:val="20"/>
-        </w:rPr>
-        <w:t xml:space="preserve">F_eff = F × (0.5 + 0.5 × coherence_t)</w:t>
-      </w:r>
-    </w:p>
-    <w:p>
-      <w:pPr>
-        <w:pStyle w:val="Heading3"/>
-      </w:pPr>
-      <w:r>
-        <w:t xml:space="preserve">3.1.2 Focus Spread</w:t>
-      </w:r>
-    </w:p>
-    <w:p>
-      <w:pPr>
-        <w:pStyle w:val="Equation"/>
-      </w:pPr>
-      <w:r>
-        <w:rPr>
-          <w:rFonts w:ascii="Courier New" w:cs="Courier New" w:eastAsia="Courier New" w:hAnsi="Courier New"/>
-          <w:sz w:val="20"/>
-          <w:szCs w:val="20"/>
-        </w:rPr>
-        <w:t xml:space="preserve">k ← k_neighbors(T) = round(lerp(8, 32, T))</w:t>
-      </w:r>
-    </w:p>
-    <w:p>
-      <w:pPr>
-        <w:pStyle w:val="Equation"/>
-      </w:pPr>
-      <w:r>
-        <w:rPr>
-          <w:rFonts w:ascii="Courier New" w:cs="Courier New" w:eastAsia="Courier New" w:hAnsi="Courier New"/>
-          <w:sz w:val="20"/>
-          <w:szCs w:val="20"/>
-        </w:rPr>
-        <w:t xml:space="preserve">p ← softmax(kNN_similarities)</w:t>
-      </w:r>
-    </w:p>
-    <w:p>
-      <w:pPr>
-        <w:pStyle w:val="Equation"/>
-      </w:pPr>
-      <w:r>
-        <w:rPr>
-          <w:rFonts w:ascii="Courier New" w:cs="Courier New" w:eastAsia="Courier New" w:hAnsi="Courier New"/>
-          <w:sz w:val="20"/>
-          <w:szCs w:val="20"/>
-        </w:rPr>
-        <w:t xml:space="preserve">focus_spread_t ← H(p) / ln(k)</w:t>
-      </w:r>
-    </w:p>
-    <w:p>
-      <w:pPr>
-        <w:pStyle w:val="Equation"/>
-      </w:pPr>
-      <w:r>
-        <w:rPr>
-          <w:rFonts w:ascii="Courier New" w:cs="Courier New" w:eastAsia="Courier New" w:hAnsi="Courier New"/>
-          <w:sz w:val="20"/>
-          <w:szCs w:val="20"/>
-        </w:rPr>
-        <w:t xml:space="preserve">F_eff ← F_eff × (1 − focus_spread_t)</w:t>
-      </w:r>
-    </w:p>
-    <w:p>
-      <w:pPr>
-        <w:pStyle w:val="Heading3"/>
-      </w:pPr>
-      <w:r>
-        <w:t xml:space="preserve">3.1.3 Trajectory Drift</w:t>
-      </w:r>
-    </w:p>
-    <w:p>
-      <w:pPr>
-        <w:pStyle w:val="Equation"/>
-      </w:pPr>
-      <w:r>
-        <w:rPr>
-          <w:rFonts w:ascii="Courier New" w:cs="Courier New" w:eastAsia="Courier New" w:hAnsi="Courier New"/>
-          <w:sz w:val="20"/>
-          <w:szCs w:val="20"/>
-        </w:rPr>
-        <w:t xml:space="preserve">drift_vec_t ← l2_normalize(mean(ctx_t)) −</w:t>
-      </w:r>
-    </w:p>
-    <w:p>
-      <w:pPr>
-        <w:pStyle w:val="Equation"/>
-      </w:pPr>
-      <w:r>
-        <w:rPr>
-          <w:rFonts w:ascii="Courier New" w:cs="Courier New" w:eastAsia="Courier New" w:hAnsi="Courier New"/>
-          <w:sz w:val="20"/>
-          <w:szCs w:val="20"/>
-        </w:rPr>
-        <w:t xml:space="preserve">              l2_normalize(mean(ctx_{t−k}))</w:t>
-      </w:r>
-    </w:p>
-    <w:p>
-      <w:pPr>
-        <w:pStyle w:val="Equation"/>
-      </w:pPr>
-      <w:r>
-        <w:rPr>
-          <w:rFonts w:ascii="Courier New" w:cs="Courier New" w:eastAsia="Courier New" w:hAnsi="Courier New"/>
-          <w:sz w:val="20"/>
-          <w:szCs w:val="20"/>
-        </w:rPr>
-        <w:t xml:space="preserve">drift_mag_t ← ‖drift_vec_t‖</w:t>
-      </w:r>
-    </w:p>
-    <w:p>
-      <w:pPr>
-        <w:pStyle w:val="Equation"/>
-      </w:pPr>
-      <w:r>
-        <w:rPr>
-          <w:rFonts w:ascii="Courier New" w:cs="Courier New" w:eastAsia="Courier New" w:hAnsi="Courier New"/>
-          <w:sz w:val="20"/>
-          <w:szCs w:val="20"/>
-        </w:rPr>
-        <w:t xml:space="preserve">drift_threshold ← lerp(0.10, 0.35, T)</w:t>
-      </w:r>
-    </w:p>
-    <w:p>
-      <w:pPr>
-        <w:pStyle w:val="Equation"/>
-      </w:pPr>
-      <w:r>
-        <w:rPr>
-          <w:rFonts w:ascii="Courier New" w:cs="Courier New" w:eastAsia="Courier New" w:hAnsi="Courier New"/>
-          <w:sz w:val="20"/>
-          <w:szCs w:val="20"/>
-        </w:rPr>
-        <w:t xml:space="preserve">if drift_mag_t &gt; drift_threshold:</w:t>
-      </w:r>
-    </w:p>
-    <w:p>
-      <w:pPr>
-        <w:pStyle w:val="Equation"/>
-      </w:pPr>
-      <w:r>
-        <w:rPr>
-          <w:rFonts w:ascii="Courier New" w:cs="Courier New" w:eastAsia="Courier New" w:hAnsi="Courier New"/>
-          <w:sz w:val="20"/>
-          <w:szCs w:val="20"/>
-        </w:rPr>
-        <w:t xml:space="preserve">    trigger_episode_boundary()</w:t>
-      </w:r>
-    </w:p>
-    <w:p>
-      <w:pPr>
-        <w:pStyle w:val="Heading3"/>
-      </w:pPr>
-      <w:r>
-        <w:t xml:space="preserve">3.1.4 Embedding Prediction Error</w:t>
-      </w:r>
-    </w:p>
-    <w:p>
-      <w:pPr>
-        <w:pStyle w:val="Equation"/>
-      </w:pPr>
-      <w:r>
-        <w:rPr>
-          <w:rFonts w:ascii="Courier New" w:cs="Courier New" w:eastAsia="Courier New" w:hAnsi="Courier New"/>
-          <w:sz w:val="20"/>
-          <w:szCs w:val="20"/>
-        </w:rPr>
-        <w:t xml:space="preserve">Δx_t = x_t − x_{t−1}</w:t>
-      </w:r>
-    </w:p>
-    <w:p>
-      <w:pPr>
-        <w:pStyle w:val="Equation"/>
-      </w:pPr>
-      <w:r>
-        <w:rPr>
-          <w:rFonts w:ascii="Courier New" w:cs="Courier New" w:eastAsia="Courier New" w:hAnsi="Courier New"/>
-          <w:sz w:val="20"/>
-          <w:szCs w:val="20"/>
-        </w:rPr>
-        <w:t xml:space="preserve">Δx_trend_t = EWMA(Δx_trend_{t−1}, Δx_t, α=0.1)</w:t>
-      </w:r>
-    </w:p>
-    <w:p>
-      <w:pPr>
-        <w:pStyle w:val="Equation"/>
-      </w:pPr>
-      <w:r>
-        <w:rPr>
-          <w:rFonts w:ascii="Courier New" w:cs="Courier New" w:eastAsia="Courier New" w:hAnsi="Courier New"/>
-          <w:sz w:val="20"/>
-          <w:szCs w:val="20"/>
-        </w:rPr>
-        <w:t xml:space="preserve">x_pred_t = x_{t−1} + Δx_trend_{t−1}</w:t>
-      </w:r>
-    </w:p>
-    <w:p>
-      <w:pPr>
-        <w:pStyle w:val="Equation"/>
-      </w:pPr>
-      <w:r>
-        <w:rPr>
-          <w:rFonts w:ascii="Courier New" w:cs="Courier New" w:eastAsia="Courier New" w:hAnsi="Courier New"/>
-          <w:sz w:val="20"/>
-          <w:szCs w:val="20"/>
-        </w:rPr>
-        <w:t xml:space="preserve">prediction_error_t = 1 − cos(x_pred_t, x_t)</w:t>
-      </w:r>
-    </w:p>
-    <w:p>
-      <w:pPr>
-        <w:pStyle w:val="Equation"/>
-      </w:pPr>
-      <w:r>
-        <w:rPr>
-          <w:rFonts w:ascii="Courier New" w:cs="Courier New" w:eastAsia="Courier New" w:hAnsi="Courier New"/>
-          <w:sz w:val="20"/>
-          <w:szCs w:val="20"/>
-        </w:rPr>
-        <w:t xml:space="preserve">err_max = 0.5</w:t>
-      </w:r>
-    </w:p>
-    <w:p>
-      <w:pPr>
-        <w:pStyle w:val="Equation"/>
-      </w:pPr>
-      <w:r>
-        <w:rPr>
-          <w:rFonts w:ascii="Courier New" w:cs="Courier New" w:eastAsia="Courier New" w:hAnsi="Courier New"/>
-          <w:sz w:val="20"/>
-          <w:szCs w:val="20"/>
-        </w:rPr>
-        <w:t xml:space="preserve">surprisal_t ← clamp(prediction_error_t / err_max, 0, 1)</w:t>
-      </w:r>
-    </w:p>
-    <w:p>
-      <w:pPr>
-        <w:pStyle w:val="Heading2"/>
-      </w:pPr>
-      <w:r>
-        <w:t xml:space="preserve">3.2 Metric Weight Blending</w:t>
-      </w:r>
-    </w:p>
-    <w:p>
-      <w:pPr>
-        <w:pStyle w:val="Equation"/>
-      </w:pPr>
-      <w:r>
-        <w:rPr>
-          <w:rFonts w:ascii="Courier New" w:cs="Courier New" w:eastAsia="Courier New" w:hAnsi="Courier New"/>
-          <w:sz w:val="20"/>
-          <w:szCs w:val="20"/>
-        </w:rPr>
-        <w:t xml:space="preserve">w_bootstrap[i] ← sigmoid(c_F[i]×F + c_S[i]×S + c_T[i]×T + d_i)</w:t>
-      </w:r>
-    </w:p>
-    <w:p>
-      <w:pPr>
-        <w:pStyle w:val="Equation"/>
-      </w:pPr>
-      <w:r>
-        <w:rPr>
-          <w:rFonts w:ascii="Courier New" w:cs="Courier New" w:eastAsia="Courier New" w:hAnsi="Courier New"/>
-          <w:sz w:val="20"/>
-          <w:szCs w:val="20"/>
-        </w:rPr>
-        <w:t xml:space="preserve">φ(T) = 0.90 + 0.09T</w:t>
-      </w:r>
-    </w:p>
-    <w:p>
-      <w:pPr>
-        <w:pStyle w:val="Equation"/>
-      </w:pPr>
-      <w:r>
-        <w:rPr>
-          <w:rFonts w:ascii="Courier New" w:cs="Courier New" w:eastAsia="Courier New" w:hAnsi="Courier New"/>
-          <w:sz w:val="20"/>
-          <w:szCs w:val="20"/>
-        </w:rPr>
-        <w:t xml:space="preserve">N ← round(lerp(64, 512, T))  # fitting window</w:t>
-      </w:r>
-    </w:p>
-    <w:p>
-      <w:pPr>
-        <w:pStyle w:val="Equation"/>
-      </w:pPr>
-      <w:r>
-        <w:rPr>
-          <w:rFonts w:ascii="Courier New" w:cs="Courier New" w:eastAsia="Courier New" w:hAnsi="Courier New"/>
-          <w:sz w:val="20"/>
-          <w:szCs w:val="20"/>
-        </w:rPr>
-        <w:t xml:space="preserve">τ_rls ← lerp(20.0, 80.0, T)</w:t>
-      </w:r>
-    </w:p>
-    <w:p>
-      <w:pPr>
-        <w:pStyle w:val="Equation"/>
-      </w:pPr>
-      <w:r>
-        <w:rPr>
-          <w:rFonts w:ascii="Courier New" w:cs="Courier New" w:eastAsia="Courier New" w:hAnsi="Courier New"/>
-          <w:sz w:val="20"/>
-          <w:szCs w:val="20"/>
-        </w:rPr>
-        <w:t xml:space="preserve">confidence_rls ← 1 − exp(−t / τ_rls)</w:t>
-      </w:r>
-    </w:p>
-    <w:p>
-      <w:pPr>
-        <w:pStyle w:val="Equation"/>
-      </w:pPr>
-      <w:r>
-        <w:rPr>
-          <w:rFonts w:ascii="Courier New" w:cs="Courier New" w:eastAsia="Courier New" w:hAnsi="Courier New"/>
-          <w:sz w:val="20"/>
-          <w:szCs w:val="20"/>
-        </w:rPr>
-        <w:t xml:space="preserve">weight_i(t) ← (1 − confidence_rls) × w_bootstrap[i] +</w:t>
-      </w:r>
-    </w:p>
-    <w:p>
-      <w:pPr>
-        <w:pStyle w:val="Equation"/>
-      </w:pPr>
-      <w:r>
-        <w:rPr>
-          <w:rFonts w:ascii="Courier New" w:cs="Courier New" w:eastAsia="Courier New" w:hAnsi="Courier New"/>
-          <w:sz w:val="20"/>
-          <w:szCs w:val="20"/>
-        </w:rPr>
-        <w:t xml:space="preserve">               confidence_rls × w_rls[i]</w:t>
-      </w:r>
-    </w:p>
-    <w:p>
-      <w:pPr>
-        <w:pStyle w:val="Heading2"/>
-      </w:pPr>
-      <w:r>
-        <w:t xml:space="preserve">3.3 Score Normalization</w:t>
+        <w:t xml:space="preserve">3.3.1 Score Normalization</w:t>
       </w:r>
     </w:p>
     <w:p>

</xml_diff>

<commit_message>
feat: Integrate LiteRT-LM into the benchmark suite, enhance sensitivity feedback with redundancy storage, and update research documentation with new algorithm details.
</commit_message>
<xml_diff>
--- a/docs/research/algorithms.docx
+++ b/docs/research/algorithms.docx
@@ -2427,6 +2427,162 @@
           </w:p>
         </w:tc>
       </w:tr>
+      <w:tr>
+        <w:tc>
+          <w:tcPr>
+            <w:tcBorders>
+              <w:top w:val="single" w:color="999999" w:sz="1"/>
+              <w:left w:val="single" w:color="999999" w:sz="1"/>
+              <w:bottom w:val="single" w:color="999999" w:sz="1"/>
+              <w:right w:val="single" w:color="999999" w:sz="1"/>
+            </w:tcBorders>
+          </w:tcPr>
+          <w:p>
+            <w:r>
+              <w:t xml:space="preserve">Contradiction</w:t>
+            </w:r>
+          </w:p>
+        </w:tc>
+        <w:tc>
+          <w:tcPr>
+            <w:tcBorders>
+              <w:top w:val="single" w:color="999999" w:sz="1"/>
+              <w:left w:val="single" w:color="999999" w:sz="1"/>
+              <w:bottom w:val="single" w:color="999999" w:sz="1"/>
+              <w:right w:val="single" w:color="999999" w:sz="1"/>
+            </w:tcBorders>
+          </w:tcPr>
+          <w:p>
+            <w:r>
+              <w:t xml:space="preserve">↑S, ↓F</w:t>
+            </w:r>
+          </w:p>
+        </w:tc>
+        <w:tc>
+          <w:tcPr>
+            <w:tcBorders>
+              <w:top w:val="single" w:color="999999" w:sz="1"/>
+              <w:left w:val="single" w:color="999999" w:sz="1"/>
+              <w:bottom w:val="single" w:color="999999" w:sz="1"/>
+              <w:right w:val="single" w:color="999999" w:sz="1"/>
+            </w:tcBorders>
+          </w:tcPr>
+          <w:p>
+            <w:r>
+              <w:rPr>
+                <w:rFonts w:ascii="Courier New" w:cs="Courier New" w:eastAsia="Courier New" w:hAnsi="Courier New"/>
+                <w:sz w:val="20"/>
+                <w:szCs w:val="20"/>
+              </w:rPr>
+              <w:t xml:space="preserve">max(0, S − F)</w:t>
+            </w:r>
+          </w:p>
+        </w:tc>
+      </w:tr>
+      <w:tr>
+        <w:tc>
+          <w:tcPr>
+            <w:tcBorders>
+              <w:top w:val="single" w:color="999999" w:sz="1"/>
+              <w:left w:val="single" w:color="999999" w:sz="1"/>
+              <w:bottom w:val="single" w:color="999999" w:sz="1"/>
+              <w:right w:val="single" w:color="999999" w:sz="1"/>
+            </w:tcBorders>
+          </w:tcPr>
+          <w:p>
+            <w:r>
+              <w:t xml:space="preserve">Periphery</w:t>
+            </w:r>
+          </w:p>
+        </w:tc>
+        <w:tc>
+          <w:tcPr>
+            <w:tcBorders>
+              <w:top w:val="single" w:color="999999" w:sz="1"/>
+              <w:left w:val="single" w:color="999999" w:sz="1"/>
+              <w:bottom w:val="single" w:color="999999" w:sz="1"/>
+              <w:right w:val="single" w:color="999999" w:sz="1"/>
+            </w:tcBorders>
+          </w:tcPr>
+          <w:p>
+            <w:r>
+              <w:t xml:space="preserve">↑T</w:t>
+            </w:r>
+          </w:p>
+        </w:tc>
+        <w:tc>
+          <w:tcPr>
+            <w:tcBorders>
+              <w:top w:val="single" w:color="999999" w:sz="1"/>
+              <w:left w:val="single" w:color="999999" w:sz="1"/>
+              <w:bottom w:val="single" w:color="999999" w:sz="1"/>
+              <w:right w:val="single" w:color="999999" w:sz="1"/>
+            </w:tcBorders>
+          </w:tcPr>
+          <w:p>
+            <w:r>
+              <w:rPr>
+                <w:rFonts w:ascii="Courier New" w:cs="Courier New" w:eastAsia="Courier New" w:hAnsi="Courier New"/>
+                <w:sz w:val="20"/>
+                <w:szCs w:val="20"/>
+              </w:rPr>
+              <w:t xml:space="preserve">(1 − relevance) × T</w:t>
+            </w:r>
+          </w:p>
+        </w:tc>
+      </w:tr>
+      <w:tr>
+        <w:tc>
+          <w:tcPr>
+            <w:tcBorders>
+              <w:top w:val="single" w:color="999999" w:sz="1"/>
+              <w:left w:val="single" w:color="999999" w:sz="1"/>
+              <w:bottom w:val="single" w:color="999999" w:sz="1"/>
+              <w:right w:val="single" w:color="999999" w:sz="1"/>
+            </w:tcBorders>
+          </w:tcPr>
+          <w:p>
+            <w:r>
+              <w:t xml:space="preserve">Coverage</w:t>
+            </w:r>
+          </w:p>
+        </w:tc>
+        <w:tc>
+          <w:tcPr>
+            <w:tcBorders>
+              <w:top w:val="single" w:color="999999" w:sz="1"/>
+              <w:left w:val="single" w:color="999999" w:sz="1"/>
+              <w:bottom w:val="single" w:color="999999" w:sz="1"/>
+              <w:right w:val="single" w:color="999999" w:sz="1"/>
+            </w:tcBorders>
+          </w:tcPr>
+          <w:p>
+            <w:r>
+              <w:t xml:space="preserve">↑F</w:t>
+            </w:r>
+          </w:p>
+        </w:tc>
+        <w:tc>
+          <w:tcPr>
+            <w:tcBorders>
+              <w:top w:val="single" w:color="999999" w:sz="1"/>
+              <w:left w:val="single" w:color="999999" w:sz="1"/>
+              <w:bottom w:val="single" w:color="999999" w:sz="1"/>
+              <w:right w:val="single" w:color="999999" w:sz="1"/>
+            </w:tcBorders>
+          </w:tcPr>
+          <w:p>
+            <w:r>
+              <w:rPr>
+                <w:rFonts w:ascii="Courier New" w:cs="Courier New" w:eastAsia="Courier New" w:hAnsi="Courier New"/>
+                <w:sz w:val="20"/>
+                <w:szCs w:val="20"/>
+              </w:rPr>
+              <w:t xml:space="preserve">F × relevance</w:t>
+            </w:r>
+          </w:p>
+        </w:tc>
+      </w:tr>
     </w:tbl>
     <w:p>
       <w:pPr>

</xml_diff>

<commit_message>
refactor: Extract shared algorithm content from paper.js into algorithms.js
- algorithms.js now contains all algorithm sections with full prose and exports
  them via createAlgorithmSections(offset) for flexible section numbering
- paper.js imports from algorithms.js, reducing from ~1300 to ~275 lines
- Eliminates code duplication while preserving identical paper.docx output
- algorithms.docx now includes full prose (previously terse equations only)

🤖 Generated with [Claude Code](https://claude.com/claude-code)

Co-Authored-By: Claude Opus 4.5 <noreply@anthropic.com>
</commit_message>
<xml_diff>
--- a/docs/research/algorithms.docx
+++ b/docs/research/algorithms.docx
@@ -171,17 +171,10 @@
     </w:p>
     <w:p>
       <w:r>
-        <w:t xml:space="preserve">Cortext is governed by three continuous control parameters:</w:t>
-      </w:r>
-    </w:p>
-    <w:p>
-      <w:pPr>
-        <w:pStyle w:val="ListParagraph"/>
-        <w:numPr>
-          <w:ilvl w:val="0"/>
-          <w:numId w:val="2"/>
-        </w:numPr>
-      </w:pPr>
+        <w:t xml:space="preserve">Cortext is governed by three continuous control parameters, each representing a distinct dimension of cognitive regulation:</w:t>
+      </w:r>
+    </w:p>
+    <w:p>
       <w:r>
         <w:rPr>
           <w:b/>
@@ -190,17 +183,10 @@
         <w:t xml:space="preserve">Focus (F ∈ [0, 1]): </w:t>
       </w:r>
       <w:r>
-        <w:t xml:space="preserve">Perceptual selectivity and precision.</w:t>
-      </w:r>
-    </w:p>
-    <w:p>
-      <w:pPr>
-        <w:pStyle w:val="ListParagraph"/>
-        <w:numPr>
-          <w:ilvl w:val="0"/>
-          <w:numId w:val="2"/>
-        </w:numPr>
-      </w:pPr>
+        <w:t xml:space="preserve">Perceptual selectivity and precision. Higher Focus narrows attention, increases relevance weighting, and reduces retrieval breadth. Focus modulates the trade-off between exploitation of known-relevant information and exploration of potentially useful context.</w:t>
+      </w:r>
+    </w:p>
+    <w:p>
       <w:r>
         <w:rPr>
           <w:b/>
@@ -209,17 +195,10 @@
         <w:t xml:space="preserve">Sensitivity (S ∈ [0, 1]): </w:t>
       </w:r>
       <w:r>
-        <w:t xml:space="preserve">Plasticity and affective gain.</w:t>
-      </w:r>
-    </w:p>
-    <w:p>
-      <w:pPr>
-        <w:pStyle w:val="ListParagraph"/>
-        <w:numPr>
-          <w:ilvl w:val="0"/>
-          <w:numId w:val="2"/>
-        </w:numPr>
-      </w:pPr>
+        <w:t xml:space="preserve">Plasticity and affective gain. Higher Sensitivity accelerates learning, increases emotional and novelty responsiveness, and raises write-rate targets. Sensitivity governs how readily the system captures novel information and responds to salient stimuli.</w:t>
+      </w:r>
+    </w:p>
+    <w:p>
       <w:r>
         <w:rPr>
           <w:b/>
@@ -228,7 +207,12 @@
         <w:t xml:space="preserve">Stability (T ∈ [0, 1]): </w:t>
       </w:r>
       <w:r>
-        <w:t xml:space="preserve">Temporal persistence and inertia.</w:t>
+        <w:t xml:space="preserve">Temporal persistence and inertia. Higher Stability lengthens memory half-lives, widens hysteresis bands, slows adaptive updates, and tightens safety bounds over time. Stability controls the resistance to change and the preservation of established knowledge.</w:t>
+      </w:r>
+    </w:p>
+    <w:p>
+      <w:r>
+        <w:t xml:space="preserve">A central design principle is that knobs set rates rather than modes. Behavioral differences emerge continuously from parameter interactions; there are no hard-coded phase transitions or discrete operational states.</w:t>
       </w:r>
     </w:p>
     <w:p>
@@ -240,6 +224,11 @@
       </w:r>
     </w:p>
     <w:p>
+      <w:r>
+        <w:t xml:space="preserve">All system tunables derive from the three primary knobs. This section catalogs the key derivations.</w:t>
+      </w:r>
+    </w:p>
+    <w:p>
       <w:pPr>
         <w:pStyle w:val="Heading3"/>
       </w:pPr>
@@ -287,6 +276,11 @@
       </w:r>
     </w:p>
     <w:p>
+      <w:r>
+        <w:t xml:space="preserve">The context window n_ctx determines how many recent items inform relevance computation. The scoring window w_score controls the lookback for variance estimation and percentile calculation. The rate window w_rate_seconds specifies the temporal horizon for write-rate measurement.</w:t>
+      </w:r>
+    </w:p>
+    <w:p>
       <w:pPr>
         <w:pStyle w:val="Heading3"/>
       </w:pPr>
@@ -295,6 +289,11 @@
       </w:r>
     </w:p>
     <w:p>
+      <w:r>
+        <w:t xml:space="preserve">Memory half-life follows a log-scale mapping to span multiple orders of magnitude:</w:t>
+      </w:r>
+    </w:p>
+    <w:p>
       <w:pPr>
         <w:pStyle w:val="Equation"/>
       </w:pPr>
@@ -334,6 +333,11 @@
       </w:r>
     </w:p>
     <w:p>
+      <w:r>
+        <w:t xml:space="preserve">This exponential mapping ensures that low Stability yields half-lives near 2 minutes while high Stability approaches 12 hours, with smooth interpolation across the range.</w:t>
+      </w:r>
+    </w:p>
+    <w:p>
       <w:pPr>
         <w:pStyle w:val="Heading3"/>
       </w:pPr>
@@ -394,6 +398,11 @@
       </w:r>
     </w:p>
     <w:p>
+      <w:r>
+        <w:t xml:space="preserve">The hysteresis band prevents oscillation in threshold-crossing decisions. Write-rate targets establish homeostatic setpoints for the threshold controller.</w:t>
+      </w:r>
+    </w:p>
+    <w:p>
       <w:pPr>
         <w:pStyle w:val="Heading3"/>
       </w:pPr>
@@ -402,6 +411,11 @@
       </w:r>
     </w:p>
     <w:p>
+      <w:r>
+        <w:t xml:space="preserve">The system tracks accumulated experience through a maturity function that governs the annealing of safety bounds:</w:t>
+      </w:r>
+    </w:p>
+    <w:p>
       <w:pPr>
         <w:pStyle w:val="Equation"/>
       </w:pPr>
@@ -428,6 +442,16 @@
       </w:r>
     </w:p>
     <w:p>
+      <w:r>
+        <w:t xml:space="preserve">where count is the total number of signals processed. This produces asymptotic approach to unit maturity, with higher Stability slowing the progression to reflect greater conservatism.</w:t>
+      </w:r>
+    </w:p>
+    <w:p>
+      <w:r>
+        <w:t xml:space="preserve">Safety bounds on the dynamic threshold anneal with maturity:</w:t>
+      </w:r>
+    </w:p>
+    <w:p>
       <w:pPr>
         <w:pStyle w:val="Equation"/>
       </w:pPr>
@@ -467,6 +491,11 @@
       </w:r>
     </w:p>
     <w:p>
+      <w:r>
+        <w:t xml:space="preserve">Early operation permits wide threshold excursions; mature operation constrains movement to a narrower band.</w:t>
+      </w:r>
+    </w:p>
+    <w:p>
       <w:pPr>
         <w:pStyle w:val="Heading2"/>
       </w:pPr>
@@ -475,6 +504,11 @@
       </w:r>
     </w:p>
     <w:p>
+      <w:r>
+        <w:t xml:space="preserve">Uncertainty u(t) ∈ [0, 1] modulates learning rates and evidence weighting. The raw uncertainty estimate blends multiple signals:</w:t>
+      </w:r>
+    </w:p>
+    <w:p>
       <w:pPr>
         <w:pStyle w:val="Equation"/>
       </w:pPr>
@@ -514,6 +548,11 @@
       </w:r>
     </w:p>
     <w:p>
+      <w:r>
+        <w:t xml:space="preserve">When prediction error signals are available, novelty and surprisal are blended:</w:t>
+      </w:r>
+    </w:p>
+    <w:p>
       <w:pPr>
         <w:pStyle w:val="Equation"/>
       </w:pPr>
@@ -540,6 +579,11 @@
       </w:r>
     </w:p>
     <w:p>
+      <w:r>
+        <w:t xml:space="preserve">The final raw uncertainty combines these components with knob-derived weights:</w:t>
+      </w:r>
+    </w:p>
+    <w:p>
       <w:pPr>
         <w:pStyle w:val="Equation"/>
       </w:pPr>
@@ -592,6 +636,11 @@
       </w:r>
     </w:p>
     <w:p>
+      <w:r>
+        <w:t xml:space="preserve">Smoothed uncertainty applies EWMA with a stability-dependent rate:</w:t>
+      </w:r>
+    </w:p>
+    <w:p>
       <w:pPr>
         <w:pStyle w:val="Equation"/>
       </w:pPr>
@@ -619,7 +668,7 @@
     </w:p>
     <w:p>
       <w:r>
-        <w:t xml:space="preserve">When structural metrics are unavailable, the fallback is u_raw(t) = 1 − maturity(t).</w:t>
+        <w:t xml:space="preserve">When structural metrics are unavailable, the fallback is u_raw(t) = 1 − maturity(t), ensuring high uncertainty during early operation.</w:t>
       </w:r>
     </w:p>
     <w:p>
@@ -636,6 +685,11 @@
       </w:r>
     </w:p>
     <w:p>
+      <w:r>
+        <w:t xml:space="preserve">This section presents the algorithms governing adaptation along each of the three primary dimensions. Each algorithm consists of a prior computation (executed at initialization) and a dynamic update (executed per signal).</w:t>
+      </w:r>
+    </w:p>
+    <w:p>
       <w:pPr>
         <w:pStyle w:val="Heading2"/>
       </w:pPr>
@@ -644,6 +698,11 @@
       </w:r>
     </w:p>
     <w:p>
+      <w:r>
+        <w:t xml:space="preserve">Focus governs perceptual selectivity through relevance weighting and attention width.</w:t>
+      </w:r>
+    </w:p>
+    <w:p>
       <w:pPr>
         <w:pStyle w:val="Heading3"/>
       </w:pPr>
@@ -652,6 +711,11 @@
       </w:r>
     </w:p>
     <w:p>
+      <w:r>
+        <w:t xml:space="preserve">Given Focus knob F ∈ [0, 1], compute initial priors:</w:t>
+      </w:r>
+    </w:p>
+    <w:p>
       <w:pPr>
         <w:pStyle w:val="Equation"/>
       </w:pPr>
@@ -704,6 +768,11 @@
       </w:r>
     </w:p>
     <w:p>
+      <w:r>
+        <w:t xml:space="preserve">The attention width (in radians) controls the angular spread of the receptive field in embedding space. High Focus produces narrow attention (0.1π), while low Focus permits broad capture (π).</w:t>
+      </w:r>
+    </w:p>
+    <w:p>
       <w:pPr>
         <w:pStyle w:val="Heading3"/>
       </w:pPr>
@@ -712,6 +781,11 @@
       </w:r>
     </w:p>
     <w:p>
+      <w:r>
+        <w:t xml:space="preserve">At each signal event t with input embedding x_t:</w:t>
+      </w:r>
+    </w:p>
+    <w:p>
       <w:pPr>
         <w:pStyle w:val="Equation"/>
       </w:pPr>
@@ -764,6 +838,16 @@
       </w:r>
     </w:p>
     <w:p>
+      <w:r>
+        <w:t xml:space="preserve">where map01(z) = clamp((z + 1) / 2, 0, 1) transforms cosine values from [−1, 1] to [0, 1].</w:t>
+      </w:r>
+    </w:p>
+    <w:p>
+      <w:r>
+        <w:t xml:space="preserve">The learning rate α_F(t) is modulated by uncertainty:</w:t>
+      </w:r>
+    </w:p>
+    <w:p>
       <w:pPr>
         <w:pStyle w:val="Equation"/>
       </w:pPr>
@@ -790,6 +874,11 @@
       </w:r>
     </w:p>
     <w:p>
+      <w:r>
+        <w:t xml:space="preserve">High uncertainty increases learning rate, allowing faster adaptation when the environment is volatile. The Focus knob scales the uncertainty responsiveness.</w:t>
+      </w:r>
+    </w:p>
+    <w:p>
       <w:pPr>
         <w:pStyle w:val="Heading2"/>
       </w:pPr>
@@ -798,6 +887,11 @@
       </w:r>
     </w:p>
     <w:p>
+      <w:r>
+        <w:t xml:space="preserve">Sensitivity governs learning speed, emotional responsiveness, and novelty capture.</w:t>
+      </w:r>
+    </w:p>
+    <w:p>
       <w:pPr>
         <w:pStyle w:val="Heading3"/>
       </w:pPr>
@@ -806,6 +900,11 @@
       </w:r>
     </w:p>
     <w:p>
+      <w:r>
+        <w:t xml:space="preserve">Given Sensitivity knob S ∈ [0, 1], compute initial priors:</w:t>
+      </w:r>
+    </w:p>
+    <w:p>
       <w:pPr>
         <w:pStyle w:val="Equation"/>
       </w:pPr>
@@ -918,6 +1017,11 @@
       </w:r>
     </w:p>
     <w:p>
+      <w:r>
+        <w:t xml:space="preserve">When emotion category centroids are available, the system projects input embeddings onto a discrete emotion space C = {anger, fear, joy, love, sadness, surprise}. Inspired by Russell's (1980) circumplex model, each category maps to valence and arousal coordinates:</w:t>
+      </w:r>
+    </w:p>
+    <w:p>
       <w:pPr>
         <w:pStyle w:val="Equation"/>
       </w:pPr>
@@ -970,6 +1074,11 @@
       </w:r>
     </w:p>
     <w:p>
+      <w:r>
+        <w:t xml:space="preserve">The projection procedure:</w:t>
+      </w:r>
+    </w:p>
+    <w:p>
       <w:pPr>
         <w:pStyle w:val="Equation"/>
       </w:pPr>
@@ -1126,6 +1235,11 @@
       </w:r>
     </w:p>
     <w:p>
+      <w:r>
+        <w:t xml:space="preserve">The emotion intensity combines peak probability with distributional confidence via geometric mean, providing a measure that is high only when a single emotion dominates with high certainty.</w:t>
+      </w:r>
+    </w:p>
+    <w:p>
       <w:pPr>
         <w:pStyle w:val="Heading3"/>
       </w:pPr>
@@ -1134,6 +1248,11 @@
       </w:r>
     </w:p>
     <w:p>
+      <w:r>
+        <w:t xml:space="preserve">Emotional activation loosens write thresholds to capture salient moments:</w:t>
+      </w:r>
+    </w:p>
+    <w:p>
       <w:pPr>
         <w:pStyle w:val="Equation"/>
       </w:pPr>
@@ -1173,6 +1292,11 @@
       </w:r>
     </w:p>
     <w:p>
+      <w:r>
+        <w:t xml:space="preserve">This negative adjustment makes writing more likely during emotionally salient events, consistent with McGaugh's (2004) findings on arousal-enhanced encoding.</w:t>
+      </w:r>
+    </w:p>
+    <w:p>
       <w:pPr>
         <w:pStyle w:val="Heading3"/>
       </w:pPr>
@@ -1181,6 +1305,11 @@
       </w:r>
     </w:p>
     <w:p>
+      <w:r>
+        <w:t xml:space="preserve">Distinct from instantaneous emotion, the mood state M_t maintains a persistent background affective tone:</w:t>
+      </w:r>
+    </w:p>
+    <w:p>
       <w:pPr>
         <w:pStyle w:val="Equation"/>
       </w:pPr>
@@ -1233,6 +1362,11 @@
       </w:r>
     </w:p>
     <w:p>
+      <w:r>
+        <w:t xml:space="preserve">Note that this update does not enforce coefficient normalization; the explicit clamp handles potential accumulation. The mood state provides a separate threshold bias:</w:t>
+      </w:r>
+    </w:p>
+    <w:p>
       <w:pPr>
         <w:pStyle w:val="Equation"/>
       </w:pPr>
@@ -1280,6 +1414,11 @@
       </w:r>
     </w:p>
     <w:p>
+      <w:r>
+        <w:t xml:space="preserve">Stability governs temporal dynamics through half-life, decay rates, and hysteresis.</w:t>
+      </w:r>
+    </w:p>
+    <w:p>
       <w:pPr>
         <w:pStyle w:val="Heading3"/>
       </w:pPr>
@@ -1288,6 +1427,11 @@
       </w:r>
     </w:p>
     <w:p>
+      <w:r>
+        <w:t xml:space="preserve">Given Stability knob T ∈ [0, 1], compute initial priors:</w:t>
+      </w:r>
+    </w:p>
+    <w:p>
       <w:pPr>
         <w:pStyle w:val="Equation"/>
       </w:pPr>
@@ -1374,6 +1518,11 @@
       </w:r>
     </w:p>
     <w:p>
+      <w:r>
+        <w:t xml:space="preserve">At each signal event, compute retention statistics and adjust half-life:</w:t>
+      </w:r>
+    </w:p>
+    <w:p>
       <w:pPr>
         <w:pStyle w:val="Equation"/>
       </w:pPr>
@@ -1426,6 +1575,11 @@
       </w:r>
     </w:p>
     <w:p>
+      <w:r>
+        <w:t xml:space="preserve">Compute z-score relative to recent retention history:</w:t>
+      </w:r>
+    </w:p>
+    <w:p>
       <w:pPr>
         <w:pStyle w:val="Equation"/>
       </w:pPr>
@@ -1478,6 +1632,11 @@
       </w:r>
     </w:p>
     <w:p>
+      <w:r>
+        <w:t xml:space="preserve">The target half-life incorporates feedback adjustment from the stability feedback mechanism (Section 7.3):</w:t>
+      </w:r>
+    </w:p>
+    <w:p>
       <w:pPr>
         <w:pStyle w:val="Equation"/>
       </w:pPr>
@@ -1585,6 +1744,11 @@
       </w:r>
     </w:p>
     <w:p>
+      <w:r>
+        <w:t xml:space="preserve">Coherence measures integration of the current signal with context:</w:t>
+      </w:r>
+    </w:p>
+    <w:p>
       <w:pPr>
         <w:pStyle w:val="Equation"/>
       </w:pPr>
@@ -1611,16 +1775,8 @@
       </w:r>
     </w:p>
     <w:p>
-      <w:pPr>
-        <w:pStyle w:val="Equation"/>
-      </w:pPr>
-      <w:r>
-        <w:rPr>
-          <w:rFonts w:ascii="Courier New" w:cs="Courier New" w:eastAsia="Courier New" w:hAnsi="Courier New"/>
-          <w:sz w:val="20"/>
-          <w:szCs w:val="20"/>
-        </w:rPr>
-        <w:t xml:space="preserve">F_eff = F × (0.5 + 0.5 × coherence_t)</w:t>
+      <w:r>
+        <w:t xml:space="preserve">High coherence (low variance in similarities) indicates the signal fits consistently with context. The effective Focus is modulated: F_eff = F × (0.5 + 0.5 × coherence_t).</w:t>
       </w:r>
     </w:p>
     <w:p>
@@ -1632,6 +1788,11 @@
       </w:r>
     </w:p>
     <w:p>
+      <w:r>
+        <w:t xml:space="preserve">Focus spread quantifies the entropy of attention over nearest neighbors:</w:t>
+      </w:r>
+    </w:p>
+    <w:p>
       <w:pPr>
         <w:pStyle w:val="Equation"/>
       </w:pPr>
@@ -1671,16 +1832,8 @@
       </w:r>
     </w:p>
     <w:p>
-      <w:pPr>
-        <w:pStyle w:val="Equation"/>
-      </w:pPr>
-      <w:r>
-        <w:rPr>
-          <w:rFonts w:ascii="Courier New" w:cs="Courier New" w:eastAsia="Courier New" w:hAnsi="Courier New"/>
-          <w:sz w:val="20"/>
-          <w:szCs w:val="20"/>
-        </w:rPr>
-        <w:t xml:space="preserve">F_eff ← F_eff × (1 − focus_spread_t)</w:t>
+      <w:r>
+        <w:t xml:space="preserve">Values near 1 indicate diffuse attention; values near 0 indicate concentrated attention. The effective Focus is further modulated: F_eff ← F_eff × (1 − focus_spread_t).</w:t>
       </w:r>
     </w:p>
     <w:p>
@@ -1692,6 +1845,11 @@
       </w:r>
     </w:p>
     <w:p>
+      <w:r>
+        <w:t xml:space="preserve">Drift measures directional change in context centroids:</w:t>
+      </w:r>
+    </w:p>
+    <w:p>
       <w:pPr>
         <w:pStyle w:val="Equation"/>
       </w:pPr>
@@ -1731,6 +1889,11 @@
       </w:r>
     </w:p>
     <w:p>
+      <w:r>
+        <w:t xml:space="preserve">Since both centroids are unit-normalized, drift_mag_t ∈ [0, 2]. A threshold determines episode boundaries:</w:t>
+      </w:r>
+    </w:p>
+    <w:p>
       <w:pPr>
         <w:pStyle w:val="Equation"/>
       </w:pPr>
@@ -1778,6 +1941,11 @@
       </w:r>
     </w:p>
     <w:p>
+      <w:r>
+        <w:t xml:space="preserve">We measure surprisal as the deviation of the current embedding from the predicted trajectory in latent space:</w:t>
+      </w:r>
+    </w:p>
+    <w:p>
       <w:pPr>
         <w:pStyle w:val="Equation"/>
       </w:pPr>
@@ -1830,6 +1998,11 @@
       </w:r>
     </w:p>
     <w:p>
+      <w:r>
+        <w:t xml:space="preserve">This error is normalized to produce the surprisal signal:</w:t>
+      </w:r>
+    </w:p>
+    <w:p>
       <w:pPr>
         <w:pStyle w:val="Equation"/>
       </w:pPr>
@@ -1853,6 +2026,11 @@
           <w:szCs w:val="20"/>
         </w:rPr>
         <w:t xml:space="preserve">surprisal_t ← clamp(prediction_error_t / err_max, 0, 1)</w:t>
+      </w:r>
+    </w:p>
+    <w:p>
+      <w:r>
+        <w:t xml:space="preserve">This formulation captures purely kinematic surprise in the thought process</w:t>
       </w:r>
     </w:p>
     <w:p>
@@ -2601,6 +2779,11 @@
       </w:r>
     </w:p>
     <w:p>
+      <w:r>
+        <w:t xml:space="preserve">Metric weights adapt online using recursive least squares (RLS) to minimize prediction error between composite scores and observed outcomes. Initial weights derive from bootstrap coefficients:</w:t>
+      </w:r>
+    </w:p>
+    <w:p>
       <w:pPr>
         <w:pStyle w:val="Equation"/>
       </w:pPr>
@@ -2614,6 +2797,11 @@
       </w:r>
     </w:p>
     <w:p>
+      <w:r>
+        <w:t xml:space="preserve">RLS fitting updates coefficients with stability-dependent forgetting:</w:t>
+      </w:r>
+    </w:p>
+    <w:p>
       <w:pPr>
         <w:pStyle w:val="Equation"/>
       </w:pPr>
@@ -2640,6 +2828,11 @@
       </w:r>
     </w:p>
     <w:p>
+      <w:r>
+        <w:t xml:space="preserve">The fitted weights blend with bootstrap weights based on RLS confidence:</w:t>
+      </w:r>
+    </w:p>
+    <w:p>
       <w:pPr>
         <w:pStyle w:val="Equation"/>
       </w:pPr>
@@ -2700,6 +2893,11 @@
       </w:r>
     </w:p>
     <w:p>
+      <w:r>
+        <w:t xml:space="preserve">Composite score computation requires careful normalization:</w:t>
+      </w:r>
+    </w:p>
+    <w:p>
       <w:pPr>
         <w:pStyle w:val="Equation"/>
       </w:pPr>
@@ -2779,6 +2977,11 @@
     </w:p>
     <w:p>
       <w:r>
+        <w:t xml:space="preserve">Weight normalization is critical: with 12 metrics and raw weights averaging ~0.6, the sum approaches 7.2. Without normalization, weighted sums would saturate and collapse variance.</w:t>
+      </w:r>
+    </w:p>
+    <w:p>
+      <w:r>
         <w:br w:type="page"/>
       </w:r>
     </w:p>
@@ -2791,6 +2994,11 @@
       </w:r>
     </w:p>
     <w:p>
+      <w:r>
+        <w:t xml:space="preserve">The write gate compares composite scores against an adaptive threshold θ_dynamic. This section details the threshold evolution algorithm incorporating Bayesian prior-evidence blending and homeostatic rate control.</w:t>
+      </w:r>
+    </w:p>
+    <w:p>
       <w:pPr>
         <w:pStyle w:val="Heading2"/>
       </w:pPr>
@@ -2799,6 +3007,11 @@
       </w:r>
     </w:p>
     <w:p>
+      <w:r>
+        <w:t xml:space="preserve">The threshold prior derives from knob settings:</w:t>
+      </w:r>
+    </w:p>
+    <w:p>
       <w:pPr>
         <w:pStyle w:val="Equation"/>
       </w:pPr>
@@ -2812,6 +3025,11 @@
       </w:r>
     </w:p>
     <w:p>
+      <w:r>
+        <w:t xml:space="preserve">Observed evidence comes from the 90th percentile of recent scores:</w:t>
+      </w:r>
+    </w:p>
+    <w:p>
       <w:pPr>
         <w:pStyle w:val="Equation"/>
       </w:pPr>
@@ -2838,6 +3056,11 @@
       </w:r>
     </w:p>
     <w:p>
+      <w:r>
+        <w:t xml:space="preserve">Prior and evidence masses weight the blend:</w:t>
+      </w:r>
+    </w:p>
+    <w:p>
       <w:pPr>
         <w:pStyle w:val="Equation"/>
       </w:pPr>
@@ -2864,6 +3087,11 @@
       </w:r>
     </w:p>
     <w:p>
+      <w:r>
+        <w:t xml:space="preserve">The target threshold blends prior and evidence:</w:t>
+      </w:r>
+    </w:p>
+    <w:p>
       <w:pPr>
         <w:pStyle w:val="Equation"/>
       </w:pPr>
@@ -2890,6 +3118,11 @@
       </w:r>
     </w:p>
     <w:p>
+      <w:r>
+        <w:t xml:space="preserve">High Stability increases prior mass, making the system more resistant to observed deviations. High uncertainty increases evidence mass, allowing faster adaptation to volatile conditions.</w:t>
+      </w:r>
+    </w:p>
+    <w:p>
       <w:pPr>
         <w:pStyle w:val="Heading2"/>
       </w:pPr>
@@ -2898,6 +3131,11 @@
       </w:r>
     </w:p>
     <w:p>
+      <w:r>
+        <w:t xml:space="preserve">The controller maintains write rates near the target setpoint through continuous-time estimation with effective sample size (ESS) reliability weighting.</w:t>
+      </w:r>
+    </w:p>
+    <w:p>
       <w:pPr>
         <w:pStyle w:val="Heading3"/>
       </w:pPr>
@@ -2971,6 +3209,11 @@
       </w:r>
     </w:p>
     <w:p>
+      <w:r>
+        <w:t xml:space="preserve">The rate time constant scales with Stability:</w:t>
+      </w:r>
+    </w:p>
+    <w:p>
       <w:pPr>
         <w:pStyle w:val="Equation"/>
       </w:pPr>
@@ -2997,6 +3240,11 @@
       </w:r>
     </w:p>
     <w:p>
+      <w:r>
+        <w:t xml:space="preserve">Instantaneous rate estimation with bias correction:</w:t>
+      </w:r>
+    </w:p>
+    <w:p>
       <w:pPr>
         <w:pStyle w:val="Equation"/>
       </w:pPr>
@@ -3101,6 +3349,11 @@
       </w:r>
     </w:p>
     <w:p>
+      <w:r>
+        <w:t xml:space="preserve">High Stability dampens reliability, preventing aggressive corrections in conservative regimes.</w:t>
+      </w:r>
+    </w:p>
+    <w:p>
       <w:pPr>
         <w:pStyle w:val="Heading3"/>
       </w:pPr>
@@ -3109,6 +3362,11 @@
       </w:r>
     </w:p>
     <w:p>
+      <w:r>
+        <w:t xml:space="preserve">The rate error drives threshold adjustment:</w:t>
+      </w:r>
+    </w:p>
+    <w:p>
       <w:pPr>
         <w:pStyle w:val="Equation"/>
       </w:pPr>
@@ -3200,6 +3458,11 @@
       </w:r>
     </w:p>
     <w:p>
+      <w:r>
+        <w:t xml:space="preserve">The correction scales with reliability and is attenuated by both Stability and maturity, ensuring conservative, mature systems make minimal homeostatic adjustments.</w:t>
+      </w:r>
+    </w:p>
+    <w:p>
       <w:pPr>
         <w:pStyle w:val="Heading2"/>
       </w:pPr>
@@ -3208,6 +3471,11 @@
       </w:r>
     </w:p>
     <w:p>
+      <w:r>
+        <w:t xml:space="preserve">All threshold deltas combine and pass through safety limiting:</w:t>
+      </w:r>
+    </w:p>
+    <w:p>
       <w:pPr>
         <w:pStyle w:val="Equation"/>
       </w:pPr>
@@ -3286,6 +3554,11 @@
       </w:r>
     </w:p>
     <w:p>
+      <w:r>
+        <w:t xml:space="preserve">Hysteresis evolves toward the stability-derived base:</w:t>
+      </w:r>
+    </w:p>
+    <w:p>
       <w:pPr>
         <w:pStyle w:val="Equation"/>
       </w:pPr>
@@ -3346,6 +3619,11 @@
       </w:r>
     </w:p>
     <w:p>
+      <w:r>
+        <w:t xml:space="preserve">Each memory m maintains a strength value updated through use-frequency tracking and exponential decay:</w:t>
+      </w:r>
+    </w:p>
+    <w:p>
       <w:pPr>
         <w:pStyle w:val="Equation"/>
       </w:pPr>
@@ -3398,6 +3676,11 @@
       </w:r>
     </w:p>
     <w:p>
+      <w:r>
+        <w:t xml:space="preserve">Memories falling below the periphery cutoff are candidates for eviction:</w:t>
+      </w:r>
+    </w:p>
+    <w:p>
       <w:pPr>
         <w:pStyle w:val="Equation"/>
       </w:pPr>
@@ -3432,6 +3715,11 @@
       </w:r>
     </w:p>
     <w:p>
+      <w:r>
+        <w:t xml:space="preserve">When contextual gain signals are available, influence factors modulate reinforcement:</w:t>
+      </w:r>
+    </w:p>
+    <w:p>
       <w:pPr>
         <w:pStyle w:val="Equation"/>
       </w:pPr>
@@ -3492,6 +3780,11 @@
       </w:r>
     </w:p>
     <w:p>
+      <w:r>
+        <w:t xml:space="preserve">The system tracks causal influence of retrieved memories on generation quality through contextual gain—the improvement in prediction accuracy attributable to including each memory in context.</w:t>
+      </w:r>
+    </w:p>
+    <w:p>
       <w:pPr>
         <w:pStyle w:val="Heading3"/>
       </w:pPr>
@@ -3630,6 +3923,11 @@
       </w:r>
     </w:p>
     <w:p>
+      <w:r>
+        <w:t xml:space="preserve">Positive contextual gain narrows attention and boosts relevance weighting; negative gain widens attention to explore alternatives.</w:t>
+      </w:r>
+    </w:p>
+    <w:p>
       <w:pPr>
         <w:pStyle w:val="Heading3"/>
       </w:pPr>
@@ -3729,6 +4027,11 @@
       </w:r>
     </w:p>
     <w:p>
+      <w:r>
+        <w:t xml:space="preserve">This rewards novelty that proves useful while penalizing redundant retrievals.</w:t>
+      </w:r>
+    </w:p>
+    <w:p>
       <w:pPr>
         <w:pStyle w:val="Heading3"/>
       </w:pPr>
@@ -3815,6 +4118,11 @@
       </w:r>
     </w:p>
     <w:p>
+      <w:r>
+        <w:t xml:space="preserve">The mean stability of used memories provides adjustment to the half-life target:</w:t>
+      </w:r>
+    </w:p>
+    <w:p>
       <w:pPr>
         <w:pStyle w:val="Equation"/>
       </w:pPr>
@@ -3841,6 +4149,11 @@
       </w:r>
     </w:p>
     <w:p>
+      <w:r>
+        <w:t xml:space="preserve">This factor is consumed by the Stability update (Section 4.3.2), avoiding conflicting adjustments between feedback mechanisms.</w:t>
+      </w:r>
+    </w:p>
+    <w:p>
       <w:pPr>
         <w:pStyle w:val="Heading2"/>
       </w:pPr>
@@ -3849,6 +4162,11 @@
       </w:r>
     </w:p>
     <w:p>
+      <w:r>
+        <w:t xml:space="preserve">When generation embeddings are available, influence incorporates output trajectory:</w:t>
+      </w:r>
+    </w:p>
+    <w:p>
       <w:pPr>
         <w:pStyle w:val="Equation"/>
       </w:pPr>
@@ -3901,6 +4219,11 @@
       </w:r>
     </w:p>
     <w:p>
+      <w:r>
+        <w:t xml:space="preserve">Total influence blends contextual gain, generation similarity, and drift contribution:</w:t>
+      </w:r>
+    </w:p>
+    <w:p>
       <w:pPr>
         <w:pStyle w:val="Equation"/>
       </w:pPr>
@@ -3953,6 +4276,11 @@
       </w:r>
     </w:p>
     <w:p>
+      <w:r>
+        <w:t xml:space="preserve">Sustained influence accumulates over a stability-dependent horizon:</w:t>
+      </w:r>
+    </w:p>
+    <w:p>
       <w:pPr>
         <w:pStyle w:val="Equation"/>
       </w:pPr>
@@ -4018,6 +4346,11 @@
       </w:r>
     </w:p>
     <w:p>
+      <w:r>
+        <w:t xml:space="preserve">This section presents algorithms modeling higher-order cognitive phenomena: working memory maintenance, metacognitive monitoring, reconsolidation dynamics, and serial position effects.</w:t>
+      </w:r>
+    </w:p>
+    <w:p>
       <w:pPr>
         <w:pStyle w:val="Heading2"/>
       </w:pPr>
@@ -4026,6 +4359,11 @@
       </w:r>
     </w:p>
     <w:p>
+      <w:r>
+        <w:t xml:space="preserve">Following Cowan's (2001) capacity constraints, working memory maintains a limited number of active items:</w:t>
+      </w:r>
+    </w:p>
+    <w:p>
       <w:pPr>
         <w:pStyle w:val="Equation"/>
       </w:pPr>
@@ -4044,6 +4382,11 @@
       </w:r>
     </w:p>
     <w:p>
+      <w:r>
+        <w:t xml:space="preserve">Maintenance incurs cognitive cost:</w:t>
+      </w:r>
+    </w:p>
+    <w:p>
       <w:pPr>
         <w:pStyle w:val="Equation"/>
       </w:pPr>
@@ -4070,6 +4413,16 @@
       </w:r>
     </w:p>
     <w:p>
+      <w:r>
+        <w:t xml:space="preserve">The manifold_complexity represents local variance in the embedding stream: 1 - mean(cos(window)).</w:t>
+      </w:r>
+    </w:p>
+    <w:p>
+      <w:r>
+        <w:t xml:space="preserve">Gating thresholds determine entry and chunking:</w:t>
+      </w:r>
+    </w:p>
+    <w:p>
       <w:pPr>
         <w:pStyle w:val="Equation"/>
       </w:pPr>
@@ -4130,6 +4483,11 @@
       </w:r>
     </w:p>
     <w:p>
+      <w:r>
+        <w:t xml:space="preserve">The system implements feeling-of-knowing (FOK) and tip-of-tongue (TOT) detection following Hart's (1965) framework:</w:t>
+      </w:r>
+    </w:p>
+    <w:p>
       <w:pPr>
         <w:pStyle w:val="Equation"/>
       </w:pPr>
@@ -4169,6 +4527,16 @@
       </w:r>
     </w:p>
     <w:p>
+      <w:r>
+        <w:t xml:space="preserve">TOT occurs when metacognitive confidence is high but retrieval strength is low—the characteristic experience of knowing one knows something but being unable to access it.</w:t>
+      </w:r>
+    </w:p>
+    <w:p>
+      <w:r>
+        <w:t xml:space="preserve">Additional metacognitive parameters:</w:t>
+      </w:r>
+    </w:p>
+    <w:p>
       <w:pPr>
         <w:pStyle w:val="Equation"/>
       </w:pPr>
@@ -4242,6 +4610,11 @@
       </w:r>
     </w:p>
     <w:p>
+      <w:r>
+        <w:t xml:space="preserve">Following Nader et al. (2000), retrieved memories enter a labile state permitting modification:</w:t>
+      </w:r>
+    </w:p>
+    <w:p>
       <w:pPr>
         <w:pStyle w:val="Equation"/>
       </w:pPr>
@@ -4281,6 +4654,11 @@
       </w:r>
     </w:p>
     <w:p>
+      <w:r>
+        <w:t xml:space="preserve">During the lability window, memories can drift toward current context:</w:t>
+      </w:r>
+    </w:p>
+    <w:p>
       <w:pPr>
         <w:pStyle w:val="Equation"/>
       </w:pPr>
@@ -4307,6 +4685,11 @@
       </w:r>
     </w:p>
     <w:p>
+      <w:r>
+        <w:t xml:space="preserve">Reconsolidation effects propagate to semantically related memories with decay:</w:t>
+      </w:r>
+    </w:p>
+    <w:p>
       <w:pPr>
         <w:pStyle w:val="Equation"/>
       </w:pPr>
@@ -4328,6 +4711,11 @@
       </w:r>
     </w:p>
     <w:p>
+      <w:r>
+        <w:t xml:space="preserve">Retrieved memories compete through lateral inhibition, modeling retrieval-induced forgetting (Anderson et al., 1994):</w:t>
+      </w:r>
+    </w:p>
+    <w:p>
       <w:pPr>
         <w:pStyle w:val="Equation"/>
       </w:pPr>
@@ -4393,6 +4781,11 @@
       </w:r>
     </w:p>
     <w:p>
+      <w:r>
+        <w:t xml:space="preserve">High Focus produces narrow winner-take-all dynamics; low Focus permits broader activation.</w:t>
+      </w:r>
+    </w:p>
+    <w:p>
       <w:pPr>
         <w:pStyle w:val="Heading2"/>
       </w:pPr>
@@ -4401,6 +4794,11 @@
       </w:r>
     </w:p>
     <w:p>
+      <w:r>
+        <w:t xml:space="preserve">The system pre-activates memories predicted to be relevant based on trajectory extrapolation:</w:t>
+      </w:r>
+    </w:p>
+    <w:p>
       <w:pPr>
         <w:pStyle w:val="Equation"/>
       </w:pPr>
@@ -4453,6 +4851,11 @@
       </w:r>
     </w:p>
     <w:p>
+      <w:r>
+        <w:t xml:space="preserve">When predictions fail (high surprise), the system updates its trajectory model:</w:t>
+      </w:r>
+    </w:p>
+    <w:p>
       <w:pPr>
         <w:pStyle w:val="Equation"/>
       </w:pPr>
@@ -4474,6 +4877,11 @@
       </w:r>
     </w:p>
     <w:p>
+      <w:r>
+        <w:t xml:space="preserve">The architecture models primacy, recency, and distinctiveness effects observed in human memory (Murdock, 1962):</w:t>
+      </w:r>
+    </w:p>
+    <w:p>
       <w:pPr>
         <w:pStyle w:val="Equation"/>
       </w:pPr>
@@ -4526,6 +4934,11 @@
       </w:r>
     </w:p>
     <w:p>
+      <w:r>
+        <w:t xml:space="preserve">The von Restorff (isolation) effect enhances memory for distinctive items (Hunt, 1995):</w:t>
+      </w:r>
+    </w:p>
+    <w:p>
       <w:pPr>
         <w:pStyle w:val="Equation"/>
       </w:pPr>
@@ -4552,6 +4965,11 @@
       </w:r>
     </w:p>
     <w:p>
+      <w:r>
+        <w:t xml:space="preserve">Items in the middle region suffer interference:</w:t>
+      </w:r>
+    </w:p>
+    <w:p>
       <w:pPr>
         <w:pStyle w:val="Equation"/>
       </w:pPr>
@@ -4586,6 +5004,11 @@
       </w:r>
     </w:p>
     <w:p>
+      <w:r>
+        <w:t xml:space="preserve">High-emotion events trigger enhanced consolidation, following McGaugh's (2004) findings:</w:t>
+      </w:r>
+    </w:p>
+    <w:p>
       <w:pPr>
         <w:pStyle w:val="Equation"/>
       </w:pPr>
@@ -4638,6 +5061,11 @@
       </w:r>
     </w:p>
     <w:p>
+      <w:r>
+        <w:t xml:space="preserve">Flashbulb memories receive extended half-life bonuses:</w:t>
+      </w:r>
+    </w:p>
+    <w:p>
       <w:pPr>
         <w:pStyle w:val="Equation"/>
       </w:pPr>
@@ -4677,6 +5105,11 @@
       </w:r>
     </w:p>
     <w:p>
+      <w:r>
+        <w:t xml:space="preserve">Emotional tags cascade to related memories with decay:</w:t>
+      </w:r>
+    </w:p>
+    <w:p>
       <w:pPr>
         <w:pStyle w:val="Equation"/>
       </w:pPr>
@@ -4716,6 +5149,11 @@
       </w:r>
     </w:p>
     <w:p>
+      <w:r>
+        <w:t xml:space="preserve">The consolidation system transforms episodic memories into semantic structures through clustering, summarization, and knowledge graph construction.</w:t>
+      </w:r>
+    </w:p>
+    <w:p>
       <w:pPr>
         <w:pStyle w:val="Heading2"/>
       </w:pPr>
@@ -4724,6 +5162,11 @@
       </w:r>
     </w:p>
     <w:p>
+      <w:r>
+        <w:t xml:space="preserve">Consolidation activates under capacity, rate, or temporal conditions:</w:t>
+      </w:r>
+    </w:p>
+    <w:p>
       <w:pPr>
         <w:pStyle w:val="Equation"/>
       </w:pPr>
@@ -4763,6 +5206,11 @@
       </w:r>
     </w:p>
     <w:p>
+      <w:r>
+        <w:t xml:space="preserve">The consolidation rate adapts to Stability and Sensitivity:</w:t>
+      </w:r>
+    </w:p>
+    <w:p>
       <w:pPr>
         <w:pStyle w:val="Equation"/>
       </w:pPr>
@@ -4797,6 +5245,11 @@
       </w:r>
     </w:p>
     <w:p>
+      <w:r>
+        <w:t xml:space="preserve">Consolidation runs during idle periods and preempts for retrieval:</w:t>
+      </w:r>
+    </w:p>
+    <w:p>
       <w:pPr>
         <w:pStyle w:val="Equation"/>
       </w:pPr>
@@ -4862,6 +5315,11 @@
       </w:r>
     </w:p>
     <w:p>
+      <w:r>
+        <w:t xml:space="preserve">On retrieval events, consolidation pauses, commits micro-batches, and resumes when idle.</w:t>
+      </w:r>
+    </w:p>
+    <w:p>
       <w:pPr>
         <w:pStyle w:val="Heading2"/>
       </w:pPr>
@@ -4870,6 +5328,11 @@
       </w:r>
     </w:p>
     <w:p>
+      <w:r>
+        <w:t xml:space="preserve">Each memory receives a consolidation score determining merge priority:</w:t>
+      </w:r>
+    </w:p>
+    <w:p>
       <w:pPr>
         <w:pStyle w:val="Equation"/>
       </w:pPr>
@@ -4922,6 +5385,11 @@
       </w:r>
     </w:p>
     <w:p>
+      <w:r>
+        <w:t xml:space="preserve">Weights derive from knobs:</w:t>
+      </w:r>
+    </w:p>
+    <w:p>
       <w:pPr>
         <w:pStyle w:val="Equation"/>
       </w:pPr>
@@ -4935,6 +5403,11 @@
       </w:r>
     </w:p>
     <w:p>
+      <w:r>
+        <w:t xml:space="preserve">Low-scoring memories are marked for merging.</w:t>
+      </w:r>
+    </w:p>
+    <w:p>
       <w:pPr>
         <w:pStyle w:val="Heading2"/>
       </w:pPr>
@@ -4943,6 +5416,11 @@
       </w:r>
     </w:p>
     <w:p>
+      <w:r>
+        <w:t xml:space="preserve">Marked memories cluster via density-based methods (e.g., DBSCAN) or k-means using embedding similarity:</w:t>
+      </w:r>
+    </w:p>
+    <w:p>
       <w:pPr>
         <w:pStyle w:val="Equation"/>
       </w:pPr>
@@ -4969,6 +5447,11 @@
       </w:r>
     </w:p>
     <w:p>
+      <w:r>
+        <w:t xml:space="preserve">Summary nodes replace clusters:</w:t>
+      </w:r>
+    </w:p>
+    <w:p>
       <w:pPr>
         <w:pStyle w:val="Equation"/>
       </w:pPr>
@@ -5016,6 +5499,11 @@
       </w:r>
     </w:p>
     <w:p>
+      <w:r>
+        <w:t xml:space="preserve">For sufficiently large clusters, semantic extraction identifies entities and relations:</w:t>
+      </w:r>
+    </w:p>
+    <w:p>
       <w:pPr>
         <w:pStyle w:val="Equation"/>
       </w:pPr>
@@ -5081,6 +5569,11 @@
       </w:r>
     </w:p>
     <w:p>
+      <w:r>
+        <w:t xml:space="preserve">Extraction uses structured prompting to identify named entities (people, places, organizations, concepts) and relationships (co-occurrence, implication, contradiction).</w:t>
+      </w:r>
+    </w:p>
+    <w:p>
       <w:pPr>
         <w:pStyle w:val="Heading2"/>
       </w:pPr>
@@ -5089,6 +5582,168 @@
       </w:r>
     </w:p>
     <w:p>
+      <w:r>
+        <w:t xml:space="preserve">The graph comprises three node types:</w:t>
+      </w:r>
+    </w:p>
+    <w:p>
+      <w:pPr>
+        <w:pStyle w:val="ListParagraph"/>
+        <w:numPr>
+          <w:ilvl w:val="0"/>
+          <w:numId w:val="2"/>
+        </w:numPr>
+      </w:pPr>
+      <w:r>
+        <w:rPr>
+          <w:b/>
+          <w:bCs/>
+        </w:rPr>
+        <w:t xml:space="preserve">Memory Nodes: </w:t>
+      </w:r>
+      <w:r>
+        <w:t xml:space="preserve">Summarized embeddings from merged clusters</w:t>
+      </w:r>
+    </w:p>
+    <w:p>
+      <w:pPr>
+        <w:pStyle w:val="ListParagraph"/>
+        <w:numPr>
+          <w:ilvl w:val="0"/>
+          <w:numId w:val="2"/>
+        </w:numPr>
+      </w:pPr>
+      <w:r>
+        <w:rPr>
+          <w:b/>
+          <w:bCs/>
+        </w:rPr>
+        <w:t xml:space="preserve">Entity Nodes: </w:t>
+      </w:r>
+      <w:r>
+        <w:t xml:space="preserve">Named entities extracted from text</w:t>
+      </w:r>
+    </w:p>
+    <w:p>
+      <w:pPr>
+        <w:pStyle w:val="ListParagraph"/>
+        <w:numPr>
+          <w:ilvl w:val="0"/>
+          <w:numId w:val="2"/>
+        </w:numPr>
+      </w:pPr>
+      <w:r>
+        <w:rPr>
+          <w:b/>
+          <w:bCs/>
+        </w:rPr>
+        <w:t xml:space="preserve">Concept Nodes: </w:t>
+      </w:r>
+      <w:r>
+        <w:t xml:space="preserve">Emergent centroids representing recurrent topics</w:t>
+      </w:r>
+    </w:p>
+    <w:p>
+      <w:r>
+        <w:t xml:space="preserve">Edge types capture relationships:</w:t>
+      </w:r>
+    </w:p>
+    <w:p>
+      <w:pPr>
+        <w:pStyle w:val="ListParagraph"/>
+        <w:numPr>
+          <w:ilvl w:val="0"/>
+          <w:numId w:val="2"/>
+        </w:numPr>
+      </w:pPr>
+      <w:r>
+        <w:rPr>
+          <w:b/>
+          <w:bCs/>
+        </w:rPr>
+        <w:t xml:space="preserve">co_occurs_with: </w:t>
+      </w:r>
+      <w:r>
+        <w:t xml:space="preserve">Shared context or temporal proximity</w:t>
+      </w:r>
+    </w:p>
+    <w:p>
+      <w:pPr>
+        <w:pStyle w:val="ListParagraph"/>
+        <w:numPr>
+          <w:ilvl w:val="0"/>
+          <w:numId w:val="2"/>
+        </w:numPr>
+      </w:pPr>
+      <w:r>
+        <w:rPr>
+          <w:b/>
+          <w:bCs/>
+        </w:rPr>
+        <w:t xml:space="preserve">implies/causes: </w:t>
+      </w:r>
+      <w:r>
+        <w:t xml:space="preserve">Directional correlation in embedding drift</w:t>
+      </w:r>
+    </w:p>
+    <w:p>
+      <w:pPr>
+        <w:pStyle w:val="ListParagraph"/>
+        <w:numPr>
+          <w:ilvl w:val="0"/>
+          <w:numId w:val="2"/>
+        </w:numPr>
+      </w:pPr>
+      <w:r>
+        <w:rPr>
+          <w:b/>
+          <w:bCs/>
+        </w:rPr>
+        <w:t xml:space="preserve">contradicts: </w:t>
+      </w:r>
+      <w:r>
+        <w:t xml:space="preserve">Strong negative similarity or schema violation</w:t>
+      </w:r>
+    </w:p>
+    <w:p>
+      <w:pPr>
+        <w:pStyle w:val="ListParagraph"/>
+        <w:numPr>
+          <w:ilvl w:val="0"/>
+          <w:numId w:val="2"/>
+        </w:numPr>
+      </w:pPr>
+      <w:r>
+        <w:rPr>
+          <w:b/>
+          <w:bCs/>
+        </w:rPr>
+        <w:t xml:space="preserve">reinforces: </w:t>
+      </w:r>
+      <w:r>
+        <w:t xml:space="preserve">Frequent joint retrieval</w:t>
+      </w:r>
+    </w:p>
+    <w:p>
+      <w:pPr>
+        <w:pStyle w:val="ListParagraph"/>
+        <w:numPr>
+          <w:ilvl w:val="0"/>
+          <w:numId w:val="2"/>
+        </w:numPr>
+      </w:pPr>
+      <w:r>
+        <w:rPr>
+          <w:b/>
+          <w:bCs/>
+        </w:rPr>
+        <w:t xml:space="preserve">derived_from: </w:t>
+      </w:r>
+      <w:r>
+        <w:t xml:space="preserve">Links summaries to source memories</w:t>
+      </w:r>
+    </w:p>
+    <w:p>
       <w:pPr>
         <w:pStyle w:val="Heading3"/>
       </w:pPr>
@@ -5097,6 +5752,11 @@
       </w:r>
     </w:p>
     <w:p>
+      <w:r>
+        <w:t xml:space="preserve">Co-occurrence edges derive from embedding similarity:</w:t>
+      </w:r>
+    </w:p>
+    <w:p>
       <w:pPr>
         <w:pStyle w:val="Equation"/>
       </w:pPr>
@@ -5149,6 +5809,11 @@
       </w:r>
     </w:p>
     <w:p>
+      <w:r>
+        <w:t xml:space="preserve">Causal edges derive from temporal drift:</w:t>
+      </w:r>
+    </w:p>
+    <w:p>
       <w:pPr>
         <w:pStyle w:val="Equation"/>
       </w:pPr>
@@ -5248,6 +5913,11 @@
       </w:r>
     </w:p>
     <w:p>
+      <w:r>
+        <w:t xml:space="preserve">Retrieval combines vector similarity with graph expansion:</w:t>
+      </w:r>
+    </w:p>
+    <w:p>
       <w:pPr>
         <w:pStyle w:val="Equation"/>
       </w:pPr>
@@ -5314,6 +5984,11 @@
     </w:p>
     <w:p>
       <w:r>
+        <w:t xml:space="preserve">Graph expansion uses recursive traversal with depth limits to find related context that pure vector search might miss.</w:t>
+      </w:r>
+    </w:p>
+    <w:p>
+      <w:r>
         <w:br w:type="page"/>
       </w:r>
     </w:p>
@@ -5326,6 +6001,11 @@
       </w:r>
     </w:p>
     <w:p>
+      <w:r>
+        <w:t xml:space="preserve">The interrupt gate controls when retrieved memories enter active context during streaming generation. The gate balances novelty value against disruption cost.</w:t>
+      </w:r>
+    </w:p>
+    <w:p>
       <w:pPr>
         <w:pStyle w:val="Heading2"/>
       </w:pPr>
@@ -5334,6 +6014,11 @@
       </w:r>
     </w:p>
     <w:p>
+      <w:r>
+        <w:t xml:space="preserve">Novelty thresholds scale with knobs and refractory state:</w:t>
+      </w:r>
+    </w:p>
+    <w:p>
       <w:pPr>
         <w:pStyle w:val="Equation"/>
       </w:pPr>
@@ -5373,6 +6058,11 @@
       </w:r>
     </w:p>
     <w:p>
+      <w:r>
+        <w:t xml:space="preserve">Refractory dynamics suppress rapid successive interrupts:</w:t>
+      </w:r>
+    </w:p>
+    <w:p>
       <w:pPr>
         <w:pStyle w:val="Equation"/>
       </w:pPr>
@@ -5425,6 +6115,11 @@
       </w:r>
     </w:p>
     <w:p>
+      <w:r>
+        <w:t xml:space="preserve">Effective thresholds incorporate refractory pressure:</w:t>
+      </w:r>
+    </w:p>
+    <w:p>
       <w:pPr>
         <w:pStyle w:val="Equation"/>
       </w:pPr>
@@ -5459,6 +6154,11 @@
       </w:r>
     </w:p>
     <w:p>
+      <w:r>
+        <w:t xml:space="preserve">The marginal utility (MU) of a candidate memory combines four factors:</w:t>
+      </w:r>
+    </w:p>
+    <w:p>
       <w:pPr>
         <w:pStyle w:val="Equation"/>
       </w:pPr>
@@ -5571,6 +6271,11 @@
       </w:r>
     </w:p>
     <w:p>
+      <w:r>
+        <w:t xml:space="preserve">Duplicate suppression threshold:</w:t>
+      </w:r>
+    </w:p>
+    <w:p>
       <w:pPr>
         <w:pStyle w:val="Equation"/>
       </w:pPr>
@@ -5597,6 +6302,11 @@
       </w:r>
     </w:p>
     <w:p>
+      <w:r>
+        <w:t xml:space="preserve">Boundary-aware override permits lower-threshold interrupts at natural boundaries:</w:t>
+      </w:r>
+    </w:p>
+    <w:p>
       <w:pPr>
         <w:pStyle w:val="Equation"/>
       </w:pPr>
@@ -5610,6 +6320,11 @@
       </w:r>
     </w:p>
     <w:p>
+      <w:r>
+        <w:t xml:space="preserve">The gate permits interrupt when:</w:t>
+      </w:r>
+    </w:p>
+    <w:p>
       <w:pPr>
         <w:pStyle w:val="Equation"/>
       </w:pPr>
@@ -5688,6 +6403,11 @@
       </w:r>
     </w:p>
     <w:p>
+      <w:r>
+        <w:t xml:space="preserve">This logic suppresses low-drift interrupts unless the marginal utility substantially exceeds threshold, while permitting normal-threshold interrupts at natural transition points.</w:t>
+      </w:r>
+    </w:p>
+    <w:p>
       <w:pPr>
         <w:pStyle w:val="Heading2"/>
       </w:pPr>
@@ -5696,6 +6416,11 @@
       </w:r>
     </w:p>
     <w:p>
+      <w:r>
+        <w:t xml:space="preserve">Streaming retrieval is gated by cumulative drift rate:</w:t>
+      </w:r>
+    </w:p>
+    <w:p>
       <w:pPr>
         <w:pStyle w:val="Equation"/>
       </w:pPr>
@@ -5771,6 +6496,11 @@
           <w:szCs w:val="20"/>
         </w:rPr>
         <w:t xml:space="preserve">adjacent_window(F) = round(lerp(8, 1, F))</w:t>
+      </w:r>
+    </w:p>
+    <w:p>
+      <w:r>
+        <w:t xml:space="preserve">High Sensitivity produces frequent checks triggered by small content shifts; high Focus enforces strict drift limits.</w:t>
       </w:r>
     </w:p>
     <w:sectPr>

</xml_diff>

<commit_message>
feat: Introduce accumulator operation and spike bypass, refactor core operations, and update documentation and tests.
</commit_message>
<xml_diff>
--- a/docs/research/algorithms.docx
+++ b/docs/research/algorithms.docx
@@ -135,6 +135,47 @@
     </w:p>
     <w:p>
       <w:r>
+        <w:t xml:space="preserve">Weight normalization and blending for combining multiple signals:</w:t>
+      </w:r>
+    </w:p>
+    <w:p>
+      <w:pPr>
+        <w:pStyle w:val="Equation"/>
+      </w:pPr>
+      <w:r>
+        <w:rPr>
+          <w:rFonts w:ascii="Courier New" w:cs="Courier New" w:eastAsia="Courier New" w:hAnsi="Courier New"/>
+          <w:sz w:val="20"/>
+          <w:szCs w:val="20"/>
+        </w:rPr>
+        <w:t xml:space="preserve">normalize(w) = w / max(sum(w), ε) # w is a weight vector</w:t>
+      </w:r>
+    </w:p>
+    <w:p>
+      <w:r>
+        <w:t xml:space="preserve">Edge case: if sum(w) &lt; ε, return uniform weights (1/|w|) to avoid division by zero or invalid probability distributions.</w:t>
+      </w:r>
+    </w:p>
+    <w:p>
+      <w:pPr>
+        <w:pStyle w:val="Equation"/>
+      </w:pPr>
+      <w:r>
+        <w:rPr>
+          <w:rFonts w:ascii="Courier New" w:cs="Courier New" w:eastAsia="Courier New" w:hAnsi="Courier New"/>
+          <w:sz w:val="20"/>
+          <w:szCs w:val="20"/>
+        </w:rPr>
+        <w:t xml:space="preserve">blend(values, weights) = Σᵢ values[i] × weights[i]</w:t>
+      </w:r>
+    </w:p>
+    <w:p>
+      <w:r>
+        <w:t xml:space="preserve">Note: normalize() operates on weight vectors, not scalars. When used with scalar expressions like lerp(), collect the scalars into a vector first: normalize([lerp(...), lerp(...), ...]). The blend() function assumes pre-normalized weights summing to 1.</w:t>
+      </w:r>
+    </w:p>
+    <w:p>
+      <w:r>
         <w:t xml:space="preserve">For vectors, we define cosine similarity as cos(u, v) = u·v / (‖u‖ × ‖v‖), and safe L2 normalization as l2_normalize(v) = v / max(‖v‖, ε). Shannon entropy is computed in nats: H(p) = −Σᵢ pᵢ ln(pᵢ).</w:t>
       </w:r>
     </w:p>
@@ -163,15 +204,15 @@
     </w:p>
     <w:p>
       <w:pPr>
-        <w:pStyle w:val="Heading2"/>
-      </w:pPr>
-      <w:r>
-        <w:t xml:space="preserve">1.2 The Three-Knob Philosophy</w:t>
-      </w:r>
-    </w:p>
-    <w:p>
-      <w:r>
-        <w:t xml:space="preserve">Cortext is governed by three continuous control parameters, each representing a distinct dimension of cognitive regulation:</w:t>
+        <w:pStyle w:val="Heading3"/>
+      </w:pPr>
+      <w:r>
+        <w:t xml:space="preserve">1.1.1 Units Convention</w:t>
+      </w:r>
+    </w:p>
+    <w:p>
+      <w:r>
+        <w:t xml:space="preserve">To ensure consistency and avoid unit mismatch errors, the following conventions apply throughout:</w:t>
       </w:r>
     </w:p>
     <w:p>
@@ -180,10 +221,10 @@
           <w:b/>
           <w:bCs/>
         </w:rPr>
-        <w:t xml:space="preserve">Focus (F ∈ [0, 1]): </w:t>
-      </w:r>
-      <w:r>
-        <w:t xml:space="preserve">Perceptual selectivity and precision. Higher Focus narrows attention, increases relevance weighting, and reduces retrieval breadth. Focus modulates the trade-off between exploitation of known-relevant information and exploration of potentially useful context.</w:t>
+        <w:t xml:space="preserve">Input timestamps: </w:t>
+      </w:r>
+      <w:r>
+        <w:t xml:space="preserve">All input timestamps (t) are specified in milliseconds since epoch, consistent with standard system time APIs.</w:t>
       </w:r>
     </w:p>
     <w:p>
@@ -192,10 +233,23 @@
           <w:b/>
           <w:bCs/>
         </w:rPr>
-        <w:t xml:space="preserve">Sensitivity (S ∈ [0, 1]): </w:t>
-      </w:r>
-      <w:r>
-        <w:t xml:space="preserve">Plasticity and affective gain. Higher Sensitivity accelerates learning, increases emotional and novelty responsiveness, and raises write-rate targets. Sensitivity governs how readily the system captures novel information and responds to salient stimuli.</w:t>
+        <w:t xml:space="preserve">Internal time representation: </w:t>
+      </w:r>
+      <w:r>
+        <w:t xml:space="preserve">All internal time calculations operate in seconds. The now() function returns the current time in seconds:</w:t>
+      </w:r>
+    </w:p>
+    <w:p>
+      <w:pPr>
+        <w:pStyle w:val="Equation"/>
+      </w:pPr>
+      <w:r>
+        <w:rPr>
+          <w:rFonts w:ascii="Courier New" w:cs="Courier New" w:eastAsia="Courier New" w:hAnsi="Courier New"/>
+          <w:sz w:val="20"/>
+          <w:szCs w:val="20"/>
+        </w:rPr>
+        <w:t xml:space="preserve">now() = system_time_ms / 1000  # returns seconds</w:t>
       </w:r>
     </w:p>
     <w:p>
@@ -204,6 +258,118 @@
           <w:b/>
           <w:bCs/>
         </w:rPr>
+        <w:t xml:space="preserve">Stored timestamps: </w:t>
+      </w:r>
+      <w:r>
+        <w:t xml:space="preserve">Internal timestamps (t_acc_start, last_signal_ts, last_timestamp, last_write_ts, last_retrieval_ts) are stored in seconds after conversion from input milliseconds.</w:t>
+      </w:r>
+    </w:p>
+    <w:p>
+      <w:r>
+        <w:rPr>
+          <w:b/>
+          <w:bCs/>
+        </w:rPr>
+        <w:t xml:space="preserve">Time deltas: </w:t>
+      </w:r>
+      <w:r>
+        <w:t xml:space="preserve">All Δt values, elapsed times (mem_elapsed, signal_gap, idle_for), and time comparisons operate in seconds:</w:t>
+      </w:r>
+    </w:p>
+    <w:p>
+      <w:pPr>
+        <w:pStyle w:val="Equation"/>
+      </w:pPr>
+      <w:r>
+        <w:rPr>
+          <w:rFonts w:ascii="Courier New" w:cs="Courier New" w:eastAsia="Courier New" w:hAnsi="Courier New"/>
+          <w:sz w:val="20"/>
+          <w:szCs w:val="20"/>
+        </w:rPr>
+        <w:t xml:space="preserve">Δt ← now() − last_timestamp  # seconds</w:t>
+      </w:r>
+    </w:p>
+    <w:p>
+      <w:pPr>
+        <w:pStyle w:val="Equation"/>
+      </w:pPr>
+      <w:r>
+        <w:rPr>
+          <w:rFonts w:ascii="Courier New" w:cs="Courier New" w:eastAsia="Courier New" w:hAnsi="Courier New"/>
+          <w:sz w:val="20"/>
+          <w:szCs w:val="20"/>
+        </w:rPr>
+        <w:t xml:space="preserve">mem_elapsed ← now() − t_acc_start  # seconds</w:t>
+      </w:r>
+    </w:p>
+    <w:p>
+      <w:pPr>
+        <w:pStyle w:val="Equation"/>
+      </w:pPr>
+      <w:r>
+        <w:rPr>
+          <w:rFonts w:ascii="Courier New" w:cs="Courier New" w:eastAsia="Courier New" w:hAnsi="Courier New"/>
+          <w:sz w:val="20"/>
+          <w:szCs w:val="20"/>
+        </w:rPr>
+        <w:t xml:space="preserve">signal_gap ← now() − last_signal_ts  # seconds</w:t>
+      </w:r>
+    </w:p>
+    <w:p>
+      <w:r>
+        <w:rPr>
+          <w:b/>
+          <w:bCs/>
+        </w:rPr>
+        <w:t xml:space="preserve">Time constants: </w:t>
+      </w:r>
+      <w:r>
+        <w:t xml:space="preserve">All time-related constants are specified with explicit units (e.g., τ_min = 120 seconds, kRecencyTau = 60 seconds). Threshold limits like max_mem_time(T) and gap_threshold(T) return values in seconds.</w:t>
+      </w:r>
+    </w:p>
+    <w:p>
+      <w:pPr>
+        <w:pStyle w:val="Heading2"/>
+      </w:pPr>
+      <w:r>
+        <w:t xml:space="preserve">1.2 The Three-Knob Philosophy</w:t>
+      </w:r>
+    </w:p>
+    <w:p>
+      <w:r>
+        <w:t xml:space="preserve">Cortext is governed by three continuous control parameters, each representing a distinct dimension of cognitive regulation:</w:t>
+      </w:r>
+    </w:p>
+    <w:p>
+      <w:r>
+        <w:rPr>
+          <w:b/>
+          <w:bCs/>
+        </w:rPr>
+        <w:t xml:space="preserve">Focus (F ∈ [0, 1]): </w:t>
+      </w:r>
+      <w:r>
+        <w:t xml:space="preserve">Perceptual selectivity and precision. Higher Focus narrows attention, increases relevance weighting, and reduces retrieval breadth. Focus modulates the trade-off between exploitation of known-relevant information and exploration of potentially useful context.</w:t>
+      </w:r>
+    </w:p>
+    <w:p>
+      <w:r>
+        <w:rPr>
+          <w:b/>
+          <w:bCs/>
+        </w:rPr>
+        <w:t xml:space="preserve">Sensitivity (S ∈ [0, 1]): </w:t>
+      </w:r>
+      <w:r>
+        <w:t xml:space="preserve">Plasticity and affective gain. Higher Sensitivity accelerates learning, increases emotional and novelty responsiveness, and raises write-rate targets. Sensitivity governs how readily the system captures novel information and responds to salient stimuli.</w:t>
+      </w:r>
+    </w:p>
+    <w:p>
+      <w:r>
+        <w:rPr>
+          <w:b/>
+          <w:bCs/>
+        </w:rPr>
         <w:t xml:space="preserve">Stability (T ∈ [0, 1]): </w:t>
       </w:r>
       <w:r>
@@ -544,7 +710,7 @@
           <w:sz w:val="20"/>
           <w:szCs w:val="20"/>
         </w:rPr>
-        <w:t xml:space="preserve">coherence_complement = 1 − coherence_t</w:t>
+        <w:t xml:space="preserve">coherence_complement = 1 − coherence_struct_t  # uses structural coherence</w:t>
       </w:r>
     </w:p>
     <w:p>
@@ -1306,7 +1472,7 @@
     </w:p>
     <w:p>
       <w:r>
-        <w:t xml:space="preserve">Distinct from instantaneous emotion, the mood state M_t maintains a persistent background affective tone:</w:t>
+        <w:t xml:space="preserve">Distinct from instantaneous emotion, the mood state M_t ∈ ℝ⁶ maintains a persistent background affective tone as a 6-dimensional vector (one component per emotion category from Section 2.2.2):</w:t>
       </w:r>
     </w:p>
     <w:p>
@@ -1345,6 +1511,19 @@
           <w:sz w:val="20"/>
           <w:szCs w:val="20"/>
         </w:rPr>
+        <w:t xml:space="preserve">e_t ← p_c for each c ∈ C  # 6D emotion probability vector</w:t>
+      </w:r>
+    </w:p>
+    <w:p>
+      <w:pPr>
+        <w:pStyle w:val="Equation"/>
+      </w:pPr>
+      <w:r>
+        <w:rPr>
+          <w:rFonts w:ascii="Courier New" w:cs="Courier New" w:eastAsia="Courier New" w:hAnsi="Courier New"/>
+          <w:sz w:val="20"/>
+          <w:szCs w:val="20"/>
+        </w:rPr>
         <w:t xml:space="preserve">M_t = λ_mood(T) × M_{t−1} + α_mood(S) × e_t</w:t>
       </w:r>
     </w:p>
@@ -1358,12 +1537,12 @@
           <w:sz w:val="20"/>
           <w:szCs w:val="20"/>
         </w:rPr>
-        <w:t xml:space="preserve">M_t ← clamp(M_t, −1.0, 1.0)</w:t>
-      </w:r>
-    </w:p>
-    <w:p>
-      <w:r>
-        <w:t xml:space="preserve">Note that this update does not enforce coefficient normalization; the explicit clamp handles potential accumulation. The mood state provides a separate threshold bias:</w:t>
+        <w:t xml:space="preserve">M_t ← clamp_elementwise(M_t, −1.0, 1.0)  # per-component</w:t>
+      </w:r>
+    </w:p>
+    <w:p>
+      <w:r>
+        <w:t xml:space="preserve">Note that this update does not enforce coefficient normalization; the explicit elementwise clamp handles potential accumulation. The mood state provides a separate threshold bias via its normalized magnitude:</w:t>
       </w:r>
     </w:p>
     <w:p>
@@ -1389,7 +1568,7 @@
           <w:sz w:val="20"/>
           <w:szCs w:val="20"/>
         </w:rPr>
-        <w:t xml:space="preserve">m_norm ← ‖M_t‖ / √6</w:t>
+        <w:t xml:space="preserve">m_norm ← ‖M_t‖ / √6  # max norm when all components at 1</w:t>
       </w:r>
     </w:p>
     <w:p>
@@ -1519,6 +1698,50 @@
     </w:p>
     <w:p>
       <w:r>
+        <w:t xml:space="preserve">The stability update uses uncertainty-modulated learning rate and a stability-derived retention window:</w:t>
+      </w:r>
+    </w:p>
+    <w:p>
+      <w:pPr>
+        <w:pStyle w:val="Equation"/>
+      </w:pPr>
+      <w:r>
+        <w:rPr>
+          <w:rFonts w:ascii="Courier New" w:cs="Courier New" w:eastAsia="Courier New" w:hAnsi="Courier New"/>
+          <w:sz w:val="20"/>
+          <w:szCs w:val="20"/>
+        </w:rPr>
+        <w:t xml:space="preserve">α_min_T = 0.02; α_span_T = 0.18</w:t>
+      </w:r>
+    </w:p>
+    <w:p>
+      <w:pPr>
+        <w:pStyle w:val="Equation"/>
+      </w:pPr>
+      <w:r>
+        <w:rPr>
+          <w:rFonts w:ascii="Courier New" w:cs="Courier New" w:eastAsia="Courier New" w:hAnsi="Courier New"/>
+          <w:sz w:val="20"/>
+          <w:szCs w:val="20"/>
+        </w:rPr>
+        <w:t xml:space="preserve">α_T(t) = α_min_T + (1 − T) × α_span_T × u(t)</w:t>
+      </w:r>
+    </w:p>
+    <w:p>
+      <w:pPr>
+        <w:pStyle w:val="Equation"/>
+      </w:pPr>
+      <w:r>
+        <w:rPr>
+          <w:rFonts w:ascii="Courier New" w:cs="Courier New" w:eastAsia="Courier New" w:hAnsi="Courier New"/>
+          <w:sz w:val="20"/>
+          <w:szCs w:val="20"/>
+        </w:rPr>
+        <w:t xml:space="preserve">w_ret(T) = round(lerp(10, 50, T))  # retention history window size</w:t>
+      </w:r>
+    </w:p>
+    <w:p>
+      <w:r>
         <w:t xml:space="preserve">At each signal event, compute retention statistics and adjust half-life:</w:t>
       </w:r>
     </w:p>
@@ -1740,12 +1963,12 @@
         <w:pStyle w:val="Heading3"/>
       </w:pPr>
       <w:r>
-        <w:t xml:space="preserve">3.1.1 Coherence</w:t>
-      </w:r>
-    </w:p>
-    <w:p>
-      <w:r>
-        <w:t xml:space="preserve">Coherence measures integration of the current signal with context:</w:t>
+        <w:t xml:space="preserve">3.1.1 Structural Coherence</w:t>
+      </w:r>
+    </w:p>
+    <w:p>
+      <w:r>
+        <w:t xml:space="preserve">Structural coherence (coherence_struct) measures integration of the current signal with the broader context window. This metric is distinct from memory coherence (coherence_mem, defined in Section 4.4.2) which tracks within-memory similarity:</w:t>
       </w:r>
     </w:p>
     <w:p>
@@ -1771,12 +1994,12 @@
           <w:sz w:val="20"/>
           <w:szCs w:val="20"/>
         </w:rPr>
-        <w:t xml:space="preserve">coherence_t ← 1 − clamp(raw, 0, 1)</w:t>
-      </w:r>
-    </w:p>
-    <w:p>
-      <w:r>
-        <w:t xml:space="preserve">High coherence (low variance in similarities) indicates the signal fits consistently with context. The effective Focus is modulated: F_eff = F × (0.5 + 0.5 × coherence_t).</w:t>
+        <w:t xml:space="preserve">coherence_struct_t ← 1 − clamp(raw, 0, 1)  # range [0, 1]</w:t>
+      </w:r>
+    </w:p>
+    <w:p>
+      <w:r>
+        <w:t xml:space="preserve">High structural coherence (low variance in similarities) indicates the signal fits consistently with context. The effective Focus is modulated: F_eff = F × (0.5 + 0.5 × coherence_struct_t).</w:t>
       </w:r>
     </w:p>
     <w:p>
@@ -3241,7 +3464,20 @@
     </w:p>
     <w:p>
       <w:r>
-        <w:t xml:space="preserve">Instantaneous rate estimation with bias correction:</w:t>
+        <w:t xml:space="preserve">Instantaneous rate estimation with bias correction. Δwrites is the binary indicator (0 or 1) of whether a write occurred during the current timestep:</w:t>
+      </w:r>
+    </w:p>
+    <w:p>
+      <w:pPr>
+        <w:pStyle w:val="Equation"/>
+      </w:pPr>
+      <w:r>
+        <w:rPr>
+          <w:rFonts w:ascii="Courier New" w:cs="Courier New" w:eastAsia="Courier New" w:hAnsi="Courier New"/>
+          <w:sz w:val="20"/>
+          <w:szCs w:val="20"/>
+        </w:rPr>
+        <w:t xml:space="preserve">Δwrites ← 1 if write_memory else 0  # binary write event</w:t>
       </w:r>
     </w:p>
     <w:p>
@@ -3464,6 +3700,159 @@
     </w:p>
     <w:p>
       <w:pPr>
+        <w:pStyle w:val="Heading3"/>
+      </w:pPr>
+      <w:r>
+        <w:t xml:space="preserve">4.2.4 Sensitivity-Based Threshold Adjustment</w:t>
+      </w:r>
+    </w:p>
+    <w:p>
+      <w:r>
+        <w:t xml:space="preserve">Sensitivity modulates threshold based on recent score volatility:</w:t>
+      </w:r>
+    </w:p>
+    <w:p>
+      <w:pPr>
+        <w:pStyle w:val="Equation"/>
+      </w:pPr>
+      <w:r>
+        <w:rPr>
+          <w:rFonts w:ascii="Courier New" w:cs="Courier New" w:eastAsia="Courier New" w:hAnsi="Courier New"/>
+          <w:sz w:val="20"/>
+          <w:szCs w:val="20"/>
+        </w:rPr>
+        <w:t xml:space="preserve">σ_scores ← std(scores[t−w:t])</w:t>
+      </w:r>
+    </w:p>
+    <w:p>
+      <w:pPr>
+        <w:pStyle w:val="Equation"/>
+      </w:pPr>
+      <w:r>
+        <w:rPr>
+          <w:rFonts w:ascii="Courier New" w:cs="Courier New" w:eastAsia="Courier New" w:hAnsi="Courier New"/>
+          <w:sz w:val="20"/>
+          <w:szCs w:val="20"/>
+        </w:rPr>
+        <w:t xml:space="preserve">κ_sens = 0.08  # sensitivity gain</w:t>
+      </w:r>
+    </w:p>
+    <w:p>
+      <w:pPr>
+        <w:pStyle w:val="Equation"/>
+      </w:pPr>
+      <w:r>
+        <w:rPr>
+          <w:rFonts w:ascii="Courier New" w:cs="Courier New" w:eastAsia="Courier New" w:hAnsi="Courier New"/>
+          <w:sz w:val="20"/>
+          <w:szCs w:val="20"/>
+        </w:rPr>
+        <w:t xml:space="preserve">cap_sens ← 0.20 × hysteresis_t</w:t>
+      </w:r>
+    </w:p>
+    <w:p>
+      <w:pPr>
+        <w:pStyle w:val="Equation"/>
+      </w:pPr>
+      <w:r>
+        <w:rPr>
+          <w:rFonts w:ascii="Courier New" w:cs="Courier New" w:eastAsia="Courier New" w:hAnsi="Courier New"/>
+          <w:sz w:val="20"/>
+          <w:szCs w:val="20"/>
+        </w:rPr>
+        <w:t xml:space="preserve">Δθ_sens ← clamp(−κ_sens × S × (σ_scores − 0.1),</w:t>
+      </w:r>
+    </w:p>
+    <w:p>
+      <w:pPr>
+        <w:pStyle w:val="Equation"/>
+      </w:pPr>
+      <w:r>
+        <w:rPr>
+          <w:rFonts w:ascii="Courier New" w:cs="Courier New" w:eastAsia="Courier New" w:hAnsi="Courier New"/>
+          <w:sz w:val="20"/>
+          <w:szCs w:val="20"/>
+        </w:rPr>
+        <w:t xml:space="preserve">                −cap_sens, +cap_sens)</w:t>
+      </w:r>
+    </w:p>
+    <w:p>
+      <w:r>
+        <w:t xml:space="preserve">High score variance with high Sensitivity lowers threshold, capturing more volatile signals.</w:t>
+      </w:r>
+    </w:p>
+    <w:p>
+      <w:pPr>
+        <w:pStyle w:val="Heading3"/>
+      </w:pPr>
+      <w:r>
+        <w:t xml:space="preserve">4.2.5 Precision-Based Threshold Adjustment</w:t>
+      </w:r>
+    </w:p>
+    <w:p>
+      <w:r>
+        <w:t xml:space="preserve">Focus-driven precision tightens threshold when structural coherence is high:</w:t>
+      </w:r>
+    </w:p>
+    <w:p>
+      <w:pPr>
+        <w:pStyle w:val="Equation"/>
+      </w:pPr>
+      <w:r>
+        <w:rPr>
+          <w:rFonts w:ascii="Courier New" w:cs="Courier New" w:eastAsia="Courier New" w:hAnsi="Courier New"/>
+          <w:sz w:val="20"/>
+          <w:szCs w:val="20"/>
+        </w:rPr>
+        <w:t xml:space="preserve">κ_prec = 0.06  # precision gain</w:t>
+      </w:r>
+    </w:p>
+    <w:p>
+      <w:pPr>
+        <w:pStyle w:val="Equation"/>
+      </w:pPr>
+      <w:r>
+        <w:rPr>
+          <w:rFonts w:ascii="Courier New" w:cs="Courier New" w:eastAsia="Courier New" w:hAnsi="Courier New"/>
+          <w:sz w:val="20"/>
+          <w:szCs w:val="20"/>
+        </w:rPr>
+        <w:t xml:space="preserve">cap_prec ← 0.15 × hysteresis_t</w:t>
+      </w:r>
+    </w:p>
+    <w:p>
+      <w:pPr>
+        <w:pStyle w:val="Equation"/>
+      </w:pPr>
+      <w:r>
+        <w:rPr>
+          <w:rFonts w:ascii="Courier New" w:cs="Courier New" w:eastAsia="Courier New" w:hAnsi="Courier New"/>
+          <w:sz w:val="20"/>
+          <w:szCs w:val="20"/>
+        </w:rPr>
+        <w:t xml:space="preserve">Δθ_prec ← clamp(κ_prec × F × (coherence_struct_t − 0.5),</w:t>
+      </w:r>
+    </w:p>
+    <w:p>
+      <w:pPr>
+        <w:pStyle w:val="Equation"/>
+      </w:pPr>
+      <w:r>
+        <w:rPr>
+          <w:rFonts w:ascii="Courier New" w:cs="Courier New" w:eastAsia="Courier New" w:hAnsi="Courier New"/>
+          <w:sz w:val="20"/>
+          <w:szCs w:val="20"/>
+        </w:rPr>
+        <w:t xml:space="preserve">                −cap_prec, +cap_prec)</w:t>
+      </w:r>
+    </w:p>
+    <w:p>
+      <w:r>
+        <w:t xml:space="preserve">High structural coherence with high Focus raises threshold, enforcing stricter relevance filtering.</w:t>
+      </w:r>
+    </w:p>
+    <w:p>
+      <w:pPr>
         <w:pStyle w:val="Heading2"/>
       </w:pPr>
       <w:r>
@@ -3472,7 +3861,7 @@
     </w:p>
     <w:p>
       <w:r>
-        <w:t xml:space="preserve">All threshold deltas combine and pass through safety limiting:</w:t>
+        <w:t xml:space="preserve">All threshold deltas combine and pass through safety limiting. The emotion and mood deltas from Section 2.2.3-2.2.4 are denoted Δθ_emo = ΔThreshold_emotion_t and Δθ_mood = ΔThreshold_mood_t:</w:t>
       </w:r>
     </w:p>
     <w:p>
@@ -3598,6 +3987,825 @@
       </w:r>
     </w:p>
     <w:p>
+      <w:pPr>
+        <w:pStyle w:val="Heading2"/>
+      </w:pPr>
+      <w:r>
+        <w:t xml:space="preserve">4.4 Write Pacing and Memory Accumulation</w:t>
+      </w:r>
+    </w:p>
+    <w:p>
+      <w:r>
+        <w:t xml:space="preserve">The write gate operates per-signal, but coherent "thoughts" often span multiple signals. This section introduces memory-level accumulation that groups signals into natural units before storage decisions, inspired by Event Segmentation Theory (Zacks &amp; Swallow, 2007).</w:t>
+      </w:r>
+    </w:p>
+    <w:p>
+      <w:r>
+        <w:t xml:space="preserve">This approach draws from EM-LLM (Fountas et al., 2024), which segments token sequences into episodic events using surprise-based boundary detection refined by graph-theoretic cohesion metrics. Their work shows that combining prediction error signals with within-segment coherence produces boundaries strongly correlated with human event perception. Our adaptation uses embedding drift as a proxy for surprise and cosine similarity for cohesion, enabling modality-agnostic operation across text tokens, audio chunks, video frames, or any signal stream.</w:t>
+      </w:r>
+    </w:p>
+    <w:p>
+      <w:pPr>
+        <w:pStyle w:val="Heading3"/>
+      </w:pPr>
+      <w:r>
+        <w:t xml:space="preserve">4.4.1 Memory Accumulator State</w:t>
+      </w:r>
+    </w:p>
+    <w:p>
+      <w:r>
+        <w:t xml:space="preserve">Each source stream maintains accumulator state:</w:t>
+      </w:r>
+    </w:p>
+    <w:p>
+      <w:pPr>
+        <w:pStyle w:val="Equation"/>
+      </w:pPr>
+      <w:r>
+        <w:rPr>
+          <w:rFonts w:ascii="Courier New" w:cs="Courier New" w:eastAsia="Courier New" w:hAnsi="Courier New"/>
+          <w:sz w:val="20"/>
+          <w:szCs w:val="20"/>
+        </w:rPr>
+        <w:t xml:space="preserve">μ_acc ← 256d running mean embedding</w:t>
+      </w:r>
+    </w:p>
+    <w:p>
+      <w:pPr>
+        <w:pStyle w:val="Equation"/>
+      </w:pPr>
+      <w:r>
+        <w:rPr>
+          <w:rFonts w:ascii="Courier New" w:cs="Courier New" w:eastAsia="Courier New" w:hAnsi="Courier New"/>
+          <w:sz w:val="20"/>
+          <w:szCs w:val="20"/>
+        </w:rPr>
+        <w:t xml:space="preserve">D_acc ← accumulated drift within memory</w:t>
+      </w:r>
+    </w:p>
+    <w:p>
+      <w:pPr>
+        <w:pStyle w:val="Equation"/>
+      </w:pPr>
+      <w:r>
+        <w:rPr>
+          <w:rFonts w:ascii="Courier New" w:cs="Courier New" w:eastAsia="Courier New" w:hAnsi="Courier New"/>
+          <w:sz w:val="20"/>
+          <w:szCs w:val="20"/>
+        </w:rPr>
+        <w:t xml:space="preserve">s_sum ← sum of signal scores in memory</w:t>
+      </w:r>
+    </w:p>
+    <w:p>
+      <w:pPr>
+        <w:pStyle w:val="Equation"/>
+      </w:pPr>
+      <w:r>
+        <w:rPr>
+          <w:rFonts w:ascii="Courier New" w:cs="Courier New" w:eastAsia="Courier New" w:hAnsi="Courier New"/>
+          <w:sz w:val="20"/>
+          <w:szCs w:val="20"/>
+        </w:rPr>
+        <w:t xml:space="preserve">s_max ← max signal score in memory</w:t>
+      </w:r>
+    </w:p>
+    <w:p>
+      <w:pPr>
+        <w:pStyle w:val="Equation"/>
+      </w:pPr>
+      <w:r>
+        <w:rPr>
+          <w:rFonts w:ascii="Courier New" w:cs="Courier New" w:eastAsia="Courier New" w:hAnsi="Courier New"/>
+          <w:sz w:val="20"/>
+          <w:szCs w:val="20"/>
+        </w:rPr>
+        <w:t xml:space="preserve">n ← count of signals in memory</w:t>
+      </w:r>
+    </w:p>
+    <w:p>
+      <w:pPr>
+        <w:pStyle w:val="Equation"/>
+      </w:pPr>
+      <w:r>
+        <w:rPr>
+          <w:rFonts w:ascii="Courier New" w:cs="Courier New" w:eastAsia="Courier New" w:hAnsi="Courier New"/>
+          <w:sz w:val="20"/>
+          <w:szCs w:val="20"/>
+        </w:rPr>
+        <w:t xml:space="preserve">e_peak ← embedding of highest-scoring signal</w:t>
+      </w:r>
+    </w:p>
+    <w:p>
+      <w:pPr>
+        <w:pStyle w:val="Equation"/>
+      </w:pPr>
+      <w:r>
+        <w:rPr>
+          <w:rFonts w:ascii="Courier New" w:cs="Courier New" w:eastAsia="Courier New" w:hAnsi="Courier New"/>
+          <w:sz w:val="20"/>
+          <w:szCs w:val="20"/>
+        </w:rPr>
+        <w:t xml:space="preserve">t_acc_start ← timestamp of accumulation start</w:t>
+      </w:r>
+    </w:p>
+    <w:p>
+      <w:pPr>
+        <w:pStyle w:val="Equation"/>
+      </w:pPr>
+      <w:r>
+        <w:rPr>
+          <w:rFonts w:ascii="Courier New" w:cs="Courier New" w:eastAsia="Courier New" w:hAnsi="Courier New"/>
+          <w:sz w:val="20"/>
+          <w:szCs w:val="20"/>
+        </w:rPr>
+        <w:t xml:space="preserve">last_signal_ts ← timestamp of previous signal (for gap detection)</w:t>
+      </w:r>
+    </w:p>
+    <w:p>
+      <w:r>
+        <w:t xml:space="preserve">On each signal, update running statistics (note: n is the count before this signal):</w:t>
+      </w:r>
+    </w:p>
+    <w:p>
+      <w:pPr>
+        <w:pStyle w:val="Equation"/>
+      </w:pPr>
+      <w:r>
+        <w:rPr>
+          <w:rFonts w:ascii="Courier New" w:cs="Courier New" w:eastAsia="Courier New" w:hAnsi="Courier New"/>
+          <w:sz w:val="20"/>
+          <w:szCs w:val="20"/>
+        </w:rPr>
+        <w:t xml:space="preserve">μ_acc ← (n × μ_acc + x_t) / (n + 1)</w:t>
+      </w:r>
+    </w:p>
+    <w:p>
+      <w:pPr>
+        <w:pStyle w:val="Equation"/>
+      </w:pPr>
+      <w:r>
+        <w:rPr>
+          <w:rFonts w:ascii="Courier New" w:cs="Courier New" w:eastAsia="Courier New" w:hAnsi="Courier New"/>
+          <w:sz w:val="20"/>
+          <w:szCs w:val="20"/>
+        </w:rPr>
+        <w:t xml:space="preserve">n ← n + 1</w:t>
+      </w:r>
+    </w:p>
+    <w:p>
+      <w:pPr>
+        <w:pStyle w:val="Equation"/>
+      </w:pPr>
+      <w:r>
+        <w:rPr>
+          <w:rFonts w:ascii="Courier New" w:cs="Courier New" w:eastAsia="Courier New" w:hAnsi="Courier New"/>
+          <w:sz w:val="20"/>
+          <w:szCs w:val="20"/>
+        </w:rPr>
+        <w:t xml:space="preserve">D_acc ← D_acc + drift_mag_t</w:t>
+      </w:r>
+    </w:p>
+    <w:p>
+      <w:pPr>
+        <w:pStyle w:val="Equation"/>
+      </w:pPr>
+      <w:r>
+        <w:rPr>
+          <w:rFonts w:ascii="Courier New" w:cs="Courier New" w:eastAsia="Courier New" w:hAnsi="Courier New"/>
+          <w:sz w:val="20"/>
+          <w:szCs w:val="20"/>
+        </w:rPr>
+        <w:t xml:space="preserve">s_sum ← s_sum + score_t</w:t>
+      </w:r>
+    </w:p>
+    <w:p>
+      <w:pPr>
+        <w:pStyle w:val="Equation"/>
+      </w:pPr>
+      <w:r>
+        <w:rPr>
+          <w:rFonts w:ascii="Courier New" w:cs="Courier New" w:eastAsia="Courier New" w:hAnsi="Courier New"/>
+          <w:sz w:val="20"/>
+          <w:szCs w:val="20"/>
+        </w:rPr>
+        <w:t xml:space="preserve">if score_t &gt; s_max:</w:t>
+      </w:r>
+    </w:p>
+    <w:p>
+      <w:pPr>
+        <w:pStyle w:val="Equation"/>
+      </w:pPr>
+      <w:r>
+        <w:rPr>
+          <w:rFonts w:ascii="Courier New" w:cs="Courier New" w:eastAsia="Courier New" w:hAnsi="Courier New"/>
+          <w:sz w:val="20"/>
+          <w:szCs w:val="20"/>
+        </w:rPr>
+        <w:t xml:space="preserve">    s_max ← score_t; e_peak ← x_t</w:t>
+      </w:r>
+    </w:p>
+    <w:p>
+      <w:pPr>
+        <w:pStyle w:val="Equation"/>
+      </w:pPr>
+      <w:r>
+        <w:rPr>
+          <w:rFonts w:ascii="Courier New" w:cs="Courier New" w:eastAsia="Courier New" w:hAnsi="Courier New"/>
+          <w:sz w:val="20"/>
+          <w:szCs w:val="20"/>
+        </w:rPr>
+        <w:t xml:space="preserve">last_signal_ts ← now()  # update timestamp for next gap calculation</w:t>
+      </w:r>
+    </w:p>
+    <w:p>
+      <w:pPr>
+        <w:pStyle w:val="Heading3"/>
+      </w:pPr>
+      <w:r>
+        <w:t xml:space="preserve">4.4.2 Hybrid Drift and Coherence Tracking</w:t>
+      </w:r>
+    </w:p>
+    <w:p>
+      <w:r>
+        <w:t xml:space="preserve">Boundary detection combines kinematic drift with semantic coherence:</w:t>
+      </w:r>
+    </w:p>
+    <w:p>
+      <w:pPr>
+        <w:pStyle w:val="Equation"/>
+      </w:pPr>
+      <w:r>
+        <w:rPr>
+          <w:rFonts w:ascii="Courier New" w:cs="Courier New" w:eastAsia="Courier New" w:hAnsi="Courier New"/>
+          <w:sz w:val="20"/>
+          <w:szCs w:val="20"/>
+        </w:rPr>
+        <w:t xml:space="preserve">ε_noise = 0.02  # noise floor for drift</w:t>
+      </w:r>
+    </w:p>
+    <w:p>
+      <w:pPr>
+        <w:pStyle w:val="Equation"/>
+      </w:pPr>
+      <w:r>
+        <w:rPr>
+          <w:rFonts w:ascii="Courier New" w:cs="Courier New" w:eastAsia="Courier New" w:hAnsi="Courier New"/>
+          <w:sz w:val="20"/>
+          <w:szCs w:val="20"/>
+        </w:rPr>
+        <w:t xml:space="preserve">d_step ← max(drift_mag_t − ε_noise, 0)</w:t>
+      </w:r>
+    </w:p>
+    <w:p>
+      <w:pPr>
+        <w:pStyle w:val="Equation"/>
+      </w:pPr>
+      <w:r>
+        <w:rPr>
+          <w:rFonts w:ascii="Courier New" w:cs="Courier New" w:eastAsia="Courier New" w:hAnsi="Courier New"/>
+          <w:sz w:val="20"/>
+          <w:szCs w:val="20"/>
+        </w:rPr>
+        <w:t xml:space="preserve">η_mem ← EWMA(η_mem, d_step, α = lerp(0.3, 0.1, T))</w:t>
+      </w:r>
+    </w:p>
+    <w:p>
+      <w:r>
+        <w:t xml:space="preserve">Memory coherence tracks similarity within the current memory accumulation window (range [−1, 1] from mean cosine):</w:t>
+      </w:r>
+    </w:p>
+    <w:p>
+      <w:pPr>
+        <w:pStyle w:val="Equation"/>
+      </w:pPr>
+      <w:r>
+        <w:rPr>
+          <w:rFonts w:ascii="Courier New" w:cs="Courier New" w:eastAsia="Courier New" w:hAnsi="Courier New"/>
+          <w:sz w:val="20"/>
+          <w:szCs w:val="20"/>
+        </w:rPr>
+        <w:t xml:space="preserve">coherence_mem_t ← mean([cos(x_t, x_i) for x_i in current_window])</w:t>
+      </w:r>
+    </w:p>
+    <w:p>
+      <w:r>
+        <w:t xml:space="preserve">Note: coherence_mem is distinct from coherence_struct (Section 3.1.1). The former tracks within-memory similarity using raw mean cosine, while the latter measures variance-based integration with broader context. This dual-signal approach mirrors EM-LLM's boundary detection mechanism. In their formulation, boundaries occur where surprise (token-level prediction error) exceeds a threshold and segment cohesion drops. Our drift spike approximates surprise via embedding-space velocity, while coherence_mem drop captures within-memory similarity degradation.</w:t>
+      </w:r>
+    </w:p>
+    <w:p>
+      <w:pPr>
+        <w:pStyle w:val="Heading3"/>
+      </w:pPr>
+      <w:r>
+        <w:t xml:space="preserve">4.4.3 Natural Boundary Detection</w:t>
+      </w:r>
+    </w:p>
+    <w:p>
+      <w:r>
+        <w:t xml:space="preserve">Boundary score combines drift spike and coherence drop:</w:t>
+      </w:r>
+    </w:p>
+    <w:p>
+      <w:pPr>
+        <w:pStyle w:val="Equation"/>
+      </w:pPr>
+      <w:r>
+        <w:rPr>
+          <w:rFonts w:ascii="Courier New" w:cs="Courier New" w:eastAsia="Courier New" w:hAnsi="Courier New"/>
+          <w:sz w:val="20"/>
+          <w:szCs w:val="20"/>
+        </w:rPr>
+        <w:t xml:space="preserve">w_drift = lerp(0.6, 0.4, T)  # weight on drift</w:t>
+      </w:r>
+    </w:p>
+    <w:p>
+      <w:pPr>
+        <w:pStyle w:val="Equation"/>
+      </w:pPr>
+      <w:r>
+        <w:rPr>
+          <w:rFonts w:ascii="Courier New" w:cs="Courier New" w:eastAsia="Courier New" w:hAnsi="Courier New"/>
+          <w:sz w:val="20"/>
+          <w:szCs w:val="20"/>
+        </w:rPr>
+        <w:t xml:space="preserve">w_coh = 1 − w_drift  # weight on coherence drop</w:t>
+      </w:r>
+    </w:p>
+    <w:p>
+      <w:pPr>
+        <w:pStyle w:val="Equation"/>
+      </w:pPr>
+      <w:r>
+        <w:rPr>
+          <w:rFonts w:ascii="Courier New" w:cs="Courier New" w:eastAsia="Courier New" w:hAnsi="Courier New"/>
+          <w:sz w:val="20"/>
+          <w:szCs w:val="20"/>
+        </w:rPr>
+        <w:t xml:space="preserve">drift_spike ← (d_step − η_mem) / max(η_mem, ε)</w:t>
+      </w:r>
+    </w:p>
+    <w:p>
+      <w:pPr>
+        <w:pStyle w:val="Equation"/>
+      </w:pPr>
+      <w:r>
+        <w:rPr>
+          <w:rFonts w:ascii="Courier New" w:cs="Courier New" w:eastAsia="Courier New" w:hAnsi="Courier New"/>
+          <w:sz w:val="20"/>
+          <w:szCs w:val="20"/>
+        </w:rPr>
+        <w:t xml:space="preserve">coh_drop ← max(0, coherence_mem_{t−1} − coherence_mem_t)</w:t>
+      </w:r>
+    </w:p>
+    <w:p>
+      <w:pPr>
+        <w:pStyle w:val="Equation"/>
+      </w:pPr>
+      <w:r>
+        <w:rPr>
+          <w:rFonts w:ascii="Courier New" w:cs="Courier New" w:eastAsia="Courier New" w:hAnsi="Courier New"/>
+          <w:sz w:val="20"/>
+          <w:szCs w:val="20"/>
+        </w:rPr>
+        <w:t xml:space="preserve">boundary_score ← w_drift × sigmoid(drift_spike) +</w:t>
+      </w:r>
+    </w:p>
+    <w:p>
+      <w:pPr>
+        <w:pStyle w:val="Equation"/>
+      </w:pPr>
+      <w:r>
+        <w:rPr>
+          <w:rFonts w:ascii="Courier New" w:cs="Courier New" w:eastAsia="Courier New" w:hAnsi="Courier New"/>
+          <w:sz w:val="20"/>
+          <w:szCs w:val="20"/>
+        </w:rPr>
+        <w:t xml:space="preserve">                  w_coh × coh_drop</w:t>
+      </w:r>
+    </w:p>
+    <w:p>
+      <w:r>
+        <w:t xml:space="preserve">Boundary threshold and limits:</w:t>
+      </w:r>
+    </w:p>
+    <w:p>
+      <w:pPr>
+        <w:pStyle w:val="Equation"/>
+      </w:pPr>
+      <w:r>
+        <w:rPr>
+          <w:rFonts w:ascii="Courier New" w:cs="Courier New" w:eastAsia="Courier New" w:hAnsi="Courier New"/>
+          <w:sz w:val="20"/>
+          <w:szCs w:val="20"/>
+        </w:rPr>
+        <w:t xml:space="preserve">b_thresh(F, S) = lerp(0.4, 0.7, F) × lerp(1.1, 0.9, S)</w:t>
+      </w:r>
+    </w:p>
+    <w:p>
+      <w:pPr>
+        <w:pStyle w:val="Equation"/>
+      </w:pPr>
+      <w:r>
+        <w:rPr>
+          <w:rFonts w:ascii="Courier New" w:cs="Courier New" w:eastAsia="Courier New" w:hAnsi="Courier New"/>
+          <w:sz w:val="20"/>
+          <w:szCs w:val="20"/>
+        </w:rPr>
+        <w:t xml:space="preserve">max_mem_time(T) = lerp(30, 120, T)  # seconds</w:t>
+      </w:r>
+    </w:p>
+    <w:p>
+      <w:pPr>
+        <w:pStyle w:val="Equation"/>
+      </w:pPr>
+      <w:r>
+        <w:rPr>
+          <w:rFonts w:ascii="Courier New" w:cs="Courier New" w:eastAsia="Courier New" w:hAnsi="Courier New"/>
+          <w:sz w:val="20"/>
+          <w:szCs w:val="20"/>
+        </w:rPr>
+        <w:t xml:space="preserve">max_mem_drift(S) = lerp(0.8, 2.0, S)  # cumulative drift cap</w:t>
+      </w:r>
+    </w:p>
+    <w:p>
+      <w:r>
+        <w:t xml:space="preserve">Trigger memory flush when:</w:t>
+      </w:r>
+    </w:p>
+    <w:p>
+      <w:pPr>
+        <w:pStyle w:val="Equation"/>
+      </w:pPr>
+      <w:r>
+        <w:rPr>
+          <w:rFonts w:ascii="Courier New" w:cs="Courier New" w:eastAsia="Courier New" w:hAnsi="Courier New"/>
+          <w:sz w:val="20"/>
+          <w:szCs w:val="20"/>
+        </w:rPr>
+        <w:t xml:space="preserve">mem_elapsed ← now() − t_acc_start</w:t>
+      </w:r>
+    </w:p>
+    <w:p>
+      <w:pPr>
+        <w:pStyle w:val="Equation"/>
+      </w:pPr>
+      <w:r>
+        <w:rPr>
+          <w:rFonts w:ascii="Courier New" w:cs="Courier New" w:eastAsia="Courier New" w:hAnsi="Courier New"/>
+          <w:sz w:val="20"/>
+          <w:szCs w:val="20"/>
+        </w:rPr>
+        <w:t xml:space="preserve">should_flush = (boundary_score &gt; b_thresh(F, S)) OR</w:t>
+      </w:r>
+    </w:p>
+    <w:p>
+      <w:pPr>
+        <w:pStyle w:val="Equation"/>
+      </w:pPr>
+      <w:r>
+        <w:rPr>
+          <w:rFonts w:ascii="Courier New" w:cs="Courier New" w:eastAsia="Courier New" w:hAnsi="Courier New"/>
+          <w:sz w:val="20"/>
+          <w:szCs w:val="20"/>
+        </w:rPr>
+        <w:t xml:space="preserve">               (mem_elapsed &gt; max_mem_time(T)) OR</w:t>
+      </w:r>
+    </w:p>
+    <w:p>
+      <w:pPr>
+        <w:pStyle w:val="Equation"/>
+      </w:pPr>
+      <w:r>
+        <w:rPr>
+          <w:rFonts w:ascii="Courier New" w:cs="Courier New" w:eastAsia="Courier New" w:hAnsi="Courier New"/>
+          <w:sz w:val="20"/>
+          <w:szCs w:val="20"/>
+        </w:rPr>
+        <w:t xml:space="preserve">               (D_acc &gt; max_mem_drift(S)) OR</w:t>
+      </w:r>
+    </w:p>
+    <w:p>
+      <w:pPr>
+        <w:pStyle w:val="Equation"/>
+      </w:pPr>
+      <w:r>
+        <w:rPr>
+          <w:rFonts w:ascii="Courier New" w:cs="Courier New" w:eastAsia="Courier New" w:hAnsi="Courier New"/>
+          <w:sz w:val="20"/>
+          <w:szCs w:val="20"/>
+        </w:rPr>
+        <w:t xml:space="preserve">               (signal_gap &gt; gap_threshold(T))</w:t>
+      </w:r>
+    </w:p>
+    <w:p>
+      <w:r>
+        <w:t xml:space="preserve">where signal_gap = now() − last_signal_ts detects natural pauses (speech pauses, generation delays):</w:t>
+      </w:r>
+    </w:p>
+    <w:p>
+      <w:pPr>
+        <w:pStyle w:val="Equation"/>
+      </w:pPr>
+      <w:r>
+        <w:rPr>
+          <w:rFonts w:ascii="Courier New" w:cs="Courier New" w:eastAsia="Courier New" w:hAnsi="Courier New"/>
+          <w:sz w:val="20"/>
+          <w:szCs w:val="20"/>
+        </w:rPr>
+        <w:t xml:space="preserve">gap_threshold(T) = lerp(5, 30, T)  # seconds</w:t>
+      </w:r>
+    </w:p>
+    <w:p>
+      <w:pPr>
+        <w:pStyle w:val="Heading3"/>
+      </w:pPr>
+      <w:r>
+        <w:t xml:space="preserve">4.4.4 Spike Bypass (Flashbulb Flush)</w:t>
+      </w:r>
+    </w:p>
+    <w:p>
+      <w:r>
+        <w:t xml:space="preserve">High-salience signals bypass accumulation and flush immediately, capturing preceding context as a coherent memory unit:</w:t>
+      </w:r>
+    </w:p>
+    <w:p>
+      <w:pPr>
+        <w:pStyle w:val="Equation"/>
+      </w:pPr>
+      <w:r>
+        <w:rPr>
+          <w:rFonts w:ascii="Courier New" w:cs="Courier New" w:eastAsia="Courier New" w:hAnsi="Courier New"/>
+          <w:sz w:val="20"/>
+          <w:szCs w:val="20"/>
+        </w:rPr>
+        <w:t xml:space="preserve">spike_margin(S) = lerp(0.3, 0.15, S)  # above θ_dynamic</w:t>
+      </w:r>
+    </w:p>
+    <w:p>
+      <w:pPr>
+        <w:pStyle w:val="Equation"/>
+      </w:pPr>
+      <w:r>
+        <w:rPr>
+          <w:rFonts w:ascii="Courier New" w:cs="Courier New" w:eastAsia="Courier New" w:hAnsi="Courier New"/>
+          <w:sz w:val="20"/>
+          <w:szCs w:val="20"/>
+        </w:rPr>
+        <w:t xml:space="preserve">spike_bypass = score_t &gt; (θ_dynamic + spike_margin(S))</w:t>
+      </w:r>
+    </w:p>
+    <w:p>
+      <w:r>
+        <w:t xml:space="preserve">When spike_bypass triggers:</w:t>
+      </w:r>
+    </w:p>
+    <w:p>
+      <w:pPr>
+        <w:pStyle w:val="Equation"/>
+      </w:pPr>
+      <w:r>
+        <w:rPr>
+          <w:rFonts w:ascii="Courier New" w:cs="Courier New" w:eastAsia="Courier New" w:hAnsi="Courier New"/>
+          <w:sz w:val="20"/>
+          <w:szCs w:val="20"/>
+        </w:rPr>
+        <w:t xml:space="preserve">if spike_bypass AND n &gt; 1:</w:t>
+      </w:r>
+    </w:p>
+    <w:p>
+      <w:pPr>
+        <w:pStyle w:val="Equation"/>
+      </w:pPr>
+      <w:r>
+        <w:rPr>
+          <w:rFonts w:ascii="Courier New" w:cs="Courier New" w:eastAsia="Courier New" w:hAnsi="Courier New"/>
+          <w:sz w:val="20"/>
+          <w:szCs w:val="20"/>
+        </w:rPr>
+        <w:t xml:space="preserve">    commit_memory()  # includes spike signal</w:t>
+      </w:r>
+    </w:p>
+    <w:p>
+      <w:pPr>
+        <w:pStyle w:val="Equation"/>
+      </w:pPr>
+      <w:r>
+        <w:rPr>
+          <w:rFonts w:ascii="Courier New" w:cs="Courier New" w:eastAsia="Courier New" w:hAnsi="Courier New"/>
+          <w:sz w:val="20"/>
+          <w:szCs w:val="20"/>
+        </w:rPr>
+        <w:t xml:space="preserve">    reset_accumulator()</w:t>
+      </w:r>
+    </w:p>
+    <w:p>
+      <w:r>
+        <w:t xml:space="preserve">This ensures flashbulb moments capture their surrounding context rather than creating isolated micro-memories.</w:t>
+      </w:r>
+    </w:p>
+    <w:p>
+      <w:pPr>
+        <w:pStyle w:val="Heading3"/>
+      </w:pPr>
+      <w:r>
+        <w:t xml:space="preserve">4.4.5 Window Score and Refractory</w:t>
+      </w:r>
+    </w:p>
+    <w:p>
+      <w:r>
+        <w:t xml:space="preserve">Memory-level score combines peak and average with coverage bonus:</w:t>
+      </w:r>
+    </w:p>
+    <w:p>
+      <w:pPr>
+        <w:pStyle w:val="Equation"/>
+      </w:pPr>
+      <w:r>
+        <w:rPr>
+          <w:rFonts w:ascii="Courier New" w:cs="Courier New" w:eastAsia="Courier New" w:hAnsi="Courier New"/>
+          <w:sz w:val="20"/>
+          <w:szCs w:val="20"/>
+        </w:rPr>
+        <w:t xml:space="preserve">s_avg ← s_sum / max(n, 1)</w:t>
+      </w:r>
+    </w:p>
+    <w:p>
+      <w:pPr>
+        <w:pStyle w:val="Equation"/>
+      </w:pPr>
+      <w:r>
+        <w:rPr>
+          <w:rFonts w:ascii="Courier New" w:cs="Courier New" w:eastAsia="Courier New" w:hAnsi="Courier New"/>
+          <w:sz w:val="20"/>
+          <w:szCs w:val="20"/>
+        </w:rPr>
+        <w:t xml:space="preserve">α(F) = lerp(0.3, 0.7, F)  # peak vs avg weight</w:t>
+      </w:r>
+    </w:p>
+    <w:p>
+      <w:pPr>
+        <w:pStyle w:val="Equation"/>
+      </w:pPr>
+      <w:r>
+        <w:rPr>
+          <w:rFonts w:ascii="Courier New" w:cs="Courier New" w:eastAsia="Courier New" w:hAnsi="Courier New"/>
+          <w:sz w:val="20"/>
+          <w:szCs w:val="20"/>
+        </w:rPr>
+        <w:t xml:space="preserve">coverage ← min(n / n_ctx(T), 1.0)  # memory completeness</w:t>
+      </w:r>
+    </w:p>
+    <w:p>
+      <w:pPr>
+        <w:pStyle w:val="Equation"/>
+      </w:pPr>
+      <w:r>
+        <w:rPr>
+          <w:rFonts w:ascii="Courier New" w:cs="Courier New" w:eastAsia="Courier New" w:hAnsi="Courier New"/>
+          <w:sz w:val="20"/>
+          <w:szCs w:val="20"/>
+        </w:rPr>
+        <w:t xml:space="preserve">β(S) = lerp(0.05, 0.15, S)  # coverage weight</w:t>
+      </w:r>
+    </w:p>
+    <w:p>
+      <w:pPr>
+        <w:pStyle w:val="Equation"/>
+      </w:pPr>
+      <w:r>
+        <w:rPr>
+          <w:rFonts w:ascii="Courier New" w:cs="Courier New" w:eastAsia="Courier New" w:hAnsi="Courier New"/>
+          <w:sz w:val="20"/>
+          <w:szCs w:val="20"/>
+        </w:rPr>
+        <w:t xml:space="preserve">S_window ← α(F) × s_max + (1 − α(F)) × s_avg + β(S) × coverage</w:t>
+      </w:r>
+    </w:p>
+    <w:p>
+      <w:r>
+        <w:t xml:space="preserve">Write refractory suppresses rapid successive writes:</w:t>
+      </w:r>
+    </w:p>
+    <w:p>
+      <w:pPr>
+        <w:pStyle w:val="Equation"/>
+      </w:pPr>
+      <w:r>
+        <w:rPr>
+          <w:rFonts w:ascii="Courier New" w:cs="Courier New" w:eastAsia="Courier New" w:hAnsi="Courier New"/>
+          <w:sz w:val="20"/>
+          <w:szCs w:val="20"/>
+        </w:rPr>
+        <w:t xml:space="preserve">τ_write_refrac(T) = lerp(5, 30, T)  # seconds</w:t>
+      </w:r>
+    </w:p>
+    <w:p>
+      <w:pPr>
+        <w:pStyle w:val="Equation"/>
+      </w:pPr>
+      <w:r>
+        <w:rPr>
+          <w:rFonts w:ascii="Courier New" w:cs="Courier New" w:eastAsia="Courier New" w:hAnsi="Courier New"/>
+          <w:sz w:val="20"/>
+          <w:szCs w:val="20"/>
+        </w:rPr>
+        <w:t xml:space="preserve">k_write_refrac = lerp(0.3, 0.1, T)</w:t>
+      </w:r>
+    </w:p>
+    <w:p>
+      <w:pPr>
+        <w:pStyle w:val="Equation"/>
+      </w:pPr>
+      <w:r>
+        <w:rPr>
+          <w:rFonts w:ascii="Courier New" w:cs="Courier New" w:eastAsia="Courier New" w:hAnsi="Courier New"/>
+          <w:sz w:val="20"/>
+          <w:szCs w:val="20"/>
+        </w:rPr>
+        <w:t xml:space="preserve">Δt_write ← now() − last_write_ts</w:t>
+      </w:r>
+    </w:p>
+    <w:p>
+      <w:pPr>
+        <w:pStyle w:val="Equation"/>
+      </w:pPr>
+      <w:r>
+        <w:rPr>
+          <w:rFonts w:ascii="Courier New" w:cs="Courier New" w:eastAsia="Courier New" w:hAnsi="Courier New"/>
+          <w:sz w:val="20"/>
+          <w:szCs w:val="20"/>
+        </w:rPr>
+        <w:t xml:space="preserve">M_write_refrac ← 1.0 + k_write_refrac × exp(−Δt_write / τ_write_refrac(T))</w:t>
+      </w:r>
+    </w:p>
+    <w:p>
+      <w:r>
+        <w:t xml:space="preserve">Final write decision:</w:t>
+      </w:r>
+    </w:p>
+    <w:p>
+      <w:pPr>
+        <w:pStyle w:val="Equation"/>
+      </w:pPr>
+      <w:r>
+        <w:rPr>
+          <w:rFonts w:ascii="Courier New" w:cs="Courier New" w:eastAsia="Courier New" w:hAnsi="Courier New"/>
+          <w:sz w:val="20"/>
+          <w:szCs w:val="20"/>
+        </w:rPr>
+        <w:t xml:space="preserve">θ_memory ← θ_dynamic × M_write_refrac</w:t>
+      </w:r>
+    </w:p>
+    <w:p>
+      <w:pPr>
+        <w:pStyle w:val="Equation"/>
+      </w:pPr>
+      <w:r>
+        <w:rPr>
+          <w:rFonts w:ascii="Courier New" w:cs="Courier New" w:eastAsia="Courier New" w:hAnsi="Courier New"/>
+          <w:sz w:val="20"/>
+          <w:szCs w:val="20"/>
+        </w:rPr>
+        <w:t xml:space="preserve">write_memory = (should_flush OR spike_bypass) AND (S_window &gt; θ_memory)</w:t>
+      </w:r>
+    </w:p>
+    <w:p>
+      <w:r>
+        <w:t xml:space="preserve">Representative embedding blends accumulator mean with peak:</w:t>
+      </w:r>
+    </w:p>
+    <w:p>
+      <w:pPr>
+        <w:pStyle w:val="Equation"/>
+      </w:pPr>
+      <w:r>
+        <w:rPr>
+          <w:rFonts w:ascii="Courier New" w:cs="Courier New" w:eastAsia="Courier New" w:hAnsi="Courier New"/>
+          <w:sz w:val="20"/>
+          <w:szCs w:val="20"/>
+        </w:rPr>
+        <w:t xml:space="preserve">ρ(F) = lerp(0.3, 0.7, F)  # mean vs peak blend</w:t>
+      </w:r>
+    </w:p>
+    <w:p>
+      <w:pPr>
+        <w:pStyle w:val="Equation"/>
+      </w:pPr>
+      <w:r>
+        <w:rPr>
+          <w:rFonts w:ascii="Courier New" w:cs="Courier New" w:eastAsia="Courier New" w:hAnsi="Courier New"/>
+          <w:sz w:val="20"/>
+          <w:szCs w:val="20"/>
+        </w:rPr>
+        <w:t xml:space="preserve">e_rep ← l2_normalize(ρ(F) × μ_acc + (1 − ρ(F)) × e_peak)</w:t>
+      </w:r>
+    </w:p>
+    <w:p>
+      <w:r>
+        <w:t xml:space="preserve">On write: store e_rep with metadata {n, s_max, s_avg, D_acc, mem_elapsed}. Reset accumulator for next unit.</w:t>
+      </w:r>
+    </w:p>
+    <w:p>
       <w:r>
         <w:br w:type="page"/>
       </w:r>
@@ -3620,7 +4828,46 @@
     </w:p>
     <w:p>
       <w:r>
-        <w:t xml:space="preserve">Each memory m maintains a strength value updated through use-frequency tracking and exponential decay:</w:t>
+        <w:t xml:space="preserve">Each memory m maintains a strength value updated through use-frequency tracking and exponential decay. The update uses a sensitivity-modulated learning rate and a binary usage indicator:</w:t>
+      </w:r>
+    </w:p>
+    <w:p>
+      <w:pPr>
+        <w:pStyle w:val="Equation"/>
+      </w:pPr>
+      <w:r>
+        <w:rPr>
+          <w:rFonts w:ascii="Courier New" w:cs="Courier New" w:eastAsia="Courier New" w:hAnsi="Courier New"/>
+          <w:sz w:val="20"/>
+          <w:szCs w:val="20"/>
+        </w:rPr>
+        <w:t xml:space="preserve">α_min_S = 0.05; α_span_S = 0.35</w:t>
+      </w:r>
+    </w:p>
+    <w:p>
+      <w:pPr>
+        <w:pStyle w:val="Equation"/>
+      </w:pPr>
+      <w:r>
+        <w:rPr>
+          <w:rFonts w:ascii="Courier New" w:cs="Courier New" w:eastAsia="Courier New" w:hAnsi="Courier New"/>
+          <w:sz w:val="20"/>
+          <w:szCs w:val="20"/>
+        </w:rPr>
+        <w:t xml:space="preserve">α_S(t) = α_min_S + S × α_span_S × u(t)</w:t>
+      </w:r>
+    </w:p>
+    <w:p>
+      <w:pPr>
+        <w:pStyle w:val="Equation"/>
+      </w:pPr>
+      <w:r>
+        <w:rPr>
+          <w:rFonts w:ascii="Courier New" w:cs="Courier New" w:eastAsia="Courier New" w:hAnsi="Courier New"/>
+          <w:sz w:val="20"/>
+          <w:szCs w:val="20"/>
+        </w:rPr>
+        <w:t xml:space="preserve">used_flag(m) = 1 if m was retrieved and used in current step, else 0</w:t>
       </w:r>
     </w:p>
     <w:p>
@@ -4150,7 +5397,7 @@
     </w:p>
     <w:p>
       <w:r>
-        <w:t xml:space="preserve">This factor is consumed by the Stability update (Section 4.3.2), avoiding conflicting adjustments between feedback mechanisms.</w:t>
+        <w:t xml:space="preserve">This factor is consumed by the Stability update (Section 2.3.2), avoiding conflicting adjustments between feedback mechanisms.</w:t>
       </w:r>
     </w:p>
     <w:p>
@@ -4360,7 +5607,7 @@
     </w:p>
     <w:p>
       <w:r>
-        <w:t xml:space="preserve">Following Cowan's (2001) capacity constraints, working memory maintains a limited number of active items:</w:t>
+        <w:t xml:space="preserve">Following Cowan's (2001) capacity constraints, working memory maintains a limited number of active items. Working memory slots hold coherent memories as defined in Section 4.4, preserving the full content and signal sequence:</w:t>
       </w:r>
     </w:p>
     <w:p>
@@ -4382,6 +5629,94 @@
       </w:r>
     </w:p>
     <w:p>
+      <w:pPr>
+        <w:pStyle w:val="Heading3"/>
+      </w:pPr>
+      <w:r>
+        <w:t xml:space="preserve">6.1.1 Slot Content Structure</w:t>
+      </w:r>
+    </w:p>
+    <w:p>
+      <w:r>
+        <w:t xml:space="preserve">Each working memory slot holds a coherent memory with its full content and metadata:</w:t>
+      </w:r>
+    </w:p>
+    <w:p>
+      <w:pPr>
+        <w:pStyle w:val="Equation"/>
+      </w:pPr>
+      <w:r>
+        <w:rPr>
+          <w:rFonts w:ascii="Courier New" w:cs="Courier New" w:eastAsia="Courier New" w:hAnsi="Courier New"/>
+          <w:sz w:val="20"/>
+          <w:szCs w:val="20"/>
+        </w:rPr>
+        <w:t xml:space="preserve">slot.content ← concatenated signal texts</w:t>
+      </w:r>
+    </w:p>
+    <w:p>
+      <w:r>
+        <w:rPr>
+          <w:rFonts w:ascii="Courier New" w:cs="Courier New" w:eastAsia="Courier New" w:hAnsi="Courier New"/>
+          <w:sz w:val="20"/>
+          <w:szCs w:val="20"/>
+        </w:rPr>
+        <w:t xml:space="preserve">slot.embedding ← e_rep  # representative embedding (Section 4.4.5)</w:t>
+      </w:r>
+    </w:p>
+    <w:p>
+      <w:pPr>
+        <w:pStyle w:val="Equation"/>
+      </w:pPr>
+      <w:r>
+        <w:rPr>
+          <w:rFonts w:ascii="Courier New" w:cs="Courier New" w:eastAsia="Courier New" w:hAnsi="Courier New"/>
+          <w:sz w:val="20"/>
+          <w:szCs w:val="20"/>
+        </w:rPr>
+        <w:t xml:space="preserve">slot.signals ← [x_1, x_2, ..., x_n]  # ordered signal embeddings</w:t>
+      </w:r>
+    </w:p>
+    <w:p>
+      <w:pPr>
+        <w:pStyle w:val="Equation"/>
+      </w:pPr>
+      <w:r>
+        <w:rPr>
+          <w:rFonts w:ascii="Courier New" w:cs="Courier New" w:eastAsia="Courier New" w:hAnsi="Courier New"/>
+          <w:sz w:val="20"/>
+          <w:szCs w:val="20"/>
+        </w:rPr>
+        <w:t xml:space="preserve">slot.metadata ← {n, s_max, s_avg, D_acc, mem_elapsed,</w:t>
+      </w:r>
+    </w:p>
+    <w:p>
+      <w:pPr>
+        <w:pStyle w:val="Equation"/>
+      </w:pPr>
+      <w:r>
+        <w:rPr>
+          <w:rFonts w:ascii="Courier New" w:cs="Courier New" w:eastAsia="Courier New" w:hAnsi="Courier New"/>
+          <w:sz w:val="20"/>
+          <w:szCs w:val="20"/>
+        </w:rPr>
+        <w:t xml:space="preserve">                 s_emotion_max, s_arousal_avg}</w:t>
+      </w:r>
+    </w:p>
+    <w:p>
+      <w:r>
+        <w:t xml:space="preserve">The emotional metrics (s_emotion_max, s_arousal_avg) are accumulated during memory formation for use by Emotional Consolidation (Section 6.7).</w:t>
+      </w:r>
+    </w:p>
+    <w:p>
+      <w:pPr>
+        <w:pStyle w:val="Heading3"/>
+      </w:pPr>
+      <w:r>
+        <w:t xml:space="preserve">6.1.2 Maintenance Cost</w:t>
+      </w:r>
+    </w:p>
+    <w:p>
       <w:r>
         <w:t xml:space="preserve">Maintenance incurs cognitive cost:</w:t>
       </w:r>
@@ -4418,6 +5753,14 @@
       </w:r>
     </w:p>
     <w:p>
+      <w:pPr>
+        <w:pStyle w:val="Heading3"/>
+      </w:pPr>
+      <w:r>
+        <w:t xml:space="preserve">6.1.3 Memory-Level Gating</w:t>
+      </w:r>
+    </w:p>
+    <w:p>
       <w:r>
         <w:t xml:space="preserve">Gating thresholds determine entry and chunking:</w:t>
       </w:r>
@@ -4475,6 +5818,146 @@
       </w:r>
     </w:p>
     <w:p>
+      <w:r>
+        <w:t xml:space="preserve">Working memory gating evaluates coherent memories at accumulation boundaries (Section 4.4.3), not individual signals:</w:t>
+      </w:r>
+    </w:p>
+    <w:p>
+      <w:pPr>
+        <w:pStyle w:val="Equation"/>
+      </w:pPr>
+      <w:r>
+        <w:rPr>
+          <w:rFonts w:ascii="Courier New" w:cs="Courier New" w:eastAsia="Courier New" w:hAnsi="Courier New"/>
+          <w:sz w:val="20"/>
+          <w:szCs w:val="20"/>
+        </w:rPr>
+        <w:t xml:space="preserve">on_memory_boundary:</w:t>
+      </w:r>
+    </w:p>
+    <w:p>
+      <w:pPr>
+        <w:pStyle w:val="Equation"/>
+      </w:pPr>
+      <w:r>
+        <w:rPr>
+          <w:rFonts w:ascii="Courier New" w:cs="Courier New" w:eastAsia="Courier New" w:hAnsi="Courier New"/>
+          <w:sz w:val="20"/>
+          <w:szCs w:val="20"/>
+        </w:rPr>
+        <w:t xml:space="preserve">    memory_benefit ← α × S_window + β × relevance(μ_acc, task_context) +</w:t>
+      </w:r>
+    </w:p>
+    <w:p>
+      <w:pPr>
+        <w:pStyle w:val="Equation"/>
+      </w:pPr>
+      <w:r>
+        <w:rPr>
+          <w:rFonts w:ascii="Courier New" w:cs="Courier New" w:eastAsia="Courier New" w:hAnsi="Courier New"/>
+          <w:sz w:val="20"/>
+          <w:szCs w:val="20"/>
+        </w:rPr>
+        <w:t xml:space="preserve">                       γ × novelty(μ_acc, existing_slots)</w:t>
+      </w:r>
+    </w:p>
+    <w:p>
+      <w:pPr>
+        <w:pStyle w:val="Equation"/>
+      </w:pPr>
+      <w:r>
+        <w:rPr>
+          <w:rFonts w:ascii="Courier New" w:cs="Courier New" w:eastAsia="Courier New" w:hAnsi="Courier New"/>
+          <w:sz w:val="20"/>
+          <w:szCs w:val="20"/>
+        </w:rPr>
+        <w:t xml:space="preserve">    margin ← memory_benefit − gate_threshold</w:t>
+      </w:r>
+    </w:p>
+    <w:p>
+      <w:pPr>
+        <w:pStyle w:val="Equation"/>
+      </w:pPr>
+      <w:r>
+        <w:rPr>
+          <w:rFonts w:ascii="Courier New" w:cs="Courier New" w:eastAsia="Courier New" w:hAnsi="Courier New"/>
+          <w:sz w:val="20"/>
+          <w:szCs w:val="20"/>
+        </w:rPr>
+        <w:t xml:space="preserve">    total_cost ← maintenance_cost_per_slot × |existing_slots| + complexity_penalty</w:t>
+      </w:r>
+    </w:p>
+    <w:p>
+      <w:pPr>
+        <w:pStyle w:val="Equation"/>
+      </w:pPr>
+      <w:r>
+        <w:rPr>
+          <w:rFonts w:ascii="Courier New" w:cs="Courier New" w:eastAsia="Courier New" w:hAnsi="Courier New"/>
+          <w:sz w:val="20"/>
+          <w:szCs w:val="20"/>
+        </w:rPr>
+        <w:t xml:space="preserve">    accept_memory = (margin ≥ total_cost)</w:t>
+      </w:r>
+    </w:p>
+    <w:p>
+      <w:r>
+        <w:t xml:space="preserve">Note that total_cost is computed from existing slots only, not the prospective new slot. This avoids a bootstrap problem where empty working memory would require unreasonably high benefit scores to accept the first item.</w:t>
+      </w:r>
+    </w:p>
+    <w:p>
+      <w:pPr>
+        <w:pStyle w:val="Heading3"/>
+      </w:pPr>
+      <w:r>
+        <w:t xml:space="preserve">6.1.4 Chunking at Memory Level</w:t>
+      </w:r>
+    </w:p>
+    <w:p>
+      <w:r>
+        <w:t xml:space="preserve">Chunking operates on memory embeddings to merge related content:</w:t>
+      </w:r>
+    </w:p>
+    <w:p>
+      <w:pPr>
+        <w:pStyle w:val="Equation"/>
+      </w:pPr>
+      <w:r>
+        <w:rPr>
+          <w:rFonts w:ascii="Courier New" w:cs="Courier New" w:eastAsia="Courier New" w:hAnsi="Courier New"/>
+          <w:sz w:val="20"/>
+          <w:szCs w:val="20"/>
+        </w:rPr>
+        <w:t xml:space="preserve">similar_slots ← {s ∈ slots | cos(s.embedding, memory.e_rep) &gt; chunking_threshold}</w:t>
+      </w:r>
+    </w:p>
+    <w:p>
+      <w:pPr>
+        <w:pStyle w:val="Equation"/>
+      </w:pPr>
+      <w:r>
+        <w:rPr>
+          <w:rFonts w:ascii="Courier New" w:cs="Courier New" w:eastAsia="Courier New" w:hAnsi="Courier New"/>
+          <w:sz w:val="20"/>
+          <w:szCs w:val="20"/>
+        </w:rPr>
+        <w:t xml:space="preserve">if |similar_slots| &gt; 0:</w:t>
+      </w:r>
+    </w:p>
+    <w:p>
+      <w:pPr>
+        <w:pStyle w:val="Equation"/>
+      </w:pPr>
+      <w:r>
+        <w:rPr>
+          <w:rFonts w:ascii="Courier New" w:cs="Courier New" w:eastAsia="Courier New" w:hAnsi="Courier New"/>
+          <w:sz w:val="20"/>
+          <w:szCs w:val="20"/>
+        </w:rPr>
+        <w:t xml:space="preserve">    merge_into_chunk(similar_slots, memory)</w:t>
+      </w:r>
+    </w:p>
+    <w:p>
       <w:pPr>
         <w:pStyle w:val="Heading2"/>
       </w:pPr>
@@ -5005,7 +6488,7 @@
     </w:p>
     <w:p>
       <w:r>
-        <w:t xml:space="preserve">High-emotion events trigger enhanced consolidation, following McGaugh's (2004) findings:</w:t>
+        <w:t xml:space="preserve">High-emotion events trigger enhanced consolidation, following McGaugh's (2004) findings. As detailed in Section 7.1.1, consolidation operates on stored memory metadata:</w:t>
       </w:r>
     </w:p>
     <w:p>
@@ -5044,25 +6527,38 @@
           <w:sz w:val="20"/>
           <w:szCs w:val="20"/>
         </w:rPr>
-        <w:t xml:space="preserve">trigger = (emotion_intensity_t ≥ θ_intensity) AND</w:t>
-      </w:r>
-    </w:p>
-    <w:p>
-      <w:pPr>
-        <w:pStyle w:val="Equation"/>
-      </w:pPr>
-      <w:r>
-        <w:rPr>
-          <w:rFonts w:ascii="Courier New" w:cs="Courier New" w:eastAsia="Courier New" w:hAnsi="Courier New"/>
-          <w:sz w:val="20"/>
-          <w:szCs w:val="20"/>
-        </w:rPr>
-        <w:t xml:space="preserve">           (arousal_t ≥ θ_arousal)</w:t>
-      </w:r>
-    </w:p>
-    <w:p>
-      <w:r>
-        <w:t xml:space="preserve">Flashbulb memories receive extended half-life bonuses:</w:t>
+        <w:t xml:space="preserve"># Consolidation uses stored memory emotional metadata</w:t>
+      </w:r>
+    </w:p>
+    <w:p>
+      <w:pPr>
+        <w:pStyle w:val="Equation"/>
+      </w:pPr>
+      <w:r>
+        <w:rPr>
+          <w:rFonts w:ascii="Courier New" w:cs="Courier New" w:eastAsia="Courier New" w:hAnsi="Courier New"/>
+          <w:sz w:val="20"/>
+          <w:szCs w:val="20"/>
+        </w:rPr>
+        <w:t xml:space="preserve">trigger = (m.metadata.s_emotion_max ≥ θ_intensity) AND</w:t>
+      </w:r>
+    </w:p>
+    <w:p>
+      <w:pPr>
+        <w:pStyle w:val="Equation"/>
+      </w:pPr>
+      <w:r>
+        <w:rPr>
+          <w:rFonts w:ascii="Courier New" w:cs="Courier New" w:eastAsia="Courier New" w:hAnsi="Courier New"/>
+          <w:sz w:val="20"/>
+          <w:szCs w:val="20"/>
+        </w:rPr>
+        <w:t xml:space="preserve">           (m.metadata.s_arousal_avg ≥ θ_arousal)</w:t>
+      </w:r>
+    </w:p>
+    <w:p>
+      <w:r>
+        <w:t xml:space="preserve">Flashbulb memories receive extended half-life bonuses based on the memory's peak emotional intensity:</w:t>
       </w:r>
     </w:p>
     <w:p>
@@ -5088,6 +6584,19 @@
           <w:sz w:val="20"/>
           <w:szCs w:val="20"/>
         </w:rPr>
+        <w:t xml:space="preserve"># Half-life bonus uses stored memory emotional peak</w:t>
+      </w:r>
+    </w:p>
+    <w:p>
+      <w:pPr>
+        <w:pStyle w:val="Equation"/>
+      </w:pPr>
+      <w:r>
+        <w:rPr>
+          <w:rFonts w:ascii="Courier New" w:cs="Courier New" w:eastAsia="Courier New" w:hAnsi="Courier New"/>
+          <w:sz w:val="20"/>
+          <w:szCs w:val="20"/>
+        </w:rPr>
         <w:t xml:space="preserve">emotional_half_life_bonus = exp(lerp(0, ln(3), S)) ×</w:t>
       </w:r>
     </w:p>
@@ -5101,12 +6610,12 @@
           <w:sz w:val="20"/>
           <w:szCs w:val="20"/>
         </w:rPr>
-        <w:t xml:space="preserve">                             (1 + emotion_intensity_t)</w:t>
-      </w:r>
-    </w:p>
-    <w:p>
-      <w:r>
-        <w:t xml:space="preserve">Emotional tags cascade to related memories with decay:</w:t>
+        <w:t xml:space="preserve">                             (1 + m.metadata.s_emotion_max)</w:t>
+      </w:r>
+    </w:p>
+    <w:p>
+      <w:r>
+        <w:t xml:space="preserve">The emotional metrics (s_emotion_max, s_arousal_avg) are accumulated during memory formation and stored with the memory (Section 6.1.1).</w:t>
       </w:r>
     </w:p>
     <w:p>
@@ -5150,7 +6659,7 @@
     </w:p>
     <w:p>
       <w:r>
-        <w:t xml:space="preserve">The consolidation system transforms episodic memories into semantic structures through clustering, summarization, and knowledge graph construction.</w:t>
+        <w:t xml:space="preserve">The consolidation system transforms episodic memories into semantic structures through clustering, summarization, and knowledge graph construction. Memory-level storage (Section 4.4) ensures each embedding represents a coherent unit.</w:t>
       </w:r>
     </w:p>
     <w:p>
@@ -5163,7 +6672,7 @@
     </w:p>
     <w:p>
       <w:r>
-        <w:t xml:space="preserve">Consolidation activates under capacity, rate, or temporal conditions:</w:t>
+        <w:t xml:space="preserve">Consolidation operates on stored memory representatives (e_rep from Section 4.4.5), not individual signals. It activates under capacity, rate, or temporal conditions:</w:t>
       </w:r>
     </w:p>
     <w:p>
@@ -5189,7 +6698,7 @@
           <w:sz w:val="20"/>
           <w:szCs w:val="20"/>
         </w:rPr>
-        <w:t xml:space="preserve">                      (write_rate_t &lt; rate_target_t / 2) OR</w:t>
+        <w:t xml:space="preserve">                      (memory_write_rate_t &lt; rate_target_t / 2) OR</w:t>
       </w:r>
     </w:p>
     <w:p>
@@ -5207,7 +6716,7 @@
     </w:p>
     <w:p>
       <w:r>
-        <w:t xml:space="preserve">The consolidation rate adapts to Stability and Sensitivity:</w:t>
+        <w:t xml:space="preserve">The consolidation rate adapts to Stability and Sensitivity (write_rate tracks memory writes, not signal writes):</w:t>
       </w:r>
     </w:p>
     <w:p>
@@ -5246,7 +6755,7 @@
     </w:p>
     <w:p>
       <w:r>
-        <w:t xml:space="preserve">Consolidation runs during idle periods and preempts for retrieval:</w:t>
+        <w:t xml:space="preserve">Consolidation runs during idle periods and preempts for retrieval. The is_accumulating_memory check ensures consolidation doesn't interrupt mid-memory accumulation:</w:t>
       </w:r>
     </w:p>
     <w:p>
@@ -5285,7 +6794,20 @@
           <w:sz w:val="20"/>
           <w:szCs w:val="20"/>
         </w:rPr>
-        <w:t xml:space="preserve">should_start = (NOT is_processing_signal) AND</w:t>
+        <w:t xml:space="preserve"># Consolidation waits for memory completion, not just signal arrival</w:t>
+      </w:r>
+    </w:p>
+    <w:p>
+      <w:pPr>
+        <w:pStyle w:val="Equation"/>
+      </w:pPr>
+      <w:r>
+        <w:rPr>
+          <w:rFonts w:ascii="Courier New" w:cs="Courier New" w:eastAsia="Courier New" w:hAnsi="Courier New"/>
+          <w:sz w:val="20"/>
+          <w:szCs w:val="20"/>
+        </w:rPr>
+        <w:t xml:space="preserve">should_start = (NOT is_accumulating_memory) AND</w:t>
       </w:r>
     </w:p>
     <w:p>
@@ -5316,7 +6838,7 @@
     </w:p>
     <w:p>
       <w:r>
-        <w:t xml:space="preserve">On retrieval events, consolidation pauses, commits micro-batches, and resumes when idle.</w:t>
+        <w:t xml:space="preserve">Consolidation begins only after the current memory has been flushed (Section 4.4.3) and the idle period has elapsed. On retrieval events, consolidation pauses, commits micro-batches, and resumes when idle.</w:t>
       </w:r>
     </w:p>
     <w:p>
@@ -5329,7 +6851,7 @@
     </w:p>
     <w:p>
       <w:r>
-        <w:t xml:space="preserve">Each memory receives a consolidation score determining merge priority:</w:t>
+        <w:t xml:space="preserve">Each stored embedding represents a memory representative (e_rep from Section 4.4.5). Each memory receives a consolidation score determining merge priority:</w:t>
       </w:r>
     </w:p>
     <w:p>
@@ -5914,20 +7436,43 @@
     </w:p>
     <w:p>
       <w:r>
-        <w:t xml:space="preserve">Retrieval combines vector similarity with graph expansion:</w:t>
-      </w:r>
-    </w:p>
-    <w:p>
-      <w:pPr>
-        <w:pStyle w:val="Equation"/>
-      </w:pPr>
-      <w:r>
-        <w:rPr>
-          <w:rFonts w:ascii="Courier New" w:cs="Courier New" w:eastAsia="Courier New" w:hAnsi="Courier New"/>
-          <w:sz w:val="20"/>
-          <w:szCs w:val="20"/>
-        </w:rPr>
-        <w:t xml:space="preserve">results_vec ← topK(vector_search(x_t, k=kNN_size))</w:t>
+        <w:t xml:space="preserve">Retrieval combines vector similarity with graph expansion. Both initial retrieval and re-ranking use the memory centroid (μ_acc from Section 4.4.1) as the query vector, ensuring retrieved memories are ranked by relevance to the overall context rather than momentary signal fluctuations:</w:t>
+      </w:r>
+    </w:p>
+    <w:p>
+      <w:pPr>
+        <w:pStyle w:val="Equation"/>
+      </w:pPr>
+      <w:r>
+        <w:rPr>
+          <w:rFonts w:ascii="Courier New" w:cs="Courier New" w:eastAsia="Courier New" w:hAnsi="Courier New"/>
+          <w:sz w:val="20"/>
+          <w:szCs w:val="20"/>
+        </w:rPr>
+        <w:t xml:space="preserve"># Query and re-rank using current memory centroid</w:t>
+      </w:r>
+    </w:p>
+    <w:p>
+      <w:r>
+        <w:rPr>
+          <w:rFonts w:ascii="Courier New" w:cs="Courier New" w:eastAsia="Courier New" w:hAnsi="Courier New"/>
+          <w:sz w:val="20"/>
+          <w:szCs w:val="20"/>
+        </w:rPr>
+        <w:t xml:space="preserve">q ← μ_acc  # memory centroid from Section 4.4.1</w:t>
+      </w:r>
+    </w:p>
+    <w:p>
+      <w:pPr>
+        <w:pStyle w:val="Equation"/>
+      </w:pPr>
+      <w:r>
+        <w:rPr>
+          <w:rFonts w:ascii="Courier New" w:cs="Courier New" w:eastAsia="Courier New" w:hAnsi="Courier New"/>
+          <w:sz w:val="20"/>
+          <w:szCs w:val="20"/>
+        </w:rPr>
+        <w:t xml:space="preserve">results_vec ← topK(vector_search(q, k=kNN_size))</w:t>
       </w:r>
     </w:p>
     <w:p>
@@ -5979,12 +7524,12 @@
           <w:sz w:val="20"/>
           <w:szCs w:val="20"/>
         </w:rPr>
-        <w:t xml:space="preserve">re_ranked ← sort_by(cos(x_t, embeddings(combined)))</w:t>
-      </w:r>
-    </w:p>
-    <w:p>
-      <w:r>
-        <w:t xml:space="preserve">Graph expansion uses recursive traversal with depth limits to find related context that pure vector search might miss.</w:t>
+        <w:t xml:space="preserve">re_ranked ← sort_by(cos(q, embeddings(combined)))  # re-rank by memory centroid</w:t>
+      </w:r>
+    </w:p>
+    <w:p>
+      <w:r>
+        <w:t xml:space="preserve">Graph expansion uses recursive traversal with depth limits to find related context that pure vector search might miss. Using the memory centroid maintains consistency between vector search and graph expansion results.</w:t>
       </w:r>
     </w:p>
     <w:p>
@@ -6002,7 +7547,7 @@
     </w:p>
     <w:p>
       <w:r>
-        <w:t xml:space="preserve">The interrupt gate controls when retrieved memories enter active context during streaming generation. The gate balances novelty value against disruption cost.</w:t>
+        <w:t xml:space="preserve">The interrupt gate controls when retrieved memories enter active context during streaming generation. The gate balances novelty value against disruption cost. The interrupt gate operates on memory-level context, using centroids (μ_acc) rather than individual signal embeddings for novelty and relevance computation.</w:t>
       </w:r>
     </w:p>
     <w:p>
@@ -6155,59 +7700,111 @@
     </w:p>
     <w:p>
       <w:r>
-        <w:t xml:space="preserve">The marginal utility (MU) of a candidate memory combines four factors:</w:t>
-      </w:r>
-    </w:p>
-    <w:p>
-      <w:pPr>
-        <w:pStyle w:val="Equation"/>
-      </w:pPr>
-      <w:r>
-        <w:rPr>
-          <w:rFonts w:ascii="Courier New" w:cs="Courier New" w:eastAsia="Courier New" w:hAnsi="Courier New"/>
-          <w:sz w:val="20"/>
-          <w:szCs w:val="20"/>
-        </w:rPr>
-        <w:t xml:space="preserve">w_cov = normalize(lerp(0.40, 0.60, F))  # coverage gain</w:t>
-      </w:r>
-    </w:p>
-    <w:p>
-      <w:pPr>
-        <w:pStyle w:val="Equation"/>
-      </w:pPr>
-      <w:r>
-        <w:rPr>
-          <w:rFonts w:ascii="Courier New" w:cs="Courier New" w:eastAsia="Courier New" w:hAnsi="Courier New"/>
-          <w:sz w:val="20"/>
-          <w:szCs w:val="20"/>
-        </w:rPr>
-        <w:t xml:space="preserve">w_rel = normalize(lerp(0.35, 0.25, F))  # relevance</w:t>
-      </w:r>
-    </w:p>
-    <w:p>
-      <w:pPr>
-        <w:pStyle w:val="Equation"/>
-      </w:pPr>
-      <w:r>
-        <w:rPr>
-          <w:rFonts w:ascii="Courier New" w:cs="Courier New" w:eastAsia="Courier New" w:hAnsi="Courier New"/>
-          <w:sz w:val="20"/>
-          <w:szCs w:val="20"/>
-        </w:rPr>
-        <w:t xml:space="preserve">w_red = normalize(lerp(0.15, 0.25, S))  # redundancy penalty</w:t>
-      </w:r>
-    </w:p>
-    <w:p>
-      <w:pPr>
-        <w:pStyle w:val="Equation"/>
-      </w:pPr>
-      <w:r>
-        <w:rPr>
-          <w:rFonts w:ascii="Courier New" w:cs="Courier New" w:eastAsia="Courier New" w:hAnsi="Courier New"/>
-          <w:sz w:val="20"/>
-          <w:szCs w:val="20"/>
-        </w:rPr>
-        <w:t xml:space="preserve">w_coh = normalize(lerp(0.15, 0.25, S))  # incoherence penalty</w:t>
+        <w:t xml:space="preserve">The marginal utility (MU) of a candidate memory combines four factors. Context comparisons use memory centroids rather than individual signal embeddings:</w:t>
+      </w:r>
+    </w:p>
+    <w:p>
+      <w:pPr>
+        <w:pStyle w:val="Equation"/>
+      </w:pPr>
+      <w:r>
+        <w:rPr>
+          <w:rFonts w:ascii="Courier New" w:cs="Courier New" w:eastAsia="Courier New" w:hAnsi="Courier New"/>
+          <w:sz w:val="20"/>
+          <w:szCs w:val="20"/>
+        </w:rPr>
+        <w:t xml:space="preserve"># Context window contains recent memory centroids, not individual signals</w:t>
+      </w:r>
+    </w:p>
+    <w:p>
+      <w:pPr>
+        <w:pStyle w:val="Equation"/>
+      </w:pPr>
+      <w:r>
+        <w:rPr>
+          <w:rFonts w:ascii="Courier New" w:cs="Courier New" w:eastAsia="Courier New" w:hAnsi="Courier New"/>
+          <w:sz w:val="20"/>
+          <w:szCs w:val="20"/>
+        </w:rPr>
+        <w:t xml:space="preserve">ctx_window ← recent_memory_centroids  # deque of μ_acc values</w:t>
+      </w:r>
+    </w:p>
+    <w:p>
+      <w:pPr>
+        <w:pStyle w:val="Equation"/>
+      </w:pPr>
+      <w:r>
+        <w:rPr>
+          <w:rFonts w:ascii="Courier New" w:cs="Courier New" w:eastAsia="Courier New" w:hAnsi="Courier New"/>
+          <w:sz w:val="20"/>
+          <w:szCs w:val="20"/>
+        </w:rPr>
+        <w:t xml:space="preserve">ctx_centroid ← mean(ctx_window)  # centroid of recent memory centroids</w:t>
+      </w:r>
+    </w:p>
+    <w:p>
+      <w:pPr>
+        <w:pStyle w:val="Equation"/>
+      </w:pPr>
+      <w:r>
+        <w:rPr>
+          <w:rFonts w:ascii="Courier New" w:cs="Courier New" w:eastAsia="Courier New" w:hAnsi="Courier New"/>
+          <w:sz w:val="20"/>
+          <w:szCs w:val="20"/>
+        </w:rPr>
+        <w:t xml:space="preserve">w_raw = [lerp(0.40, 0.60, F),   # coverage gain</w:t>
+      </w:r>
+    </w:p>
+    <w:p>
+      <w:pPr>
+        <w:pStyle w:val="Equation"/>
+      </w:pPr>
+      <w:r>
+        <w:rPr>
+          <w:rFonts w:ascii="Courier New" w:cs="Courier New" w:eastAsia="Courier New" w:hAnsi="Courier New"/>
+          <w:sz w:val="20"/>
+          <w:szCs w:val="20"/>
+        </w:rPr>
+        <w:t xml:space="preserve">         lerp(0.35, 0.25, F),   # relevance</w:t>
+      </w:r>
+    </w:p>
+    <w:p>
+      <w:pPr>
+        <w:pStyle w:val="Equation"/>
+      </w:pPr>
+      <w:r>
+        <w:rPr>
+          <w:rFonts w:ascii="Courier New" w:cs="Courier New" w:eastAsia="Courier New" w:hAnsi="Courier New"/>
+          <w:sz w:val="20"/>
+          <w:szCs w:val="20"/>
+        </w:rPr>
+        <w:t xml:space="preserve">         lerp(0.15, 0.25, S),   # redundancy penalty</w:t>
+      </w:r>
+    </w:p>
+    <w:p>
+      <w:pPr>
+        <w:pStyle w:val="Equation"/>
+      </w:pPr>
+      <w:r>
+        <w:rPr>
+          <w:rFonts w:ascii="Courier New" w:cs="Courier New" w:eastAsia="Courier New" w:hAnsi="Courier New"/>
+          <w:sz w:val="20"/>
+          <w:szCs w:val="20"/>
+        </w:rPr>
+        <w:t xml:space="preserve">         lerp(0.15, 0.25, S)]   # incoherence penalty</w:t>
+      </w:r>
+    </w:p>
+    <w:p>
+      <w:pPr>
+        <w:pStyle w:val="Equation"/>
+      </w:pPr>
+      <w:r>
+        <w:rPr>
+          <w:rFonts w:ascii="Courier New" w:cs="Courier New" w:eastAsia="Courier New" w:hAnsi="Courier New"/>
+          <w:sz w:val="20"/>
+          <w:szCs w:val="20"/>
+        </w:rPr>
+        <w:t xml:space="preserve">[w_cov, w_rel, w_red, w_coh] = normalize(w_raw)</w:t>
       </w:r>
     </w:p>
     <w:p>
@@ -6259,7 +7856,7 @@
           <w:sz w:val="20"/>
           <w:szCs w:val="20"/>
         </w:rPr>
-        <w:t xml:space="preserve">      w_coh × (1 − coherence_t)</w:t>
+        <w:t xml:space="preserve">      w_coh × (1 − coherence_struct_t)  # structural coherence penalty</w:t>
       </w:r>
     </w:p>
     <w:p>
@@ -6311,20 +7908,30 @@
     </w:p>
     <w:p>
       <w:r>
-        <w:t xml:space="preserve">Memories stored during the current signal processing cycle are excluded from interrupt consideration to prevent self-triggering:</w:t>
-      </w:r>
-    </w:p>
-    <w:p>
-      <w:pPr>
-        <w:pStyle w:val="Equation"/>
-      </w:pPr>
-      <w:r>
-        <w:rPr>
-          <w:rFonts w:ascii="Courier New" w:cs="Courier New" w:eastAsia="Courier New" w:hAnsi="Courier New"/>
-          <w:sz w:val="20"/>
-          <w:szCs w:val="20"/>
-        </w:rPr>
-        <w:t xml:space="preserve">write_exclusion_ts ← current_signal.start_timestamp</w:t>
+        <w:t xml:space="preserve">Memories stored during the current accumulation unit are excluded from interrupt consideration to prevent self-triggering. Using the accumulation start timestamp ensures all memories written within the current unit are excluded:</w:t>
+      </w:r>
+    </w:p>
+    <w:p>
+      <w:pPr>
+        <w:pStyle w:val="Equation"/>
+      </w:pPr>
+      <w:r>
+        <w:rPr>
+          <w:rFonts w:ascii="Courier New" w:cs="Courier New" w:eastAsia="Courier New" w:hAnsi="Courier New"/>
+          <w:sz w:val="20"/>
+          <w:szCs w:val="20"/>
+        </w:rPr>
+        <w:t xml:space="preserve"># Exclude memories written during current accumulation to prevent self-triggering</w:t>
+      </w:r>
+    </w:p>
+    <w:p>
+      <w:r>
+        <w:rPr>
+          <w:rFonts w:ascii="Courier New" w:cs="Courier New" w:eastAsia="Courier New" w:hAnsi="Courier New"/>
+          <w:sz w:val="20"/>
+          <w:szCs w:val="20"/>
+        </w:rPr>
+        <w:t xml:space="preserve">write_exclusion_ts ← t_acc_start  # start timestamp from Section 4.4.1</w:t>
       </w:r>
     </w:p>
     <w:p>
@@ -6342,7 +7949,7 @@
     </w:p>
     <w:p>
       <w:r>
-        <w:t xml:space="preserve">This filter is applied before novelty and marginal utility evaluation. All subsequent gate logic operates on candidates_eligible rather than the raw candidate set, ensuring that recently written memories cannot immediately trigger retrieval interrupts regardless of their semantic properties.</w:t>
+        <w:t xml:space="preserve">This filter is applied before novelty and marginal utility evaluation. All subsequent gate logic operates on candidates_eligible rather than the raw candidate set, preventing recursive triggering within a coherent thought unit.</w:t>
       </w:r>
     </w:p>
     <w:p>
@@ -6461,7 +8068,20 @@
     </w:p>
     <w:p>
       <w:r>
-        <w:t xml:space="preserve">Streaming retrieval is gated by cumulative drift rate:</w:t>
+        <w:t xml:space="preserve">Streaming retrieval is gated by cumulative drift rate within the accumulation unit. Retrieval checks trigger when drift exceeds threshold or at boundaries:</w:t>
+      </w:r>
+    </w:p>
+    <w:p>
+      <w:pPr>
+        <w:pStyle w:val="Equation"/>
+      </w:pPr>
+      <w:r>
+        <w:rPr>
+          <w:rFonts w:ascii="Courier New" w:cs="Courier New" w:eastAsia="Courier New" w:hAnsi="Courier New"/>
+          <w:sz w:val="20"/>
+          <w:szCs w:val="20"/>
+        </w:rPr>
+        <w:t xml:space="preserve"># Pacing tracks drift within current memory formation</w:t>
       </w:r>
     </w:p>
     <w:p>
@@ -6500,7 +8120,33 @@
           <w:sz w:val="20"/>
           <w:szCs w:val="20"/>
         </w:rPr>
-        <w:t xml:space="preserve">if drift_accum &gt; pacing_thresh(S): trigger_check()</w:t>
+        <w:t xml:space="preserve"># Retrieval triggered when drift exceeds threshold or at memory boundary</w:t>
+      </w:r>
+    </w:p>
+    <w:p>
+      <w:pPr>
+        <w:pStyle w:val="Equation"/>
+      </w:pPr>
+      <w:r>
+        <w:rPr>
+          <w:rFonts w:ascii="Courier New" w:cs="Courier New" w:eastAsia="Courier New" w:hAnsi="Courier New"/>
+          <w:sz w:val="20"/>
+          <w:szCs w:val="20"/>
+        </w:rPr>
+        <w:t xml:space="preserve">if drift_accum &gt; pacing_thresh(S) OR should_flush:</w:t>
+      </w:r>
+    </w:p>
+    <w:p>
+      <w:pPr>
+        <w:pStyle w:val="Equation"/>
+      </w:pPr>
+      <w:r>
+        <w:rPr>
+          <w:rFonts w:ascii="Courier New" w:cs="Courier New" w:eastAsia="Courier New" w:hAnsi="Courier New"/>
+          <w:sz w:val="20"/>
+          <w:szCs w:val="20"/>
+        </w:rPr>
+        <w:t xml:space="preserve">    trigger_check()</w:t>
       </w:r>
     </w:p>
     <w:p>
@@ -6544,7 +8190,7 @@
     </w:p>
     <w:p>
       <w:r>
-        <w:t xml:space="preserve">High Sensitivity produces frequent checks triggered by small content shifts; high Focus enforces strict drift limits.</w:t>
+        <w:t xml:space="preserve">High Sensitivity produces frequent checks triggered by small content shifts; high Focus enforces strict drift limits. Memory boundaries (Section 4.4.3) also trigger retrieval checks to ensure context updates align with natural thought transitions.</w:t>
       </w:r>
     </w:p>
     <w:sectPr>

</xml_diff>

<commit_message>
feat: Introduce new research paper documentation and refactor numerous core operations, removing goal alignment and graph schema components.
</commit_message>
<xml_diff>
--- a/docs/research/algorithms.docx
+++ b/docs/research/algorithms.docx
@@ -299,7 +299,7 @@
         <w:t xml:space="preserve">Naming contract (canonical): </w:t>
       </w:r>
       <w:r>
-        <w:t xml:space="preserve">Use the variable names below consistently throughout this document. Units: stored timestamps are integers in milliseconds (commonly suffixed *_ts, and also appearing as timestamp/created_at/last_rate_timestamp); derived time intervals in seconds use the *_s suffix. Accumulator variables: t_start, last_signal_ts, last_write_ts, drift_acc. Global variables: theta_dynamic, theta_target, hysteresis, m_rate, dt_ema, rate_ticks, reliability, last_rate_timestamp, last_retrieval_ts, drift_accum. Weight naming rule: weight_* and *_weight variables (e.g., weight_relevance, mismatch_weight, weight_surprise) are control parameters; w_* variables (e.g., w_relevance, w_mismatch, … w_arousal) are composite-score blender weights.</w:t>
+        <w:t xml:space="preserve">Use the variable names below consistently throughout this document. Units: stored timestamps are integers in milliseconds (commonly suffixed *_ts, and also appearing as timestamp/created_at/last_rate_timestamp); derived time intervals in seconds use the *_s suffix. Accumulator variables: t_start, last_signal_ts, last_write_ts, drift_acc, eta_acc, coherence_prev, emo_max, arousal_sum, drift_accum, drift_at_last_interrupt, drift_acc_pacing, x_last_check. Global variables: u_uncertainty, mood_vector, last_mood_ts, theta_dynamic, theta_target, hysteresis, m_rate, dt_ema, rate_ticks, reliability, last_rate_timestamp, last_retrieval_ts. Weight naming rule: weight_* and *_weight variables (e.g., weight_relevance, mismatch_weight, weight_surprise) are control parameters; w_* variables (e.g., w_relevance, w_mismatch, … w_arousal) are composite-score blender weights.</w:t>
       </w:r>
     </w:p>
     <w:p>
@@ -367,15 +367,15 @@
     </w:p>
     <w:p>
       <w:pPr>
-        <w:pStyle w:val="Heading2"/>
-      </w:pPr>
-      <w:r>
-        <w:t xml:space="preserve">1.2 The Three-Knob Philosophy</w:t>
-      </w:r>
-    </w:p>
-    <w:p>
-      <w:r>
-        <w:t xml:space="preserve">Cortext is governed by three continuous control parameters, each representing a distinct dimension of cognitive regulation:</w:t>
+        <w:pStyle w:val="Heading3"/>
+      </w:pPr>
+      <w:r>
+        <w:t xml:space="preserve">1.1.2 Buffers</w:t>
+      </w:r>
+    </w:p>
+    <w:p>
+      <w:r>
+        <w:t xml:space="preserve">The specification uses distinct streaming buffers:</w:t>
       </w:r>
     </w:p>
     <w:p>
@@ -384,10 +384,10 @@
           <w:b/>
           <w:bCs/>
         </w:rPr>
-        <w:t xml:space="preserve">Focus (F ∈ [0, 1]): </w:t>
-      </w:r>
-      <w:r>
-        <w:t xml:space="preserve">Perceptual selectivity and precision. Higher Focus narrows attention, increases relevance weighting, and reduces retrieval breadth. Focus modulates the trade-off between exploitation of known-relevant information and exploration of potentially useful context.</w:t>
+        <w:t xml:space="preserve">signal_stream: </w:t>
+      </w:r>
+      <w:r>
+        <w:t xml:space="preserve">The raw per-signal embedding stream x_t used for scoring, uncertainty estimation, threshold/rate updates, and accumulator updates. Any context slices operate on signal_stream.</w:t>
       </w:r>
     </w:p>
     <w:p>
@@ -396,10 +396,10 @@
           <w:b/>
           <w:bCs/>
         </w:rPr>
-        <w:t xml:space="preserve">Sensitivity (S ∈ [0, 1]): </w:t>
-      </w:r>
-      <w:r>
-        <w:t xml:space="preserve">Plasticity and affective gain. Higher Sensitivity accelerates learning, increases emotional and novelty responsiveness, and raises write-rate targets. Sensitivity governs how readily the system captures novel information and responds to salient stimuli.</w:t>
+        <w:t xml:space="preserve">score_stream: </w:t>
+      </w:r>
+      <w:r>
+        <w:t xml:space="preserve">The per-signal scalar score stream. At each step, append score_t to score_stream. Any score lookbacks operate on score_stream.</w:t>
       </w:r>
     </w:p>
     <w:p>
@@ -408,6 +408,267 @@
           <w:b/>
           <w:bCs/>
         </w:rPr>
+        <w:t xml:space="preserve">memory_stream: </w:t>
+      </w:r>
+      <w:r>
+        <w:t xml:space="preserve">The stream of written memory representatives (e.g., e_rep/μ_acc for completed units) used for retrieval and interrupt-gate context. Sections that reference recent_memory_centroids operate on memory_stream.</w:t>
+      </w:r>
+    </w:p>
+    <w:p>
+      <w:r>
+        <w:rPr>
+          <w:b/>
+          <w:bCs/>
+        </w:rPr>
+        <w:t xml:space="preserve">recent_memory_centroids: </w:t>
+      </w:r>
+      <w:r>
+        <w:t xml:space="preserve">A bounded deque of recent memory representatives used by the interrupt gate.</w:t>
+      </w:r>
+    </w:p>
+    <w:p>
+      <w:pPr>
+        <w:pStyle w:val="Equation"/>
+      </w:pPr>
+      <w:r>
+        <w:rPr>
+          <w:rFonts w:ascii="Courier New" w:cs="Courier New" w:eastAsia="Courier New" w:hAnsi="Courier New"/>
+          <w:sz w:val="20"/>
+          <w:szCs w:val="20"/>
+        </w:rPr>
+        <w:t xml:space="preserve">win_mem_ctx(T) = round(lerp(4, 32, T))  # max memories in interrupt context</w:t>
+      </w:r>
+    </w:p>
+    <w:p>
+      <w:pPr>
+        <w:pStyle w:val="Equation"/>
+      </w:pPr>
+      <w:r>
+        <w:rPr>
+          <w:rFonts w:ascii="Courier New" w:cs="Courier New" w:eastAsia="Courier New" w:hAnsi="Courier New"/>
+          <w:sz w:val="20"/>
+          <w:szCs w:val="20"/>
+        </w:rPr>
+        <w:t xml:space="preserve">On successful write_memory: recent_memory_centroids.append(e_rep); recent_memory_centroids ← tail(recent_memory_centroids, win_mem_ctx(T))</w:t>
+      </w:r>
+    </w:p>
+    <w:p>
+      <w:pPr>
+        <w:pStyle w:val="Heading3"/>
+      </w:pPr>
+      <w:r>
+        <w:t xml:space="preserve">1.1.3 Initialization (Normative)</w:t>
+      </w:r>
+    </w:p>
+    <w:p>
+      <w:r>
+        <w:t xml:space="preserve">To avoid cold-start artifacts in time-based dynamics, implementations MUST initialize timestamped and EWMA state as follows:</w:t>
+      </w:r>
+    </w:p>
+    <w:p>
+      <w:pPr>
+        <w:pStyle w:val="Equation"/>
+      </w:pPr>
+      <w:r>
+        <w:rPr>
+          <w:rFonts w:ascii="Courier New" w:cs="Courier New" w:eastAsia="Courier New" w:hAnsi="Courier New"/>
+          <w:sz w:val="20"/>
+          <w:szCs w:val="20"/>
+        </w:rPr>
+        <w:t xml:space="preserve">last_mood_ts ← now_ms()</w:t>
+      </w:r>
+    </w:p>
+    <w:p>
+      <w:pPr>
+        <w:pStyle w:val="Equation"/>
+      </w:pPr>
+      <w:r>
+        <w:rPr>
+          <w:rFonts w:ascii="Courier New" w:cs="Courier New" w:eastAsia="Courier New" w:hAnsi="Courier New"/>
+          <w:sz w:val="20"/>
+          <w:szCs w:val="20"/>
+        </w:rPr>
+        <w:t xml:space="preserve">mood_vector ← 0_vector</w:t>
+      </w:r>
+    </w:p>
+    <w:p>
+      <w:pPr>
+        <w:pStyle w:val="Equation"/>
+      </w:pPr>
+      <w:r>
+        <w:rPr>
+          <w:rFonts w:ascii="Courier New" w:cs="Courier New" w:eastAsia="Courier New" w:hAnsi="Courier New"/>
+          <w:sz w:val="20"/>
+          <w:szCs w:val="20"/>
+        </w:rPr>
+        <w:t xml:space="preserve">theta_target ← θ_prior(F, S, T)</w:t>
+      </w:r>
+    </w:p>
+    <w:p>
+      <w:pPr>
+        <w:pStyle w:val="Equation"/>
+      </w:pPr>
+      <w:r>
+        <w:rPr>
+          <w:rFonts w:ascii="Courier New" w:cs="Courier New" w:eastAsia="Courier New" w:hAnsi="Courier New"/>
+          <w:sz w:val="20"/>
+          <w:szCs w:val="20"/>
+        </w:rPr>
+        <w:t xml:space="preserve">theta_dynamic ← theta_target</w:t>
+      </w:r>
+    </w:p>
+    <w:p>
+      <w:pPr>
+        <w:pStyle w:val="Equation"/>
+      </w:pPr>
+      <w:r>
+        <w:rPr>
+          <w:rFonts w:ascii="Courier New" w:cs="Courier New" w:eastAsia="Courier New" w:hAnsi="Courier New"/>
+          <w:sz w:val="20"/>
+          <w:szCs w:val="20"/>
+        </w:rPr>
+        <w:t xml:space="preserve">hysteresis ← base_band(T)</w:t>
+      </w:r>
+    </w:p>
+    <w:p>
+      <w:pPr>
+        <w:pStyle w:val="Equation"/>
+      </w:pPr>
+      <w:r>
+        <w:rPr>
+          <w:rFonts w:ascii="Courier New" w:cs="Courier New" w:eastAsia="Courier New" w:hAnsi="Courier New"/>
+          <w:sz w:val="20"/>
+          <w:szCs w:val="20"/>
+        </w:rPr>
+        <w:t xml:space="preserve">reliability ← 0</w:t>
+      </w:r>
+    </w:p>
+    <w:p>
+      <w:pPr>
+        <w:pStyle w:val="Equation"/>
+      </w:pPr>
+      <w:r>
+        <w:rPr>
+          <w:rFonts w:ascii="Courier New" w:cs="Courier New" w:eastAsia="Courier New" w:hAnsi="Courier New"/>
+          <w:sz w:val="20"/>
+          <w:szCs w:val="20"/>
+        </w:rPr>
+        <w:t xml:space="preserve">last_retrieval_ts ← now_ms()</w:t>
+      </w:r>
+    </w:p>
+    <w:p>
+      <w:pPr>
+        <w:pStyle w:val="Equation"/>
+      </w:pPr>
+      <w:r>
+        <w:rPr>
+          <w:rFonts w:ascii="Courier New" w:cs="Courier New" w:eastAsia="Courier New" w:hAnsi="Courier New"/>
+          <w:sz w:val="20"/>
+          <w:szCs w:val="20"/>
+        </w:rPr>
+        <w:t xml:space="preserve">last_rate_timestamp ← now_ms()</w:t>
+      </w:r>
+    </w:p>
+    <w:p>
+      <w:pPr>
+        <w:pStyle w:val="Equation"/>
+      </w:pPr>
+      <w:r>
+        <w:rPr>
+          <w:rFonts w:ascii="Courier New" w:cs="Courier New" w:eastAsia="Courier New" w:hAnsi="Courier New"/>
+          <w:sz w:val="20"/>
+          <w:szCs w:val="20"/>
+        </w:rPr>
+        <w:t xml:space="preserve">dt_ema ← 1.0</w:t>
+      </w:r>
+    </w:p>
+    <w:p>
+      <w:pPr>
+        <w:pStyle w:val="Equation"/>
+      </w:pPr>
+      <w:r>
+        <w:rPr>
+          <w:rFonts w:ascii="Courier New" w:cs="Courier New" w:eastAsia="Courier New" w:hAnsi="Courier New"/>
+          <w:sz w:val="20"/>
+          <w:szCs w:val="20"/>
+        </w:rPr>
+        <w:t xml:space="preserve">rate_ticks ← 0</w:t>
+      </w:r>
+    </w:p>
+    <w:p>
+      <w:pPr>
+        <w:pStyle w:val="Equation"/>
+      </w:pPr>
+      <w:r>
+        <w:rPr>
+          <w:rFonts w:ascii="Courier New" w:cs="Courier New" w:eastAsia="Courier New" w:hAnsi="Courier New"/>
+          <w:sz w:val="20"/>
+          <w:szCs w:val="20"/>
+        </w:rPr>
+        <w:t xml:space="preserve">m_rate ← rate_target</w:t>
+      </w:r>
+    </w:p>
+    <w:p>
+      <w:pPr>
+        <w:pStyle w:val="Equation"/>
+      </w:pPr>
+      <w:r>
+        <w:rPr>
+          <w:rFonts w:ascii="Courier New" w:cs="Courier New" w:eastAsia="Courier New" w:hAnsi="Courier New"/>
+          <w:sz w:val="20"/>
+          <w:szCs w:val="20"/>
+        </w:rPr>
+        <w:t xml:space="preserve">ρ_hat_prev ← rate_target</w:t>
+      </w:r>
+    </w:p>
+    <w:p>
+      <w:r>
+        <w:t xml:space="preserve">Per stream initialization: prev_x is unset; x_last_check is unset.</w:t>
+      </w:r>
+    </w:p>
+    <w:p>
+      <w:pPr>
+        <w:pStyle w:val="Heading2"/>
+      </w:pPr>
+      <w:r>
+        <w:t xml:space="preserve">1.2 The Three-Knob Philosophy</w:t>
+      </w:r>
+    </w:p>
+    <w:p>
+      <w:r>
+        <w:t xml:space="preserve">Cortext is governed by three continuous control parameters, each representing a distinct dimension of cognitive regulation:</w:t>
+      </w:r>
+    </w:p>
+    <w:p>
+      <w:r>
+        <w:rPr>
+          <w:b/>
+          <w:bCs/>
+        </w:rPr>
+        <w:t xml:space="preserve">Focus (F ∈ [0, 1]): </w:t>
+      </w:r>
+      <w:r>
+        <w:t xml:space="preserve">Perceptual selectivity and precision. Higher Focus narrows attention, increases relevance weighting, and reduces retrieval breadth. Focus modulates the trade-off between exploitation of known-relevant information and exploration of potentially useful context.</w:t>
+      </w:r>
+    </w:p>
+    <w:p>
+      <w:r>
+        <w:rPr>
+          <w:b/>
+          <w:bCs/>
+        </w:rPr>
+        <w:t xml:space="preserve">Sensitivity (S ∈ [0, 1]): </w:t>
+      </w:r>
+      <w:r>
+        <w:t xml:space="preserve">Plasticity and affective gain. Higher Sensitivity accelerates learning, increases emotional and novelty responsiveness, and raises write-rate targets. Sensitivity governs how readily the system captures novel information and responds to salient stimuli.</w:t>
+      </w:r>
+    </w:p>
+    <w:p>
+      <w:r>
+        <w:rPr>
+          <w:b/>
+          <w:bCs/>
+        </w:rPr>
         <w:t xml:space="preserve">Stability (T ∈ [0, 1]): </w:t>
       </w:r>
       <w:r>
@@ -735,7 +996,59 @@
           <w:sz w:val="20"/>
           <w:szCs w:val="20"/>
         </w:rPr>
-        <w:t xml:space="preserve">var_recent_norm = clamp(var(scores[t−w:t]) / var_score_max, 0, 1)</w:t>
+        <w:t xml:space="preserve">recent_scores ← tail(score_stream, win_score(T))</w:t>
+      </w:r>
+    </w:p>
+    <w:p>
+      <w:pPr>
+        <w:pStyle w:val="Equation"/>
+      </w:pPr>
+      <w:r>
+        <w:rPr>
+          <w:rFonts w:ascii="Courier New" w:cs="Courier New" w:eastAsia="Courier New" w:hAnsi="Courier New"/>
+          <w:sz w:val="20"/>
+          <w:szCs w:val="20"/>
+        </w:rPr>
+        <w:t xml:space="preserve">if |recent_scores| &lt; 2:</w:t>
+      </w:r>
+    </w:p>
+    <w:p>
+      <w:pPr>
+        <w:pStyle w:val="Equation"/>
+      </w:pPr>
+      <w:r>
+        <w:rPr>
+          <w:rFonts w:ascii="Courier New" w:cs="Courier New" w:eastAsia="Courier New" w:hAnsi="Courier New"/>
+          <w:sz w:val="20"/>
+          <w:szCs w:val="20"/>
+        </w:rPr>
+        <w:t xml:space="preserve">    var_recent_norm ← 0</w:t>
+      </w:r>
+    </w:p>
+    <w:p>
+      <w:pPr>
+        <w:pStyle w:val="Equation"/>
+      </w:pPr>
+      <w:r>
+        <w:rPr>
+          <w:rFonts w:ascii="Courier New" w:cs="Courier New" w:eastAsia="Courier New" w:hAnsi="Courier New"/>
+          <w:sz w:val="20"/>
+          <w:szCs w:val="20"/>
+        </w:rPr>
+        <w:t xml:space="preserve">else:</w:t>
+      </w:r>
+    </w:p>
+    <w:p>
+      <w:pPr>
+        <w:pStyle w:val="Equation"/>
+      </w:pPr>
+      <w:r>
+        <w:rPr>
+          <w:rFonts w:ascii="Courier New" w:cs="Courier New" w:eastAsia="Courier New" w:hAnsi="Courier New"/>
+          <w:sz w:val="20"/>
+          <w:szCs w:val="20"/>
+        </w:rPr>
+        <w:t xml:space="preserve">    var_recent_norm ← clamp(var(recent_scores) / var_score_max, 0, 1)</w:t>
       </w:r>
     </w:p>
     <w:p>
@@ -788,6 +1101,11 @@
       </w:r>
     </w:p>
     <w:p>
+      <w:r>
+        <w:t xml:space="preserve">Normative note (MUST): focus_spread_t is the per-step derived focus-spread metric from Section 3.1.2 and is available each step when computing u(t).</w:t>
+      </w:r>
+    </w:p>
+    <w:p>
       <w:pPr>
         <w:pStyle w:val="Equation"/>
       </w:pPr>
@@ -810,7 +1128,7 @@
           <w:sz w:val="20"/>
           <w:szCs w:val="20"/>
         </w:rPr>
-        <w:t xml:space="preserve">u_raw(t) = clamp(blend([var_recent_norm, focus_spread,</w:t>
+        <w:t xml:space="preserve">u_raw(t) = clamp(blend([var_recent_norm, focus_spread_t,</w:t>
       </w:r>
     </w:p>
     <w:p>
@@ -999,20 +1317,72 @@
           <w:sz w:val="20"/>
           <w:szCs w:val="20"/>
         </w:rPr>
-        <w:t xml:space="preserve">recent_context ← tail(signals, n_ctx(T))</w:t>
-      </w:r>
-    </w:p>
-    <w:p>
-      <w:pPr>
-        <w:pStyle w:val="Equation"/>
-      </w:pPr>
-      <w:r>
-        <w:rPr>
-          <w:rFonts w:ascii="Courier New" w:cs="Courier New" w:eastAsia="Courier New" w:hAnsi="Courier New"/>
-          <w:sz w:val="20"/>
-          <w:szCs w:val="20"/>
-        </w:rPr>
-        <w:t xml:space="preserve">observed_cosine ← cos(x_t, mean(recent_context))</w:t>
+        <w:t xml:space="preserve">recent_context ← tail(signal_stream, n_ctx(T))</w:t>
+      </w:r>
+    </w:p>
+    <w:p>
+      <w:pPr>
+        <w:pStyle w:val="Equation"/>
+      </w:pPr>
+      <w:r>
+        <w:rPr>
+          <w:rFonts w:ascii="Courier New" w:cs="Courier New" w:eastAsia="Courier New" w:hAnsi="Courier New"/>
+          <w:sz w:val="20"/>
+          <w:szCs w:val="20"/>
+        </w:rPr>
+        <w:t xml:space="preserve">if |recent_context| == 0:</w:t>
+      </w:r>
+    </w:p>
+    <w:p>
+      <w:pPr>
+        <w:pStyle w:val="Equation"/>
+      </w:pPr>
+      <w:r>
+        <w:rPr>
+          <w:rFonts w:ascii="Courier New" w:cs="Courier New" w:eastAsia="Courier New" w:hAnsi="Courier New"/>
+          <w:sz w:val="20"/>
+          <w:szCs w:val="20"/>
+        </w:rPr>
+        <w:t xml:space="preserve">    μ_ctx ← 0_vector; observed_cosine ← 0  # map01(0)=0.5</w:t>
+      </w:r>
+    </w:p>
+    <w:p>
+      <w:pPr>
+        <w:pStyle w:val="Equation"/>
+      </w:pPr>
+      <w:r>
+        <w:rPr>
+          <w:rFonts w:ascii="Courier New" w:cs="Courier New" w:eastAsia="Courier New" w:hAnsi="Courier New"/>
+          <w:sz w:val="20"/>
+          <w:szCs w:val="20"/>
+        </w:rPr>
+        <w:t xml:space="preserve">else:</w:t>
+      </w:r>
+    </w:p>
+    <w:p>
+      <w:pPr>
+        <w:pStyle w:val="Equation"/>
+      </w:pPr>
+      <w:r>
+        <w:rPr>
+          <w:rFonts w:ascii="Courier New" w:cs="Courier New" w:eastAsia="Courier New" w:hAnsi="Courier New"/>
+          <w:sz w:val="20"/>
+          <w:szCs w:val="20"/>
+        </w:rPr>
+        <w:t xml:space="preserve">    μ_ctx ← mean(recent_context)</w:t>
+      </w:r>
+    </w:p>
+    <w:p>
+      <w:pPr>
+        <w:pStyle w:val="Equation"/>
+      </w:pPr>
+      <w:r>
+        <w:rPr>
+          <w:rFonts w:ascii="Courier New" w:cs="Courier New" w:eastAsia="Courier New" w:hAnsi="Courier New"/>
+          <w:sz w:val="20"/>
+          <w:szCs w:val="20"/>
+        </w:rPr>
+        <w:t xml:space="preserve">    observed_cosine ← cos(x_t, μ_ctx)</w:t>
       </w:r>
     </w:p>
     <w:p>
@@ -1118,7 +1488,7 @@
           <w:sz w:val="20"/>
           <w:szCs w:val="20"/>
         </w:rPr>
-        <w:t xml:space="preserve">rate_target = lerp(0.2, 5.0, S) × (0.5 + 1.5S)  # writes/min</w:t>
+        <w:t xml:space="preserve">rate_target = base_rate(S)  # writes/min</w:t>
       </w:r>
     </w:p>
     <w:p>
@@ -1523,33 +1893,59 @@
           <w:sz w:val="20"/>
           <w:szCs w:val="20"/>
         </w:rPr>
-        <w:t xml:space="preserve">λ_mood(T) = lerp(0.90, 0.999, T)  # decay</w:t>
-      </w:r>
-    </w:p>
-    <w:p>
-      <w:pPr>
-        <w:pStyle w:val="Equation"/>
-      </w:pPr>
-      <w:r>
-        <w:rPr>
-          <w:rFonts w:ascii="Courier New" w:cs="Courier New" w:eastAsia="Courier New" w:hAnsi="Courier New"/>
-          <w:sz w:val="20"/>
-          <w:szCs w:val="20"/>
-        </w:rPr>
-        <w:t xml:space="preserve">e_t ← p_c for each c ∈ C  # 6D emotion probability vector</w:t>
-      </w:r>
-    </w:p>
-    <w:p>
-      <w:pPr>
-        <w:pStyle w:val="Equation"/>
-      </w:pPr>
-      <w:r>
-        <w:rPr>
-          <w:rFonts w:ascii="Courier New" w:cs="Courier New" w:eastAsia="Courier New" w:hAnsi="Courier New"/>
-          <w:sz w:val="20"/>
-          <w:szCs w:val="20"/>
-        </w:rPr>
-        <w:t xml:space="preserve">M_t = λ_mood(T) × M_{t−1} + α_mood(S) × e_t</w:t>
+        <w:t xml:space="preserve">half_life_mood(T) = lerp(30, 600, T)  # seconds</w:t>
+      </w:r>
+    </w:p>
+    <w:p>
+      <w:pPr>
+        <w:pStyle w:val="Equation"/>
+      </w:pPr>
+      <w:r>
+        <w:rPr>
+          <w:rFonts w:ascii="Courier New" w:cs="Courier New" w:eastAsia="Courier New" w:hAnsi="Courier New"/>
+          <w:sz w:val="20"/>
+          <w:szCs w:val="20"/>
+        </w:rPr>
+        <w:t xml:space="preserve">Δt_mood ← now_s() − to_s(last_mood_ts)</w:t>
+      </w:r>
+    </w:p>
+    <w:p>
+      <w:pPr>
+        <w:pStyle w:val="Equation"/>
+      </w:pPr>
+      <w:r>
+        <w:rPr>
+          <w:rFonts w:ascii="Courier New" w:cs="Courier New" w:eastAsia="Courier New" w:hAnsi="Courier New"/>
+          <w:sz w:val="20"/>
+          <w:szCs w:val="20"/>
+        </w:rPr>
+        <w:t xml:space="preserve">λ_mood(Δt_mood, T) ← exp(−ln(2) × Δt_mood / max(half_life_mood(T), ε))</w:t>
+      </w:r>
+    </w:p>
+    <w:p>
+      <w:pPr>
+        <w:pStyle w:val="Equation"/>
+      </w:pPr>
+      <w:r>
+        <w:rPr>
+          <w:rFonts w:ascii="Courier New" w:cs="Courier New" w:eastAsia="Courier New" w:hAnsi="Courier New"/>
+          <w:sz w:val="20"/>
+          <w:szCs w:val="20"/>
+        </w:rPr>
+        <w:t xml:space="preserve">e_t ← p_c − (1/6)  # centered 6D vector (can be negative)</w:t>
+      </w:r>
+    </w:p>
+    <w:p>
+      <w:pPr>
+        <w:pStyle w:val="Equation"/>
+      </w:pPr>
+      <w:r>
+        <w:rPr>
+          <w:rFonts w:ascii="Courier New" w:cs="Courier New" w:eastAsia="Courier New" w:hAnsi="Courier New"/>
+          <w:sz w:val="20"/>
+          <w:szCs w:val="20"/>
+        </w:rPr>
+        <w:t xml:space="preserve">M_t = λ_mood(Δt_mood, T) × M_{t−1} + α_mood(S) × e_t</w:t>
       </w:r>
     </w:p>
     <w:p>
@@ -1566,8 +1962,21 @@
       </w:r>
     </w:p>
     <w:p>
-      <w:r>
-        <w:t xml:space="preserve">Note that this update does not enforce coefficient normalization; the explicit elementwise clamp handles potential accumulation. The mood state provides a separate threshold bias via its normalized magnitude:</w:t>
+      <w:pPr>
+        <w:pStyle w:val="Equation"/>
+      </w:pPr>
+      <w:r>
+        <w:rPr>
+          <w:rFonts w:ascii="Courier New" w:cs="Courier New" w:eastAsia="Courier New" w:hAnsi="Courier New"/>
+          <w:sz w:val="20"/>
+          <w:szCs w:val="20"/>
+        </w:rPr>
+        <w:t xml:space="preserve">last_mood_ts ← now_ms()  # update timestamp after mood update (ms)</w:t>
+      </w:r>
+    </w:p>
+    <w:p>
+      <w:r>
+        <w:t xml:space="preserve">Because e_t is centered around zero, M_t can have both positive and negative components, reflecting sustained elevation or suppression relative to baseline. The mood state provides a separate threshold bias via its normalized magnitude:</w:t>
       </w:r>
     </w:p>
     <w:p>
@@ -1976,6 +2385,76 @@
       </w:r>
     </w:p>
     <w:p>
+      <w:r>
+        <w:t xml:space="preserve">Context definitions (used throughout Table 1 and structural metrics):</w:t>
+      </w:r>
+    </w:p>
+    <w:p>
+      <w:pPr>
+        <w:pStyle w:val="Equation"/>
+      </w:pPr>
+      <w:r>
+        <w:rPr>
+          <w:rFonts w:ascii="Courier New" w:cs="Courier New" w:eastAsia="Courier New" w:hAnsi="Courier New"/>
+          <w:sz w:val="20"/>
+          <w:szCs w:val="20"/>
+        </w:rPr>
+        <w:t xml:space="preserve">recent_context ← tail(signal_stream, n_ctx(T))</w:t>
+      </w:r>
+    </w:p>
+    <w:p>
+      <w:pPr>
+        <w:pStyle w:val="Equation"/>
+      </w:pPr>
+      <w:r>
+        <w:rPr>
+          <w:rFonts w:ascii="Courier New" w:cs="Courier New" w:eastAsia="Courier New" w:hAnsi="Courier New"/>
+          <w:sz w:val="20"/>
+          <w:szCs w:val="20"/>
+        </w:rPr>
+        <w:t xml:space="preserve">if |recent_context| == 0:</w:t>
+      </w:r>
+    </w:p>
+    <w:p>
+      <w:pPr>
+        <w:pStyle w:val="Equation"/>
+      </w:pPr>
+      <w:r>
+        <w:rPr>
+          <w:rFonts w:ascii="Courier New" w:cs="Courier New" w:eastAsia="Courier New" w:hAnsi="Courier New"/>
+          <w:sz w:val="20"/>
+          <w:szCs w:val="20"/>
+        </w:rPr>
+        <w:t xml:space="preserve">    μ_ctx ← 0_vector  # define cos(x_t, μ_ctx)=0 so map01(cos)=0.5</w:t>
+      </w:r>
+    </w:p>
+    <w:p>
+      <w:pPr>
+        <w:pStyle w:val="Equation"/>
+      </w:pPr>
+      <w:r>
+        <w:rPr>
+          <w:rFonts w:ascii="Courier New" w:cs="Courier New" w:eastAsia="Courier New" w:hAnsi="Courier New"/>
+          <w:sz w:val="20"/>
+          <w:szCs w:val="20"/>
+        </w:rPr>
+        <w:t xml:space="preserve">else:</w:t>
+      </w:r>
+    </w:p>
+    <w:p>
+      <w:pPr>
+        <w:pStyle w:val="Equation"/>
+      </w:pPr>
+      <w:r>
+        <w:rPr>
+          <w:rFonts w:ascii="Courier New" w:cs="Courier New" w:eastAsia="Courier New" w:hAnsi="Courier New"/>
+          <w:sz w:val="20"/>
+          <w:szCs w:val="20"/>
+        </w:rPr>
+        <w:t xml:space="preserve">    μ_ctx ← mean(recent_context)</w:t>
+      </w:r>
+    </w:p>
+    <w:p>
       <w:pPr>
         <w:pStyle w:val="Heading2"/>
       </w:pPr>
@@ -2006,20 +2485,59 @@
           <w:sz w:val="20"/>
           <w:szCs w:val="20"/>
         </w:rPr>
-        <w:t xml:space="preserve">raw ← var([cos(x_t, c) for c in recent_context])</w:t>
-      </w:r>
-    </w:p>
-    <w:p>
-      <w:pPr>
-        <w:pStyle w:val="Equation"/>
-      </w:pPr>
-      <w:r>
-        <w:rPr>
-          <w:rFonts w:ascii="Courier New" w:cs="Courier New" w:eastAsia="Courier New" w:hAnsi="Courier New"/>
-          <w:sz w:val="20"/>
-          <w:szCs w:val="20"/>
-        </w:rPr>
-        <w:t xml:space="preserve">coherence_struct_t ← 1 − clamp(raw, 0, 1)  # range [0, 1]</w:t>
+        <w:t xml:space="preserve">if |recent_context| &lt; 2:</w:t>
+      </w:r>
+    </w:p>
+    <w:p>
+      <w:pPr>
+        <w:pStyle w:val="Equation"/>
+      </w:pPr>
+      <w:r>
+        <w:rPr>
+          <w:rFonts w:ascii="Courier New" w:cs="Courier New" w:eastAsia="Courier New" w:hAnsi="Courier New"/>
+          <w:sz w:val="20"/>
+          <w:szCs w:val="20"/>
+        </w:rPr>
+        <w:t xml:space="preserve">    coherence_struct_t ← 0.5  # neutral</w:t>
+      </w:r>
+    </w:p>
+    <w:p>
+      <w:pPr>
+        <w:pStyle w:val="Equation"/>
+      </w:pPr>
+      <w:r>
+        <w:rPr>
+          <w:rFonts w:ascii="Courier New" w:cs="Courier New" w:eastAsia="Courier New" w:hAnsi="Courier New"/>
+          <w:sz w:val="20"/>
+          <w:szCs w:val="20"/>
+        </w:rPr>
+        <w:t xml:space="preserve">else:</w:t>
+      </w:r>
+    </w:p>
+    <w:p>
+      <w:pPr>
+        <w:pStyle w:val="Equation"/>
+      </w:pPr>
+      <w:r>
+        <w:rPr>
+          <w:rFonts w:ascii="Courier New" w:cs="Courier New" w:eastAsia="Courier New" w:hAnsi="Courier New"/>
+          <w:sz w:val="20"/>
+          <w:szCs w:val="20"/>
+        </w:rPr>
+        <w:t xml:space="preserve">    raw ← var([cos(x_t, c) for c in recent_context])</w:t>
+      </w:r>
+    </w:p>
+    <w:p>
+      <w:pPr>
+        <w:pStyle w:val="Equation"/>
+      </w:pPr>
+      <w:r>
+        <w:rPr>
+          <w:rFonts w:ascii="Courier New" w:cs="Courier New" w:eastAsia="Courier New" w:hAnsi="Courier New"/>
+          <w:sz w:val="20"/>
+          <w:szCs w:val="20"/>
+        </w:rPr>
+        <w:t xml:space="preserve">    coherence_struct_t ← 1 − clamp(raw, 0, 1)  # range [0, 1]</w:t>
       </w:r>
     </w:p>
     <w:p>
@@ -2054,6 +2572,11 @@
       </w:r>
     </w:p>
     <w:p>
+      <w:r>
+        <w:t xml:space="preserve">Normative note (MUST): kNN_similarities MUST be computed by querying memory_stream with q = x_t and k = k_neighbors(T) (not recent_context).</w:t>
+      </w:r>
+    </w:p>
+    <w:p>
       <w:pPr>
         <w:pStyle w:val="Equation"/>
       </w:pPr>
@@ -2107,6 +2630,45 @@
           <w:sz w:val="20"/>
           <w:szCs w:val="20"/>
         </w:rPr>
+        <w:t xml:space="preserve">k_ctx(T) = round(lerp(3, 10, T))  # step lag for drift</w:t>
+      </w:r>
+    </w:p>
+    <w:p>
+      <w:pPr>
+        <w:pStyle w:val="Equation"/>
+      </w:pPr>
+      <w:r>
+        <w:rPr>
+          <w:rFonts w:ascii="Courier New" w:cs="Courier New" w:eastAsia="Courier New" w:hAnsi="Courier New"/>
+          <w:sz w:val="20"/>
+          <w:szCs w:val="20"/>
+        </w:rPr>
+        <w:t xml:space="preserve">ctx_t = signal_stream[t − n_ctx(T) + 1 : t]  # inclusive end</w:t>
+      </w:r>
+    </w:p>
+    <w:p>
+      <w:pPr>
+        <w:pStyle w:val="Equation"/>
+      </w:pPr>
+      <w:r>
+        <w:rPr>
+          <w:rFonts w:ascii="Courier New" w:cs="Courier New" w:eastAsia="Courier New" w:hAnsi="Courier New"/>
+          <w:sz w:val="20"/>
+          <w:szCs w:val="20"/>
+        </w:rPr>
+        <w:t xml:space="preserve">ctx_{t−k} = signal_stream[t − k_ctx(T) − n_ctx(T) + 1 : t − k_ctx(T)]</w:t>
+      </w:r>
+    </w:p>
+    <w:p>
+      <w:pPr>
+        <w:pStyle w:val="Equation"/>
+      </w:pPr>
+      <w:r>
+        <w:rPr>
+          <w:rFonts w:ascii="Courier New" w:cs="Courier New" w:eastAsia="Courier New" w:hAnsi="Courier New"/>
+          <w:sz w:val="20"/>
+          <w:szCs w:val="20"/>
+        </w:rPr>
         <w:t xml:space="preserve">drift_vec_t ← l2_normalize(mean(ctx_t)) −</w:t>
       </w:r>
     </w:p>
@@ -2138,7 +2700,7 @@
     </w:p>
     <w:p>
       <w:r>
-        <w:t xml:space="preserve">Since both centroids are unit-normalized, drift_mag_t ∈ [0, 2]. A threshold determines episode boundaries:</w:t>
+        <w:t xml:space="preserve">Since both centroids are unit-normalized, drift_mag_t ∈ [0, 2]. A threshold defines an informational drift-boundary signal:</w:t>
       </w:r>
     </w:p>
     <w:p>
@@ -2164,20 +2726,12 @@
           <w:sz w:val="20"/>
           <w:szCs w:val="20"/>
         </w:rPr>
-        <w:t xml:space="preserve">if drift_mag_t &gt; drift_threshold:</w:t>
-      </w:r>
-    </w:p>
-    <w:p>
-      <w:pPr>
-        <w:pStyle w:val="Equation"/>
-      </w:pPr>
-      <w:r>
-        <w:rPr>
-          <w:rFonts w:ascii="Courier New" w:cs="Courier New" w:eastAsia="Courier New" w:hAnsi="Courier New"/>
-          <w:sz w:val="20"/>
-          <w:szCs w:val="20"/>
-        </w:rPr>
-        <w:t xml:space="preserve">    trigger_episode_boundary()</w:t>
+        <w:t xml:space="preserve">drift_boundary_t ← (drift_mag_t &gt; drift_threshold)</w:t>
+      </w:r>
+    </w:p>
+    <w:p>
+      <w:r>
+        <w:t xml:space="preserve">Normative note (MUST): drift_boundary_t is informational and MUST NOT trigger a memory flush on its own. Memory flush decisions are defined by should_flush in Section 4.4.3.</w:t>
       </w:r>
     </w:p>
     <w:p>
@@ -2203,46 +2757,98 @@
           <w:sz w:val="20"/>
           <w:szCs w:val="20"/>
         </w:rPr>
-        <w:t xml:space="preserve">Δx_t = x_t − x_{t−1}</w:t>
-      </w:r>
-    </w:p>
-    <w:p>
-      <w:pPr>
-        <w:pStyle w:val="Equation"/>
-      </w:pPr>
-      <w:r>
-        <w:rPr>
-          <w:rFonts w:ascii="Courier New" w:cs="Courier New" w:eastAsia="Courier New" w:hAnsi="Courier New"/>
-          <w:sz w:val="20"/>
-          <w:szCs w:val="20"/>
-        </w:rPr>
-        <w:t xml:space="preserve">Δx_trend_t = EWMA(Δx_trend_{t−1}, Δx_t, α=0.1)</w:t>
-      </w:r>
-    </w:p>
-    <w:p>
-      <w:pPr>
-        <w:pStyle w:val="Equation"/>
-      </w:pPr>
-      <w:r>
-        <w:rPr>
-          <w:rFonts w:ascii="Courier New" w:cs="Courier New" w:eastAsia="Courier New" w:hAnsi="Courier New"/>
-          <w:sz w:val="20"/>
-          <w:szCs w:val="20"/>
-        </w:rPr>
-        <w:t xml:space="preserve">x_pred_t = x_{t−1} + Δx_trend_{t−1}</w:t>
-      </w:r>
-    </w:p>
-    <w:p>
-      <w:pPr>
-        <w:pStyle w:val="Equation"/>
-      </w:pPr>
-      <w:r>
-        <w:rPr>
-          <w:rFonts w:ascii="Courier New" w:cs="Courier New" w:eastAsia="Courier New" w:hAnsi="Courier New"/>
-          <w:sz w:val="20"/>
-          <w:szCs w:val="20"/>
-        </w:rPr>
-        <w:t xml:space="preserve">prediction_error_t = 1 − cos(x_pred_t, x_t)</w:t>
+        <w:t xml:space="preserve">if prev_x is unset:</w:t>
+      </w:r>
+    </w:p>
+    <w:p>
+      <w:pPr>
+        <w:pStyle w:val="Equation"/>
+      </w:pPr>
+      <w:r>
+        <w:rPr>
+          <w:rFonts w:ascii="Courier New" w:cs="Courier New" w:eastAsia="Courier New" w:hAnsi="Courier New"/>
+          <w:sz w:val="20"/>
+          <w:szCs w:val="20"/>
+        </w:rPr>
+        <w:t xml:space="preserve">    surprisal_t ← 0</w:t>
+      </w:r>
+    </w:p>
+    <w:p>
+      <w:pPr>
+        <w:pStyle w:val="Equation"/>
+      </w:pPr>
+      <w:r>
+        <w:rPr>
+          <w:rFonts w:ascii="Courier New" w:cs="Courier New" w:eastAsia="Courier New" w:hAnsi="Courier New"/>
+          <w:sz w:val="20"/>
+          <w:szCs w:val="20"/>
+        </w:rPr>
+        <w:t xml:space="preserve">    Δx_trend_t ← 0_vector</w:t>
+      </w:r>
+    </w:p>
+    <w:p>
+      <w:pPr>
+        <w:pStyle w:val="Equation"/>
+      </w:pPr>
+      <w:r>
+        <w:rPr>
+          <w:rFonts w:ascii="Courier New" w:cs="Courier New" w:eastAsia="Courier New" w:hAnsi="Courier New"/>
+          <w:sz w:val="20"/>
+          <w:szCs w:val="20"/>
+        </w:rPr>
+        <w:t xml:space="preserve">else:</w:t>
+      </w:r>
+    </w:p>
+    <w:p>
+      <w:pPr>
+        <w:pStyle w:val="Equation"/>
+      </w:pPr>
+      <w:r>
+        <w:rPr>
+          <w:rFonts w:ascii="Courier New" w:cs="Courier New" w:eastAsia="Courier New" w:hAnsi="Courier New"/>
+          <w:sz w:val="20"/>
+          <w:szCs w:val="20"/>
+        </w:rPr>
+        <w:t xml:space="preserve">    Δx_t = x_t − prev_x</w:t>
+      </w:r>
+    </w:p>
+    <w:p>
+      <w:pPr>
+        <w:pStyle w:val="Equation"/>
+      </w:pPr>
+      <w:r>
+        <w:rPr>
+          <w:rFonts w:ascii="Courier New" w:cs="Courier New" w:eastAsia="Courier New" w:hAnsi="Courier New"/>
+          <w:sz w:val="20"/>
+          <w:szCs w:val="20"/>
+        </w:rPr>
+        <w:t xml:space="preserve">    Δx_trend_t = EWMA(Δx_trend_{t−1}, Δx_t, α=0.1)</w:t>
+      </w:r>
+    </w:p>
+    <w:p>
+      <w:pPr>
+        <w:pStyle w:val="Equation"/>
+      </w:pPr>
+      <w:r>
+        <w:rPr>
+          <w:rFonts w:ascii="Courier New" w:cs="Courier New" w:eastAsia="Courier New" w:hAnsi="Courier New"/>
+          <w:sz w:val="20"/>
+          <w:szCs w:val="20"/>
+        </w:rPr>
+        <w:t xml:space="preserve">    x_pred_t = prev_x + Δx_trend_{t−1}</w:t>
+      </w:r>
+    </w:p>
+    <w:p>
+      <w:pPr>
+        <w:pStyle w:val="Equation"/>
+      </w:pPr>
+      <w:r>
+        <w:rPr>
+          <w:rFonts w:ascii="Courier New" w:cs="Courier New" w:eastAsia="Courier New" w:hAnsi="Courier New"/>
+          <w:sz w:val="20"/>
+          <w:szCs w:val="20"/>
+        </w:rPr>
+        <w:t xml:space="preserve">    prediction_error_t = 1 − cos(x_pred_t, x_t)</w:t>
       </w:r>
     </w:p>
     <w:p>
@@ -2273,7 +2879,7 @@
           <w:sz w:val="20"/>
           <w:szCs w:val="20"/>
         </w:rPr>
-        <w:t xml:space="preserve">surprisal_t ← clamp(prediction_error_t / err_max, 0, 1)</w:t>
+        <w:t xml:space="preserve">    surprisal_t ← clamp(prediction_error_t / err_max, 0, 1)</w:t>
       </w:r>
     </w:p>
     <w:p>
@@ -2432,7 +3038,7 @@
                 <w:sz w:val="20"/>
                 <w:szCs w:val="20"/>
               </w:rPr>
-              <w:t xml:space="preserve">cos(x, μ_ctx) × (0.5 + F)</w:t>
+              <w:t xml:space="preserve">relevance_t = clamp(map01(cos(x_t, μ_ctx)) × (0.5 + 0.5F), 0, 1)</w:t>
             </w:r>
           </w:p>
         </w:tc>
@@ -2484,7 +3090,7 @@
                 <w:sz w:val="20"/>
                 <w:szCs w:val="20"/>
               </w:rPr>
-              <w:t xml:space="preserve">(1 − F) × S × novelty</w:t>
+              <w:t xml:space="preserve">(1 − F) × S × novelty_t</w:t>
             </w:r>
           </w:p>
         </w:tc>
@@ -2588,7 +3194,7 @@
                 <w:sz w:val="20"/>
                 <w:szCs w:val="20"/>
               </w:rPr>
-              <w:t xml:space="preserve">(1 − μ_sim) × (0.5 + 0.5F) × (1 − 0.2T)</w:t>
+              <w:t xml:space="preserve">rarity_t × (0.5 + 0.5F) × (1 − 0.2T)</w:t>
             </w:r>
           </w:p>
         </w:tc>
@@ -2640,7 +3246,7 @@
                 <w:sz w:val="20"/>
                 <w:szCs w:val="20"/>
               </w:rPr>
-              <w:t xml:space="preserve">(drift_mag / 2) × (1 − T)</w:t>
+              <w:t xml:space="preserve">(drift_mag_t / 2) × (1 − T)</w:t>
             </w:r>
           </w:p>
         </w:tc>
@@ -2744,7 +3350,7 @@
                 <w:sz w:val="20"/>
                 <w:szCs w:val="20"/>
               </w:rPr>
-              <w:t xml:space="preserve">(rarity + novelty) / 2 × (F + S) / 2</w:t>
+              <w:t xml:space="preserve">(rarity_t + novelty_t) / 2 × (F + S) / 2</w:t>
             </w:r>
           </w:p>
         </w:tc>
@@ -2796,7 +3402,7 @@
                 <w:sz w:val="20"/>
                 <w:szCs w:val="20"/>
               </w:rPr>
-              <w:t xml:space="preserve">map01(Σ p_c × v_map[c])</w:t>
+              <w:t xml:space="preserve">valence_t</w:t>
             </w:r>
           </w:p>
         </w:tc>
@@ -2848,7 +3454,7 @@
                 <w:sz w:val="20"/>
                 <w:szCs w:val="20"/>
               </w:rPr>
-              <w:t xml:space="preserve">clamp(Σ p_c × a_map[c], 0, 1)</w:t>
+              <w:t xml:space="preserve">arousal_t</w:t>
             </w:r>
           </w:p>
         </w:tc>
@@ -2952,7 +3558,7 @@
                 <w:sz w:val="20"/>
                 <w:szCs w:val="20"/>
               </w:rPr>
-              <w:t xml:space="preserve">(1 − relevance) × T</w:t>
+              <w:t xml:space="preserve">(1 − relevance_t) × T</w:t>
             </w:r>
           </w:p>
         </w:tc>
@@ -3004,7 +3610,7 @@
                 <w:sz w:val="20"/>
                 <w:szCs w:val="20"/>
               </w:rPr>
-              <w:t xml:space="preserve">F × relevance</w:t>
+              <w:t xml:space="preserve">F × relevance_t</w:t>
             </w:r>
           </w:p>
         </w:tc>
@@ -3165,20 +3771,33 @@
           <w:sz w:val="20"/>
           <w:szCs w:val="20"/>
         </w:rPr>
-        <w:t xml:space="preserve">weight_i(t) ← (1 − confidence_rls) × w_bootstrap[i] +</w:t>
-      </w:r>
-    </w:p>
-    <w:p>
-      <w:pPr>
-        <w:pStyle w:val="Equation"/>
-      </w:pPr>
-      <w:r>
-        <w:rPr>
-          <w:rFonts w:ascii="Courier New" w:cs="Courier New" w:eastAsia="Courier New" w:hAnsi="Courier New"/>
-          <w:sz w:val="20"/>
-          <w:szCs w:val="20"/>
-        </w:rPr>
-        <w:t xml:space="preserve">               confidence_rls × w_rls[i]</w:t>
+        <w:t xml:space="preserve">w_rls01[i] ← clamp(w_rls[i], 0, 1)  # constrain fitted weights to mixture range</w:t>
+      </w:r>
+    </w:p>
+    <w:p>
+      <w:pPr>
+        <w:pStyle w:val="Equation"/>
+      </w:pPr>
+      <w:r>
+        <w:rPr>
+          <w:rFonts w:ascii="Courier New" w:cs="Courier New" w:eastAsia="Courier New" w:hAnsi="Courier New"/>
+          <w:sz w:val="20"/>
+          <w:szCs w:val="20"/>
+        </w:rPr>
+        <w:t xml:space="preserve">weight_i(t) ← clamp((1 − confidence_rls) × w_bootstrap[i] +</w:t>
+      </w:r>
+    </w:p>
+    <w:p>
+      <w:pPr>
+        <w:pStyle w:val="Equation"/>
+      </w:pPr>
+      <w:r>
+        <w:rPr>
+          <w:rFonts w:ascii="Courier New" w:cs="Courier New" w:eastAsia="Courier New" w:hAnsi="Courier New"/>
+          <w:sz w:val="20"/>
+          <w:szCs w:val="20"/>
+        </w:rPr>
+        <w:t xml:space="preserve">                      confidence_rls × w_rls01[i], 0, 1)</w:t>
       </w:r>
     </w:p>
     <w:p>
@@ -3217,7 +3836,7 @@
           <w:sz w:val="20"/>
           <w:szCs w:val="20"/>
         </w:rPr>
-        <w:t xml:space="preserve">    m01[i] = map01(metric[i]) if signed else clamp(metric[i], 0, 1)</w:t>
+        <w:t xml:space="preserve">    m01[i] = clamp(metric[i], 0, 1)</w:t>
       </w:r>
     </w:p>
     <w:p>
@@ -3274,6 +3893,11 @@
     </w:p>
     <w:p>
       <w:r>
+        <w:t xml:space="preserve">Invariant (MUST): all 12 Table 1 metric values are defined on [0, 1].</w:t>
+      </w:r>
+    </w:p>
+    <w:p>
+      <w:r>
         <w:t xml:space="preserve">Weight normalization is critical: with 12 metrics and raw weights averaging ~0.6, the sum approaches 7.2. Without normalization, weighted sums would saturate and collapse variance.</w:t>
       </w:r>
     </w:p>
@@ -3336,20 +3960,59 @@
           <w:sz w:val="20"/>
           <w:szCs w:val="20"/>
         </w:rPr>
-        <w:t xml:space="preserve">w ← win_score(T)</w:t>
-      </w:r>
-    </w:p>
-    <w:p>
-      <w:pPr>
-        <w:pStyle w:val="Equation"/>
-      </w:pPr>
-      <w:r>
-        <w:rPr>
-          <w:rFonts w:ascii="Courier New" w:cs="Courier New" w:eastAsia="Courier New" w:hAnsi="Courier New"/>
-          <w:sz w:val="20"/>
-          <w:szCs w:val="20"/>
-        </w:rPr>
-        <w:t xml:space="preserve">observed_p90 ← percentile(scores[t−w:t], 90)</w:t>
+        <w:t xml:space="preserve">recent_scores ← tail(score_stream, win_score(T))</w:t>
+      </w:r>
+    </w:p>
+    <w:p>
+      <w:pPr>
+        <w:pStyle w:val="Equation"/>
+      </w:pPr>
+      <w:r>
+        <w:rPr>
+          <w:rFonts w:ascii="Courier New" w:cs="Courier New" w:eastAsia="Courier New" w:hAnsi="Courier New"/>
+          <w:sz w:val="20"/>
+          <w:szCs w:val="20"/>
+        </w:rPr>
+        <w:t xml:space="preserve">if |recent_scores| == 0:</w:t>
+      </w:r>
+    </w:p>
+    <w:p>
+      <w:pPr>
+        <w:pStyle w:val="Equation"/>
+      </w:pPr>
+      <w:r>
+        <w:rPr>
+          <w:rFonts w:ascii="Courier New" w:cs="Courier New" w:eastAsia="Courier New" w:hAnsi="Courier New"/>
+          <w:sz w:val="20"/>
+          <w:szCs w:val="20"/>
+        </w:rPr>
+        <w:t xml:space="preserve">    observed_p90 ← θ_prior  # no evidence yet</w:t>
+      </w:r>
+    </w:p>
+    <w:p>
+      <w:pPr>
+        <w:pStyle w:val="Equation"/>
+      </w:pPr>
+      <w:r>
+        <w:rPr>
+          <w:rFonts w:ascii="Courier New" w:cs="Courier New" w:eastAsia="Courier New" w:hAnsi="Courier New"/>
+          <w:sz w:val="20"/>
+          <w:szCs w:val="20"/>
+        </w:rPr>
+        <w:t xml:space="preserve">else:</w:t>
+      </w:r>
+    </w:p>
+    <w:p>
+      <w:pPr>
+        <w:pStyle w:val="Equation"/>
+      </w:pPr>
+      <w:r>
+        <w:rPr>
+          <w:rFonts w:ascii="Courier New" w:cs="Courier New" w:eastAsia="Courier New" w:hAnsi="Courier New"/>
+          <w:sz w:val="20"/>
+          <w:szCs w:val="20"/>
+        </w:rPr>
+        <w:t xml:space="preserve">    observed_p90 ← percentile(recent_scores, 90)</w:t>
       </w:r>
     </w:p>
     <w:p>
@@ -3380,7 +4043,7 @@
           <w:sz w:val="20"/>
           <w:szCs w:val="20"/>
         </w:rPr>
-        <w:t xml:space="preserve">ρ_obs ← u(t) × min(w, count)</w:t>
+        <w:t xml:space="preserve">ρ_obs ← u(t) × |recent_scores|</w:t>
       </w:r>
     </w:p>
     <w:p>
@@ -3463,7 +4126,7 @@
           <w:sz w:val="20"/>
           <w:szCs w:val="20"/>
         </w:rPr>
-        <w:t xml:space="preserve">Δt ← max(Δt, 10⁻³)  # minimum 1ms</w:t>
+        <w:t xml:space="preserve">Δt ← max(Δt, 10⁻³)  # minimum 1e-3 s (1 ms)</w:t>
       </w:r>
     </w:p>
     <w:p>
@@ -3555,6 +4218,11 @@
       </w:r>
     </w:p>
     <w:p>
+      <w:r>
+        <w:t xml:space="preserve">Normative note (MUST): Δwrites is computed from the current step's write_memory decision. Rate state updates occur after the write decision and affect subsequent timesteps.</w:t>
+      </w:r>
+    </w:p>
+    <w:p>
       <w:pPr>
         <w:pStyle w:val="Equation"/>
       </w:pPr>
@@ -3603,7 +4271,33 @@
           <w:sz w:val="20"/>
           <w:szCs w:val="20"/>
         </w:rPr>
-        <w:t xml:space="preserve">ρ_hat ← m_rate / denom  # bias-corrected estimate</w:t>
+        <w:t xml:space="preserve">ρ_hat_next ← m_rate / denom  # bias-corrected estimate for next step</w:t>
+      </w:r>
+    </w:p>
+    <w:p>
+      <w:pPr>
+        <w:pStyle w:val="Equation"/>
+      </w:pPr>
+      <w:r>
+        <w:rPr>
+          <w:rFonts w:ascii="Courier New" w:cs="Courier New" w:eastAsia="Courier New" w:hAnsi="Courier New"/>
+          <w:sz w:val="20"/>
+          <w:szCs w:val="20"/>
+        </w:rPr>
+        <w:t xml:space="preserve">rate_ticks ← rate_ticks + 1</w:t>
+      </w:r>
+    </w:p>
+    <w:p>
+      <w:pPr>
+        <w:pStyle w:val="Equation"/>
+      </w:pPr>
+      <w:r>
+        <w:rPr>
+          <w:rFonts w:ascii="Courier New" w:cs="Courier New" w:eastAsia="Courier New" w:hAnsi="Courier New"/>
+          <w:sz w:val="20"/>
+          <w:szCs w:val="20"/>
+        </w:rPr>
+        <w:t xml:space="preserve">last_rate_timestamp ← now_ms()  # update after rate computation</w:t>
       </w:r>
     </w:p>
     <w:p>
@@ -3677,29 +4371,34 @@
       </w:r>
     </w:p>
     <w:p>
-      <w:pPr>
-        <w:pStyle w:val="Equation"/>
-      </w:pPr>
-      <w:r>
-        <w:rPr>
-          <w:rFonts w:ascii="Courier New" w:cs="Courier New" w:eastAsia="Courier New" w:hAnsi="Courier New"/>
-          <w:sz w:val="20"/>
-          <w:szCs w:val="20"/>
-        </w:rPr>
-        <w:t xml:space="preserve">rate_error ← tanh((ρ_hat − rate_target_t) /</w:t>
-      </w:r>
-    </w:p>
-    <w:p>
-      <w:pPr>
-        <w:pStyle w:val="Equation"/>
-      </w:pPr>
-      <w:r>
-        <w:rPr>
-          <w:rFonts w:ascii="Courier New" w:cs="Courier New" w:eastAsia="Courier New" w:hAnsi="Courier New"/>
-          <w:sz w:val="20"/>
-          <w:szCs w:val="20"/>
-        </w:rPr>
-        <w:t xml:space="preserve">                  max(rate_target_t, ε))</w:t>
+      <w:r>
+        <w:t xml:space="preserve">Normative note (MUST): ρ_hat_prev is stored state entering the timestep. After the write decision, the rate-state update computes ρ_hat_next; the assignment ρ_hat_prev ← ρ_hat_next occurs at end of step (see Appendix C).</w:t>
+      </w:r>
+    </w:p>
+    <w:p>
+      <w:pPr>
+        <w:pStyle w:val="Equation"/>
+      </w:pPr>
+      <w:r>
+        <w:rPr>
+          <w:rFonts w:ascii="Courier New" w:cs="Courier New" w:eastAsia="Courier New" w:hAnsi="Courier New"/>
+          <w:sz w:val="20"/>
+          <w:szCs w:val="20"/>
+        </w:rPr>
+        <w:t xml:space="preserve">rate_error ← tanh((ρ_hat_prev − rate_target) /</w:t>
+      </w:r>
+    </w:p>
+    <w:p>
+      <w:pPr>
+        <w:pStyle w:val="Equation"/>
+      </w:pPr>
+      <w:r>
+        <w:rPr>
+          <w:rFonts w:ascii="Courier New" w:cs="Courier New" w:eastAsia="Courier New" w:hAnsi="Courier New"/>
+          <w:sz w:val="20"/>
+          <w:szCs w:val="20"/>
+        </w:rPr>
+        <w:t xml:space="preserve">                  max(rate_target, ε))</w:t>
       </w:r>
     </w:p>
     <w:p>
@@ -3795,7 +4494,59 @@
           <w:sz w:val="20"/>
           <w:szCs w:val="20"/>
         </w:rPr>
-        <w:t xml:space="preserve">σ_scores ← std(scores[t−w:t])</w:t>
+        <w:t xml:space="preserve">recent_scores ← tail(score_stream, win_score(T))</w:t>
+      </w:r>
+    </w:p>
+    <w:p>
+      <w:pPr>
+        <w:pStyle w:val="Equation"/>
+      </w:pPr>
+      <w:r>
+        <w:rPr>
+          <w:rFonts w:ascii="Courier New" w:cs="Courier New" w:eastAsia="Courier New" w:hAnsi="Courier New"/>
+          <w:sz w:val="20"/>
+          <w:szCs w:val="20"/>
+        </w:rPr>
+        <w:t xml:space="preserve">if |recent_scores| &lt; 2:</w:t>
+      </w:r>
+    </w:p>
+    <w:p>
+      <w:pPr>
+        <w:pStyle w:val="Equation"/>
+      </w:pPr>
+      <w:r>
+        <w:rPr>
+          <w:rFonts w:ascii="Courier New" w:cs="Courier New" w:eastAsia="Courier New" w:hAnsi="Courier New"/>
+          <w:sz w:val="20"/>
+          <w:szCs w:val="20"/>
+        </w:rPr>
+        <w:t xml:space="preserve">    σ_scores ← 0</w:t>
+      </w:r>
+    </w:p>
+    <w:p>
+      <w:pPr>
+        <w:pStyle w:val="Equation"/>
+      </w:pPr>
+      <w:r>
+        <w:rPr>
+          <w:rFonts w:ascii="Courier New" w:cs="Courier New" w:eastAsia="Courier New" w:hAnsi="Courier New"/>
+          <w:sz w:val="20"/>
+          <w:szCs w:val="20"/>
+        </w:rPr>
+        <w:t xml:space="preserve">else:</w:t>
+      </w:r>
+    </w:p>
+    <w:p>
+      <w:pPr>
+        <w:pStyle w:val="Equation"/>
+      </w:pPr>
+      <w:r>
+        <w:rPr>
+          <w:rFonts w:ascii="Courier New" w:cs="Courier New" w:eastAsia="Courier New" w:hAnsi="Courier New"/>
+          <w:sz w:val="20"/>
+          <w:szCs w:val="20"/>
+        </w:rPr>
+        <w:t xml:space="preserve">    σ_scores ← std(recent_scores)</w:t>
       </w:r>
     </w:p>
     <w:p>
@@ -4179,6 +4930,32 @@
           <w:sz w:val="20"/>
           <w:szCs w:val="20"/>
         </w:rPr>
+        <w:t xml:space="preserve">emo_max ← 0  # max emotion_intensity_t within the unit</w:t>
+      </w:r>
+    </w:p>
+    <w:p>
+      <w:pPr>
+        <w:pStyle w:val="Equation"/>
+      </w:pPr>
+      <w:r>
+        <w:rPr>
+          <w:rFonts w:ascii="Courier New" w:cs="Courier New" w:eastAsia="Courier New" w:hAnsi="Courier New"/>
+          <w:sz w:val="20"/>
+          <w:szCs w:val="20"/>
+        </w:rPr>
+        <w:t xml:space="preserve">arousal_sum ← 0  # sum of arousal_t within the unit (for avg)</w:t>
+      </w:r>
+    </w:p>
+    <w:p>
+      <w:pPr>
+        <w:pStyle w:val="Equation"/>
+      </w:pPr>
+      <w:r>
+        <w:rPr>
+          <w:rFonts w:ascii="Courier New" w:cs="Courier New" w:eastAsia="Courier New" w:hAnsi="Courier New"/>
+          <w:sz w:val="20"/>
+          <w:szCs w:val="20"/>
+        </w:rPr>
         <w:t xml:space="preserve">t_start ← now_ms()  # timestamp of accumulation start (ms since epoch)</w:t>
       </w:r>
     </w:p>
@@ -4196,6 +4973,76 @@
       </w:r>
     </w:p>
     <w:p>
+      <w:pPr>
+        <w:pStyle w:val="Equation"/>
+      </w:pPr>
+      <w:r>
+        <w:rPr>
+          <w:rFonts w:ascii="Courier New" w:cs="Courier New" w:eastAsia="Courier New" w:hAnsi="Courier New"/>
+          <w:sz w:val="20"/>
+          <w:szCs w:val="20"/>
+        </w:rPr>
+        <w:t xml:space="preserve">last_write_ts ← 0  # ms; 0 means "no prior write" for refractory</w:t>
+      </w:r>
+    </w:p>
+    <w:p>
+      <w:pPr>
+        <w:pStyle w:val="Equation"/>
+      </w:pPr>
+      <w:r>
+        <w:rPr>
+          <w:rFonts w:ascii="Courier New" w:cs="Courier New" w:eastAsia="Courier New" w:hAnsi="Courier New"/>
+          <w:sz w:val="20"/>
+          <w:szCs w:val="20"/>
+        </w:rPr>
+        <w:t xml:space="preserve">eta_acc ← 0  # drift EWMA state</w:t>
+      </w:r>
+    </w:p>
+    <w:p>
+      <w:pPr>
+        <w:pStyle w:val="Equation"/>
+      </w:pPr>
+      <w:r>
+        <w:rPr>
+          <w:rFonts w:ascii="Courier New" w:cs="Courier New" w:eastAsia="Courier New" w:hAnsi="Courier New"/>
+          <w:sz w:val="20"/>
+          <w:szCs w:val="20"/>
+        </w:rPr>
+        <w:t xml:space="preserve">coherence_prev ← 0  # previous coherence (initialize to 0)</w:t>
+      </w:r>
+    </w:p>
+    <w:p>
+      <w:pPr>
+        <w:pStyle w:val="Equation"/>
+      </w:pPr>
+      <w:r>
+        <w:rPr>
+          <w:rFonts w:ascii="Courier New" w:cs="Courier New" w:eastAsia="Courier New" w:hAnsi="Courier New"/>
+          <w:sz w:val="20"/>
+          <w:szCs w:val="20"/>
+        </w:rPr>
+        <w:t xml:space="preserve">acc_signals_window ← []  # ring buffer of recent embeddings for coherence</w:t>
+      </w:r>
+    </w:p>
+    <w:p>
+      <w:r>
+        <w:t xml:space="preserve">Reset behavior: reset_accumulator() clears μ_acc, drift_acc, s_sum, s_max, n, e_peak, emo_max, arousal_sum, eta_acc, coherence_prev, and sets acc_signals_window ← [] (and refreshes t_start/last_signal_ts for the next unit), but retains last_write_ts so the refractory term remains well-defined across boundaries.</w:t>
+      </w:r>
+    </w:p>
+    <w:p>
+      <w:pPr>
+        <w:pStyle w:val="Equation"/>
+      </w:pPr>
+      <w:r>
+        <w:rPr>
+          <w:rFonts w:ascii="Courier New" w:cs="Courier New" w:eastAsia="Courier New" w:hAnsi="Courier New"/>
+          <w:sz w:val="20"/>
+          <w:szCs w:val="20"/>
+        </w:rPr>
+        <w:t xml:space="preserve">reset_accumulator(): acc_signals_window ← []  # MUST clear coherence window at boundaries</w:t>
+      </w:r>
+    </w:p>
+    <w:p>
       <w:r>
         <w:t xml:space="preserve">On each signal, update running statistics (note: n is the count before this signal):</w:t>
       </w:r>
@@ -4210,6 +5057,45 @@
           <w:sz w:val="20"/>
           <w:szCs w:val="20"/>
         </w:rPr>
+        <w:t xml:space="preserve">signal_gap_s ← now_s() − to_s(last_signal_ts)  # compute BEFORE updating last_signal_ts</w:t>
+      </w:r>
+    </w:p>
+    <w:p>
+      <w:pPr>
+        <w:pStyle w:val="Equation"/>
+      </w:pPr>
+      <w:r>
+        <w:rPr>
+          <w:rFonts w:ascii="Courier New" w:cs="Courier New" w:eastAsia="Courier New" w:hAnsi="Courier New"/>
+          <w:sz w:val="20"/>
+          <w:szCs w:val="20"/>
+        </w:rPr>
+        <w:t xml:space="preserve">win_coh(T) = round(lerp(8, 32, T))  # coherence window size</w:t>
+      </w:r>
+    </w:p>
+    <w:p>
+      <w:pPr>
+        <w:pStyle w:val="Equation"/>
+      </w:pPr>
+      <w:r>
+        <w:rPr>
+          <w:rFonts w:ascii="Courier New" w:cs="Courier New" w:eastAsia="Courier New" w:hAnsi="Courier New"/>
+          <w:sz w:val="20"/>
+          <w:szCs w:val="20"/>
+        </w:rPr>
+        <w:t xml:space="preserve">acc_signals_window ← tail(acc_signals_window, win_coh(T))</w:t>
+      </w:r>
+    </w:p>
+    <w:p>
+      <w:pPr>
+        <w:pStyle w:val="Equation"/>
+      </w:pPr>
+      <w:r>
+        <w:rPr>
+          <w:rFonts w:ascii="Courier New" w:cs="Courier New" w:eastAsia="Courier New" w:hAnsi="Courier New"/>
+          <w:sz w:val="20"/>
+          <w:szCs w:val="20"/>
+        </w:rPr>
         <w:t xml:space="preserve">μ_acc ← (n × μ_acc + x_t) / (n + 1)</w:t>
       </w:r>
     </w:p>
@@ -4236,7 +5122,7 @@
           <w:sz w:val="20"/>
           <w:szCs w:val="20"/>
         </w:rPr>
-        <w:t xml:space="preserve">drift_acc ← drift_acc + drift_mag_t</w:t>
+        <w:t xml:space="preserve">drift_acc ← drift_acc + (drift_mag_t / 2)  # accumulate normalized context-centroid drift (drift_mag_t ∈ [0,2])</w:t>
       </w:r>
     </w:p>
     <w:p>
@@ -4262,6 +5148,32 @@
           <w:sz w:val="20"/>
           <w:szCs w:val="20"/>
         </w:rPr>
+        <w:t xml:space="preserve">emo_max ← max(emo_max, emotion_intensity_t)</w:t>
+      </w:r>
+    </w:p>
+    <w:p>
+      <w:pPr>
+        <w:pStyle w:val="Equation"/>
+      </w:pPr>
+      <w:r>
+        <w:rPr>
+          <w:rFonts w:ascii="Courier New" w:cs="Courier New" w:eastAsia="Courier New" w:hAnsi="Courier New"/>
+          <w:sz w:val="20"/>
+          <w:szCs w:val="20"/>
+        </w:rPr>
+        <w:t xml:space="preserve">arousal_sum ← arousal_sum + arousal_t</w:t>
+      </w:r>
+    </w:p>
+    <w:p>
+      <w:pPr>
+        <w:pStyle w:val="Equation"/>
+      </w:pPr>
+      <w:r>
+        <w:rPr>
+          <w:rFonts w:ascii="Courier New" w:cs="Courier New" w:eastAsia="Courier New" w:hAnsi="Courier New"/>
+          <w:sz w:val="20"/>
+          <w:szCs w:val="20"/>
+        </w:rPr>
         <w:t xml:space="preserve">if score_t &gt; s_max:</w:t>
       </w:r>
     </w:p>
@@ -4340,7 +5252,7 @@
           <w:sz w:val="20"/>
           <w:szCs w:val="20"/>
         </w:rPr>
-        <w:t xml:space="preserve">eta_acc ← EWMA(eta_acc, d_step, α = lerp(0.3, 0.1, T))</w:t>
+        <w:t xml:space="preserve">eta_prev ← eta_acc  # baseline before updating EWMA</w:t>
       </w:r>
     </w:p>
     <w:p>
@@ -4358,7 +5270,98 @@
           <w:sz w:val="20"/>
           <w:szCs w:val="20"/>
         </w:rPr>
-        <w:t xml:space="preserve">coherence_prev ← mean([cos(x_t, x_i) for x_i in current_window])</w:t>
+        <w:t xml:space="preserve">current_window ← acc_signals_window  # embeddings from the current unit before x_t</w:t>
+      </w:r>
+    </w:p>
+    <w:p>
+      <w:pPr>
+        <w:pStyle w:val="Equation"/>
+      </w:pPr>
+      <w:r>
+        <w:rPr>
+          <w:rFonts w:ascii="Courier New" w:cs="Courier New" w:eastAsia="Courier New" w:hAnsi="Courier New"/>
+          <w:sz w:val="20"/>
+          <w:szCs w:val="20"/>
+        </w:rPr>
+        <w:t xml:space="preserve">if |current_window| == 0:</w:t>
+      </w:r>
+    </w:p>
+    <w:p>
+      <w:pPr>
+        <w:pStyle w:val="Equation"/>
+      </w:pPr>
+      <w:r>
+        <w:rPr>
+          <w:rFonts w:ascii="Courier New" w:cs="Courier New" w:eastAsia="Courier New" w:hAnsi="Courier New"/>
+          <w:sz w:val="20"/>
+          <w:szCs w:val="20"/>
+        </w:rPr>
+        <w:t xml:space="preserve">    coherence_curr ← 1.0  # empty-window fallback</w:t>
+      </w:r>
+    </w:p>
+    <w:p>
+      <w:pPr>
+        <w:pStyle w:val="Equation"/>
+      </w:pPr>
+      <w:r>
+        <w:rPr>
+          <w:rFonts w:ascii="Courier New" w:cs="Courier New" w:eastAsia="Courier New" w:hAnsi="Courier New"/>
+          <w:sz w:val="20"/>
+          <w:szCs w:val="20"/>
+        </w:rPr>
+        <w:t xml:space="preserve">else:</w:t>
+      </w:r>
+    </w:p>
+    <w:p>
+      <w:pPr>
+        <w:pStyle w:val="Equation"/>
+      </w:pPr>
+      <w:r>
+        <w:rPr>
+          <w:rFonts w:ascii="Courier New" w:cs="Courier New" w:eastAsia="Courier New" w:hAnsi="Courier New"/>
+          <w:sz w:val="20"/>
+          <w:szCs w:val="20"/>
+        </w:rPr>
+        <w:t xml:space="preserve">    coherence_curr ← mean([cos(x_t, x_i) for x_i in current_window])</w:t>
+      </w:r>
+    </w:p>
+    <w:p>
+      <w:pPr>
+        <w:pStyle w:val="Equation"/>
+      </w:pPr>
+      <w:r>
+        <w:rPr>
+          <w:rFonts w:ascii="Courier New" w:cs="Courier New" w:eastAsia="Courier New" w:hAnsi="Courier New"/>
+          <w:sz w:val="20"/>
+          <w:szCs w:val="20"/>
+        </w:rPr>
+        <w:t xml:space="preserve"># After computing coherence_curr, append x_t for the next step</w:t>
+      </w:r>
+    </w:p>
+    <w:p>
+      <w:pPr>
+        <w:pStyle w:val="Equation"/>
+      </w:pPr>
+      <w:r>
+        <w:rPr>
+          <w:rFonts w:ascii="Courier New" w:cs="Courier New" w:eastAsia="Courier New" w:hAnsi="Courier New"/>
+          <w:sz w:val="20"/>
+          <w:szCs w:val="20"/>
+        </w:rPr>
+        <w:t xml:space="preserve">acc_signals_window.append(x_t); acc_signals_window ← tail(acc_signals_window, win_coh(T))</w:t>
+      </w:r>
+    </w:p>
+    <w:p>
+      <w:pPr>
+        <w:pStyle w:val="Equation"/>
+      </w:pPr>
+      <w:r>
+        <w:rPr>
+          <w:rFonts w:ascii="Courier New" w:cs="Courier New" w:eastAsia="Courier New" w:hAnsi="Courier New"/>
+          <w:sz w:val="20"/>
+          <w:szCs w:val="20"/>
+        </w:rPr>
+        <w:t xml:space="preserve"># coherence_prev is the stored coherence value from the previous step</w:t>
       </w:r>
     </w:p>
     <w:p>
@@ -4415,20 +5418,98 @@
           <w:sz w:val="20"/>
           <w:szCs w:val="20"/>
         </w:rPr>
-        <w:t xml:space="preserve">drift_spike ← (d_step − eta_acc) / max(eta_acc, ε)</w:t>
-      </w:r>
-    </w:p>
-    <w:p>
-      <w:pPr>
-        <w:pStyle w:val="Equation"/>
-      </w:pPr>
-      <w:r>
-        <w:rPr>
-          <w:rFonts w:ascii="Courier New" w:cs="Courier New" w:eastAsia="Courier New" w:hAnsi="Courier New"/>
-          <w:sz w:val="20"/>
-          <w:szCs w:val="20"/>
-        </w:rPr>
-        <w:t xml:space="preserve">coh_drop ← max(0, coherence_prev − coherence_curr)</w:t>
+        <w:t xml:space="preserve">ε0 = 0.01  # cold-start guard for eta_prev</w:t>
+      </w:r>
+    </w:p>
+    <w:p>
+      <w:pPr>
+        <w:pStyle w:val="Equation"/>
+      </w:pPr>
+      <w:r>
+        <w:rPr>
+          <w:rFonts w:ascii="Courier New" w:cs="Courier New" w:eastAsia="Courier New" w:hAnsi="Courier New"/>
+          <w:sz w:val="20"/>
+          <w:szCs w:val="20"/>
+        </w:rPr>
+        <w:t xml:space="preserve">if eta_prev &lt; ε0:</w:t>
+      </w:r>
+    </w:p>
+    <w:p>
+      <w:pPr>
+        <w:pStyle w:val="Equation"/>
+      </w:pPr>
+      <w:r>
+        <w:rPr>
+          <w:rFonts w:ascii="Courier New" w:cs="Courier New" w:eastAsia="Courier New" w:hAnsi="Courier New"/>
+          <w:sz w:val="20"/>
+          <w:szCs w:val="20"/>
+        </w:rPr>
+        <w:t xml:space="preserve">    drift_spike ← 0</w:t>
+      </w:r>
+    </w:p>
+    <w:p>
+      <w:pPr>
+        <w:pStyle w:val="Equation"/>
+      </w:pPr>
+      <w:r>
+        <w:rPr>
+          <w:rFonts w:ascii="Courier New" w:cs="Courier New" w:eastAsia="Courier New" w:hAnsi="Courier New"/>
+          <w:sz w:val="20"/>
+          <w:szCs w:val="20"/>
+        </w:rPr>
+        <w:t xml:space="preserve">else:</w:t>
+      </w:r>
+    </w:p>
+    <w:p>
+      <w:pPr>
+        <w:pStyle w:val="Equation"/>
+      </w:pPr>
+      <w:r>
+        <w:rPr>
+          <w:rFonts w:ascii="Courier New" w:cs="Courier New" w:eastAsia="Courier New" w:hAnsi="Courier New"/>
+          <w:sz w:val="20"/>
+          <w:szCs w:val="20"/>
+        </w:rPr>
+        <w:t xml:space="preserve">    drift_spike ← (d_step − eta_prev) / max(eta_prev, ε)</w:t>
+      </w:r>
+    </w:p>
+    <w:p>
+      <w:pPr>
+        <w:pStyle w:val="Equation"/>
+      </w:pPr>
+      <w:r>
+        <w:rPr>
+          <w:rFonts w:ascii="Courier New" w:cs="Courier New" w:eastAsia="Courier New" w:hAnsi="Courier New"/>
+          <w:sz w:val="20"/>
+          <w:szCs w:val="20"/>
+        </w:rPr>
+        <w:t xml:space="preserve">eta_acc ← EWMA(eta_prev, d_step, α = lerp(0.3, 0.1, T))</w:t>
+      </w:r>
+    </w:p>
+    <w:p>
+      <w:pPr>
+        <w:pStyle w:val="Equation"/>
+      </w:pPr>
+      <w:r>
+        <w:rPr>
+          <w:rFonts w:ascii="Courier New" w:cs="Courier New" w:eastAsia="Courier New" w:hAnsi="Courier New"/>
+          <w:sz w:val="20"/>
+          <w:szCs w:val="20"/>
+        </w:rPr>
+        <w:t xml:space="preserve">coh_drop01 ← clamp((coherence_prev − coherence_curr) / 2, 0, 1)</w:t>
+      </w:r>
+    </w:p>
+    <w:p>
+      <w:pPr>
+        <w:pStyle w:val="Equation"/>
+      </w:pPr>
+      <w:r>
+        <w:rPr>
+          <w:rFonts w:ascii="Courier New" w:cs="Courier New" w:eastAsia="Courier New" w:hAnsi="Courier New"/>
+          <w:sz w:val="20"/>
+          <w:szCs w:val="20"/>
+        </w:rPr>
+        <w:t xml:space="preserve">coherence_prev ← coherence_curr  # update for next step</w:t>
       </w:r>
     </w:p>
     <w:p>
@@ -4454,7 +5535,20 @@
           <w:sz w:val="20"/>
           <w:szCs w:val="20"/>
         </w:rPr>
-        <w:t xml:space="preserve">                  weight_coh_component × coh_drop</w:t>
+        <w:t xml:space="preserve">                  weight_coh_component × coh_drop01</w:t>
+      </w:r>
+    </w:p>
+    <w:p>
+      <w:pPr>
+        <w:pStyle w:val="Equation"/>
+      </w:pPr>
+      <w:r>
+        <w:rPr>
+          <w:rFonts w:ascii="Courier New" w:cs="Courier New" w:eastAsia="Courier New" w:hAnsi="Courier New"/>
+          <w:sz w:val="20"/>
+          <w:szCs w:val="20"/>
+        </w:rPr>
+        <w:t xml:space="preserve">boundary_score ← clamp(boundary_score, 0, 1)</w:t>
       </w:r>
     </w:p>
     <w:p>
@@ -4568,12 +5662,12 @@
           <w:sz w:val="20"/>
           <w:szCs w:val="20"/>
         </w:rPr>
-        <w:t xml:space="preserve">               (signal_gap &gt; gap_threshold(T))</w:t>
-      </w:r>
-    </w:p>
-    <w:p>
-      <w:r>
-        <w:t xml:space="preserve">where signal_gap = now_s() − to_s(last_signal_ts) detects natural pauses (speech pauses, generation delays):</w:t>
+        <w:t xml:space="preserve">               (signal_gap_s &gt; gap_threshold(T))</w:t>
+      </w:r>
+    </w:p>
+    <w:p>
+      <w:r>
+        <w:t xml:space="preserve">where signal_gap_s = now_s() − to_s(last_signal_ts) is computed at the start of signal processing (before last_signal_ts is updated), detecting natural pauses (speech pauses, generation delays):</w:t>
       </w:r>
     </w:p>
     <w:p>
@@ -4629,6 +5723,19 @@
       </w:r>
     </w:p>
     <w:p>
+      <w:pPr>
+        <w:pStyle w:val="Equation"/>
+      </w:pPr>
+      <w:r>
+        <w:rPr>
+          <w:rFonts w:ascii="Courier New" w:cs="Courier New" w:eastAsia="Courier New" w:hAnsi="Courier New"/>
+          <w:sz w:val="20"/>
+          <w:szCs w:val="20"/>
+        </w:rPr>
+        <w:t xml:space="preserve">force_write ← false</w:t>
+      </w:r>
+    </w:p>
+    <w:p>
       <w:r>
         <w:t xml:space="preserve">When spike_bypass triggers:</w:t>
       </w:r>
@@ -4643,33 +5750,33 @@
           <w:sz w:val="20"/>
           <w:szCs w:val="20"/>
         </w:rPr>
-        <w:t xml:space="preserve">if spike_bypass AND n &gt; 1:</w:t>
-      </w:r>
-    </w:p>
-    <w:p>
-      <w:pPr>
-        <w:pStyle w:val="Equation"/>
-      </w:pPr>
-      <w:r>
-        <w:rPr>
-          <w:rFonts w:ascii="Courier New" w:cs="Courier New" w:eastAsia="Courier New" w:hAnsi="Courier New"/>
-          <w:sz w:val="20"/>
-          <w:szCs w:val="20"/>
-        </w:rPr>
-        <w:t xml:space="preserve">    commit_memory()  # includes spike signal</w:t>
-      </w:r>
-    </w:p>
-    <w:p>
-      <w:pPr>
-        <w:pStyle w:val="Equation"/>
-      </w:pPr>
-      <w:r>
-        <w:rPr>
-          <w:rFonts w:ascii="Courier New" w:cs="Courier New" w:eastAsia="Courier New" w:hAnsi="Courier New"/>
-          <w:sz w:val="20"/>
-          <w:szCs w:val="20"/>
-        </w:rPr>
-        <w:t xml:space="preserve">    reset_accumulator()</w:t>
+        <w:t xml:space="preserve">if spike_bypass:</w:t>
+      </w:r>
+    </w:p>
+    <w:p>
+      <w:pPr>
+        <w:pStyle w:val="Equation"/>
+      </w:pPr>
+      <w:r>
+        <w:rPr>
+          <w:rFonts w:ascii="Courier New" w:cs="Courier New" w:eastAsia="Courier New" w:hAnsi="Courier New"/>
+          <w:sz w:val="20"/>
+          <w:szCs w:val="20"/>
+        </w:rPr>
+        <w:t xml:space="preserve">    should_flush = true   # force a boundary</w:t>
+      </w:r>
+    </w:p>
+    <w:p>
+      <w:pPr>
+        <w:pStyle w:val="Equation"/>
+      </w:pPr>
+      <w:r>
+        <w:rPr>
+          <w:rFonts w:ascii="Courier New" w:cs="Courier New" w:eastAsia="Courier New" w:hAnsi="Courier New"/>
+          <w:sz w:val="20"/>
+          <w:szCs w:val="20"/>
+        </w:rPr>
+        <w:t xml:space="preserve">    force_write = true   # bypass S_window &gt; θ_memory</w:t>
       </w:r>
     </w:p>
     <w:p>
@@ -4840,7 +5947,25 @@
           <w:sz w:val="20"/>
           <w:szCs w:val="20"/>
         </w:rPr>
-        <w:t xml:space="preserve">write_memory = (should_flush OR spike_bypass) AND (S_window &gt; θ_memory)</w:t>
+        <w:t xml:space="preserve">write_memory = force_write OR (should_flush AND (S_window &gt; θ_memory))</w:t>
+      </w:r>
+    </w:p>
+    <w:p>
+      <w:pPr>
+        <w:pStyle w:val="Equation"/>
+      </w:pPr>
+      <w:r>
+        <w:rPr>
+          <w:rFonts w:ascii="Courier New" w:cs="Courier New" w:eastAsia="Courier New" w:hAnsi="Courier New"/>
+          <w:sz w:val="20"/>
+          <w:szCs w:val="20"/>
+        </w:rPr>
+        <w:t xml:space="preserve">if write_memory: last_write_ts ← now_ms()  # update refractory timestamp (ms)</w:t>
+      </w:r>
+    </w:p>
+    <w:p>
+      <w:r>
+        <w:t xml:space="preserve">Normative rule (MUST): if should_flush is true, the current unit must be finalized. If write_memory is false, discard the unit and reset_accumulator() anyway (do not update last_write_ts). This prevents perpetual should_flush states (time cap / drift cap / gap cap) while never resetting.</w:t>
       </w:r>
     </w:p>
     <w:p>
@@ -4881,7 +6006,7 @@
     </w:p>
     <w:p>
       <w:r>
-        <w:t xml:space="preserve">On write: store e_rep with metadata {n, s_max, s_avg, drift_acc, mem_elapsed}. Reset accumulator for next unit.</w:t>
+        <w:t xml:space="preserve">On write: store e_rep with metadata {n, s_max, s_avg, drift_acc, mem_elapsed, s_emotion_max=emo_max, s_arousal_avg=arousal_sum / max(n, 1)}. Append e_rep to memory_stream and recent_memory_centroids. Reset accumulator for next unit.</w:t>
       </w:r>
     </w:p>
     <w:p>
@@ -4998,7 +6123,20 @@
           <w:sz w:val="20"/>
           <w:szCs w:val="20"/>
         </w:rPr>
-        <w:t xml:space="preserve">strength_t ← strength_{t−1} × exp(−λ_t × Δt) + S × use_frequency_t</w:t>
+        <w:t xml:space="preserve">strength_t ← clamp(strength_{t−1} × exp(−λ_t × Δt) +</w:t>
+      </w:r>
+    </w:p>
+    <w:p>
+      <w:pPr>
+        <w:pStyle w:val="Equation"/>
+      </w:pPr>
+      <w:r>
+        <w:rPr>
+          <w:rFonts w:ascii="Courier New" w:cs="Courier New" w:eastAsia="Courier New" w:hAnsi="Courier New"/>
+          <w:sz w:val="20"/>
+          <w:szCs w:val="20"/>
+        </w:rPr>
+        <w:t xml:space="preserve">                   S × use_frequency_t, 0, 1)</w:t>
       </w:r>
     </w:p>
     <w:p>
@@ -5081,20 +6219,20 @@
           <w:sz w:val="20"/>
           <w:szCs w:val="20"/>
         </w:rPr>
-        <w:t xml:space="preserve">strength_t ← strength_{t−1} × exp(−λ_t × Δt) +</w:t>
-      </w:r>
-    </w:p>
-    <w:p>
-      <w:pPr>
-        <w:pStyle w:val="Equation"/>
-      </w:pPr>
-      <w:r>
-        <w:rPr>
-          <w:rFonts w:ascii="Courier New" w:cs="Courier New" w:eastAsia="Courier New" w:hAnsi="Courier New"/>
-          <w:sz w:val="20"/>
-          <w:szCs w:val="20"/>
-        </w:rPr>
-        <w:t xml:space="preserve">              S × use_frequency_t + F × influence_factor</w:t>
+        <w:t xml:space="preserve">strength_t ← clamp(strength_{t−1} × exp(−λ_t × Δt) +</w:t>
+      </w:r>
+    </w:p>
+    <w:p>
+      <w:pPr>
+        <w:pStyle w:val="Equation"/>
+      </w:pPr>
+      <w:r>
+        <w:rPr>
+          <w:rFonts w:ascii="Courier New" w:cs="Courier New" w:eastAsia="Courier New" w:hAnsi="Courier New"/>
+          <w:sz w:val="20"/>
+          <w:szCs w:val="20"/>
+        </w:rPr>
+        <w:t xml:space="preserve">                   S × use_frequency_t + F × influence_factor, 0, 1)</w:t>
       </w:r>
     </w:p>
     <w:p>
@@ -5867,7 +7005,7 @@
     </w:p>
     <w:p>
       <w:r>
-        <w:t xml:space="preserve">The manifold_complexity represents local variance in the embedding stream: 1 - mean(cos(window)).</w:t>
+        <w:t xml:space="preserve">The manifold_complexity is defined as a normalized local variability proxy (see Appendix B): manifold_complexity ← clamp((1 − mean_cos_window) / 2, 0, 1).</w:t>
       </w:r>
     </w:p>
     <w:p>
@@ -5963,20 +7101,59 @@
           <w:sz w:val="20"/>
           <w:szCs w:val="20"/>
         </w:rPr>
-        <w:t xml:space="preserve">    memory_benefit ← α × S_window + β × relevance(μ_acc, task_context) +</w:t>
-      </w:r>
-    </w:p>
-    <w:p>
-      <w:pPr>
-        <w:pStyle w:val="Equation"/>
-      </w:pPr>
-      <w:r>
-        <w:rPr>
-          <w:rFonts w:ascii="Courier New" w:cs="Courier New" w:eastAsia="Courier New" w:hAnsi="Courier New"/>
-          <w:sz w:val="20"/>
-          <w:szCs w:val="20"/>
-        </w:rPr>
-        <w:t xml:space="preserve">                       γ × novelty(μ_acc, active_memories)</w:t>
+        <w:t xml:space="preserve">    [α, β, γ] ← normalize([lerp(0.55, 0.70, F),   # window score weight</w:t>
+      </w:r>
+    </w:p>
+    <w:p>
+      <w:pPr>
+        <w:pStyle w:val="Equation"/>
+      </w:pPr>
+      <w:r>
+        <w:rPr>
+          <w:rFonts w:ascii="Courier New" w:cs="Courier New" w:eastAsia="Courier New" w:hAnsi="Courier New"/>
+          <w:sz w:val="20"/>
+          <w:szCs w:val="20"/>
+        </w:rPr>
+        <w:t xml:space="preserve">                        lerp(0.20, 0.35, F),   # task relevance weight</w:t>
+      </w:r>
+    </w:p>
+    <w:p>
+      <w:pPr>
+        <w:pStyle w:val="Equation"/>
+      </w:pPr>
+      <w:r>
+        <w:rPr>
+          <w:rFonts w:ascii="Courier New" w:cs="Courier New" w:eastAsia="Courier New" w:hAnsi="Courier New"/>
+          <w:sz w:val="20"/>
+          <w:szCs w:val="20"/>
+        </w:rPr>
+        <w:t xml:space="preserve">                        lerp(0.10, 0.30, S)])   # novelty-to-WM weight</w:t>
+      </w:r>
+    </w:p>
+    <w:p>
+      <w:pPr>
+        <w:pStyle w:val="Equation"/>
+      </w:pPr>
+      <w:r>
+        <w:rPr>
+          <w:rFonts w:ascii="Courier New" w:cs="Courier New" w:eastAsia="Courier New" w:hAnsi="Courier New"/>
+          <w:sz w:val="20"/>
+          <w:szCs w:val="20"/>
+        </w:rPr>
+        <w:t xml:space="preserve">    memory_benefit ← α × S_window + β × relevance_to_task(μ_acc, task_context) +</w:t>
+      </w:r>
+    </w:p>
+    <w:p>
+      <w:pPr>
+        <w:pStyle w:val="Equation"/>
+      </w:pPr>
+      <w:r>
+        <w:rPr>
+          <w:rFonts w:ascii="Courier New" w:cs="Courier New" w:eastAsia="Courier New" w:hAnsi="Courier New"/>
+          <w:sz w:val="20"/>
+          <w:szCs w:val="20"/>
+        </w:rPr>
+        <w:t xml:space="preserve">                       γ × novelty_to_set(μ_acc, {m.embedding | m ∈ active_memories})</w:t>
       </w:r>
     </w:p>
     <w:p>
@@ -6002,7 +7179,72 @@
           <w:sz w:val="20"/>
           <w:szCs w:val="20"/>
         </w:rPr>
-        <w:t xml:space="preserve">    total_cost ← maintenance_cost_per_memory × |active_memories| + complexity_penalty</w:t>
+        <w:t xml:space="preserve">    k ← |active_memories|</w:t>
+      </w:r>
+    </w:p>
+    <w:p>
+      <w:pPr>
+        <w:pStyle w:val="Equation"/>
+      </w:pPr>
+      <w:r>
+        <w:rPr>
+          <w:rFonts w:ascii="Courier New" w:cs="Courier New" w:eastAsia="Courier New" w:hAnsi="Courier New"/>
+          <w:sz w:val="20"/>
+          <w:szCs w:val="20"/>
+        </w:rPr>
+        <w:t xml:space="preserve">    C ← max(base_capacity, 1)</w:t>
+      </w:r>
+    </w:p>
+    <w:p>
+      <w:pPr>
+        <w:pStyle w:val="Equation"/>
+      </w:pPr>
+      <w:r>
+        <w:rPr>
+          <w:rFonts w:ascii="Courier New" w:cs="Courier New" w:eastAsia="Courier New" w:hAnsi="Courier New"/>
+          <w:sz w:val="20"/>
+          <w:szCs w:val="20"/>
+        </w:rPr>
+        <w:t xml:space="preserve">    p_cap ← 3</w:t>
+      </w:r>
+    </w:p>
+    <w:p>
+      <w:pPr>
+        <w:pStyle w:val="Equation"/>
+      </w:pPr>
+      <w:r>
+        <w:rPr>
+          <w:rFonts w:ascii="Courier New" w:cs="Courier New" w:eastAsia="Courier New" w:hAnsi="Courier New"/>
+          <w:sz w:val="20"/>
+          <w:szCs w:val="20"/>
+        </w:rPr>
+        <w:t xml:space="preserve">    capacity_pressure(k, C) ← 1 + max(0, (k − C) / C)^p_cap</w:t>
+      </w:r>
+    </w:p>
+    <w:p>
+      <w:pPr>
+        <w:pStyle w:val="Equation"/>
+      </w:pPr>
+      <w:r>
+        <w:rPr>
+          <w:rFonts w:ascii="Courier New" w:cs="Courier New" w:eastAsia="Courier New" w:hAnsi="Courier New"/>
+          <w:sz w:val="20"/>
+          <w:szCs w:val="20"/>
+        </w:rPr>
+        <w:t xml:space="preserve">    base_cost ← maintenance_cost_per_memory × k + complexity_penalty</w:t>
+      </w:r>
+    </w:p>
+    <w:p>
+      <w:pPr>
+        <w:pStyle w:val="Equation"/>
+      </w:pPr>
+      <w:r>
+        <w:rPr>
+          <w:rFonts w:ascii="Courier New" w:cs="Courier New" w:eastAsia="Courier New" w:hAnsi="Courier New"/>
+          <w:sz w:val="20"/>
+          <w:szCs w:val="20"/>
+        </w:rPr>
+        <w:t xml:space="preserve">    total_cost ← base_cost × capacity_pressure(k, C)</w:t>
       </w:r>
     </w:p>
     <w:p>
@@ -6020,7 +7262,7 @@
     </w:p>
     <w:p>
       <w:r>
-        <w:t xml:space="preserve">Note that total_cost is computed from existing active memories only, not the prospective new memory. This avoids a bootstrap problem where empty working memory would require unreasonably high benefit scores to accept the first item.</w:t>
+        <w:t xml:space="preserve">Note that total_cost is computed from existing active memories only (k is the current count), so k=0 yields no bootstrap penalty. Capacity pressure activates only when k &gt; C.</w:t>
       </w:r>
     </w:p>
     <w:p>
@@ -6829,7 +8071,7 @@
           <w:sz w:val="20"/>
           <w:szCs w:val="20"/>
         </w:rPr>
-        <w:t xml:space="preserve">                      (m_rate &lt; rate_target_t / 2) OR</w:t>
+        <w:t xml:space="preserve">                      (m_rate &lt; rate_target / 2) OR</w:t>
       </w:r>
     </w:p>
     <w:p>
@@ -6913,6 +8155,11 @@
           <w:szCs w:val="20"/>
         </w:rPr>
         <w:t xml:space="preserve">idle_for_s = now_s() − to_s(last_retrieval_ts)</w:t>
+      </w:r>
+    </w:p>
+    <w:p>
+      <w:r>
+        <w:t xml:space="preserve">Normative rule (MUST): on any retrieval attempt (including interrupt injection), set last_retrieval_ts ← now_ms().</w:t>
       </w:r>
     </w:p>
     <w:p>
@@ -7302,6 +8549,11 @@
       </w:r>
     </w:p>
     <w:p>
+      <w:r>
+        <w:t xml:space="preserve">Edge weight convention (MUST): all association weights are normalized to [0, 1]. For cosine-based edges, store weight01 = clamp((cos_sim + 1) / 2, 0, 1).</w:t>
+      </w:r>
+    </w:p>
+    <w:p>
       <w:pPr>
         <w:pStyle w:val="ListParagraph"/>
         <w:numPr>
@@ -7417,6 +8669,44 @@
     </w:p>
     <w:p>
       <w:pPr>
+        <w:pStyle w:val="ListParagraph"/>
+        <w:numPr>
+          <w:ilvl w:val="0"/>
+          <w:numId w:val="2"/>
+        </w:numPr>
+      </w:pPr>
+      <w:r>
+        <w:rPr>
+          <w:b/>
+          <w:bCs/>
+        </w:rPr>
+        <w:t xml:space="preserve">similar_to: </w:t>
+      </w:r>
+      <w:r>
+        <w:t xml:space="preserve">High cosine similarity (soft equivalence)</w:t>
+      </w:r>
+    </w:p>
+    <w:p>
+      <w:pPr>
+        <w:pStyle w:val="ListParagraph"/>
+        <w:numPr>
+          <w:ilvl w:val="0"/>
+          <w:numId w:val="2"/>
+        </w:numPr>
+      </w:pPr>
+      <w:r>
+        <w:rPr>
+          <w:b/>
+          <w:bCs/>
+        </w:rPr>
+        <w:t xml:space="preserve">has_label: </w:t>
+      </w:r>
+      <w:r>
+        <w:t xml:space="preserve">Attaches an extracted label/tag to a node</w:t>
+      </w:r>
+    </w:p>
+    <w:p>
+      <w:pPr>
         <w:pStyle w:val="Heading3"/>
       </w:pPr>
       <w:r>
@@ -7477,7 +8767,20 @@
           <w:sz w:val="20"/>
           <w:szCs w:val="20"/>
         </w:rPr>
-        <w:t xml:space="preserve">        create_edge(m_i, m_j, 'co_occurs', cos_sim)</w:t>
+        <w:t xml:space="preserve">        weight01 ← clamp((cos_sim + 1) / 2, 0, 1)</w:t>
+      </w:r>
+    </w:p>
+    <w:p>
+      <w:pPr>
+        <w:pStyle w:val="Equation"/>
+      </w:pPr>
+      <w:r>
+        <w:rPr>
+          <w:rFonts w:ascii="Courier New" w:cs="Courier New" w:eastAsia="Courier New" w:hAnsi="Courier New"/>
+          <w:sz w:val="20"/>
+          <w:szCs w:val="20"/>
+        </w:rPr>
+        <w:t xml:space="preserve">        create_edge(m_i, m_j, 'co_occurs', weight01)</w:t>
       </w:r>
     </w:p>
     <w:p>
@@ -7573,7 +8876,20 @@
           <w:sz w:val="20"/>
           <w:szCs w:val="20"/>
         </w:rPr>
-        <w:t xml:space="preserve">        create_edge(m_i, m_j, 'causes', drift_mag)</w:t>
+        <w:t xml:space="preserve">        weight01 ← clamp(drift_mag / 2, 0, 1)  # drift_mag ∈ [0,2] when embeddings are L2-normalized</w:t>
+      </w:r>
+    </w:p>
+    <w:p>
+      <w:pPr>
+        <w:pStyle w:val="Equation"/>
+      </w:pPr>
+      <w:r>
+        <w:rPr>
+          <w:rFonts w:ascii="Courier New" w:cs="Courier New" w:eastAsia="Courier New" w:hAnsi="Courier New"/>
+          <w:sz w:val="20"/>
+          <w:szCs w:val="20"/>
+        </w:rPr>
+        <w:t xml:space="preserve">        create_edge(m_i, m_j, 'causes', weight01)</w:t>
       </w:r>
     </w:p>
     <w:p>
@@ -7622,7 +8938,7 @@
           <w:sz w:val="20"/>
           <w:szCs w:val="20"/>
         </w:rPr>
-        <w:t xml:space="preserve">results_vec ← topK(vector_search(q, k=kNN_size))</w:t>
+        <w:t xml:space="preserve">results_vec ← topK(vector_search(q, k=kNN_size(F)))</w:t>
       </w:r>
     </w:p>
     <w:p>
@@ -7648,7 +8964,7 @@
           <w:sz w:val="20"/>
           <w:szCs w:val="20"/>
         </w:rPr>
-        <w:t xml:space="preserve">expanded_nodes ← graph.traverse(seed_nodes, depth=graph_depth)</w:t>
+        <w:t xml:space="preserve">expanded_nodes ← graph.traverse(seed_nodes, depth=graph_depth(T), min_edge_weight=min_edge_weight(F))</w:t>
       </w:r>
     </w:p>
     <w:p>
@@ -7758,16 +9074,112 @@
       </w:r>
     </w:p>
     <w:p>
-      <w:pPr>
-        <w:pStyle w:val="Equation"/>
-      </w:pPr>
-      <w:r>
-        <w:rPr>
-          <w:rFonts w:ascii="Courier New" w:cs="Courier New" w:eastAsia="Courier New" w:hAnsi="Courier New"/>
-          <w:sz w:val="20"/>
-          <w:szCs w:val="20"/>
-        </w:rPr>
-        <w:t xml:space="preserve">Δ = cumulative_drift_since_last_interrupt</w:t>
+      <w:r>
+        <w:t xml:space="preserve">Interrupt state (per stream):</w:t>
+      </w:r>
+    </w:p>
+    <w:p>
+      <w:pPr>
+        <w:pStyle w:val="Equation"/>
+      </w:pPr>
+      <w:r>
+        <w:rPr>
+          <w:rFonts w:ascii="Courier New" w:cs="Courier New" w:eastAsia="Courier New" w:hAnsi="Courier New"/>
+          <w:sz w:val="20"/>
+          <w:szCs w:val="20"/>
+        </w:rPr>
+        <w:t xml:space="preserve">prev_x is unset on the first signal of a stream; set prev_x ← x_t after processing each signal</w:t>
+      </w:r>
+    </w:p>
+    <w:p>
+      <w:pPr>
+        <w:pStyle w:val="Equation"/>
+      </w:pPr>
+      <w:r>
+        <w:rPr>
+          <w:rFonts w:ascii="Courier New" w:cs="Courier New" w:eastAsia="Courier New" w:hAnsi="Courier New"/>
+          <w:sz w:val="20"/>
+          <w:szCs w:val="20"/>
+        </w:rPr>
+        <w:t xml:space="preserve">first_step ← (prev_x is unset for this stream)</w:t>
+      </w:r>
+    </w:p>
+    <w:p>
+      <w:pPr>
+        <w:pStyle w:val="Equation"/>
+      </w:pPr>
+      <w:r>
+        <w:rPr>
+          <w:rFonts w:ascii="Courier New" w:cs="Courier New" w:eastAsia="Courier New" w:hAnsi="Courier New"/>
+          <w:sz w:val="20"/>
+          <w:szCs w:val="20"/>
+        </w:rPr>
+        <w:t xml:space="preserve">if first_step:</w:t>
+      </w:r>
+    </w:p>
+    <w:p>
+      <w:pPr>
+        <w:pStyle w:val="Equation"/>
+      </w:pPr>
+      <w:r>
+        <w:rPr>
+          <w:rFonts w:ascii="Courier New" w:cs="Courier New" w:eastAsia="Courier New" w:hAnsi="Courier New"/>
+          <w:sz w:val="20"/>
+          <w:szCs w:val="20"/>
+        </w:rPr>
+        <w:t xml:space="preserve">    # cold start: do not update drift_accum</w:t>
+      </w:r>
+    </w:p>
+    <w:p>
+      <w:pPr>
+        <w:pStyle w:val="Equation"/>
+      </w:pPr>
+      <w:r>
+        <w:rPr>
+          <w:rFonts w:ascii="Courier New" w:cs="Courier New" w:eastAsia="Courier New" w:hAnsi="Courier New"/>
+          <w:sz w:val="20"/>
+          <w:szCs w:val="20"/>
+        </w:rPr>
+        <w:t xml:space="preserve">    drift_accum ← drift_accum</w:t>
+      </w:r>
+    </w:p>
+    <w:p>
+      <w:pPr>
+        <w:pStyle w:val="Equation"/>
+      </w:pPr>
+      <w:r>
+        <w:rPr>
+          <w:rFonts w:ascii="Courier New" w:cs="Courier New" w:eastAsia="Courier New" w:hAnsi="Courier New"/>
+          <w:sz w:val="20"/>
+          <w:szCs w:val="20"/>
+        </w:rPr>
+        <w:t xml:space="preserve">else:</w:t>
+      </w:r>
+    </w:p>
+    <w:p>
+      <w:pPr>
+        <w:pStyle w:val="Equation"/>
+      </w:pPr>
+      <w:r>
+        <w:rPr>
+          <w:rFonts w:ascii="Courier New" w:cs="Courier New" w:eastAsia="Courier New" w:hAnsi="Courier New"/>
+          <w:sz w:val="20"/>
+          <w:szCs w:val="20"/>
+        </w:rPr>
+        <w:t xml:space="preserve">    drift_accum ← drift_accum + cosine_dist(x_t, prev_x)  # cumulative drift</w:t>
+      </w:r>
+    </w:p>
+    <w:p>
+      <w:pPr>
+        <w:pStyle w:val="Equation"/>
+      </w:pPr>
+      <w:r>
+        <w:rPr>
+          <w:rFonts w:ascii="Courier New" w:cs="Courier New" w:eastAsia="Courier New" w:hAnsi="Courier New"/>
+          <w:sz w:val="20"/>
+          <w:szCs w:val="20"/>
+        </w:rPr>
+        <w:t xml:space="preserve">Δ ← drift_accum − drift_at_last_interrupt  # cumulative drift since last interrupt</w:t>
       </w:r>
     </w:p>
     <w:p>
@@ -7811,6 +9223,11 @@
     </w:p>
     <w:p>
       <w:r>
+        <w:t xml:space="preserve">On interrupt: set drift_at_last_interrupt ← drift_accum (resetting Δ to 0 for subsequent signals).</w:t>
+      </w:r>
+    </w:p>
+    <w:p>
+      <w:r>
         <w:t xml:space="preserve">Effective thresholds incorporate refractory pressure:</w:t>
       </w:r>
     </w:p>
@@ -7876,20 +9293,77 @@
           <w:sz w:val="20"/>
           <w:szCs w:val="20"/>
         </w:rPr>
-        <w:t xml:space="preserve">ctx_window ← recent_memory_centroids  # deque of μ_acc values</w:t>
-      </w:r>
-    </w:p>
-    <w:p>
-      <w:pPr>
-        <w:pStyle w:val="Equation"/>
-      </w:pPr>
-      <w:r>
-        <w:rPr>
-          <w:rFonts w:ascii="Courier New" w:cs="Courier New" w:eastAsia="Courier New" w:hAnsi="Courier New"/>
-          <w:sz w:val="20"/>
-          <w:szCs w:val="20"/>
-        </w:rPr>
-        <w:t xml:space="preserve">ctx_centroid ← mean(ctx_window)  # centroid of recent memory centroids</w:t>
+        <w:t xml:space="preserve">ctx_window ← recent_memory_centroids  # bounded deque of recent memory representatives (e_rep)</w:t>
+      </w:r>
+    </w:p>
+    <w:p>
+      <w:pPr>
+        <w:pStyle w:val="Equation"/>
+      </w:pPr>
+      <w:r>
+        <w:rPr>
+          <w:rFonts w:ascii="Courier New" w:cs="Courier New" w:eastAsia="Courier New" w:hAnsi="Courier New"/>
+          <w:sz w:val="20"/>
+          <w:szCs w:val="20"/>
+        </w:rPr>
+        <w:t xml:space="preserve">included_set ← {embedding(m) | m already injected into the current context window}</w:t>
+      </w:r>
+    </w:p>
+    <w:p>
+      <w:r>
+        <w:t xml:space="preserve">Fallback: if included_set is empty, treat redundancy(·, included_set) = 0 and overlap_star = −1.</w:t>
+      </w:r>
+    </w:p>
+    <w:p>
+      <w:pPr>
+        <w:pStyle w:val="Equation"/>
+      </w:pPr>
+      <w:r>
+        <w:rPr>
+          <w:rFonts w:ascii="Courier New" w:cs="Courier New" w:eastAsia="Courier New" w:hAnsi="Courier New"/>
+          <w:sz w:val="20"/>
+          <w:szCs w:val="20"/>
+        </w:rPr>
+        <w:t xml:space="preserve">if |ctx_window| == 0:</w:t>
+      </w:r>
+    </w:p>
+    <w:p>
+      <w:pPr>
+        <w:pStyle w:val="Equation"/>
+      </w:pPr>
+      <w:r>
+        <w:rPr>
+          <w:rFonts w:ascii="Courier New" w:cs="Courier New" w:eastAsia="Courier New" w:hAnsi="Courier New"/>
+          <w:sz w:val="20"/>
+          <w:szCs w:val="20"/>
+        </w:rPr>
+        <w:t xml:space="preserve">    ctx_centroid ← μ_acc  # fallback: use current memory centroid</w:t>
+      </w:r>
+    </w:p>
+    <w:p>
+      <w:pPr>
+        <w:pStyle w:val="Equation"/>
+      </w:pPr>
+      <w:r>
+        <w:rPr>
+          <w:rFonts w:ascii="Courier New" w:cs="Courier New" w:eastAsia="Courier New" w:hAnsi="Courier New"/>
+          <w:sz w:val="20"/>
+          <w:szCs w:val="20"/>
+        </w:rPr>
+        <w:t xml:space="preserve">else:</w:t>
+      </w:r>
+    </w:p>
+    <w:p>
+      <w:pPr>
+        <w:pStyle w:val="Equation"/>
+      </w:pPr>
+      <w:r>
+        <w:rPr>
+          <w:rFonts w:ascii="Courier New" w:cs="Courier New" w:eastAsia="Courier New" w:hAnsi="Courier New"/>
+          <w:sz w:val="20"/>
+          <w:szCs w:val="20"/>
+        </w:rPr>
+        <w:t xml:space="preserve">    ctx_centroid ← mean(ctx_window)  # centroid of recent memory centroids</w:t>
       </w:r>
     </w:p>
     <w:p>
@@ -8135,7 +9609,163 @@
           <w:sz w:val="20"/>
           <w:szCs w:val="20"/>
         </w:rPr>
-        <w:t xml:space="preserve">embedding_novelty = 1 − max(cos(candidate, ctx_window))</w:t>
+        <w:t xml:space="preserve">at_drift_boundary = should_flush  # boundary signal from the current accumulator</w:t>
+      </w:r>
+    </w:p>
+    <w:p>
+      <w:pPr>
+        <w:pStyle w:val="Equation"/>
+      </w:pPr>
+      <w:r>
+        <w:rPr>
+          <w:rFonts w:ascii="Courier New" w:cs="Courier New" w:eastAsia="Courier New" w:hAnsi="Courier New"/>
+          <w:sz w:val="20"/>
+          <w:szCs w:val="20"/>
+        </w:rPr>
+        <w:t xml:space="preserve">candidate_star = argmax_{c ∈ candidates_eligible} mu(c)</w:t>
+      </w:r>
+    </w:p>
+    <w:p>
+      <w:pPr>
+        <w:pStyle w:val="Equation"/>
+      </w:pPr>
+      <w:r>
+        <w:rPr>
+          <w:rFonts w:ascii="Courier New" w:cs="Courier New" w:eastAsia="Courier New" w:hAnsi="Courier New"/>
+          <w:sz w:val="20"/>
+          <w:szCs w:val="20"/>
+        </w:rPr>
+        <w:t xml:space="preserve">mu_star = mu(candidate_star)</w:t>
+      </w:r>
+    </w:p>
+    <w:p>
+      <w:pPr>
+        <w:pStyle w:val="Equation"/>
+      </w:pPr>
+      <w:r>
+        <w:rPr>
+          <w:rFonts w:ascii="Courier New" w:cs="Courier New" w:eastAsia="Courier New" w:hAnsi="Courier New"/>
+          <w:sz w:val="20"/>
+          <w:szCs w:val="20"/>
+        </w:rPr>
+        <w:t xml:space="preserve">rel_star = cos(candidate_star, ctx_centroid)</w:t>
+      </w:r>
+    </w:p>
+    <w:p>
+      <w:pPr>
+        <w:pStyle w:val="Equation"/>
+      </w:pPr>
+      <w:r>
+        <w:rPr>
+          <w:rFonts w:ascii="Courier New" w:cs="Courier New" w:eastAsia="Courier New" w:hAnsi="Courier New"/>
+          <w:sz w:val="20"/>
+          <w:szCs w:val="20"/>
+        </w:rPr>
+        <w:t xml:space="preserve">if |included_set| == 0:</w:t>
+      </w:r>
+    </w:p>
+    <w:p>
+      <w:pPr>
+        <w:pStyle w:val="Equation"/>
+      </w:pPr>
+      <w:r>
+        <w:rPr>
+          <w:rFonts w:ascii="Courier New" w:cs="Courier New" w:eastAsia="Courier New" w:hAnsi="Courier New"/>
+          <w:sz w:val="20"/>
+          <w:szCs w:val="20"/>
+        </w:rPr>
+        <w:t xml:space="preserve">    overlap_star = −1.0</w:t>
+      </w:r>
+    </w:p>
+    <w:p>
+      <w:pPr>
+        <w:pStyle w:val="Equation"/>
+      </w:pPr>
+      <w:r>
+        <w:rPr>
+          <w:rFonts w:ascii="Courier New" w:cs="Courier New" w:eastAsia="Courier New" w:hAnsi="Courier New"/>
+          <w:sz w:val="20"/>
+          <w:szCs w:val="20"/>
+        </w:rPr>
+        <w:t xml:space="preserve">else:</w:t>
+      </w:r>
+    </w:p>
+    <w:p>
+      <w:pPr>
+        <w:pStyle w:val="Equation"/>
+      </w:pPr>
+      <w:r>
+        <w:rPr>
+          <w:rFonts w:ascii="Courier New" w:cs="Courier New" w:eastAsia="Courier New" w:hAnsi="Courier New"/>
+          <w:sz w:val="20"/>
+          <w:szCs w:val="20"/>
+        </w:rPr>
+        <w:t xml:space="preserve">    overlap_star = max_{y ∈ included_set} cos(candidate_star, y)</w:t>
+      </w:r>
+    </w:p>
+    <w:p>
+      <w:pPr>
+        <w:pStyle w:val="Equation"/>
+      </w:pPr>
+      <w:r>
+        <w:rPr>
+          <w:rFonts w:ascii="Courier New" w:cs="Courier New" w:eastAsia="Courier New" w:hAnsi="Courier New"/>
+          <w:sz w:val="20"/>
+          <w:szCs w:val="20"/>
+        </w:rPr>
+        <w:t xml:space="preserve">if |ctx_window| == 0:</w:t>
+      </w:r>
+    </w:p>
+    <w:p>
+      <w:pPr>
+        <w:pStyle w:val="Equation"/>
+      </w:pPr>
+      <w:r>
+        <w:rPr>
+          <w:rFonts w:ascii="Courier New" w:cs="Courier New" w:eastAsia="Courier New" w:hAnsi="Courier New"/>
+          <w:sz w:val="20"/>
+          <w:szCs w:val="20"/>
+        </w:rPr>
+        <w:t xml:space="preserve">    novelty_star = 1.0</w:t>
+      </w:r>
+    </w:p>
+    <w:p>
+      <w:pPr>
+        <w:pStyle w:val="Equation"/>
+      </w:pPr>
+      <w:r>
+        <w:rPr>
+          <w:rFonts w:ascii="Courier New" w:cs="Courier New" w:eastAsia="Courier New" w:hAnsi="Courier New"/>
+          <w:sz w:val="20"/>
+          <w:szCs w:val="20"/>
+        </w:rPr>
+        <w:t xml:space="preserve">else:</w:t>
+      </w:r>
+    </w:p>
+    <w:p>
+      <w:pPr>
+        <w:pStyle w:val="Equation"/>
+      </w:pPr>
+      <w:r>
+        <w:rPr>
+          <w:rFonts w:ascii="Courier New" w:cs="Courier New" w:eastAsia="Courier New" w:hAnsi="Courier New"/>
+          <w:sz w:val="20"/>
+          <w:szCs w:val="20"/>
+        </w:rPr>
+        <w:t xml:space="preserve">    max_cos = max_{c ∈ ctx_window} cos(candidate_star, c)  # in [−1, 1]</w:t>
+      </w:r>
+    </w:p>
+    <w:p>
+      <w:pPr>
+        <w:pStyle w:val="Equation"/>
+      </w:pPr>
+      <w:r>
+        <w:rPr>
+          <w:rFonts w:ascii="Courier New" w:cs="Courier New" w:eastAsia="Courier New" w:hAnsi="Courier New"/>
+          <w:sz w:val="20"/>
+          <w:szCs w:val="20"/>
+        </w:rPr>
+        <w:t xml:space="preserve">    novelty_star = clamp((1 − max_cos) / 2, 0, 1)</w:t>
       </w:r>
     </w:p>
     <w:p>
@@ -8161,46 +9791,46 @@
           <w:sz w:val="20"/>
           <w:szCs w:val="20"/>
         </w:rPr>
-        <w:t xml:space="preserve">    (max_relevance ≥ retrieval_thresh(F)) AND</w:t>
-      </w:r>
-    </w:p>
-    <w:p>
-      <w:pPr>
-        <w:pStyle w:val="Equation"/>
-      </w:pPr>
-      <w:r>
-        <w:rPr>
-          <w:rFonts w:ascii="Courier New" w:cs="Courier New" w:eastAsia="Courier New" w:hAnsi="Courier New"/>
-          <w:sz w:val="20"/>
-          <w:szCs w:val="20"/>
-        </w:rPr>
-        <w:t xml:space="preserve">    (embedding_novelty ≥ τ_novelty_eff OR best_mu ≥ τ_mu_eff) AND</w:t>
-      </w:r>
-    </w:p>
-    <w:p>
-      <w:pPr>
-        <w:pStyle w:val="Equation"/>
-      </w:pPr>
-      <w:r>
-        <w:rPr>
-          <w:rFonts w:ascii="Courier New" w:cs="Courier New" w:eastAsia="Courier New" w:hAnsi="Courier New"/>
-          <w:sz w:val="20"/>
-          <w:szCs w:val="20"/>
-        </w:rPr>
-        <w:t xml:space="preserve">    (max_semantic_overlap &lt; dup_thresh) AND</w:t>
-      </w:r>
-    </w:p>
-    <w:p>
-      <w:pPr>
-        <w:pStyle w:val="Equation"/>
-      </w:pPr>
-      <w:r>
-        <w:rPr>
-          <w:rFonts w:ascii="Courier New" w:cs="Courier New" w:eastAsia="Courier New" w:hAnsi="Courier New"/>
-          <w:sz w:val="20"/>
-          <w:szCs w:val="20"/>
-        </w:rPr>
-        <w:t xml:space="preserve">    (at_drift_boundary OR best_mu ≥ boundary_mult × τ_mu_eff)</w:t>
+        <w:t xml:space="preserve">    (rel_star ≥ retrieval_thresh(F)) AND</w:t>
+      </w:r>
+    </w:p>
+    <w:p>
+      <w:pPr>
+        <w:pStyle w:val="Equation"/>
+      </w:pPr>
+      <w:r>
+        <w:rPr>
+          <w:rFonts w:ascii="Courier New" w:cs="Courier New" w:eastAsia="Courier New" w:hAnsi="Courier New"/>
+          <w:sz w:val="20"/>
+          <w:szCs w:val="20"/>
+        </w:rPr>
+        <w:t xml:space="preserve">    (novelty_star ≥ τ_novelty_eff OR mu_star ≥ τ_mu_eff) AND</w:t>
+      </w:r>
+    </w:p>
+    <w:p>
+      <w:pPr>
+        <w:pStyle w:val="Equation"/>
+      </w:pPr>
+      <w:r>
+        <w:rPr>
+          <w:rFonts w:ascii="Courier New" w:cs="Courier New" w:eastAsia="Courier New" w:hAnsi="Courier New"/>
+          <w:sz w:val="20"/>
+          <w:szCs w:val="20"/>
+        </w:rPr>
+        <w:t xml:space="preserve">    (overlap_star &lt; dup_thresh) AND</w:t>
+      </w:r>
+    </w:p>
+    <w:p>
+      <w:pPr>
+        <w:pStyle w:val="Equation"/>
+      </w:pPr>
+      <w:r>
+        <w:rPr>
+          <w:rFonts w:ascii="Courier New" w:cs="Courier New" w:eastAsia="Courier New" w:hAnsi="Courier New"/>
+          <w:sz w:val="20"/>
+          <w:szCs w:val="20"/>
+        </w:rPr>
+        <w:t xml:space="preserve">    (at_drift_boundary OR mu_star ≥ boundary_mult × τ_mu_eff)</w:t>
       </w:r>
     </w:p>
     <w:p>
@@ -8249,7 +9879,33 @@
           <w:sz w:val="20"/>
           <w:szCs w:val="20"/>
         </w:rPr>
-        <w:t xml:space="preserve">drift_acc += cosine_dist(x_t, x_{last_check})</w:t>
+        <w:t xml:space="preserve">first_step ← (x_last_check is unset for this stream)  # MUST occur once per stream</w:t>
+      </w:r>
+    </w:p>
+    <w:p>
+      <w:pPr>
+        <w:pStyle w:val="Equation"/>
+      </w:pPr>
+      <w:r>
+        <w:rPr>
+          <w:rFonts w:ascii="Courier New" w:cs="Courier New" w:eastAsia="Courier New" w:hAnsi="Courier New"/>
+          <w:sz w:val="20"/>
+          <w:szCs w:val="20"/>
+        </w:rPr>
+        <w:t xml:space="preserve">if first_step: x_last_check ← x_t; drift_acc_pacing ← 0</w:t>
+      </w:r>
+    </w:p>
+    <w:p>
+      <w:pPr>
+        <w:pStyle w:val="Equation"/>
+      </w:pPr>
+      <w:r>
+        <w:rPr>
+          <w:rFonts w:ascii="Courier New" w:cs="Courier New" w:eastAsia="Courier New" w:hAnsi="Courier New"/>
+          <w:sz w:val="20"/>
+          <w:szCs w:val="20"/>
+        </w:rPr>
+        <w:t xml:space="preserve">drift_acc_pacing += cosine_dist(x_t, x_last_check)</w:t>
       </w:r>
     </w:p>
     <w:p>
@@ -8288,20 +9944,20 @@
           <w:sz w:val="20"/>
           <w:szCs w:val="20"/>
         </w:rPr>
-        <w:t xml:space="preserve">if drift_acc &gt; pacing_thresh(S) OR should_flush:</w:t>
-      </w:r>
-    </w:p>
-    <w:p>
-      <w:pPr>
-        <w:pStyle w:val="Equation"/>
-      </w:pPr>
-      <w:r>
-        <w:rPr>
-          <w:rFonts w:ascii="Courier New" w:cs="Courier New" w:eastAsia="Courier New" w:hAnsi="Courier New"/>
-          <w:sz w:val="20"/>
-          <w:szCs w:val="20"/>
-        </w:rPr>
-        <w:t xml:space="preserve">    trigger_check()</w:t>
+        <w:t xml:space="preserve">if drift_acc_pacing &gt; pacing_thresh(S) OR should_flush:</w:t>
+      </w:r>
+    </w:p>
+    <w:p>
+      <w:pPr>
+        <w:pStyle w:val="Equation"/>
+      </w:pPr>
+      <w:r>
+        <w:rPr>
+          <w:rFonts w:ascii="Courier New" w:cs="Courier New" w:eastAsia="Courier New" w:hAnsi="Courier New"/>
+          <w:sz w:val="20"/>
+          <w:szCs w:val="20"/>
+        </w:rPr>
+        <w:t xml:space="preserve">    trigger_check(); x_last_check ← x_t; drift_acc_pacing ← 0</w:t>
       </w:r>
     </w:p>
     <w:p>
@@ -8327,19 +9983,6 @@
           <w:sz w:val="20"/>
           <w:szCs w:val="20"/>
         </w:rPr>
-        <w:t xml:space="preserve">max_results(F) = round(lerp(64, 4, F))</w:t>
-      </w:r>
-    </w:p>
-    <w:p>
-      <w:pPr>
-        <w:pStyle w:val="Equation"/>
-      </w:pPr>
-      <w:r>
-        <w:rPr>
-          <w:rFonts w:ascii="Courier New" w:cs="Courier New" w:eastAsia="Courier New" w:hAnsi="Courier New"/>
-          <w:sz w:val="20"/>
-          <w:szCs w:val="20"/>
-        </w:rPr>
         <w:t xml:space="preserve">adjacent_window(F) = round(lerp(8, 1, F))</w:t>
       </w:r>
     </w:p>
@@ -8376,7 +10019,7 @@
     </w:p>
     <w:p>
       <w:r>
-        <w:t xml:space="preserve">The dynamic threshold (θ_dynamic) successfully tracked score distributions. In high-volatility inputs (drift_accum &gt; 1.0), thresholds relaxed to ~0.15, while stable contexts tightened to ~0.27.</w:t>
+        <w:t xml:space="preserve">The dynamic threshold (θ_dynamic) successfully tracked score distributions. In high-volatility inputs (within-accumulator drift_acc &gt; 1.0), thresholds relaxed to ~0.15, while stable contexts tightened to ~0.27.</w:t>
       </w:r>
     </w:p>
     <w:p>
@@ -8403,6 +10046,938 @@
     <w:p>
       <w:r>
         <w:t xml:space="preserve">End-to-end processing per token averaged &lt; 50ms. Graph expansion added &lt; 10ms overhead due to efficient kNN (k=32) and limited expansion depth (d=2).</w:t>
+      </w:r>
+    </w:p>
+    <w:p>
+      <w:r>
+        <w:br w:type="page"/>
+      </w:r>
+    </w:p>
+    <w:p>
+      <w:pPr>
+        <w:pStyle w:val="Heading1"/>
+      </w:pPr>
+      <w:r>
+        <w:t xml:space="preserve">Appendix A. State Variables Map</w:t>
+      </w:r>
+    </w:p>
+    <w:p>
+      <w:r>
+        <w:t xml:space="preserve">This appendix enumerates the state variables used by the specification and separates retained state (carried across timesteps) from per-step derived quantities.</w:t>
+      </w:r>
+    </w:p>
+    <w:p>
+      <w:pPr>
+        <w:pStyle w:val="ListParagraph"/>
+        <w:numPr>
+          <w:ilvl w:val="0"/>
+          <w:numId w:val="2"/>
+        </w:numPr>
+      </w:pPr>
+      <w:r>
+        <w:rPr>
+          <w:b/>
+          <w:bCs/>
+        </w:rPr>
+        <w:t xml:space="preserve">Accumulator state (per stream; retained across timesteps): </w:t>
+      </w:r>
+    </w:p>
+    <w:p>
+      <w:pPr>
+        <w:pStyle w:val="ListParagraph"/>
+        <w:numPr>
+          <w:ilvl w:val="1"/>
+          <w:numId w:val="2"/>
+        </w:numPr>
+      </w:pPr>
+      <w:r>
+        <w:rPr>
+          <w:rFonts w:ascii="Courier New" w:cs="Courier New" w:eastAsia="Courier New" w:hAnsi="Courier New"/>
+          <w:sz w:val="20"/>
+          <w:szCs w:val="20"/>
+        </w:rPr>
+        <w:t xml:space="preserve">{μ_acc, drift_acc, s_sum, s_max, n, e_peak, emo_max, arousal_sum, eta_acc, coherence_prev, acc_signals_window, t_start, last_signal_ts, last_write_ts, drift_accum, drift_at_last_interrupt, drift_acc_pacing, x_last_check, prev_x}</w:t>
+      </w:r>
+    </w:p>
+    <w:p>
+      <w:pPr>
+        <w:pStyle w:val="ListParagraph"/>
+        <w:numPr>
+          <w:ilvl w:val="0"/>
+          <w:numId w:val="2"/>
+        </w:numPr>
+      </w:pPr>
+      <w:r>
+        <w:rPr>
+          <w:b/>
+          <w:bCs/>
+        </w:rPr>
+        <w:t xml:space="preserve">Global state (retained across timesteps): </w:t>
+      </w:r>
+    </w:p>
+    <w:p>
+      <w:pPr>
+        <w:pStyle w:val="ListParagraph"/>
+        <w:numPr>
+          <w:ilvl w:val="1"/>
+          <w:numId w:val="2"/>
+        </w:numPr>
+      </w:pPr>
+      <w:r>
+        <w:rPr>
+          <w:rFonts w:ascii="Courier New" w:cs="Courier New" w:eastAsia="Courier New" w:hAnsi="Courier New"/>
+          <w:sz w:val="20"/>
+          <w:szCs w:val="20"/>
+        </w:rPr>
+        <w:t xml:space="preserve">{u_uncertainty, mood_vector, last_mood_ts, theta_dynamic, theta_target, hysteresis, m_rate, dt_ema, rate_ticks, last_rate_timestamp, reliability, last_retrieval_ts}</w:t>
+      </w:r>
+    </w:p>
+    <w:p>
+      <w:pPr>
+        <w:pStyle w:val="ListParagraph"/>
+        <w:numPr>
+          <w:ilvl w:val="0"/>
+          <w:numId w:val="2"/>
+        </w:numPr>
+      </w:pPr>
+      <w:r>
+        <w:rPr>
+          <w:b/>
+          <w:bCs/>
+        </w:rPr>
+        <w:t xml:space="preserve">Buffers (retained across timesteps; bounded by window rules): </w:t>
+      </w:r>
+    </w:p>
+    <w:p>
+      <w:pPr>
+        <w:pStyle w:val="ListParagraph"/>
+        <w:numPr>
+          <w:ilvl w:val="1"/>
+          <w:numId w:val="2"/>
+        </w:numPr>
+      </w:pPr>
+      <w:r>
+        <w:rPr>
+          <w:rFonts w:ascii="Courier New" w:cs="Courier New" w:eastAsia="Courier New" w:hAnsi="Courier New"/>
+          <w:sz w:val="20"/>
+          <w:szCs w:val="20"/>
+        </w:rPr>
+        <w:t xml:space="preserve">{signal_stream, score_stream, memory_stream, recent_memory_centroids}</w:t>
+      </w:r>
+    </w:p>
+    <w:p>
+      <w:pPr>
+        <w:pStyle w:val="ListParagraph"/>
+        <w:numPr>
+          <w:ilvl w:val="0"/>
+          <w:numId w:val="2"/>
+        </w:numPr>
+      </w:pPr>
+      <w:r>
+        <w:rPr>
+          <w:b/>
+          <w:bCs/>
+        </w:rPr>
+        <w:t xml:space="preserve">Recorded signal fields (per signal): </w:t>
+      </w:r>
+    </w:p>
+    <w:p>
+      <w:pPr>
+        <w:pStyle w:val="ListParagraph"/>
+        <w:numPr>
+          <w:ilvl w:val="1"/>
+          <w:numId w:val="2"/>
+        </w:numPr>
+      </w:pPr>
+      <w:r>
+        <w:rPr>
+          <w:rFonts w:ascii="Courier New" w:cs="Courier New" w:eastAsia="Courier New" w:hAnsi="Courier New"/>
+          <w:sz w:val="20"/>
+          <w:szCs w:val="20"/>
+        </w:rPr>
+        <w:t xml:space="preserve">{coherence_struct_t → SIGNALS.coherence, focus_spread_t → SIGNALS.focus_spread}</w:t>
+      </w:r>
+    </w:p>
+    <w:p>
+      <w:pPr>
+        <w:pStyle w:val="ListParagraph"/>
+        <w:numPr>
+          <w:ilvl w:val="0"/>
+          <w:numId w:val="2"/>
+        </w:numPr>
+      </w:pPr>
+      <w:r>
+        <w:rPr>
+          <w:b/>
+          <w:bCs/>
+        </w:rPr>
+        <w:t xml:space="preserve">Recorded global fields: </w:t>
+      </w:r>
+    </w:p>
+    <w:p>
+      <w:pPr>
+        <w:pStyle w:val="ListParagraph"/>
+        <w:numPr>
+          <w:ilvl w:val="1"/>
+          <w:numId w:val="2"/>
+        </w:numPr>
+      </w:pPr>
+      <w:r>
+        <w:rPr>
+          <w:rFonts w:ascii="Courier New" w:cs="Courier New" w:eastAsia="Courier New" w:hAnsi="Courier New"/>
+          <w:sz w:val="20"/>
+          <w:szCs w:val="20"/>
+        </w:rPr>
+        <w:t xml:space="preserve">{u(t) → STATE.u_uncertainty, M_t → STATE.mood_vector}</w:t>
+      </w:r>
+    </w:p>
+    <w:p>
+      <w:pPr>
+        <w:pStyle w:val="ListParagraph"/>
+        <w:numPr>
+          <w:ilvl w:val="0"/>
+          <w:numId w:val="2"/>
+        </w:numPr>
+      </w:pPr>
+      <w:r>
+        <w:rPr>
+          <w:b/>
+          <w:bCs/>
+        </w:rPr>
+        <w:t xml:space="preserve">Per-step derived scalars (ephemeral; recomputed each step): </w:t>
+      </w:r>
+    </w:p>
+    <w:p>
+      <w:pPr>
+        <w:pStyle w:val="ListParagraph"/>
+        <w:numPr>
+          <w:ilvl w:val="1"/>
+          <w:numId w:val="2"/>
+        </w:numPr>
+      </w:pPr>
+      <w:r>
+        <w:rPr>
+          <w:rFonts w:ascii="Courier New" w:cs="Courier New" w:eastAsia="Courier New" w:hAnsi="Courier New"/>
+          <w:sz w:val="20"/>
+          <w:szCs w:val="20"/>
+        </w:rPr>
+        <w:t xml:space="preserve">{signal_gap_s, coherence_curr, s_avg, S_window, boundary_score, should_flush, write_memory, Δwrites}</w:t>
+      </w:r>
+    </w:p>
+    <w:p>
+      <w:r>
+        <w:br w:type="page"/>
+      </w:r>
+    </w:p>
+    <w:p>
+      <w:pPr>
+        <w:pStyle w:val="Heading1"/>
+      </w:pPr>
+      <w:r>
+        <w:t xml:space="preserve">Appendix B. Derived Signals: Definitions and Bounds</w:t>
+      </w:r>
+    </w:p>
+    <w:p>
+      <w:r>
+        <w:t xml:space="preserve">This appendix defines non-trivial derived signals used throughout the specification. Unless otherwise stated, all derived scalars are clamped to [0, 1].</w:t>
+      </w:r>
+    </w:p>
+    <w:p>
+      <w:r>
+        <w:rPr>
+          <w:b/>
+          <w:bCs/>
+        </w:rPr>
+        <w:t xml:space="preserve">novelty: </w:t>
+      </w:r>
+      <w:r>
+        <w:t xml:space="preserve">A normalized dissimilarity-to-context signal.</w:t>
+      </w:r>
+    </w:p>
+    <w:p>
+      <w:pPr>
+        <w:pStyle w:val="Equation"/>
+      </w:pPr>
+      <w:r>
+        <w:rPr>
+          <w:rFonts w:ascii="Courier New" w:cs="Courier New" w:eastAsia="Courier New" w:hAnsi="Courier New"/>
+          <w:sz w:val="20"/>
+          <w:szCs w:val="20"/>
+        </w:rPr>
+        <w:t xml:space="preserve">max_cos ← max_{c ∈ recent_context} cos(x_t, c)  # in [−1, 1]</w:t>
+      </w:r>
+    </w:p>
+    <w:p>
+      <w:pPr>
+        <w:pStyle w:val="Equation"/>
+      </w:pPr>
+      <w:r>
+        <w:rPr>
+          <w:rFonts w:ascii="Courier New" w:cs="Courier New" w:eastAsia="Courier New" w:hAnsi="Courier New"/>
+          <w:sz w:val="20"/>
+          <w:szCs w:val="20"/>
+        </w:rPr>
+        <w:t xml:space="preserve">novelty_t ← clamp((1 − max_cos) / 2, 0, 1)</w:t>
+      </w:r>
+    </w:p>
+    <w:p>
+      <w:r>
+        <w:t xml:space="preserve">Fallback: if recent_context is empty, set novelty_t ← 1.</w:t>
+      </w:r>
+    </w:p>
+    <w:p>
+      <w:r>
+        <w:rPr>
+          <w:b/>
+          <w:bCs/>
+        </w:rPr>
+        <w:t xml:space="preserve">μ_sim: </w:t>
+      </w:r>
+      <w:r>
+        <w:t xml:space="preserve">A normalized mean similarity to context.</w:t>
+      </w:r>
+    </w:p>
+    <w:p>
+      <w:pPr>
+        <w:pStyle w:val="Equation"/>
+      </w:pPr>
+      <w:r>
+        <w:rPr>
+          <w:rFonts w:ascii="Courier New" w:cs="Courier New" w:eastAsia="Courier New" w:hAnsi="Courier New"/>
+          <w:sz w:val="20"/>
+          <w:szCs w:val="20"/>
+        </w:rPr>
+        <w:t xml:space="preserve">mean_cos ← mean_{c ∈ recent_context} cos(x_t, c)</w:t>
+      </w:r>
+    </w:p>
+    <w:p>
+      <w:pPr>
+        <w:pStyle w:val="Equation"/>
+      </w:pPr>
+      <w:r>
+        <w:rPr>
+          <w:rFonts w:ascii="Courier New" w:cs="Courier New" w:eastAsia="Courier New" w:hAnsi="Courier New"/>
+          <w:sz w:val="20"/>
+          <w:szCs w:val="20"/>
+        </w:rPr>
+        <w:t xml:space="preserve">μ_sim ← clamp((mean_cos + 1) / 2, 0, 1)</w:t>
+      </w:r>
+    </w:p>
+    <w:p>
+      <w:r>
+        <w:t xml:space="preserve">Fallback: if recent_context is empty, set μ_sim ← 0.5.</w:t>
+      </w:r>
+    </w:p>
+    <w:p>
+      <w:r>
+        <w:rPr>
+          <w:b/>
+          <w:bCs/>
+        </w:rPr>
+        <w:t xml:space="preserve">rarity_t: </w:t>
+      </w:r>
+      <w:r>
+        <w:t xml:space="preserve">A normalized rarity signal defined as dissimilarity-to-context mean.</w:t>
+      </w:r>
+    </w:p>
+    <w:p>
+      <w:pPr>
+        <w:pStyle w:val="Equation"/>
+      </w:pPr>
+      <w:r>
+        <w:rPr>
+          <w:rFonts w:ascii="Courier New" w:cs="Courier New" w:eastAsia="Courier New" w:hAnsi="Courier New"/>
+          <w:sz w:val="20"/>
+          <w:szCs w:val="20"/>
+        </w:rPr>
+        <w:t xml:space="preserve">rarity_t ← clamp(1 − μ_sim, 0, 1)</w:t>
+      </w:r>
+    </w:p>
+    <w:p>
+      <w:r>
+        <w:t xml:space="preserve">Fallback: inherits μ_sim fallback, so rarity_t defaults to 0.5 when recent_context is empty.</w:t>
+      </w:r>
+    </w:p>
+    <w:p>
+      <w:r>
+        <w:rPr>
+          <w:b/>
+          <w:bCs/>
+        </w:rPr>
+        <w:t xml:space="preserve">relevance_to_task(q, task_ctx): </w:t>
+      </w:r>
+      <w:r>
+        <w:t xml:space="preserve">A normalized relevance of embedding q to a task context set.</w:t>
+      </w:r>
+    </w:p>
+    <w:p>
+      <w:pPr>
+        <w:pStyle w:val="Equation"/>
+      </w:pPr>
+      <w:r>
+        <w:rPr>
+          <w:rFonts w:ascii="Courier New" w:cs="Courier New" w:eastAsia="Courier New" w:hAnsi="Courier New"/>
+          <w:sz w:val="20"/>
+          <w:szCs w:val="20"/>
+        </w:rPr>
+        <w:t xml:space="preserve">if |task_ctx| == 0: return 0.5</w:t>
+      </w:r>
+    </w:p>
+    <w:p>
+      <w:pPr>
+        <w:pStyle w:val="Equation"/>
+      </w:pPr>
+      <w:r>
+        <w:rPr>
+          <w:rFonts w:ascii="Courier New" w:cs="Courier New" w:eastAsia="Courier New" w:hAnsi="Courier New"/>
+          <w:sz w:val="20"/>
+          <w:szCs w:val="20"/>
+        </w:rPr>
+        <w:t xml:space="preserve">return clamp((cos(q, mean(task_ctx)) + 1) / 2, 0, 1)</w:t>
+      </w:r>
+    </w:p>
+    <w:p>
+      <w:r>
+        <w:rPr>
+          <w:b/>
+          <w:bCs/>
+        </w:rPr>
+        <w:t xml:space="preserve">novelty_to_set(q, S_set_embeddings): </w:t>
+      </w:r>
+      <w:r>
+        <w:t xml:space="preserve">A normalized novelty of q relative to a set of embeddings.</w:t>
+      </w:r>
+    </w:p>
+    <w:p>
+      <w:pPr>
+        <w:pStyle w:val="Equation"/>
+      </w:pPr>
+      <w:r>
+        <w:rPr>
+          <w:rFonts w:ascii="Courier New" w:cs="Courier New" w:eastAsia="Courier New" w:hAnsi="Courier New"/>
+          <w:sz w:val="20"/>
+          <w:szCs w:val="20"/>
+        </w:rPr>
+        <w:t xml:space="preserve">novelty_to_set(q, S_set_embeddings) ← 1 − redundancy(q, S_set_embeddings)</w:t>
+      </w:r>
+    </w:p>
+    <w:p>
+      <w:r>
+        <w:rPr>
+          <w:b/>
+          <w:bCs/>
+        </w:rPr>
+        <w:t xml:space="preserve">ΔSSE: </w:t>
+      </w:r>
+      <w:r>
+        <w:t xml:space="preserve">A normalized improvement in reconstruction/prediction error (utility proxy).</w:t>
+      </w:r>
+    </w:p>
+    <w:p>
+      <w:pPr>
+        <w:pStyle w:val="Equation"/>
+      </w:pPr>
+      <w:r>
+        <w:rPr>
+          <w:rFonts w:ascii="Courier New" w:cs="Courier New" w:eastAsia="Courier New" w:hAnsi="Courier New"/>
+          <w:sz w:val="20"/>
+          <w:szCs w:val="20"/>
+        </w:rPr>
+        <w:t xml:space="preserve">ΔSSE ← clamp((SSE_prev − SSE_curr) / max(SSE_prev, ε), 0, 1)</w:t>
+      </w:r>
+    </w:p>
+    <w:p>
+      <w:r>
+        <w:t xml:space="preserve">Fallback: if SSE signals are unavailable, set ΔSSE ← 0.</w:t>
+      </w:r>
+    </w:p>
+    <w:p>
+      <w:r>
+        <w:rPr>
+          <w:b/>
+          <w:bCs/>
+        </w:rPr>
+        <w:t xml:space="preserve">redundancy(a, S_set): </w:t>
+      </w:r>
+      <w:r>
+        <w:t xml:space="preserve">A normalized redundancy of item a w.r.t. a set S_set.</w:t>
+      </w:r>
+    </w:p>
+    <w:p>
+      <w:pPr>
+        <w:pStyle w:val="Equation"/>
+      </w:pPr>
+      <w:r>
+        <w:rPr>
+          <w:rFonts w:ascii="Courier New" w:cs="Courier New" w:eastAsia="Courier New" w:hAnsi="Courier New"/>
+          <w:sz w:val="20"/>
+          <w:szCs w:val="20"/>
+        </w:rPr>
+        <w:t xml:space="preserve">redundancy(a, S_set) ← max_{s ∈ S_set} clamp((cos(a, s) + 1) / 2, 0, 1)</w:t>
+      </w:r>
+    </w:p>
+    <w:p>
+      <w:r>
+        <w:t xml:space="preserve">Fallback: if S_set is empty, redundancy(a, S_set) ← 0.</w:t>
+      </w:r>
+    </w:p>
+    <w:p>
+      <w:r>
+        <w:rPr>
+          <w:b/>
+          <w:bCs/>
+        </w:rPr>
+        <w:t xml:space="preserve">coverage_gain(candidate | included_set): </w:t>
+      </w:r>
+      <w:r>
+        <w:t xml:space="preserve">Incremental coverage contribution of adding candidate.</w:t>
+      </w:r>
+    </w:p>
+    <w:p>
+      <w:pPr>
+        <w:pStyle w:val="Equation"/>
+      </w:pPr>
+      <w:r>
+        <w:rPr>
+          <w:rFonts w:ascii="Courier New" w:cs="Courier New" w:eastAsia="Courier New" w:hAnsi="Courier New"/>
+          <w:sz w:val="20"/>
+          <w:szCs w:val="20"/>
+        </w:rPr>
+        <w:t xml:space="preserve">coverage_gain(candidate | included_set) ← 1 − redundancy(candidate, included_set)</w:t>
+      </w:r>
+    </w:p>
+    <w:p>
+      <w:r>
+        <w:rPr>
+          <w:b/>
+          <w:bCs/>
+        </w:rPr>
+        <w:t xml:space="preserve">contextual_gain(m): </w:t>
+      </w:r>
+      <w:r>
+        <w:t xml:space="preserve">A normalized marginal gain attributed to using memory m in context.</w:t>
+      </w:r>
+    </w:p>
+    <w:p>
+      <w:pPr>
+        <w:pStyle w:val="Equation"/>
+      </w:pPr>
+      <w:r>
+        <w:rPr>
+          <w:rFonts w:ascii="Courier New" w:cs="Courier New" w:eastAsia="Courier New" w:hAnsi="Courier New"/>
+          <w:sz w:val="20"/>
+          <w:szCs w:val="20"/>
+        </w:rPr>
+        <w:t xml:space="preserve">contextual_gain(m) ∈ [−1, +1]  # normalized gain/loss signal</w:t>
+      </w:r>
+    </w:p>
+    <w:p>
+      <w:r>
+        <w:t xml:space="preserve">Fallback: if marginal gain cannot be estimated, contextual_gain(m) ← 0.</w:t>
+      </w:r>
+    </w:p>
+    <w:p>
+      <w:r>
+        <w:rPr>
+          <w:b/>
+          <w:bCs/>
+        </w:rPr>
+        <w:t xml:space="preserve">connectivity(m): </w:t>
+      </w:r>
+      <w:r>
+        <w:t xml:space="preserve">A normalized connectivity score (graph centrality proxy).</w:t>
+      </w:r>
+    </w:p>
+    <w:p>
+      <w:pPr>
+        <w:pStyle w:val="Equation"/>
+      </w:pPr>
+      <w:r>
+        <w:rPr>
+          <w:rFonts w:ascii="Courier New" w:cs="Courier New" w:eastAsia="Courier New" w:hAnsi="Courier New"/>
+          <w:sz w:val="20"/>
+          <w:szCs w:val="20"/>
+        </w:rPr>
+        <w:t xml:space="preserve">connectivity(m) ← clamp(degree(m) / deg_cap, 0, 1)</w:t>
+      </w:r>
+    </w:p>
+    <w:p>
+      <w:r>
+        <w:t xml:space="preserve">Fallback: if no graph structure is present, connectivity(m) ← 0.</w:t>
+      </w:r>
+    </w:p>
+    <w:p>
+      <w:r>
+        <w:rPr>
+          <w:b/>
+          <w:bCs/>
+        </w:rPr>
+        <w:t xml:space="preserve">manifold_complexity: </w:t>
+      </w:r>
+      <w:r>
+        <w:t xml:space="preserve">A local embedding-stream complexity proxy used in working-memory cost.</w:t>
+      </w:r>
+    </w:p>
+    <w:p>
+      <w:pPr>
+        <w:pStyle w:val="Equation"/>
+      </w:pPr>
+      <w:r>
+        <w:rPr>
+          <w:rFonts w:ascii="Courier New" w:cs="Courier New" w:eastAsia="Courier New" w:hAnsi="Courier New"/>
+          <w:sz w:val="20"/>
+          <w:szCs w:val="20"/>
+        </w:rPr>
+        <w:t xml:space="preserve">manifold_complexity ← clamp((1 − mean_cos_window) / 2, 0, 1)</w:t>
+      </w:r>
+    </w:p>
+    <w:p>
+      <w:r>
+        <w:t xml:space="preserve">where mean_cos_window is the mean cosine similarity across adjacent embeddings in a short local window.</w:t>
+      </w:r>
+    </w:p>
+    <w:p>
+      <w:pPr>
+        <w:pStyle w:val="Equation"/>
+      </w:pPr>
+      <w:r>
+        <w:rPr>
+          <w:rFonts w:ascii="Courier New" w:cs="Courier New" w:eastAsia="Courier New" w:hAnsi="Courier New"/>
+          <w:sz w:val="20"/>
+          <w:szCs w:val="20"/>
+        </w:rPr>
+        <w:t xml:space="preserve">win_complex(T) = round(lerp(8, 32, T))</w:t>
+      </w:r>
+    </w:p>
+    <w:p>
+      <w:pPr>
+        <w:pStyle w:val="Equation"/>
+      </w:pPr>
+      <w:r>
+        <w:rPr>
+          <w:rFonts w:ascii="Courier New" w:cs="Courier New" w:eastAsia="Courier New" w:hAnsi="Courier New"/>
+          <w:sz w:val="20"/>
+          <w:szCs w:val="20"/>
+        </w:rPr>
+        <w:t xml:space="preserve">window_signals ← tail(signal_stream, win_complex(T) + 1)</w:t>
+      </w:r>
+    </w:p>
+    <w:p>
+      <w:pPr>
+        <w:pStyle w:val="Equation"/>
+      </w:pPr>
+      <w:r>
+        <w:rPr>
+          <w:rFonts w:ascii="Courier New" w:cs="Courier New" w:eastAsia="Courier New" w:hAnsi="Courier New"/>
+          <w:sz w:val="20"/>
+          <w:szCs w:val="20"/>
+        </w:rPr>
+        <w:t xml:space="preserve">if |window_signals| &lt; 2:</w:t>
+      </w:r>
+    </w:p>
+    <w:p>
+      <w:pPr>
+        <w:pStyle w:val="Equation"/>
+      </w:pPr>
+      <w:r>
+        <w:rPr>
+          <w:rFonts w:ascii="Courier New" w:cs="Courier New" w:eastAsia="Courier New" w:hAnsi="Courier New"/>
+          <w:sz w:val="20"/>
+          <w:szCs w:val="20"/>
+        </w:rPr>
+        <w:t xml:space="preserve">    mean_cos_window ← 1.0</w:t>
+      </w:r>
+    </w:p>
+    <w:p>
+      <w:pPr>
+        <w:pStyle w:val="Equation"/>
+      </w:pPr>
+      <w:r>
+        <w:rPr>
+          <w:rFonts w:ascii="Courier New" w:cs="Courier New" w:eastAsia="Courier New" w:hAnsi="Courier New"/>
+          <w:sz w:val="20"/>
+          <w:szCs w:val="20"/>
+        </w:rPr>
+        <w:t xml:space="preserve">else:</w:t>
+      </w:r>
+    </w:p>
+    <w:p>
+      <w:pPr>
+        <w:pStyle w:val="Equation"/>
+      </w:pPr>
+      <w:r>
+        <w:rPr>
+          <w:rFonts w:ascii="Courier New" w:cs="Courier New" w:eastAsia="Courier New" w:hAnsi="Courier New"/>
+          <w:sz w:val="20"/>
+          <w:szCs w:val="20"/>
+        </w:rPr>
+        <w:t xml:space="preserve">    mean_cos_window ← mean([cos(window_signals[i−1], window_signals[i]) for i = 1..|window_signals|−1])</w:t>
+      </w:r>
+    </w:p>
+    <w:p>
+      <w:r>
+        <w:rPr>
+          <w:b/>
+          <w:bCs/>
+        </w:rPr>
+        <w:t xml:space="preserve">kNN_similarities: </w:t>
+      </w:r>
+      <w:r>
+        <w:t xml:space="preserve">Vector of cosine similarities returned by nearest-neighbor search for the current query embedding.</w:t>
+      </w:r>
+    </w:p>
+    <w:p>
+      <w:pPr>
+        <w:pStyle w:val="Equation"/>
+      </w:pPr>
+      <w:r>
+        <w:rPr>
+          <w:rFonts w:ascii="Courier New" w:cs="Courier New" w:eastAsia="Courier New" w:hAnsi="Courier New"/>
+          <w:sz w:val="20"/>
+          <w:szCs w:val="20"/>
+        </w:rPr>
+        <w:t xml:space="preserve">kNN_similarities = [sim_1, …, sim_k] where sim_i ∈ [−1, 1]</w:t>
+      </w:r>
+    </w:p>
+    <w:p>
+      <w:r>
+        <w:rPr>
+          <w:b/>
+          <w:bCs/>
+        </w:rPr>
+        <w:t xml:space="preserve">kNN_size, graph_depth: </w:t>
+      </w:r>
+      <w:r>
+        <w:t xml:space="preserve">Discrete retrieval hyperparameters.</w:t>
+      </w:r>
+    </w:p>
+    <w:p>
+      <w:pPr>
+        <w:pStyle w:val="Equation"/>
+      </w:pPr>
+      <w:r>
+        <w:rPr>
+          <w:rFonts w:ascii="Courier New" w:cs="Courier New" w:eastAsia="Courier New" w:hAnsi="Courier New"/>
+          <w:sz w:val="20"/>
+          <w:szCs w:val="20"/>
+        </w:rPr>
+        <w:t xml:space="preserve">kNN_size(F) = round(lerp(64, 4, F))</w:t>
+      </w:r>
+    </w:p>
+    <w:p>
+      <w:pPr>
+        <w:pStyle w:val="Equation"/>
+      </w:pPr>
+      <w:r>
+        <w:rPr>
+          <w:rFonts w:ascii="Courier New" w:cs="Courier New" w:eastAsia="Courier New" w:hAnsi="Courier New"/>
+          <w:sz w:val="20"/>
+          <w:szCs w:val="20"/>
+        </w:rPr>
+        <w:t xml:space="preserve">graph_depth(T) = round(lerp(1, 3, T))</w:t>
+      </w:r>
+    </w:p>
+    <w:p>
+      <w:pPr>
+        <w:pStyle w:val="Equation"/>
+      </w:pPr>
+      <w:r>
+        <w:rPr>
+          <w:rFonts w:ascii="Courier New" w:cs="Courier New" w:eastAsia="Courier New" w:hAnsi="Courier New"/>
+          <w:sz w:val="20"/>
+          <w:szCs w:val="20"/>
+        </w:rPr>
+        <w:t xml:space="preserve">min_edge_weight(F) = lerp(0.70, 0.95, F)  # minimum association weight to traverse</w:t>
+      </w:r>
+    </w:p>
+    <w:p>
+      <w:r>
+        <w:br w:type="page"/>
+      </w:r>
+    </w:p>
+    <w:p>
+      <w:pPr>
+        <w:pStyle w:val="Heading1"/>
+      </w:pPr>
+      <w:r>
+        <w:t xml:space="preserve">Appendix C. Main Loop and Normative Invariants</w:t>
+      </w:r>
+    </w:p>
+    <w:p>
+      <w:r>
+        <w:t xml:space="preserve">Main loop (per signal):</w:t>
+      </w:r>
+    </w:p>
+    <w:p>
+      <w:pPr>
+        <w:pStyle w:val="ListParagraph"/>
+        <w:numPr>
+          <w:ilvl w:val="0"/>
+          <w:numId w:val="3"/>
+        </w:numPr>
+      </w:pPr>
+      <w:r>
+        <w:t xml:space="preserve">1) Compute now_ms(), now_s(), and signal_gap_s (before updating last_signal_ts).</w:t>
+      </w:r>
+    </w:p>
+    <w:p>
+      <w:pPr>
+        <w:pStyle w:val="ListParagraph"/>
+        <w:numPr>
+          <w:ilvl w:val="0"/>
+          <w:numId w:val="3"/>
+        </w:numPr>
+      </w:pPr>
+      <w:r>
+        <w:t xml:space="preserve">2) Update accumulator running statistics (μ_acc, drift_acc, s_sum, s_max, n, emo_max, arousal_sum, eta_acc, coherence_curr/coherence_prev).</w:t>
+      </w:r>
+    </w:p>
+    <w:p>
+      <w:pPr>
+        <w:pStyle w:val="ListParagraph"/>
+        <w:numPr>
+          <w:ilvl w:val="0"/>
+          <w:numId w:val="3"/>
+        </w:numPr>
+      </w:pPr>
+      <w:r>
+        <w:t xml:space="preserve">3) Update uncertainty u(t), then update θ_dynamic and hysteresis.</w:t>
+      </w:r>
+    </w:p>
+    <w:p>
+      <w:pPr>
+        <w:pStyle w:val="ListParagraph"/>
+        <w:numPr>
+          <w:ilvl w:val="0"/>
+          <w:numId w:val="3"/>
+        </w:numPr>
+      </w:pPr>
+      <w:r>
+        <w:t xml:space="preserve">4) Compute should_flush and spike_bypass/force_write; if boundary condition holds, compute S_window and decide write_memory.</w:t>
+      </w:r>
+    </w:p>
+    <w:p>
+      <w:pPr>
+        <w:pStyle w:val="ListParagraph"/>
+        <w:numPr>
+          <w:ilvl w:val="0"/>
+          <w:numId w:val="3"/>
+        </w:numPr>
+      </w:pPr>
+      <w:r>
+        <w:t xml:space="preserve">5) Update rate state (m_rate, dt_ema, rate_ticks, last_rate_timestamp) using Δwrites derived from this step's write_memory. Compute ρ_hat_next and then set ρ_hat_prev ← ρ_hat_next.</w:t>
+      </w:r>
+    </w:p>
+    <w:p>
+      <w:pPr>
+        <w:pStyle w:val="ListParagraph"/>
+        <w:numPr>
+          <w:ilvl w:val="0"/>
+          <w:numId w:val="3"/>
+        </w:numPr>
+      </w:pPr>
+      <w:r>
+        <w:t xml:space="preserve">6) If should_flush: finalize the unit. If write_memory: record the memory and update last_write_ts ← now_ms(); else discard. In both cases, reset_accumulator() for the next unit.</w:t>
+      </w:r>
+    </w:p>
+    <w:p>
+      <w:r>
+        <w:t xml:space="preserve">Normative invariants:</w:t>
+      </w:r>
+    </w:p>
+    <w:p>
+      <w:pPr>
+        <w:pStyle w:val="ListParagraph"/>
+        <w:numPr>
+          <w:ilvl w:val="0"/>
+          <w:numId w:val="2"/>
+        </w:numPr>
+      </w:pPr>
+      <w:r>
+        <w:rPr>
+          <w:b/>
+          <w:bCs/>
+        </w:rPr>
+        <w:t xml:space="preserve">MUST: </w:t>
+      </w:r>
+      <w:r>
+        <w:t xml:space="preserve">All stored timestamps are milliseconds since epoch; derived time deltas are seconds.</w:t>
+      </w:r>
+    </w:p>
+    <w:p>
+      <w:pPr>
+        <w:pStyle w:val="ListParagraph"/>
+        <w:numPr>
+          <w:ilvl w:val="0"/>
+          <w:numId w:val="2"/>
+        </w:numPr>
+      </w:pPr>
+      <w:r>
+        <w:rPr>
+          <w:b/>
+          <w:bCs/>
+        </w:rPr>
+        <w:t xml:space="preserve">MUST: </w:t>
+      </w:r>
+      <w:r>
+        <w:t xml:space="preserve">All thresholds and composite scores are clamped to [0, 1].</w:t>
+      </w:r>
+    </w:p>
+    <w:p>
+      <w:pPr>
+        <w:pStyle w:val="ListParagraph"/>
+        <w:numPr>
+          <w:ilvl w:val="0"/>
+          <w:numId w:val="2"/>
+        </w:numPr>
+      </w:pPr>
+      <w:r>
+        <w:rPr>
+          <w:b/>
+          <w:bCs/>
+        </w:rPr>
+        <w:t xml:space="preserve">MUST: </w:t>
+      </w:r>
+      <w:r>
+        <w:t xml:space="preserve">Strength is clamped to [0, 1] (bounded reinforcement).</w:t>
+      </w:r>
+    </w:p>
+    <w:p>
+      <w:pPr>
+        <w:pStyle w:val="ListParagraph"/>
+        <w:numPr>
+          <w:ilvl w:val="0"/>
+          <w:numId w:val="2"/>
+        </w:numPr>
+      </w:pPr>
+      <w:r>
+        <w:rPr>
+          <w:b/>
+          <w:bCs/>
+        </w:rPr>
+        <w:t xml:space="preserve">MUST: </w:t>
+      </w:r>
+      <w:r>
+        <w:t xml:space="preserve">If weight_sum &lt; ε during score normalization, return score = 0.</w:t>
+      </w:r>
+    </w:p>
+    <w:p>
+      <w:pPr>
+        <w:pStyle w:val="ListParagraph"/>
+        <w:numPr>
+          <w:ilvl w:val="0"/>
+          <w:numId w:val="2"/>
+        </w:numPr>
+      </w:pPr>
+      <w:r>
+        <w:rPr>
+          <w:b/>
+          <w:bCs/>
+        </w:rPr>
+        <w:t xml:space="preserve">SHOULD: </w:t>
+      </w:r>
+      <w:r>
+        <w:t xml:space="preserve">All cosine-derived quantities that are interpreted as probabilities are map01/clamped consistently.</w:t>
       </w:r>
     </w:p>
     <w:sectPr>
@@ -8615,6 +11190,12 @@
   </w:num>
   <w:num w:numId="2">
     <w:abstractNumId w:val="3"/>
+    <w:lvlOverride w:ilvl="0">
+      <w:startOverride w:val="1"/>
+    </w:lvlOverride>
+  </w:num>
+  <w:num w:numId="3">
+    <w:abstractNumId w:val="2"/>
     <w:lvlOverride w:ilvl="0">
       <w:startOverride w:val="1"/>
     </w:lvlOverride>

</xml_diff>